<commit_message>
Mejorar ilustraciones del apartado 1.1 y añadir gráfica de accidentes DADO
Co-Authored-By: Claude Opus 5.5 <noreply@anthropic.com>
Claude-Session: https://claude.ai/code/session_01GULK22xqK1fWX4r8uc4cx1
</commit_message>
<xml_diff>
--- a/trabajo/Trabajo_Taburete.docx
+++ b/trabajo/Trabajo_Taburete.docx
@@ -40,7 +40,7 @@
       <w:r>
         <w:drawing>
           <wp:inline xmlns:a="http://schemas.openxmlformats.org/drawingml/2006/main" xmlns:pic="http://schemas.openxmlformats.org/drawingml/2006/picture">
-            <wp:extent cx="5400000" cy="3510000"/>
+            <wp:extent cx="5760000" cy="3719388"/>
             <wp:docPr id="1" name="Picture 1"/>
             <wp:cNvGraphicFramePr>
               <a:graphicFrameLocks noChangeAspect="1"/>
@@ -53,7 +53,7 @@
                     <pic:cNvPicPr/>
                   </pic:nvPicPr>
                   <pic:blipFill>
-                    <a:blip r:embed="rId9"/>
+                    <a:blip r:embed="rId10"/>
                     <a:stretch>
                       <a:fillRect/>
                     </a:stretch>
@@ -61,7 +61,7 @@
                   <pic:spPr>
                     <a:xfrm>
                       <a:off x="0" y="0"/>
-                      <a:ext cx="5400000" cy="3510000"/>
+                      <a:ext cx="5760000" cy="3719388"/>
                     </a:xfrm>
                     <a:prstGeom prst="rect"/>
                   </pic:spPr>
@@ -88,7 +88,52 @@
     </w:p>
     <w:p>
       <w:r>
-        <w:t>Los datos lo confirman: según el informe DADO (Detección de Accidentes Domésticos y de Ocio) del Ministerio de Sanidad, las caídas son el tipo de accidente más frecuente, con un 51,1 % del total, y el interior de la vivienda es el lugar donde se producen la mayoría de estos accidentes (54,5 %). Además, la población española está cada vez más envejecida: a 1 de enero de 2025 el 20,7 % de la población tenía 65 años o más (INE), y en este grupo una caída desde poca altura puede tener consecuencias graves.</w:t>
+        <w:t>Los datos lo confirman: según el informe DADO (Detección de Accidentes Domésticos y de Ocio) del Ministerio de Sanidad, las caídas son el tipo de accidente más frecuente, con un 51,1 % del total, y el interior de la vivienda es el lugar donde se producen la mayoría de estos accidentes (54,5 %), como se ve en la Ilustración 2. Además, la población española está cada vez más envejecida: a 1 de enero de 2025 el 20,7 % de la población tenía 65 años o más (INE), y en este grupo una caída desde poca altura puede tener consecuencias graves.</w:t>
+      </w:r>
+    </w:p>
+    <w:p>
+      <w:r>
+        <w:drawing>
+          <wp:inline xmlns:a="http://schemas.openxmlformats.org/drawingml/2006/main" xmlns:pic="http://schemas.openxmlformats.org/drawingml/2006/picture">
+            <wp:extent cx="5040000" cy="2268000"/>
+            <wp:docPr id="2" name="Picture 2"/>
+            <wp:cNvGraphicFramePr>
+              <a:graphicFrameLocks noChangeAspect="1"/>
+            </wp:cNvGraphicFramePr>
+            <a:graphic>
+              <a:graphicData uri="http://schemas.openxmlformats.org/drawingml/2006/picture">
+                <pic:pic>
+                  <pic:nvPicPr>
+                    <pic:cNvPr id="0" name="figura2_accidentes_DADO.png"/>
+                    <pic:cNvPicPr/>
+                  </pic:nvPicPr>
+                  <pic:blipFill>
+                    <a:blip r:embed="rId11"/>
+                    <a:stretch>
+                      <a:fillRect/>
+                    </a:stretch>
+                  </pic:blipFill>
+                  <pic:spPr>
+                    <a:xfrm>
+                      <a:off x="0" y="0"/>
+                      <a:ext cx="5040000" cy="2268000"/>
+                    </a:xfrm>
+                    <a:prstGeom prst="rect"/>
+                  </pic:spPr>
+                </pic:pic>
+              </a:graphicData>
+            </a:graphic>
+          </wp:inline>
+        </w:drawing>
+      </w:r>
+    </w:p>
+    <w:p>
+      <w:r>
+        <w:rPr>
+          <w:i/>
+          <w:sz w:val="18"/>
+        </w:rPr>
+        <w:t>Ilustración 2. Accidentes domésticos y de ocio en España según su tipo. Fuente: informe DADO 2011. Elaboración propia.</w:t>
       </w:r>
     </w:p>
     <w:p>

</xml_diff>

<commit_message>
Añadir apartados 1.2 a 1.6 (definición, objetivos, funciones, requisitos, propiedades) e ilustraciones 3 y 4
Co-Authored-By: Claude Opus 5.5 <noreply@anthropic.com>
Claude-Session: https://claude.ai/code/session_01GULK22xqK1fWX4r8uc4cx1
</commit_message>
<xml_diff>
--- a/trabajo/Trabajo_Taburete.docx
+++ b/trabajo/Trabajo_Taburete.docx
@@ -249,10 +249,2633 @@
     </w:p>
     <w:p>
       <w:pPr>
+        <w:pStyle w:val="Heading2"/>
+      </w:pPr>
+      <w:r>
+        <w:t>1.2. DEFINICIÓN</w:t>
+      </w:r>
+    </w:p>
+    <w:p>
+      <w:r>
+        <w:t>El producto a diseñar es un taburete-escalera plegable de uso doméstico, es decir, un elemento auxiliar de pocos peldaños que permite a una persona elevarse de forma segura para acceder a zonas altas de la vivienda (muebles altos de cocina, altillos, estanterías, lámparas, cortinas…), y que cuando no se utiliza se puede plegar para guardarlo en poco espacio.</w:t>
+      </w:r>
+    </w:p>
+    <w:p>
+      <w:r>
+        <w:t>No se trata de una escalera de mano ni de una escalera de tijera profesional, sino de un producto pensado para un uso breve y frecuente dentro de casa, por cualquier miembro de la familia.</w:t>
+      </w:r>
+    </w:p>
+    <w:p>
+      <w:pPr>
+        <w:pStyle w:val="Heading2"/>
+      </w:pPr>
+      <w:r>
+        <w:t>1.3. OBJETIVOS</w:t>
+      </w:r>
+    </w:p>
+    <w:p>
+      <w:r>
+        <w:rPr>
+          <w:b/>
+        </w:rPr>
+        <w:t>Objetivo general:</w:t>
+      </w:r>
+    </w:p>
+    <w:p>
+      <w:r>
+        <w:t>Diseñar un taburete-escalera doméstico que sea seguro y estable durante su uso y que, a la vez, sea ligero y fácil de guardar, con un precio competitivo y un impacto ambiental reducido a lo largo de su ciclo de vida.</w:t>
+      </w:r>
+    </w:p>
+    <w:p>
+      <w:r>
+        <w:rPr>
+          <w:b/>
+        </w:rPr>
+        <w:t>Objetivos específicos:</w:t>
+      </w:r>
+    </w:p>
+    <w:p>
+      <w:pPr>
+        <w:pStyle w:val="ListNumber"/>
+      </w:pPr>
+      <w:r>
+        <w:t>Permitir que una usuaria de percentil 5 alcance con comodidad una altura de 2,30 m, lo que cubre el mueble alto completo y la balda media del altillo.</w:t>
+      </w:r>
+    </w:p>
+    <w:p>
+      <w:pPr>
+        <w:pStyle w:val="ListNumber"/>
+      </w:pPr>
+      <w:r>
+        <w:t>Soportar a un usuario adulto de hasta 150 kg sin riesgo de rotura, deformación ni vuelco.</w:t>
+      </w:r>
+    </w:p>
+    <w:p>
+      <w:pPr>
+        <w:pStyle w:val="ListNumber"/>
+      </w:pPr>
+      <w:r>
+        <w:t>Conseguir que, una vez plegado, ocupe el mínimo espesor posible para guardarlo en huecos estrechos.</w:t>
+      </w:r>
+    </w:p>
+    <w:p>
+      <w:pPr>
+        <w:pStyle w:val="ListNumber"/>
+      </w:pPr>
+      <w:r>
+        <w:t>Que se pueda abrir, cerrar y transportar con una sola mano.</w:t>
+      </w:r>
+    </w:p>
+    <w:p>
+      <w:pPr>
+        <w:pStyle w:val="ListNumber"/>
+      </w:pPr>
+      <w:r>
+        <w:t>Cumplir la norma UNE-EN 14183 sobre taburetes-escalera.</w:t>
+      </w:r>
+    </w:p>
+    <w:p>
+      <w:pPr>
+        <w:pStyle w:val="ListNumber"/>
+      </w:pPr>
+      <w:r>
+        <w:t>Reducir la huella de carbono del producto respecto a los modelos equivalentes del mercado, utilizando materiales reciclables y fáciles de separar.</w:t>
+      </w:r>
+    </w:p>
+    <w:p>
+      <w:pPr>
+        <w:pStyle w:val="ListNumber"/>
+      </w:pPr>
+      <w:r>
+        <w:t>Mantener un precio de venta similar o inferior al de la competencia de gama media.</w:t>
+      </w:r>
+    </w:p>
+    <w:p>
+      <w:r>
+        <w:t>Para fijar la altura necesaria se ha hecho un cálculo sencillo a partir de los datos del apartado anterior. Si el objetivo es llegar a 2,30 m y el alcance de una usuaria de percentil 5 es de unos 1,85 m, la plataforma superior tiene que estar como mínimo a 0,45 m del suelo. Por comodidad se toma una altura de 0,48 m, repartida en dos peldaños de unos 0,24 m (Ilustración 3).</w:t>
+      </w:r>
+    </w:p>
+    <w:p>
+      <w:pPr>
+        <w:jc w:val="center"/>
+      </w:pPr>
+      <w:r>
+        <w:drawing>
+          <wp:inline xmlns:a="http://schemas.openxmlformats.org/drawingml/2006/main" xmlns:pic="http://schemas.openxmlformats.org/drawingml/2006/picture">
+            <wp:extent cx="5400000" cy="3433019"/>
+            <wp:docPr id="3" name="Picture 3"/>
+            <wp:cNvGraphicFramePr>
+              <a:graphicFrameLocks noChangeAspect="1"/>
+            </wp:cNvGraphicFramePr>
+            <a:graphic>
+              <a:graphicData uri="http://schemas.openxmlformats.org/drawingml/2006/picture">
+                <pic:pic>
+                  <pic:nvPicPr>
+                    <pic:cNvPr id="0" name="figura3_altura_plataforma.png"/>
+                    <pic:cNvPicPr/>
+                  </pic:nvPicPr>
+                  <pic:blipFill>
+                    <a:blip r:embed="rId12"/>
+                    <a:stretch>
+                      <a:fillRect/>
+                    </a:stretch>
+                  </pic:blipFill>
+                  <pic:spPr>
+                    <a:xfrm>
+                      <a:off x="0" y="0"/>
+                      <a:ext cx="5400000" cy="3433019"/>
+                    </a:xfrm>
+                    <a:prstGeom prst="rect"/>
+                  </pic:spPr>
+                </pic:pic>
+              </a:graphicData>
+            </a:graphic>
+          </wp:inline>
+        </w:drawing>
+      </w:r>
+    </w:p>
+    <w:p>
+      <w:pPr>
+        <w:jc w:val="center"/>
+      </w:pPr>
+      <w:r>
+        <w:rPr>
+          <w:i/>
+          <w:sz w:val="18"/>
+        </w:rPr>
+        <w:t>Ilustración 3. Determinación de la altura de la plataforma superior. Elaboración propia.</w:t>
+      </w:r>
+    </w:p>
+    <w:p>
+      <w:pPr>
+        <w:pStyle w:val="Heading2"/>
+      </w:pPr>
+      <w:r>
+        <w:t>1.4. FUNCIONES</w:t>
+      </w:r>
+    </w:p>
+    <w:p>
+      <w:r>
+        <w:t>Siguiendo la clasificación vista en la asignatura, las funciones del producto se dividen en funciones de uso, de manipulación y comunicativas. La función principal es elevar al usuario de forma segura para que pueda alcanzar zonas altas; el resto son funciones secundarias que hacen posible o mejoran la principal (Ilustración 4).</w:t>
+      </w:r>
+    </w:p>
+    <w:p>
+      <w:pPr>
+        <w:jc w:val="center"/>
+      </w:pPr>
+      <w:r>
+        <w:drawing>
+          <wp:inline xmlns:a="http://schemas.openxmlformats.org/drawingml/2006/main" xmlns:pic="http://schemas.openxmlformats.org/drawingml/2006/picture">
+            <wp:extent cx="5580000" cy="3321200"/>
+            <wp:docPr id="4" name="Picture 4"/>
+            <wp:cNvGraphicFramePr>
+              <a:graphicFrameLocks noChangeAspect="1"/>
+            </wp:cNvGraphicFramePr>
+            <a:graphic>
+              <a:graphicData uri="http://schemas.openxmlformats.org/drawingml/2006/picture">
+                <pic:pic>
+                  <pic:nvPicPr>
+                    <pic:cNvPr id="0" name="figura4_arbol_funciones.png"/>
+                    <pic:cNvPicPr/>
+                  </pic:nvPicPr>
+                  <pic:blipFill>
+                    <a:blip r:embed="rId13"/>
+                    <a:stretch>
+                      <a:fillRect/>
+                    </a:stretch>
+                  </pic:blipFill>
+                  <pic:spPr>
+                    <a:xfrm>
+                      <a:off x="0" y="0"/>
+                      <a:ext cx="5580000" cy="3321200"/>
+                    </a:xfrm>
+                    <a:prstGeom prst="rect"/>
+                  </pic:spPr>
+                </pic:pic>
+              </a:graphicData>
+            </a:graphic>
+          </wp:inline>
+        </w:drawing>
+      </w:r>
+    </w:p>
+    <w:p>
+      <w:pPr>
+        <w:jc w:val="center"/>
+      </w:pPr>
+      <w:r>
+        <w:rPr>
+          <w:i/>
+          <w:sz w:val="18"/>
+        </w:rPr>
+        <w:t>Ilustración 4. Árbol de funciones del taburete-escalera. Elaboración propia.</w:t>
+      </w:r>
+    </w:p>
+    <w:p>
+      <w:r>
+        <w:rPr>
+          <w:b/>
+        </w:rPr>
+        <w:t>Funciones de uso (principales):</w:t>
+      </w:r>
+    </w:p>
+    <w:p>
+      <w:pPr>
+        <w:pStyle w:val="ListBullet"/>
+      </w:pPr>
+      <w:r>
+        <w:t>Soportar el peso del usuario mientras sube, está de pie y baja.</w:t>
+      </w:r>
+    </w:p>
+    <w:p>
+      <w:pPr>
+        <w:pStyle w:val="ListBullet"/>
+      </w:pPr>
+      <w:r>
+        <w:t>Mantener la estabilidad aunque el usuario se incline o cambie el peso de un pie a otro.</w:t>
+      </w:r>
+    </w:p>
+    <w:p>
+      <w:pPr>
+        <w:pStyle w:val="ListBullet"/>
+      </w:pPr>
+      <w:r>
+        <w:t>Proporcionar un apoyo firme y cómodo para el pie.</w:t>
+      </w:r>
+    </w:p>
+    <w:p>
+      <w:pPr>
+        <w:pStyle w:val="ListBullet"/>
+      </w:pPr>
+      <w:r>
+        <w:t>Ofrecer un punto de agarre en el que apoyarse al subir y bajar.</w:t>
+      </w:r>
+    </w:p>
+    <w:p>
+      <w:r>
+        <w:rPr>
+          <w:b/>
+        </w:rPr>
+        <w:t>Funciones de manipulación (secundarias):</w:t>
+      </w:r>
+    </w:p>
+    <w:p>
+      <w:pPr>
+        <w:pStyle w:val="ListBullet"/>
+      </w:pPr>
+      <w:r>
+        <w:t>Desplegarse y plegarse de forma rápida.</w:t>
+      </w:r>
+    </w:p>
+    <w:p>
+      <w:pPr>
+        <w:pStyle w:val="ListBullet"/>
+      </w:pPr>
+      <w:r>
+        <w:t>Quedar bloqueado en posición de uso para que no se cierre solo.</w:t>
+      </w:r>
+    </w:p>
+    <w:p>
+      <w:pPr>
+        <w:pStyle w:val="ListBullet"/>
+      </w:pPr>
+      <w:r>
+        <w:t>Poder transportarse de una habitación a otra con una mano.</w:t>
+      </w:r>
+    </w:p>
+    <w:p>
+      <w:pPr>
+        <w:pStyle w:val="ListBullet"/>
+      </w:pPr>
+      <w:r>
+        <w:t>Almacenarse en poco espacio cuando no se usa.</w:t>
+      </w:r>
+    </w:p>
+    <w:p>
+      <w:r>
+        <w:rPr>
+          <w:b/>
+        </w:rPr>
+        <w:t>Funciones comunicativas (secundarias):</w:t>
+      </w:r>
+    </w:p>
+    <w:p>
+      <w:pPr>
+        <w:pStyle w:val="ListBullet"/>
+      </w:pPr>
+      <w:r>
+        <w:t>Transmitir sensación de seguridad y solidez al usuario.</w:t>
+      </w:r>
+    </w:p>
+    <w:p>
+      <w:pPr>
+        <w:pStyle w:val="ListBullet"/>
+      </w:pPr>
+      <w:r>
+        <w:t>Indicar la carga máxima admisible y las advertencias de uso.</w:t>
+      </w:r>
+    </w:p>
+    <w:p>
+      <w:pPr>
+        <w:pStyle w:val="ListBullet"/>
+      </w:pPr>
+      <w:r>
+        <w:t>Dejar claro, a simple vista, cómo se abre y cuándo está bien bloqueado.</w:t>
+      </w:r>
+    </w:p>
+    <w:p>
+      <w:pPr>
+        <w:pStyle w:val="ListBullet"/>
+      </w:pPr>
+      <w:r>
+        <w:t>Integrarse estéticamente en la cocina o en el salón, ya que muchas veces estará a la vista.</w:t>
+      </w:r>
+    </w:p>
+    <w:p>
+      <w:pPr>
+        <w:pStyle w:val="Heading2"/>
+      </w:pPr>
+      <w:r>
+        <w:t>1.5. REQUISITOS</w:t>
+      </w:r>
+    </w:p>
+    <w:p>
+      <w:r>
+        <w:t>Los requisitos son las condiciones que tiene que cumplir el producto para realizar correctamente sus funciones. Se han agrupado en los tipos vistos en clase (ergonómicos, estéticos, de uso y medioambientales), añadiendo los de seguridad y los económicos, y se han separado en imprescindibles (I) y deseables (D).</w:t>
+      </w:r>
+    </w:p>
+    <w:tbl>
+      <w:tblPr>
+        <w:tblStyle w:val="TableGrid"/>
+        <w:tblW w:type="auto" w:w="0"/>
+        <w:tblLook w:firstColumn="1" w:firstRow="1" w:lastColumn="0" w:lastRow="0" w:noHBand="0" w:noVBand="1" w:val="04A0"/>
+      </w:tblPr>
+      <w:tblGrid>
+        <w:gridCol w:w="2160"/>
+        <w:gridCol w:w="2160"/>
+        <w:gridCol w:w="2160"/>
+        <w:gridCol w:w="2160"/>
+      </w:tblGrid>
+      <w:tr>
+        <w:tc>
+          <w:tcPr>
+            <w:tcW w:type="dxa" w:w="850"/>
+            <w:shd w:val="clear" w:color="auto" w:fill="C0392B"/>
+          </w:tcPr>
+          <w:p>
+            <w:r/>
+            <w:r>
+              <w:rPr>
+                <w:b/>
+                <w:color w:val="FFFFFF"/>
+                <w:sz w:val="19"/>
+              </w:rPr>
+              <w:t>Código</w:t>
+            </w:r>
+          </w:p>
+        </w:tc>
+        <w:tc>
+          <w:tcPr>
+            <w:tcW w:type="dxa" w:w="1701"/>
+            <w:shd w:val="clear" w:color="auto" w:fill="C0392B"/>
+          </w:tcPr>
+          <w:p>
+            <w:r/>
+            <w:r>
+              <w:rPr>
+                <w:b/>
+                <w:color w:val="FFFFFF"/>
+                <w:sz w:val="19"/>
+              </w:rPr>
+              <w:t>Tipo</w:t>
+            </w:r>
+          </w:p>
+        </w:tc>
+        <w:tc>
+          <w:tcPr>
+            <w:tcW w:type="dxa" w:w="5386"/>
+            <w:shd w:val="clear" w:color="auto" w:fill="C0392B"/>
+          </w:tcPr>
+          <w:p>
+            <w:r/>
+            <w:r>
+              <w:rPr>
+                <w:b/>
+                <w:color w:val="FFFFFF"/>
+                <w:sz w:val="19"/>
+              </w:rPr>
+              <w:t>Requisito</w:t>
+            </w:r>
+          </w:p>
+        </w:tc>
+        <w:tc>
+          <w:tcPr>
+            <w:tcW w:type="dxa" w:w="794"/>
+            <w:shd w:val="clear" w:color="auto" w:fill="C0392B"/>
+          </w:tcPr>
+          <w:p>
+            <w:r/>
+            <w:r>
+              <w:rPr>
+                <w:b/>
+                <w:color w:val="FFFFFF"/>
+                <w:sz w:val="19"/>
+              </w:rPr>
+              <w:t>I / D</w:t>
+            </w:r>
+          </w:p>
+        </w:tc>
+      </w:tr>
+      <w:tr>
+        <w:tc>
+          <w:tcPr>
+            <w:tcW w:type="dxa" w:w="850"/>
+          </w:tcPr>
+          <w:p>
+            <w:r/>
+            <w:r>
+              <w:rPr>
+                <w:sz w:val="18"/>
+              </w:rPr>
+              <w:t>R1</w:t>
+            </w:r>
+          </w:p>
+        </w:tc>
+        <w:tc>
+          <w:tcPr>
+            <w:tcW w:type="dxa" w:w="1701"/>
+          </w:tcPr>
+          <w:p>
+            <w:r/>
+            <w:r>
+              <w:rPr>
+                <w:sz w:val="18"/>
+              </w:rPr>
+              <w:t>Seguridad</w:t>
+            </w:r>
+          </w:p>
+        </w:tc>
+        <w:tc>
+          <w:tcPr>
+            <w:tcW w:type="dxa" w:w="5386"/>
+          </w:tcPr>
+          <w:p>
+            <w:r/>
+            <w:r>
+              <w:rPr>
+                <w:sz w:val="18"/>
+              </w:rPr>
+              <w:t>Soportar a un adulto de hasta 150 kg</w:t>
+            </w:r>
+          </w:p>
+        </w:tc>
+        <w:tc>
+          <w:tcPr>
+            <w:tcW w:type="dxa" w:w="794"/>
+          </w:tcPr>
+          <w:p>
+            <w:r/>
+            <w:r>
+              <w:rPr>
+                <w:sz w:val="18"/>
+              </w:rPr>
+              <w:t>I</w:t>
+            </w:r>
+          </w:p>
+        </w:tc>
+      </w:tr>
+      <w:tr>
+        <w:tc>
+          <w:tcPr>
+            <w:tcW w:type="dxa" w:w="850"/>
+          </w:tcPr>
+          <w:p>
+            <w:r/>
+            <w:r>
+              <w:rPr>
+                <w:sz w:val="18"/>
+              </w:rPr>
+              <w:t>R2</w:t>
+            </w:r>
+          </w:p>
+        </w:tc>
+        <w:tc>
+          <w:tcPr>
+            <w:tcW w:type="dxa" w:w="1701"/>
+          </w:tcPr>
+          <w:p>
+            <w:r/>
+            <w:r>
+              <w:rPr>
+                <w:sz w:val="18"/>
+              </w:rPr>
+              <w:t>Seguridad</w:t>
+            </w:r>
+          </w:p>
+        </w:tc>
+        <w:tc>
+          <w:tcPr>
+            <w:tcW w:type="dxa" w:w="5386"/>
+          </w:tcPr>
+          <w:p>
+            <w:r/>
+            <w:r>
+              <w:rPr>
+                <w:sz w:val="18"/>
+              </w:rPr>
+              <w:t>No volcar al subir, bajar o inclinarse hacia un lado</w:t>
+            </w:r>
+          </w:p>
+        </w:tc>
+        <w:tc>
+          <w:tcPr>
+            <w:tcW w:type="dxa" w:w="794"/>
+          </w:tcPr>
+          <w:p>
+            <w:r/>
+            <w:r>
+              <w:rPr>
+                <w:sz w:val="18"/>
+              </w:rPr>
+              <w:t>I</w:t>
+            </w:r>
+          </w:p>
+        </w:tc>
+      </w:tr>
+      <w:tr>
+        <w:tc>
+          <w:tcPr>
+            <w:tcW w:type="dxa" w:w="850"/>
+          </w:tcPr>
+          <w:p>
+            <w:r/>
+            <w:r>
+              <w:rPr>
+                <w:sz w:val="18"/>
+              </w:rPr>
+              <w:t>R3</w:t>
+            </w:r>
+          </w:p>
+        </w:tc>
+        <w:tc>
+          <w:tcPr>
+            <w:tcW w:type="dxa" w:w="1701"/>
+          </w:tcPr>
+          <w:p>
+            <w:r/>
+            <w:r>
+              <w:rPr>
+                <w:sz w:val="18"/>
+              </w:rPr>
+              <w:t>Seguridad</w:t>
+            </w:r>
+          </w:p>
+        </w:tc>
+        <w:tc>
+          <w:tcPr>
+            <w:tcW w:type="dxa" w:w="5386"/>
+          </w:tcPr>
+          <w:p>
+            <w:r/>
+            <w:r>
+              <w:rPr>
+                <w:sz w:val="18"/>
+              </w:rPr>
+              <w:t>No poder plegarse accidentalmente mientras se usa</w:t>
+            </w:r>
+          </w:p>
+        </w:tc>
+        <w:tc>
+          <w:tcPr>
+            <w:tcW w:type="dxa" w:w="794"/>
+          </w:tcPr>
+          <w:p>
+            <w:r/>
+            <w:r>
+              <w:rPr>
+                <w:sz w:val="18"/>
+              </w:rPr>
+              <w:t>I</w:t>
+            </w:r>
+          </w:p>
+        </w:tc>
+      </w:tr>
+      <w:tr>
+        <w:tc>
+          <w:tcPr>
+            <w:tcW w:type="dxa" w:w="850"/>
+          </w:tcPr>
+          <w:p>
+            <w:r/>
+            <w:r>
+              <w:rPr>
+                <w:sz w:val="18"/>
+              </w:rPr>
+              <w:t>R4</w:t>
+            </w:r>
+          </w:p>
+        </w:tc>
+        <w:tc>
+          <w:tcPr>
+            <w:tcW w:type="dxa" w:w="1701"/>
+          </w:tcPr>
+          <w:p>
+            <w:r/>
+            <w:r>
+              <w:rPr>
+                <w:sz w:val="18"/>
+              </w:rPr>
+              <w:t>Seguridad</w:t>
+            </w:r>
+          </w:p>
+        </w:tc>
+        <w:tc>
+          <w:tcPr>
+            <w:tcW w:type="dxa" w:w="5386"/>
+          </w:tcPr>
+          <w:p>
+            <w:r/>
+            <w:r>
+              <w:rPr>
+                <w:sz w:val="18"/>
+              </w:rPr>
+              <w:t>Peldaños y apoyos antideslizantes</w:t>
+            </w:r>
+          </w:p>
+        </w:tc>
+        <w:tc>
+          <w:tcPr>
+            <w:tcW w:type="dxa" w:w="794"/>
+          </w:tcPr>
+          <w:p>
+            <w:r/>
+            <w:r>
+              <w:rPr>
+                <w:sz w:val="18"/>
+              </w:rPr>
+              <w:t>I</w:t>
+            </w:r>
+          </w:p>
+        </w:tc>
+      </w:tr>
+      <w:tr>
+        <w:tc>
+          <w:tcPr>
+            <w:tcW w:type="dxa" w:w="850"/>
+          </w:tcPr>
+          <w:p>
+            <w:r/>
+            <w:r>
+              <w:rPr>
+                <w:sz w:val="18"/>
+              </w:rPr>
+              <w:t>R5</w:t>
+            </w:r>
+          </w:p>
+        </w:tc>
+        <w:tc>
+          <w:tcPr>
+            <w:tcW w:type="dxa" w:w="1701"/>
+          </w:tcPr>
+          <w:p>
+            <w:r/>
+            <w:r>
+              <w:rPr>
+                <w:sz w:val="18"/>
+              </w:rPr>
+              <w:t>Seguridad</w:t>
+            </w:r>
+          </w:p>
+        </w:tc>
+        <w:tc>
+          <w:tcPr>
+            <w:tcW w:type="dxa" w:w="5386"/>
+          </w:tcPr>
+          <w:p>
+            <w:r/>
+            <w:r>
+              <w:rPr>
+                <w:sz w:val="18"/>
+              </w:rPr>
+              <w:t>Cumplir la norma UNE-EN 14183</w:t>
+            </w:r>
+          </w:p>
+        </w:tc>
+        <w:tc>
+          <w:tcPr>
+            <w:tcW w:type="dxa" w:w="794"/>
+          </w:tcPr>
+          <w:p>
+            <w:r/>
+            <w:r>
+              <w:rPr>
+                <w:sz w:val="18"/>
+              </w:rPr>
+              <w:t>I</w:t>
+            </w:r>
+          </w:p>
+        </w:tc>
+      </w:tr>
+      <w:tr>
+        <w:tc>
+          <w:tcPr>
+            <w:tcW w:type="dxa" w:w="850"/>
+          </w:tcPr>
+          <w:p>
+            <w:r/>
+            <w:r>
+              <w:rPr>
+                <w:sz w:val="18"/>
+              </w:rPr>
+              <w:t>R6</w:t>
+            </w:r>
+          </w:p>
+        </w:tc>
+        <w:tc>
+          <w:tcPr>
+            <w:tcW w:type="dxa" w:w="1701"/>
+          </w:tcPr>
+          <w:p>
+            <w:r/>
+            <w:r>
+              <w:rPr>
+                <w:sz w:val="18"/>
+              </w:rPr>
+              <w:t>Ergonómico</w:t>
+            </w:r>
+          </w:p>
+        </w:tc>
+        <w:tc>
+          <w:tcPr>
+            <w:tcW w:type="dxa" w:w="5386"/>
+          </w:tcPr>
+          <w:p>
+            <w:r/>
+            <w:r>
+              <w:rPr>
+                <w:sz w:val="18"/>
+              </w:rPr>
+              <w:t>Permitir alcanzar 2,30 m a una usuaria de percentil 5</w:t>
+            </w:r>
+          </w:p>
+        </w:tc>
+        <w:tc>
+          <w:tcPr>
+            <w:tcW w:type="dxa" w:w="794"/>
+          </w:tcPr>
+          <w:p>
+            <w:r/>
+            <w:r>
+              <w:rPr>
+                <w:sz w:val="18"/>
+              </w:rPr>
+              <w:t>I</w:t>
+            </w:r>
+          </w:p>
+        </w:tc>
+      </w:tr>
+      <w:tr>
+        <w:tc>
+          <w:tcPr>
+            <w:tcW w:type="dxa" w:w="850"/>
+          </w:tcPr>
+          <w:p>
+            <w:r/>
+            <w:r>
+              <w:rPr>
+                <w:sz w:val="18"/>
+              </w:rPr>
+              <w:t>R7</w:t>
+            </w:r>
+          </w:p>
+        </w:tc>
+        <w:tc>
+          <w:tcPr>
+            <w:tcW w:type="dxa" w:w="1701"/>
+          </w:tcPr>
+          <w:p>
+            <w:r/>
+            <w:r>
+              <w:rPr>
+                <w:sz w:val="18"/>
+              </w:rPr>
+              <w:t>Ergonómico</w:t>
+            </w:r>
+          </w:p>
+        </w:tc>
+        <w:tc>
+          <w:tcPr>
+            <w:tcW w:type="dxa" w:w="5386"/>
+          </w:tcPr>
+          <w:p>
+            <w:r/>
+            <w:r>
+              <w:rPr>
+                <w:sz w:val="18"/>
+              </w:rPr>
+              <w:t>Peldaños en los que quepa el pie completo</w:t>
+            </w:r>
+          </w:p>
+        </w:tc>
+        <w:tc>
+          <w:tcPr>
+            <w:tcW w:type="dxa" w:w="794"/>
+          </w:tcPr>
+          <w:p>
+            <w:r/>
+            <w:r>
+              <w:rPr>
+                <w:sz w:val="18"/>
+              </w:rPr>
+              <w:t>I</w:t>
+            </w:r>
+          </w:p>
+        </w:tc>
+      </w:tr>
+      <w:tr>
+        <w:tc>
+          <w:tcPr>
+            <w:tcW w:type="dxa" w:w="850"/>
+          </w:tcPr>
+          <w:p>
+            <w:r/>
+            <w:r>
+              <w:rPr>
+                <w:sz w:val="18"/>
+              </w:rPr>
+              <w:t>R8</w:t>
+            </w:r>
+          </w:p>
+        </w:tc>
+        <w:tc>
+          <w:tcPr>
+            <w:tcW w:type="dxa" w:w="1701"/>
+          </w:tcPr>
+          <w:p>
+            <w:r/>
+            <w:r>
+              <w:rPr>
+                <w:sz w:val="18"/>
+              </w:rPr>
+              <w:t>Ergonómico</w:t>
+            </w:r>
+          </w:p>
+        </w:tc>
+        <w:tc>
+          <w:tcPr>
+            <w:tcW w:type="dxa" w:w="5386"/>
+          </w:tcPr>
+          <w:p>
+            <w:r/>
+            <w:r>
+              <w:rPr>
+                <w:sz w:val="18"/>
+              </w:rPr>
+              <w:t>Altura entre peldaños cómoda de subir, también para personas mayores</w:t>
+            </w:r>
+          </w:p>
+        </w:tc>
+        <w:tc>
+          <w:tcPr>
+            <w:tcW w:type="dxa" w:w="794"/>
+          </w:tcPr>
+          <w:p>
+            <w:r/>
+            <w:r>
+              <w:rPr>
+                <w:sz w:val="18"/>
+              </w:rPr>
+              <w:t>I</w:t>
+            </w:r>
+          </w:p>
+        </w:tc>
+      </w:tr>
+      <w:tr>
+        <w:tc>
+          <w:tcPr>
+            <w:tcW w:type="dxa" w:w="850"/>
+          </w:tcPr>
+          <w:p>
+            <w:r/>
+            <w:r>
+              <w:rPr>
+                <w:sz w:val="18"/>
+              </w:rPr>
+              <w:t>R9</w:t>
+            </w:r>
+          </w:p>
+        </w:tc>
+        <w:tc>
+          <w:tcPr>
+            <w:tcW w:type="dxa" w:w="1701"/>
+          </w:tcPr>
+          <w:p>
+            <w:r/>
+            <w:r>
+              <w:rPr>
+                <w:sz w:val="18"/>
+              </w:rPr>
+              <w:t>Ergonómico</w:t>
+            </w:r>
+          </w:p>
+        </w:tc>
+        <w:tc>
+          <w:tcPr>
+            <w:tcW w:type="dxa" w:w="5386"/>
+          </w:tcPr>
+          <w:p>
+            <w:r/>
+            <w:r>
+              <w:rPr>
+                <w:sz w:val="18"/>
+              </w:rPr>
+              <w:t>Abrirse y cerrarse con una mano y sin riesgo de pillarse los dedos</w:t>
+            </w:r>
+          </w:p>
+        </w:tc>
+        <w:tc>
+          <w:tcPr>
+            <w:tcW w:type="dxa" w:w="794"/>
+          </w:tcPr>
+          <w:p>
+            <w:r/>
+            <w:r>
+              <w:rPr>
+                <w:sz w:val="18"/>
+              </w:rPr>
+              <w:t>I</w:t>
+            </w:r>
+          </w:p>
+        </w:tc>
+      </w:tr>
+      <w:tr>
+        <w:tc>
+          <w:tcPr>
+            <w:tcW w:type="dxa" w:w="850"/>
+          </w:tcPr>
+          <w:p>
+            <w:r/>
+            <w:r>
+              <w:rPr>
+                <w:sz w:val="18"/>
+              </w:rPr>
+              <w:t>R10</w:t>
+            </w:r>
+          </w:p>
+        </w:tc>
+        <w:tc>
+          <w:tcPr>
+            <w:tcW w:type="dxa" w:w="1701"/>
+          </w:tcPr>
+          <w:p>
+            <w:r/>
+            <w:r>
+              <w:rPr>
+                <w:sz w:val="18"/>
+              </w:rPr>
+              <w:t>Ergonómico</w:t>
+            </w:r>
+          </w:p>
+        </w:tc>
+        <w:tc>
+          <w:tcPr>
+            <w:tcW w:type="dxa" w:w="5386"/>
+          </w:tcPr>
+          <w:p>
+            <w:r/>
+            <w:r>
+              <w:rPr>
+                <w:sz w:val="18"/>
+              </w:rPr>
+              <w:t>Ser ligero para poder llevarlo con una mano</w:t>
+            </w:r>
+          </w:p>
+        </w:tc>
+        <w:tc>
+          <w:tcPr>
+            <w:tcW w:type="dxa" w:w="794"/>
+          </w:tcPr>
+          <w:p>
+            <w:r/>
+            <w:r>
+              <w:rPr>
+                <w:sz w:val="18"/>
+              </w:rPr>
+              <w:t>I</w:t>
+            </w:r>
+          </w:p>
+        </w:tc>
+      </w:tr>
+      <w:tr>
+        <w:tc>
+          <w:tcPr>
+            <w:tcW w:type="dxa" w:w="850"/>
+          </w:tcPr>
+          <w:p>
+            <w:r/>
+            <w:r>
+              <w:rPr>
+                <w:sz w:val="18"/>
+              </w:rPr>
+              <w:t>R11</w:t>
+            </w:r>
+          </w:p>
+        </w:tc>
+        <w:tc>
+          <w:tcPr>
+            <w:tcW w:type="dxa" w:w="1701"/>
+          </w:tcPr>
+          <w:p>
+            <w:r/>
+            <w:r>
+              <w:rPr>
+                <w:sz w:val="18"/>
+              </w:rPr>
+              <w:t>Ergonómico</w:t>
+            </w:r>
+          </w:p>
+        </w:tc>
+        <w:tc>
+          <w:tcPr>
+            <w:tcW w:type="dxa" w:w="5386"/>
+          </w:tcPr>
+          <w:p>
+            <w:r/>
+            <w:r>
+              <w:rPr>
+                <w:sz w:val="18"/>
+              </w:rPr>
+              <w:t>Disponer de un punto de agarre al subir</w:t>
+            </w:r>
+          </w:p>
+        </w:tc>
+        <w:tc>
+          <w:tcPr>
+            <w:tcW w:type="dxa" w:w="794"/>
+          </w:tcPr>
+          <w:p>
+            <w:r/>
+            <w:r>
+              <w:rPr>
+                <w:sz w:val="18"/>
+              </w:rPr>
+              <w:t>D</w:t>
+            </w:r>
+          </w:p>
+        </w:tc>
+      </w:tr>
+      <w:tr>
+        <w:tc>
+          <w:tcPr>
+            <w:tcW w:type="dxa" w:w="850"/>
+          </w:tcPr>
+          <w:p>
+            <w:r/>
+            <w:r>
+              <w:rPr>
+                <w:sz w:val="18"/>
+              </w:rPr>
+              <w:t>R12</w:t>
+            </w:r>
+          </w:p>
+        </w:tc>
+        <w:tc>
+          <w:tcPr>
+            <w:tcW w:type="dxa" w:w="1701"/>
+          </w:tcPr>
+          <w:p>
+            <w:r/>
+            <w:r>
+              <w:rPr>
+                <w:sz w:val="18"/>
+              </w:rPr>
+              <w:t>De uso</w:t>
+            </w:r>
+          </w:p>
+        </w:tc>
+        <w:tc>
+          <w:tcPr>
+            <w:tcW w:type="dxa" w:w="5386"/>
+          </w:tcPr>
+          <w:p>
+            <w:r/>
+            <w:r>
+              <w:rPr>
+                <w:sz w:val="18"/>
+              </w:rPr>
+              <w:t>Ocupar poco espacio una vez plegado</w:t>
+            </w:r>
+          </w:p>
+        </w:tc>
+        <w:tc>
+          <w:tcPr>
+            <w:tcW w:type="dxa" w:w="794"/>
+          </w:tcPr>
+          <w:p>
+            <w:r/>
+            <w:r>
+              <w:rPr>
+                <w:sz w:val="18"/>
+              </w:rPr>
+              <w:t>I</w:t>
+            </w:r>
+          </w:p>
+        </w:tc>
+      </w:tr>
+      <w:tr>
+        <w:tc>
+          <w:tcPr>
+            <w:tcW w:type="dxa" w:w="850"/>
+          </w:tcPr>
+          <w:p>
+            <w:r/>
+            <w:r>
+              <w:rPr>
+                <w:sz w:val="18"/>
+              </w:rPr>
+              <w:t>R13</w:t>
+            </w:r>
+          </w:p>
+        </w:tc>
+        <w:tc>
+          <w:tcPr>
+            <w:tcW w:type="dxa" w:w="1701"/>
+          </w:tcPr>
+          <w:p>
+            <w:r/>
+            <w:r>
+              <w:rPr>
+                <w:sz w:val="18"/>
+              </w:rPr>
+              <w:t>De uso</w:t>
+            </w:r>
+          </w:p>
+        </w:tc>
+        <w:tc>
+          <w:tcPr>
+            <w:tcW w:type="dxa" w:w="5386"/>
+          </w:tcPr>
+          <w:p>
+            <w:r/>
+            <w:r>
+              <w:rPr>
+                <w:sz w:val="18"/>
+              </w:rPr>
+              <w:t>No marcar el suelo ni hacer ruido</w:t>
+            </w:r>
+          </w:p>
+        </w:tc>
+        <w:tc>
+          <w:tcPr>
+            <w:tcW w:type="dxa" w:w="794"/>
+          </w:tcPr>
+          <w:p>
+            <w:r/>
+            <w:r>
+              <w:rPr>
+                <w:sz w:val="18"/>
+              </w:rPr>
+              <w:t>I</w:t>
+            </w:r>
+          </w:p>
+        </w:tc>
+      </w:tr>
+      <w:tr>
+        <w:tc>
+          <w:tcPr>
+            <w:tcW w:type="dxa" w:w="850"/>
+          </w:tcPr>
+          <w:p>
+            <w:r/>
+            <w:r>
+              <w:rPr>
+                <w:sz w:val="18"/>
+              </w:rPr>
+              <w:t>R14</w:t>
+            </w:r>
+          </w:p>
+        </w:tc>
+        <w:tc>
+          <w:tcPr>
+            <w:tcW w:type="dxa" w:w="1701"/>
+          </w:tcPr>
+          <w:p>
+            <w:r/>
+            <w:r>
+              <w:rPr>
+                <w:sz w:val="18"/>
+              </w:rPr>
+              <w:t>De uso</w:t>
+            </w:r>
+          </w:p>
+        </w:tc>
+        <w:tc>
+          <w:tcPr>
+            <w:tcW w:type="dxa" w:w="5386"/>
+          </w:tcPr>
+          <w:p>
+            <w:r/>
+            <w:r>
+              <w:rPr>
+                <w:sz w:val="18"/>
+              </w:rPr>
+              <w:t>No necesitar mantenimiento</w:t>
+            </w:r>
+          </w:p>
+        </w:tc>
+        <w:tc>
+          <w:tcPr>
+            <w:tcW w:type="dxa" w:w="794"/>
+          </w:tcPr>
+          <w:p>
+            <w:r/>
+            <w:r>
+              <w:rPr>
+                <w:sz w:val="18"/>
+              </w:rPr>
+              <w:t>D</w:t>
+            </w:r>
+          </w:p>
+        </w:tc>
+      </w:tr>
+      <w:tr>
+        <w:tc>
+          <w:tcPr>
+            <w:tcW w:type="dxa" w:w="850"/>
+          </w:tcPr>
+          <w:p>
+            <w:r/>
+            <w:r>
+              <w:rPr>
+                <w:sz w:val="18"/>
+              </w:rPr>
+              <w:t>R15</w:t>
+            </w:r>
+          </w:p>
+        </w:tc>
+        <w:tc>
+          <w:tcPr>
+            <w:tcW w:type="dxa" w:w="1701"/>
+          </w:tcPr>
+          <w:p>
+            <w:r/>
+            <w:r>
+              <w:rPr>
+                <w:sz w:val="18"/>
+              </w:rPr>
+              <w:t>De uso</w:t>
+            </w:r>
+          </w:p>
+        </w:tc>
+        <w:tc>
+          <w:tcPr>
+            <w:tcW w:type="dxa" w:w="5386"/>
+          </w:tcPr>
+          <w:p>
+            <w:r/>
+            <w:r>
+              <w:rPr>
+                <w:sz w:val="18"/>
+              </w:rPr>
+              <w:t>Piezas de desgaste (tacos, recubrimientos) sustituibles</w:t>
+            </w:r>
+          </w:p>
+        </w:tc>
+        <w:tc>
+          <w:tcPr>
+            <w:tcW w:type="dxa" w:w="794"/>
+          </w:tcPr>
+          <w:p>
+            <w:r/>
+            <w:r>
+              <w:rPr>
+                <w:sz w:val="18"/>
+              </w:rPr>
+              <w:t>D</w:t>
+            </w:r>
+          </w:p>
+        </w:tc>
+      </w:tr>
+      <w:tr>
+        <w:tc>
+          <w:tcPr>
+            <w:tcW w:type="dxa" w:w="850"/>
+          </w:tcPr>
+          <w:p>
+            <w:r/>
+            <w:r>
+              <w:rPr>
+                <w:sz w:val="18"/>
+              </w:rPr>
+              <w:t>R16</w:t>
+            </w:r>
+          </w:p>
+        </w:tc>
+        <w:tc>
+          <w:tcPr>
+            <w:tcW w:type="dxa" w:w="1701"/>
+          </w:tcPr>
+          <w:p>
+            <w:r/>
+            <w:r>
+              <w:rPr>
+                <w:sz w:val="18"/>
+              </w:rPr>
+              <w:t>Estético</w:t>
+            </w:r>
+          </w:p>
+        </w:tc>
+        <w:tc>
+          <w:tcPr>
+            <w:tcW w:type="dxa" w:w="5386"/>
+          </w:tcPr>
+          <w:p>
+            <w:r/>
+            <w:r>
+              <w:rPr>
+                <w:sz w:val="18"/>
+              </w:rPr>
+              <w:t>Transmitir robustez y seguridad</w:t>
+            </w:r>
+          </w:p>
+        </w:tc>
+        <w:tc>
+          <w:tcPr>
+            <w:tcW w:type="dxa" w:w="794"/>
+          </w:tcPr>
+          <w:p>
+            <w:r/>
+            <w:r>
+              <w:rPr>
+                <w:sz w:val="18"/>
+              </w:rPr>
+              <w:t>I</w:t>
+            </w:r>
+          </w:p>
+        </w:tc>
+      </w:tr>
+      <w:tr>
+        <w:tc>
+          <w:tcPr>
+            <w:tcW w:type="dxa" w:w="850"/>
+          </w:tcPr>
+          <w:p>
+            <w:r/>
+            <w:r>
+              <w:rPr>
+                <w:sz w:val="18"/>
+              </w:rPr>
+              <w:t>R17</w:t>
+            </w:r>
+          </w:p>
+        </w:tc>
+        <w:tc>
+          <w:tcPr>
+            <w:tcW w:type="dxa" w:w="1701"/>
+          </w:tcPr>
+          <w:p>
+            <w:r/>
+            <w:r>
+              <w:rPr>
+                <w:sz w:val="18"/>
+              </w:rPr>
+              <w:t>Estético</w:t>
+            </w:r>
+          </w:p>
+        </w:tc>
+        <w:tc>
+          <w:tcPr>
+            <w:tcW w:type="dxa" w:w="5386"/>
+          </w:tcPr>
+          <w:p>
+            <w:r/>
+            <w:r>
+              <w:rPr>
+                <w:sz w:val="18"/>
+              </w:rPr>
+              <w:t>Aspecto sencillo que no desentone en la vivienda</w:t>
+            </w:r>
+          </w:p>
+        </w:tc>
+        <w:tc>
+          <w:tcPr>
+            <w:tcW w:type="dxa" w:w="794"/>
+          </w:tcPr>
+          <w:p>
+            <w:r/>
+            <w:r>
+              <w:rPr>
+                <w:sz w:val="18"/>
+              </w:rPr>
+              <w:t>D</w:t>
+            </w:r>
+          </w:p>
+        </w:tc>
+      </w:tr>
+      <w:tr>
+        <w:tc>
+          <w:tcPr>
+            <w:tcW w:type="dxa" w:w="850"/>
+          </w:tcPr>
+          <w:p>
+            <w:r/>
+            <w:r>
+              <w:rPr>
+                <w:sz w:val="18"/>
+              </w:rPr>
+              <w:t>R18</w:t>
+            </w:r>
+          </w:p>
+        </w:tc>
+        <w:tc>
+          <w:tcPr>
+            <w:tcW w:type="dxa" w:w="1701"/>
+          </w:tcPr>
+          <w:p>
+            <w:r/>
+            <w:r>
+              <w:rPr>
+                <w:sz w:val="18"/>
+              </w:rPr>
+              <w:t>Estético</w:t>
+            </w:r>
+          </w:p>
+        </w:tc>
+        <w:tc>
+          <w:tcPr>
+            <w:tcW w:type="dxa" w:w="5386"/>
+          </w:tcPr>
+          <w:p>
+            <w:r/>
+            <w:r>
+              <w:rPr>
+                <w:sz w:val="18"/>
+              </w:rPr>
+              <w:t>Disponible en varios acabados de color</w:t>
+            </w:r>
+          </w:p>
+        </w:tc>
+        <w:tc>
+          <w:tcPr>
+            <w:tcW w:type="dxa" w:w="794"/>
+          </w:tcPr>
+          <w:p>
+            <w:r/>
+            <w:r>
+              <w:rPr>
+                <w:sz w:val="18"/>
+              </w:rPr>
+              <w:t>D</w:t>
+            </w:r>
+          </w:p>
+        </w:tc>
+      </w:tr>
+      <w:tr>
+        <w:tc>
+          <w:tcPr>
+            <w:tcW w:type="dxa" w:w="850"/>
+          </w:tcPr>
+          <w:p>
+            <w:r/>
+            <w:r>
+              <w:rPr>
+                <w:sz w:val="18"/>
+              </w:rPr>
+              <w:t>R19</w:t>
+            </w:r>
+          </w:p>
+        </w:tc>
+        <w:tc>
+          <w:tcPr>
+            <w:tcW w:type="dxa" w:w="1701"/>
+          </w:tcPr>
+          <w:p>
+            <w:r/>
+            <w:r>
+              <w:rPr>
+                <w:sz w:val="18"/>
+              </w:rPr>
+              <w:t>Medioambiental</w:t>
+            </w:r>
+          </w:p>
+        </w:tc>
+        <w:tc>
+          <w:tcPr>
+            <w:tcW w:type="dxa" w:w="5386"/>
+          </w:tcPr>
+          <w:p>
+            <w:r/>
+            <w:r>
+              <w:rPr>
+                <w:sz w:val="18"/>
+              </w:rPr>
+              <w:t>Fabricado con materiales reciclables</w:t>
+            </w:r>
+          </w:p>
+        </w:tc>
+        <w:tc>
+          <w:tcPr>
+            <w:tcW w:type="dxa" w:w="794"/>
+          </w:tcPr>
+          <w:p>
+            <w:r/>
+            <w:r>
+              <w:rPr>
+                <w:sz w:val="18"/>
+              </w:rPr>
+              <w:t>I</w:t>
+            </w:r>
+          </w:p>
+        </w:tc>
+      </w:tr>
+      <w:tr>
+        <w:tc>
+          <w:tcPr>
+            <w:tcW w:type="dxa" w:w="850"/>
+          </w:tcPr>
+          <w:p>
+            <w:r/>
+            <w:r>
+              <w:rPr>
+                <w:sz w:val="18"/>
+              </w:rPr>
+              <w:t>R20</w:t>
+            </w:r>
+          </w:p>
+        </w:tc>
+        <w:tc>
+          <w:tcPr>
+            <w:tcW w:type="dxa" w:w="1701"/>
+          </w:tcPr>
+          <w:p>
+            <w:r/>
+            <w:r>
+              <w:rPr>
+                <w:sz w:val="18"/>
+              </w:rPr>
+              <w:t>Medioambiental</w:t>
+            </w:r>
+          </w:p>
+        </w:tc>
+        <w:tc>
+          <w:tcPr>
+            <w:tcW w:type="dxa" w:w="5386"/>
+          </w:tcPr>
+          <w:p>
+            <w:r/>
+            <w:r>
+              <w:rPr>
+                <w:sz w:val="18"/>
+              </w:rPr>
+              <w:t>Larga vida útil</w:t>
+            </w:r>
+          </w:p>
+        </w:tc>
+        <w:tc>
+          <w:tcPr>
+            <w:tcW w:type="dxa" w:w="794"/>
+          </w:tcPr>
+          <w:p>
+            <w:r/>
+            <w:r>
+              <w:rPr>
+                <w:sz w:val="18"/>
+              </w:rPr>
+              <w:t>I</w:t>
+            </w:r>
+          </w:p>
+        </w:tc>
+      </w:tr>
+      <w:tr>
+        <w:tc>
+          <w:tcPr>
+            <w:tcW w:type="dxa" w:w="850"/>
+          </w:tcPr>
+          <w:p>
+            <w:r/>
+            <w:r>
+              <w:rPr>
+                <w:sz w:val="18"/>
+              </w:rPr>
+              <w:t>R21</w:t>
+            </w:r>
+          </w:p>
+        </w:tc>
+        <w:tc>
+          <w:tcPr>
+            <w:tcW w:type="dxa" w:w="1701"/>
+          </w:tcPr>
+          <w:p>
+            <w:r/>
+            <w:r>
+              <w:rPr>
+                <w:sz w:val="18"/>
+              </w:rPr>
+              <w:t>Medioambiental</w:t>
+            </w:r>
+          </w:p>
+        </w:tc>
+        <w:tc>
+          <w:tcPr>
+            <w:tcW w:type="dxa" w:w="5386"/>
+          </w:tcPr>
+          <w:p>
+            <w:r/>
+            <w:r>
+              <w:rPr>
+                <w:sz w:val="18"/>
+              </w:rPr>
+              <w:t>Fácil de desmontar para separar los materiales al final de su vida</w:t>
+            </w:r>
+          </w:p>
+        </w:tc>
+        <w:tc>
+          <w:tcPr>
+            <w:tcW w:type="dxa" w:w="794"/>
+          </w:tcPr>
+          <w:p>
+            <w:r/>
+            <w:r>
+              <w:rPr>
+                <w:sz w:val="18"/>
+              </w:rPr>
+              <w:t>D</w:t>
+            </w:r>
+          </w:p>
+        </w:tc>
+      </w:tr>
+      <w:tr>
+        <w:tc>
+          <w:tcPr>
+            <w:tcW w:type="dxa" w:w="850"/>
+          </w:tcPr>
+          <w:p>
+            <w:r/>
+            <w:r>
+              <w:rPr>
+                <w:sz w:val="18"/>
+              </w:rPr>
+              <w:t>R22</w:t>
+            </w:r>
+          </w:p>
+        </w:tc>
+        <w:tc>
+          <w:tcPr>
+            <w:tcW w:type="dxa" w:w="1701"/>
+          </w:tcPr>
+          <w:p>
+            <w:r/>
+            <w:r>
+              <w:rPr>
+                <w:sz w:val="18"/>
+              </w:rPr>
+              <w:t>Medioambiental</w:t>
+            </w:r>
+          </w:p>
+        </w:tc>
+        <w:tc>
+          <w:tcPr>
+            <w:tcW w:type="dxa" w:w="5386"/>
+          </w:tcPr>
+          <w:p>
+            <w:r/>
+            <w:r>
+              <w:rPr>
+                <w:sz w:val="18"/>
+              </w:rPr>
+              <w:t>Embalaje mínimo y reciclable</w:t>
+            </w:r>
+          </w:p>
+        </w:tc>
+        <w:tc>
+          <w:tcPr>
+            <w:tcW w:type="dxa" w:w="794"/>
+          </w:tcPr>
+          <w:p>
+            <w:r/>
+            <w:r>
+              <w:rPr>
+                <w:sz w:val="18"/>
+              </w:rPr>
+              <w:t>D</w:t>
+            </w:r>
+          </w:p>
+        </w:tc>
+      </w:tr>
+      <w:tr>
+        <w:tc>
+          <w:tcPr>
+            <w:tcW w:type="dxa" w:w="850"/>
+          </w:tcPr>
+          <w:p>
+            <w:r/>
+            <w:r>
+              <w:rPr>
+                <w:sz w:val="18"/>
+              </w:rPr>
+              <w:t>R23</w:t>
+            </w:r>
+          </w:p>
+        </w:tc>
+        <w:tc>
+          <w:tcPr>
+            <w:tcW w:type="dxa" w:w="1701"/>
+          </w:tcPr>
+          <w:p>
+            <w:r/>
+            <w:r>
+              <w:rPr>
+                <w:sz w:val="18"/>
+              </w:rPr>
+              <w:t>Económico</w:t>
+            </w:r>
+          </w:p>
+        </w:tc>
+        <w:tc>
+          <w:tcPr>
+            <w:tcW w:type="dxa" w:w="5386"/>
+          </w:tcPr>
+          <w:p>
+            <w:r/>
+            <w:r>
+              <w:rPr>
+                <w:sz w:val="18"/>
+              </w:rPr>
+              <w:t>Precio de venta competitivo</w:t>
+            </w:r>
+          </w:p>
+        </w:tc>
+        <w:tc>
+          <w:tcPr>
+            <w:tcW w:type="dxa" w:w="794"/>
+          </w:tcPr>
+          <w:p>
+            <w:r/>
+            <w:r>
+              <w:rPr>
+                <w:sz w:val="18"/>
+              </w:rPr>
+              <w:t>I</w:t>
+            </w:r>
+          </w:p>
+        </w:tc>
+      </w:tr>
+    </w:tbl>
+    <w:p>
+      <w:pPr>
+        <w:jc w:val="center"/>
+      </w:pPr>
+      <w:r>
+        <w:rPr>
+          <w:i/>
+          <w:sz w:val="18"/>
+        </w:rPr>
+        <w:t>Tabla 1. Requisitos del producto. Elaboración propia.</w:t>
+      </w:r>
+    </w:p>
+    <w:p>
+      <w:pPr>
+        <w:pStyle w:val="Heading2"/>
+      </w:pPr>
+      <w:r>
+        <w:t>1.6. PROPIEDADES, ASPECTO Y FORMA</w:t>
+      </w:r>
+    </w:p>
+    <w:p>
+      <w:pPr>
         <w:pStyle w:val="Heading3"/>
       </w:pPr>
       <w:r>
-        <w:t>Bibliografía (apartado 1.1)</w:t>
+        <w:t>1.6.1. Propiedades</w:t>
+      </w:r>
+    </w:p>
+    <w:p>
+      <w:r>
+        <w:t>Las propiedades traducen los requisitos anteriores a valores concretos y medibles, que servirán luego para comprobar si el diseño es correcto. Se dividen en pasivas (relacionadas con la estructura y los materiales) y activas (relacionadas con el movimiento y el funcionamiento). Los valores son objetivos de diseño y se revisarán cuando se complete la etapa de información (competencia, norma y EDP).</w:t>
+      </w:r>
+    </w:p>
+    <w:tbl>
+      <w:tblPr>
+        <w:tblStyle w:val="TableGrid"/>
+        <w:tblW w:type="auto" w:w="0"/>
+        <w:tblLook w:firstColumn="1" w:firstRow="1" w:lastColumn="0" w:lastRow="0" w:noHBand="0" w:noVBand="1" w:val="04A0"/>
+      </w:tblPr>
+      <w:tblGrid>
+        <w:gridCol w:w="2160"/>
+        <w:gridCol w:w="2160"/>
+        <w:gridCol w:w="2160"/>
+        <w:gridCol w:w="2160"/>
+      </w:tblGrid>
+      <w:tr>
+        <w:tc>
+          <w:tcPr>
+            <w:tcW w:type="dxa" w:w="850"/>
+            <w:shd w:val="clear" w:color="auto" w:fill="C0392B"/>
+          </w:tcPr>
+          <w:p>
+            <w:r/>
+            <w:r>
+              <w:rPr>
+                <w:b/>
+                <w:color w:val="FFFFFF"/>
+                <w:sz w:val="19"/>
+              </w:rPr>
+              <w:t>Código</w:t>
+            </w:r>
+          </w:p>
+        </w:tc>
+        <w:tc>
+          <w:tcPr>
+            <w:tcW w:type="dxa" w:w="1134"/>
+            <w:shd w:val="clear" w:color="auto" w:fill="C0392B"/>
+          </w:tcPr>
+          <w:p>
+            <w:r/>
+            <w:r>
+              <w:rPr>
+                <w:b/>
+                <w:color w:val="FFFFFF"/>
+                <w:sz w:val="19"/>
+              </w:rPr>
+              <w:t>Requisito</w:t>
+            </w:r>
+          </w:p>
+        </w:tc>
+        <w:tc>
+          <w:tcPr>
+            <w:tcW w:type="dxa" w:w="5669"/>
+            <w:shd w:val="clear" w:color="auto" w:fill="C0392B"/>
+          </w:tcPr>
+          <w:p>
+            <w:r/>
+            <w:r>
+              <w:rPr>
+                <w:b/>
+                <w:color w:val="FFFFFF"/>
+                <w:sz w:val="19"/>
+              </w:rPr>
+              <w:t>Propiedad (valor objetivo)</w:t>
+            </w:r>
+          </w:p>
+        </w:tc>
+        <w:tc>
+          <w:tcPr>
+            <w:tcW w:type="dxa" w:w="1077"/>
+            <w:shd w:val="clear" w:color="auto" w:fill="C0392B"/>
+          </w:tcPr>
+          <w:p>
+            <w:r/>
+            <w:r>
+              <w:rPr>
+                <w:b/>
+                <w:color w:val="FFFFFF"/>
+                <w:sz w:val="19"/>
+              </w:rPr>
+              <w:t>Tipo</w:t>
+            </w:r>
+          </w:p>
+        </w:tc>
+      </w:tr>
+      <w:tr>
+        <w:tc>
+          <w:tcPr>
+            <w:tcW w:type="dxa" w:w="850"/>
+          </w:tcPr>
+          <w:p>
+            <w:r/>
+            <w:r>
+              <w:rPr>
+                <w:sz w:val="18"/>
+              </w:rPr>
+              <w:t>P1</w:t>
+            </w:r>
+          </w:p>
+        </w:tc>
+        <w:tc>
+          <w:tcPr>
+            <w:tcW w:type="dxa" w:w="1134"/>
+          </w:tcPr>
+          <w:p>
+            <w:r/>
+            <w:r>
+              <w:rPr>
+                <w:sz w:val="18"/>
+              </w:rPr>
+              <w:t>R1</w:t>
+            </w:r>
+          </w:p>
+        </w:tc>
+        <w:tc>
+          <w:tcPr>
+            <w:tcW w:type="dxa" w:w="5669"/>
+          </w:tcPr>
+          <w:p>
+            <w:r/>
+            <w:r>
+              <w:rPr>
+                <w:sz w:val="18"/>
+              </w:rPr>
+              <w:t>Carga máxima de uso: 150 kg, sin deformación permanente en el ensayo de resistencia de la norma</w:t>
+            </w:r>
+          </w:p>
+        </w:tc>
+        <w:tc>
+          <w:tcPr>
+            <w:tcW w:type="dxa" w:w="1077"/>
+          </w:tcPr>
+          <w:p>
+            <w:r/>
+            <w:r>
+              <w:rPr>
+                <w:sz w:val="18"/>
+              </w:rPr>
+              <w:t>Pasiva</w:t>
+            </w:r>
+          </w:p>
+        </w:tc>
+      </w:tr>
+      <w:tr>
+        <w:tc>
+          <w:tcPr>
+            <w:tcW w:type="dxa" w:w="850"/>
+          </w:tcPr>
+          <w:p>
+            <w:r/>
+            <w:r>
+              <w:rPr>
+                <w:sz w:val="18"/>
+              </w:rPr>
+              <w:t>P2</w:t>
+            </w:r>
+          </w:p>
+        </w:tc>
+        <w:tc>
+          <w:tcPr>
+            <w:tcW w:type="dxa" w:w="1134"/>
+          </w:tcPr>
+          <w:p>
+            <w:r/>
+            <w:r>
+              <w:rPr>
+                <w:sz w:val="18"/>
+              </w:rPr>
+              <w:t>R2, R5</w:t>
+            </w:r>
+          </w:p>
+        </w:tc>
+        <w:tc>
+          <w:tcPr>
+            <w:tcW w:type="dxa" w:w="5669"/>
+          </w:tcPr>
+          <w:p>
+            <w:r/>
+            <w:r>
+              <w:rPr>
+                <w:sz w:val="18"/>
+              </w:rPr>
+              <w:t>Superar el ensayo de estabilidad de la UNE-EN 14183; base de apoyo más ancha que la plataforma</w:t>
+            </w:r>
+          </w:p>
+        </w:tc>
+        <w:tc>
+          <w:tcPr>
+            <w:tcW w:type="dxa" w:w="1077"/>
+          </w:tcPr>
+          <w:p>
+            <w:r/>
+            <w:r>
+              <w:rPr>
+                <w:sz w:val="18"/>
+              </w:rPr>
+              <w:t>Pasiva</w:t>
+            </w:r>
+          </w:p>
+        </w:tc>
+      </w:tr>
+      <w:tr>
+        <w:tc>
+          <w:tcPr>
+            <w:tcW w:type="dxa" w:w="850"/>
+          </w:tcPr>
+          <w:p>
+            <w:r/>
+            <w:r>
+              <w:rPr>
+                <w:sz w:val="18"/>
+              </w:rPr>
+              <w:t>P3</w:t>
+            </w:r>
+          </w:p>
+        </w:tc>
+        <w:tc>
+          <w:tcPr>
+            <w:tcW w:type="dxa" w:w="1134"/>
+          </w:tcPr>
+          <w:p>
+            <w:r/>
+            <w:r>
+              <w:rPr>
+                <w:sz w:val="18"/>
+              </w:rPr>
+              <w:t>R6, R8</w:t>
+            </w:r>
+          </w:p>
+        </w:tc>
+        <w:tc>
+          <w:tcPr>
+            <w:tcW w:type="dxa" w:w="5669"/>
+          </w:tcPr>
+          <w:p>
+            <w:r/>
+            <w:r>
+              <w:rPr>
+                <w:sz w:val="18"/>
+              </w:rPr>
+              <w:t>Altura de la plataforma superior: 0,48 m, con dos peldaños separados unos 0,24 m</w:t>
+            </w:r>
+          </w:p>
+        </w:tc>
+        <w:tc>
+          <w:tcPr>
+            <w:tcW w:type="dxa" w:w="1077"/>
+          </w:tcPr>
+          <w:p>
+            <w:r/>
+            <w:r>
+              <w:rPr>
+                <w:sz w:val="18"/>
+              </w:rPr>
+              <w:t>Pasiva</w:t>
+            </w:r>
+          </w:p>
+        </w:tc>
+      </w:tr>
+      <w:tr>
+        <w:tc>
+          <w:tcPr>
+            <w:tcW w:type="dxa" w:w="850"/>
+          </w:tcPr>
+          <w:p>
+            <w:r/>
+            <w:r>
+              <w:rPr>
+                <w:sz w:val="18"/>
+              </w:rPr>
+              <w:t>P4</w:t>
+            </w:r>
+          </w:p>
+        </w:tc>
+        <w:tc>
+          <w:tcPr>
+            <w:tcW w:type="dxa" w:w="1134"/>
+          </w:tcPr>
+          <w:p>
+            <w:r/>
+            <w:r>
+              <w:rPr>
+                <w:sz w:val="18"/>
+              </w:rPr>
+              <w:t>R7</w:t>
+            </w:r>
+          </w:p>
+        </w:tc>
+        <w:tc>
+          <w:tcPr>
+            <w:tcW w:type="dxa" w:w="5669"/>
+          </w:tcPr>
+          <w:p>
+            <w:r/>
+            <w:r>
+              <w:rPr>
+                <w:sz w:val="18"/>
+              </w:rPr>
+              <w:t>Profundidad de peldaño ≥ 200 mm y anchura ≥ 350 mm</w:t>
+            </w:r>
+          </w:p>
+        </w:tc>
+        <w:tc>
+          <w:tcPr>
+            <w:tcW w:type="dxa" w:w="1077"/>
+          </w:tcPr>
+          <w:p>
+            <w:r/>
+            <w:r>
+              <w:rPr>
+                <w:sz w:val="18"/>
+              </w:rPr>
+              <w:t>Pasiva</w:t>
+            </w:r>
+          </w:p>
+        </w:tc>
+      </w:tr>
+      <w:tr>
+        <w:tc>
+          <w:tcPr>
+            <w:tcW w:type="dxa" w:w="850"/>
+          </w:tcPr>
+          <w:p>
+            <w:r/>
+            <w:r>
+              <w:rPr>
+                <w:sz w:val="18"/>
+              </w:rPr>
+              <w:t>P5</w:t>
+            </w:r>
+          </w:p>
+        </w:tc>
+        <w:tc>
+          <w:tcPr>
+            <w:tcW w:type="dxa" w:w="1134"/>
+          </w:tcPr>
+          <w:p>
+            <w:r/>
+            <w:r>
+              <w:rPr>
+                <w:sz w:val="18"/>
+              </w:rPr>
+              <w:t>R10</w:t>
+            </w:r>
+          </w:p>
+        </w:tc>
+        <w:tc>
+          <w:tcPr>
+            <w:tcW w:type="dxa" w:w="5669"/>
+          </w:tcPr>
+          <w:p>
+            <w:r/>
+            <w:r>
+              <w:rPr>
+                <w:sz w:val="18"/>
+              </w:rPr>
+              <w:t>Peso total ≤ 5 kg</w:t>
+            </w:r>
+          </w:p>
+        </w:tc>
+        <w:tc>
+          <w:tcPr>
+            <w:tcW w:type="dxa" w:w="1077"/>
+          </w:tcPr>
+          <w:p>
+            <w:r/>
+            <w:r>
+              <w:rPr>
+                <w:sz w:val="18"/>
+              </w:rPr>
+              <w:t>Pasiva</w:t>
+            </w:r>
+          </w:p>
+        </w:tc>
+      </w:tr>
+      <w:tr>
+        <w:tc>
+          <w:tcPr>
+            <w:tcW w:type="dxa" w:w="850"/>
+          </w:tcPr>
+          <w:p>
+            <w:r/>
+            <w:r>
+              <w:rPr>
+                <w:sz w:val="18"/>
+              </w:rPr>
+              <w:t>P6</w:t>
+            </w:r>
+          </w:p>
+        </w:tc>
+        <w:tc>
+          <w:tcPr>
+            <w:tcW w:type="dxa" w:w="1134"/>
+          </w:tcPr>
+          <w:p>
+            <w:r/>
+            <w:r>
+              <w:rPr>
+                <w:sz w:val="18"/>
+              </w:rPr>
+              <w:t>R12</w:t>
+            </w:r>
+          </w:p>
+        </w:tc>
+        <w:tc>
+          <w:tcPr>
+            <w:tcW w:type="dxa" w:w="5669"/>
+          </w:tcPr>
+          <w:p>
+            <w:r/>
+            <w:r>
+              <w:rPr>
+                <w:sz w:val="18"/>
+              </w:rPr>
+              <w:t>Espesor plegado ≤ 80 mm</w:t>
+            </w:r>
+          </w:p>
+        </w:tc>
+        <w:tc>
+          <w:tcPr>
+            <w:tcW w:type="dxa" w:w="1077"/>
+          </w:tcPr>
+          <w:p>
+            <w:r/>
+            <w:r>
+              <w:rPr>
+                <w:sz w:val="18"/>
+              </w:rPr>
+              <w:t>Pasiva</w:t>
+            </w:r>
+          </w:p>
+        </w:tc>
+      </w:tr>
+      <w:tr>
+        <w:tc>
+          <w:tcPr>
+            <w:tcW w:type="dxa" w:w="850"/>
+          </w:tcPr>
+          <w:p>
+            <w:r/>
+            <w:r>
+              <w:rPr>
+                <w:sz w:val="18"/>
+              </w:rPr>
+              <w:t>P7</w:t>
+            </w:r>
+          </w:p>
+        </w:tc>
+        <w:tc>
+          <w:tcPr>
+            <w:tcW w:type="dxa" w:w="1134"/>
+          </w:tcPr>
+          <w:p>
+            <w:r/>
+            <w:r>
+              <w:rPr>
+                <w:sz w:val="18"/>
+              </w:rPr>
+              <w:t>R3, R9</w:t>
+            </w:r>
+          </w:p>
+        </w:tc>
+        <w:tc>
+          <w:tcPr>
+            <w:tcW w:type="dxa" w:w="5669"/>
+          </w:tcPr>
+          <w:p>
+            <w:r/>
+            <w:r>
+              <w:rPr>
+                <w:sz w:val="18"/>
+              </w:rPr>
+              <w:t>Apertura y cierre en ≤ 3 s con una mano, con bloqueo automático en posición de uso</w:t>
+            </w:r>
+          </w:p>
+        </w:tc>
+        <w:tc>
+          <w:tcPr>
+            <w:tcW w:type="dxa" w:w="1077"/>
+          </w:tcPr>
+          <w:p>
+            <w:r/>
+            <w:r>
+              <w:rPr>
+                <w:sz w:val="18"/>
+              </w:rPr>
+              <w:t>Activa</w:t>
+            </w:r>
+          </w:p>
+        </w:tc>
+      </w:tr>
+      <w:tr>
+        <w:tc>
+          <w:tcPr>
+            <w:tcW w:type="dxa" w:w="850"/>
+          </w:tcPr>
+          <w:p>
+            <w:r/>
+            <w:r>
+              <w:rPr>
+                <w:sz w:val="18"/>
+              </w:rPr>
+              <w:t>P8</w:t>
+            </w:r>
+          </w:p>
+        </w:tc>
+        <w:tc>
+          <w:tcPr>
+            <w:tcW w:type="dxa" w:w="1134"/>
+          </w:tcPr>
+          <w:p>
+            <w:r/>
+            <w:r>
+              <w:rPr>
+                <w:sz w:val="18"/>
+              </w:rPr>
+              <w:t>R9</w:t>
+            </w:r>
+          </w:p>
+        </w:tc>
+        <w:tc>
+          <w:tcPr>
+            <w:tcW w:type="dxa" w:w="5669"/>
+          </w:tcPr>
+          <w:p>
+            <w:r/>
+            <w:r>
+              <w:rPr>
+                <w:sz w:val="18"/>
+              </w:rPr>
+              <w:t>Holguras en zonas móviles &lt; 8 mm o &gt; 25 mm, para evitar atrapamientos</w:t>
+            </w:r>
+          </w:p>
+        </w:tc>
+        <w:tc>
+          <w:tcPr>
+            <w:tcW w:type="dxa" w:w="1077"/>
+          </w:tcPr>
+          <w:p>
+            <w:r/>
+            <w:r>
+              <w:rPr>
+                <w:sz w:val="18"/>
+              </w:rPr>
+              <w:t>Activa</w:t>
+            </w:r>
+          </w:p>
+        </w:tc>
+      </w:tr>
+      <w:tr>
+        <w:tc>
+          <w:tcPr>
+            <w:tcW w:type="dxa" w:w="850"/>
+          </w:tcPr>
+          <w:p>
+            <w:r/>
+            <w:r>
+              <w:rPr>
+                <w:sz w:val="18"/>
+              </w:rPr>
+              <w:t>P9</w:t>
+            </w:r>
+          </w:p>
+        </w:tc>
+        <w:tc>
+          <w:tcPr>
+            <w:tcW w:type="dxa" w:w="1134"/>
+          </w:tcPr>
+          <w:p>
+            <w:r/>
+            <w:r>
+              <w:rPr>
+                <w:sz w:val="18"/>
+              </w:rPr>
+              <w:t>R4, R13</w:t>
+            </w:r>
+          </w:p>
+        </w:tc>
+        <w:tc>
+          <w:tcPr>
+            <w:tcW w:type="dxa" w:w="5669"/>
+          </w:tcPr>
+          <w:p>
+            <w:r/>
+            <w:r>
+              <w:rPr>
+                <w:sz w:val="18"/>
+              </w:rPr>
+              <w:t>Tacos de apoyo de elastómero no marcante y superficie de peldaño antideslizante</w:t>
+            </w:r>
+          </w:p>
+        </w:tc>
+        <w:tc>
+          <w:tcPr>
+            <w:tcW w:type="dxa" w:w="1077"/>
+          </w:tcPr>
+          <w:p>
+            <w:r/>
+            <w:r>
+              <w:rPr>
+                <w:sz w:val="18"/>
+              </w:rPr>
+              <w:t>Pasiva</w:t>
+            </w:r>
+          </w:p>
+        </w:tc>
+      </w:tr>
+      <w:tr>
+        <w:tc>
+          <w:tcPr>
+            <w:tcW w:type="dxa" w:w="850"/>
+          </w:tcPr>
+          <w:p>
+            <w:r/>
+            <w:r>
+              <w:rPr>
+                <w:sz w:val="18"/>
+              </w:rPr>
+              <w:t>P10</w:t>
+            </w:r>
+          </w:p>
+        </w:tc>
+        <w:tc>
+          <w:tcPr>
+            <w:tcW w:type="dxa" w:w="1134"/>
+          </w:tcPr>
+          <w:p>
+            <w:r/>
+            <w:r>
+              <w:rPr>
+                <w:sz w:val="18"/>
+              </w:rPr>
+              <w:t>R19, R21</w:t>
+            </w:r>
+          </w:p>
+        </w:tc>
+        <w:tc>
+          <w:tcPr>
+            <w:tcW w:type="dxa" w:w="5669"/>
+          </w:tcPr>
+          <w:p>
+            <w:r/>
+            <w:r>
+              <w:rPr>
+                <w:sz w:val="18"/>
+              </w:rPr>
+              <w:t>≥ 90 % del peso en materiales reciclables; piezas de un solo material, unidas de forma desmontable</w:t>
+            </w:r>
+          </w:p>
+        </w:tc>
+        <w:tc>
+          <w:tcPr>
+            <w:tcW w:type="dxa" w:w="1077"/>
+          </w:tcPr>
+          <w:p>
+            <w:r/>
+            <w:r>
+              <w:rPr>
+                <w:sz w:val="18"/>
+              </w:rPr>
+              <w:t>Pasiva</w:t>
+            </w:r>
+          </w:p>
+        </w:tc>
+      </w:tr>
+      <w:tr>
+        <w:tc>
+          <w:tcPr>
+            <w:tcW w:type="dxa" w:w="850"/>
+          </w:tcPr>
+          <w:p>
+            <w:r/>
+            <w:r>
+              <w:rPr>
+                <w:sz w:val="18"/>
+              </w:rPr>
+              <w:t>P11</w:t>
+            </w:r>
+          </w:p>
+        </w:tc>
+        <w:tc>
+          <w:tcPr>
+            <w:tcW w:type="dxa" w:w="1134"/>
+          </w:tcPr>
+          <w:p>
+            <w:r/>
+            <w:r>
+              <w:rPr>
+                <w:sz w:val="18"/>
+              </w:rPr>
+              <w:t>R20</w:t>
+            </w:r>
+          </w:p>
+        </w:tc>
+        <w:tc>
+          <w:tcPr>
+            <w:tcW w:type="dxa" w:w="5669"/>
+          </w:tcPr>
+          <w:p>
+            <w:r/>
+            <w:r>
+              <w:rPr>
+                <w:sz w:val="18"/>
+              </w:rPr>
+              <w:t>Vida útil ≥ 10 años en uso doméstico</w:t>
+            </w:r>
+          </w:p>
+        </w:tc>
+        <w:tc>
+          <w:tcPr>
+            <w:tcW w:type="dxa" w:w="1077"/>
+          </w:tcPr>
+          <w:p>
+            <w:r/>
+            <w:r>
+              <w:rPr>
+                <w:sz w:val="18"/>
+              </w:rPr>
+              <w:t>Pasiva</w:t>
+            </w:r>
+          </w:p>
+        </w:tc>
+      </w:tr>
+      <w:tr>
+        <w:tc>
+          <w:tcPr>
+            <w:tcW w:type="dxa" w:w="850"/>
+          </w:tcPr>
+          <w:p>
+            <w:r/>
+            <w:r>
+              <w:rPr>
+                <w:sz w:val="18"/>
+              </w:rPr>
+              <w:t>P12</w:t>
+            </w:r>
+          </w:p>
+        </w:tc>
+        <w:tc>
+          <w:tcPr>
+            <w:tcW w:type="dxa" w:w="1134"/>
+          </w:tcPr>
+          <w:p>
+            <w:r/>
+            <w:r>
+              <w:rPr>
+                <w:sz w:val="18"/>
+              </w:rPr>
+              <w:t>R23</w:t>
+            </w:r>
+          </w:p>
+        </w:tc>
+        <w:tc>
+          <w:tcPr>
+            <w:tcW w:type="dxa" w:w="5669"/>
+          </w:tcPr>
+          <w:p>
+            <w:r/>
+            <w:r>
+              <w:rPr>
+                <w:sz w:val="18"/>
+              </w:rPr>
+              <w:t>Precio de venta objetivo ≤ 45 € (a contrastar en el estudio de mercado)</w:t>
+            </w:r>
+          </w:p>
+        </w:tc>
+        <w:tc>
+          <w:tcPr>
+            <w:tcW w:type="dxa" w:w="1077"/>
+          </w:tcPr>
+          <w:p>
+            <w:r/>
+            <w:r>
+              <w:rPr>
+                <w:sz w:val="18"/>
+              </w:rPr>
+              <w:t>—</w:t>
+            </w:r>
+          </w:p>
+        </w:tc>
+      </w:tr>
+    </w:tbl>
+    <w:p>
+      <w:pPr>
+        <w:jc w:val="center"/>
+      </w:pPr>
+      <w:r>
+        <w:rPr>
+          <w:i/>
+          <w:sz w:val="18"/>
+        </w:rPr>
+        <w:t>Tabla 2. Propiedades del producto y requisito del que derivan. Elaboración propia.</w:t>
+      </w:r>
+    </w:p>
+    <w:p>
+      <w:pPr>
+        <w:pStyle w:val="Heading3"/>
+      </w:pPr>
+      <w:r>
+        <w:t>1.6.2. Aspecto</w:t>
+      </w:r>
+    </w:p>
+    <w:p>
+      <w:r>
+        <w:t>El aspecto buscado es sencillo y actual, con líneas limpias y colores neutros (blanco, gris antracita o acabado madera), para que el taburete no desentone si se queda a la vista en la cocina o en el salón. Al mismo tiempo tiene que transmitir robustez: el usuario debe percibir, antes de subirse, que el producto es firme y que está bien bloqueado. Las indicaciones de uso y la carga máxima deben verse con claridad pero sin recargar el diseño.</w:t>
+      </w:r>
+    </w:p>
+    <w:p>
+      <w:pPr>
+        <w:pStyle w:val="Heading3"/>
+      </w:pPr>
+      <w:r>
+        <w:t>1.6.3. Forma</w:t>
+      </w:r>
+    </w:p>
+    <w:p>
+      <w:r>
+        <w:t>La forma tiene que estar supeditada a la función. En posición de uso, el taburete debe tener una base de apoyo más amplia que la parte superior, para que el centro de gravedad del usuario quede siempre dentro de la base y se evite el vuelco. Una vez plegado, debe quedar prácticamente plano para poder guardarse en huecos estrechos. Además, no debe tener aristas vivas ni salientes, y debe contar con una zona que permita cogerlo cómodamente con una mano para transportarlo.</w:t>
+      </w:r>
+    </w:p>
+    <w:p>
+      <w:pPr>
+        <w:pStyle w:val="Heading2"/>
+      </w:pPr>
+      <w:r>
+        <w:t>Bibliografía</w:t>
       </w:r>
     </w:p>
     <w:p>
@@ -285,6 +2908,14 @@
       </w:pPr>
       <w:r>
         <w:t>INSHT. Datos antropométricos de la población laboral española. 1999.</w:t>
+      </w:r>
+    </w:p>
+    <w:p>
+      <w:pPr>
+        <w:pStyle w:val="ListNumber"/>
+      </w:pPr>
+      <w:r>
+        <w:t>AENOR. UNE-EN 14183: Taburetes-escalera.</w:t>
       </w:r>
     </w:p>
     <w:sectPr>

</xml_diff>

<commit_message>
Verificar datos pendientes: reivindicaciones y dibujos de patentes, antropometría INSHT, celda TRIZ 33/27 y legislación; corregir tablas y numeración de ilustraciones
Co-Authored-By: Claude Opus 5.5 <noreply@anthropic.com>
Claude-Session: https://claude.ai/code/session_01GULK22xqK1fWX4r8uc4cx1
</commit_message>
<xml_diff>
--- a/trabajo/Trabajo_Taburete.docx
+++ b/trabajo/Trabajo_Taburete.docx
@@ -33,10 +33,7 @@
     </w:p>
     <w:p>
       <w:r>
-        <w:rPr>
-          <w:highlight w:val="yellow"/>
-        </w:rPr>
-        <w:t>El problema es que estas alturas no están al alcance de todo el mundo. Si tomamos como referencia el percentil 5 de la población femenina española (estatura de unos 1,50 m), el alcance vertical máximo de pie ronda los 1,85 m, por lo que la balda superior de un mueble alto y todo el altillo quedan fuera de su alcance (Ilustración 1). Incluso para un hombre de estatura media el altillo sigue siendo inaccesible sin ayuda.</w:t>
+        <w:t>El problema es que estas alturas no están al alcance de todo el mundo. Si tomamos como referencia el percentil 5 de la población femenina española, con una estatura de 1,49 m según los datos antropométricos del INSHT, y teniendo en cuenta que el alcance vertical máximo de pie es aproximadamente 1,24 veces la estatura, este alcance ronda los 1,85 m. Por tanto, la balda superior de un mueble alto y todo el altillo quedan fuera de su alcance (Ilustración 1). Incluso un hombre de estatura media (1,70 m, con un alcance de unos 2,11 m) no puede llegar al altillo sin ayuda.</w:t>
       </w:r>
     </w:p>
     <w:p>
@@ -609,14 +606,15 @@
     <w:tbl>
       <w:tblPr>
         <w:tblStyle w:val="TableGrid"/>
-        <w:tblW w:type="auto" w:w="0"/>
+        <w:tblW w:type="dxa" w:w="9070"/>
         <w:tblLook w:firstColumn="1" w:firstRow="1" w:lastColumn="0" w:lastRow="0" w:noHBand="0" w:noVBand="1" w:val="04A0"/>
+        <w:tblLayout w:type="fixed"/>
       </w:tblPr>
       <w:tblGrid>
-        <w:gridCol w:w="2160"/>
-        <w:gridCol w:w="2160"/>
-        <w:gridCol w:w="2160"/>
-        <w:gridCol w:w="2160"/>
+        <w:gridCol w:w="850"/>
+        <w:gridCol w:w="1700"/>
+        <w:gridCol w:w="5669"/>
+        <w:gridCol w:w="850"/>
       </w:tblGrid>
       <w:tr>
         <w:tc>
@@ -655,7 +653,7 @@
         </w:tc>
         <w:tc>
           <w:tcPr>
-            <w:tcW w:type="dxa" w:w="5386"/>
+            <w:tcW w:type="dxa" w:w="5669"/>
             <w:shd w:val="clear" w:color="auto" w:fill="C0392B"/>
           </w:tcPr>
           <w:p>
@@ -672,7 +670,7 @@
         </w:tc>
         <w:tc>
           <w:tcPr>
-            <w:tcW w:type="dxa" w:w="794"/>
+            <w:tcW w:type="dxa" w:w="850"/>
             <w:shd w:val="clear" w:color="auto" w:fill="C0392B"/>
           </w:tcPr>
           <w:p>
@@ -719,7 +717,7 @@
         </w:tc>
         <w:tc>
           <w:tcPr>
-            <w:tcW w:type="dxa" w:w="5386"/>
+            <w:tcW w:type="dxa" w:w="5669"/>
           </w:tcPr>
           <w:p>
             <w:r/>
@@ -733,7 +731,7 @@
         </w:tc>
         <w:tc>
           <w:tcPr>
-            <w:tcW w:type="dxa" w:w="794"/>
+            <w:tcW w:type="dxa" w:w="850"/>
           </w:tcPr>
           <w:p>
             <w:r/>
@@ -777,7 +775,7 @@
         </w:tc>
         <w:tc>
           <w:tcPr>
-            <w:tcW w:type="dxa" w:w="5386"/>
+            <w:tcW w:type="dxa" w:w="5669"/>
           </w:tcPr>
           <w:p>
             <w:r/>
@@ -791,7 +789,7 @@
         </w:tc>
         <w:tc>
           <w:tcPr>
-            <w:tcW w:type="dxa" w:w="794"/>
+            <w:tcW w:type="dxa" w:w="850"/>
           </w:tcPr>
           <w:p>
             <w:r/>
@@ -835,7 +833,7 @@
         </w:tc>
         <w:tc>
           <w:tcPr>
-            <w:tcW w:type="dxa" w:w="5386"/>
+            <w:tcW w:type="dxa" w:w="5669"/>
           </w:tcPr>
           <w:p>
             <w:r/>
@@ -849,7 +847,7 @@
         </w:tc>
         <w:tc>
           <w:tcPr>
-            <w:tcW w:type="dxa" w:w="794"/>
+            <w:tcW w:type="dxa" w:w="850"/>
           </w:tcPr>
           <w:p>
             <w:r/>
@@ -893,7 +891,7 @@
         </w:tc>
         <w:tc>
           <w:tcPr>
-            <w:tcW w:type="dxa" w:w="5386"/>
+            <w:tcW w:type="dxa" w:w="5669"/>
           </w:tcPr>
           <w:p>
             <w:r/>
@@ -907,7 +905,7 @@
         </w:tc>
         <w:tc>
           <w:tcPr>
-            <w:tcW w:type="dxa" w:w="794"/>
+            <w:tcW w:type="dxa" w:w="850"/>
           </w:tcPr>
           <w:p>
             <w:r/>
@@ -951,7 +949,7 @@
         </w:tc>
         <w:tc>
           <w:tcPr>
-            <w:tcW w:type="dxa" w:w="5386"/>
+            <w:tcW w:type="dxa" w:w="5669"/>
           </w:tcPr>
           <w:p>
             <w:r/>
@@ -965,7 +963,7 @@
         </w:tc>
         <w:tc>
           <w:tcPr>
-            <w:tcW w:type="dxa" w:w="794"/>
+            <w:tcW w:type="dxa" w:w="850"/>
           </w:tcPr>
           <w:p>
             <w:r/>
@@ -1009,7 +1007,7 @@
         </w:tc>
         <w:tc>
           <w:tcPr>
-            <w:tcW w:type="dxa" w:w="5386"/>
+            <w:tcW w:type="dxa" w:w="5669"/>
           </w:tcPr>
           <w:p>
             <w:r/>
@@ -1023,7 +1021,7 @@
         </w:tc>
         <w:tc>
           <w:tcPr>
-            <w:tcW w:type="dxa" w:w="794"/>
+            <w:tcW w:type="dxa" w:w="850"/>
           </w:tcPr>
           <w:p>
             <w:r/>
@@ -1067,7 +1065,7 @@
         </w:tc>
         <w:tc>
           <w:tcPr>
-            <w:tcW w:type="dxa" w:w="5386"/>
+            <w:tcW w:type="dxa" w:w="5669"/>
           </w:tcPr>
           <w:p>
             <w:r/>
@@ -1081,7 +1079,7 @@
         </w:tc>
         <w:tc>
           <w:tcPr>
-            <w:tcW w:type="dxa" w:w="794"/>
+            <w:tcW w:type="dxa" w:w="850"/>
           </w:tcPr>
           <w:p>
             <w:r/>
@@ -1125,7 +1123,7 @@
         </w:tc>
         <w:tc>
           <w:tcPr>
-            <w:tcW w:type="dxa" w:w="5386"/>
+            <w:tcW w:type="dxa" w:w="5669"/>
           </w:tcPr>
           <w:p>
             <w:r/>
@@ -1139,7 +1137,7 @@
         </w:tc>
         <w:tc>
           <w:tcPr>
-            <w:tcW w:type="dxa" w:w="794"/>
+            <w:tcW w:type="dxa" w:w="850"/>
           </w:tcPr>
           <w:p>
             <w:r/>
@@ -1183,7 +1181,7 @@
         </w:tc>
         <w:tc>
           <w:tcPr>
-            <w:tcW w:type="dxa" w:w="5386"/>
+            <w:tcW w:type="dxa" w:w="5669"/>
           </w:tcPr>
           <w:p>
             <w:r/>
@@ -1197,7 +1195,7 @@
         </w:tc>
         <w:tc>
           <w:tcPr>
-            <w:tcW w:type="dxa" w:w="794"/>
+            <w:tcW w:type="dxa" w:w="850"/>
           </w:tcPr>
           <w:p>
             <w:r/>
@@ -1241,7 +1239,7 @@
         </w:tc>
         <w:tc>
           <w:tcPr>
-            <w:tcW w:type="dxa" w:w="5386"/>
+            <w:tcW w:type="dxa" w:w="5669"/>
           </w:tcPr>
           <w:p>
             <w:r/>
@@ -1255,7 +1253,7 @@
         </w:tc>
         <w:tc>
           <w:tcPr>
-            <w:tcW w:type="dxa" w:w="794"/>
+            <w:tcW w:type="dxa" w:w="850"/>
           </w:tcPr>
           <w:p>
             <w:r/>
@@ -1299,7 +1297,7 @@
         </w:tc>
         <w:tc>
           <w:tcPr>
-            <w:tcW w:type="dxa" w:w="5386"/>
+            <w:tcW w:type="dxa" w:w="5669"/>
           </w:tcPr>
           <w:p>
             <w:r/>
@@ -1313,7 +1311,7 @@
         </w:tc>
         <w:tc>
           <w:tcPr>
-            <w:tcW w:type="dxa" w:w="794"/>
+            <w:tcW w:type="dxa" w:w="850"/>
           </w:tcPr>
           <w:p>
             <w:r/>
@@ -1357,7 +1355,7 @@
         </w:tc>
         <w:tc>
           <w:tcPr>
-            <w:tcW w:type="dxa" w:w="5386"/>
+            <w:tcW w:type="dxa" w:w="5669"/>
           </w:tcPr>
           <w:p>
             <w:r/>
@@ -1371,7 +1369,7 @@
         </w:tc>
         <w:tc>
           <w:tcPr>
-            <w:tcW w:type="dxa" w:w="794"/>
+            <w:tcW w:type="dxa" w:w="850"/>
           </w:tcPr>
           <w:p>
             <w:r/>
@@ -1415,7 +1413,7 @@
         </w:tc>
         <w:tc>
           <w:tcPr>
-            <w:tcW w:type="dxa" w:w="5386"/>
+            <w:tcW w:type="dxa" w:w="5669"/>
           </w:tcPr>
           <w:p>
             <w:r/>
@@ -1429,7 +1427,7 @@
         </w:tc>
         <w:tc>
           <w:tcPr>
-            <w:tcW w:type="dxa" w:w="794"/>
+            <w:tcW w:type="dxa" w:w="850"/>
           </w:tcPr>
           <w:p>
             <w:r/>
@@ -1473,7 +1471,7 @@
         </w:tc>
         <w:tc>
           <w:tcPr>
-            <w:tcW w:type="dxa" w:w="5386"/>
+            <w:tcW w:type="dxa" w:w="5669"/>
           </w:tcPr>
           <w:p>
             <w:r/>
@@ -1487,7 +1485,7 @@
         </w:tc>
         <w:tc>
           <w:tcPr>
-            <w:tcW w:type="dxa" w:w="794"/>
+            <w:tcW w:type="dxa" w:w="850"/>
           </w:tcPr>
           <w:p>
             <w:r/>
@@ -1531,7 +1529,7 @@
         </w:tc>
         <w:tc>
           <w:tcPr>
-            <w:tcW w:type="dxa" w:w="5386"/>
+            <w:tcW w:type="dxa" w:w="5669"/>
           </w:tcPr>
           <w:p>
             <w:r/>
@@ -1545,7 +1543,7 @@
         </w:tc>
         <w:tc>
           <w:tcPr>
-            <w:tcW w:type="dxa" w:w="794"/>
+            <w:tcW w:type="dxa" w:w="850"/>
           </w:tcPr>
           <w:p>
             <w:r/>
@@ -1589,7 +1587,7 @@
         </w:tc>
         <w:tc>
           <w:tcPr>
-            <w:tcW w:type="dxa" w:w="5386"/>
+            <w:tcW w:type="dxa" w:w="5669"/>
           </w:tcPr>
           <w:p>
             <w:r/>
@@ -1603,7 +1601,7 @@
         </w:tc>
         <w:tc>
           <w:tcPr>
-            <w:tcW w:type="dxa" w:w="794"/>
+            <w:tcW w:type="dxa" w:w="850"/>
           </w:tcPr>
           <w:p>
             <w:r/>
@@ -1647,7 +1645,7 @@
         </w:tc>
         <w:tc>
           <w:tcPr>
-            <w:tcW w:type="dxa" w:w="5386"/>
+            <w:tcW w:type="dxa" w:w="5669"/>
           </w:tcPr>
           <w:p>
             <w:r/>
@@ -1661,7 +1659,7 @@
         </w:tc>
         <w:tc>
           <w:tcPr>
-            <w:tcW w:type="dxa" w:w="794"/>
+            <w:tcW w:type="dxa" w:w="850"/>
           </w:tcPr>
           <w:p>
             <w:r/>
@@ -1705,7 +1703,7 @@
         </w:tc>
         <w:tc>
           <w:tcPr>
-            <w:tcW w:type="dxa" w:w="5386"/>
+            <w:tcW w:type="dxa" w:w="5669"/>
           </w:tcPr>
           <w:p>
             <w:r/>
@@ -1719,7 +1717,7 @@
         </w:tc>
         <w:tc>
           <w:tcPr>
-            <w:tcW w:type="dxa" w:w="794"/>
+            <w:tcW w:type="dxa" w:w="850"/>
           </w:tcPr>
           <w:p>
             <w:r/>
@@ -1763,7 +1761,7 @@
         </w:tc>
         <w:tc>
           <w:tcPr>
-            <w:tcW w:type="dxa" w:w="5386"/>
+            <w:tcW w:type="dxa" w:w="5669"/>
           </w:tcPr>
           <w:p>
             <w:r/>
@@ -1777,7 +1775,7 @@
         </w:tc>
         <w:tc>
           <w:tcPr>
-            <w:tcW w:type="dxa" w:w="794"/>
+            <w:tcW w:type="dxa" w:w="850"/>
           </w:tcPr>
           <w:p>
             <w:r/>
@@ -1821,7 +1819,7 @@
         </w:tc>
         <w:tc>
           <w:tcPr>
-            <w:tcW w:type="dxa" w:w="5386"/>
+            <w:tcW w:type="dxa" w:w="5669"/>
           </w:tcPr>
           <w:p>
             <w:r/>
@@ -1835,7 +1833,7 @@
         </w:tc>
         <w:tc>
           <w:tcPr>
-            <w:tcW w:type="dxa" w:w="794"/>
+            <w:tcW w:type="dxa" w:w="850"/>
           </w:tcPr>
           <w:p>
             <w:r/>
@@ -1879,7 +1877,7 @@
         </w:tc>
         <w:tc>
           <w:tcPr>
-            <w:tcW w:type="dxa" w:w="5386"/>
+            <w:tcW w:type="dxa" w:w="5669"/>
           </w:tcPr>
           <w:p>
             <w:r/>
@@ -1893,7 +1891,7 @@
         </w:tc>
         <w:tc>
           <w:tcPr>
-            <w:tcW w:type="dxa" w:w="794"/>
+            <w:tcW w:type="dxa" w:w="850"/>
           </w:tcPr>
           <w:p>
             <w:r/>
@@ -1937,7 +1935,7 @@
         </w:tc>
         <w:tc>
           <w:tcPr>
-            <w:tcW w:type="dxa" w:w="5386"/>
+            <w:tcW w:type="dxa" w:w="5669"/>
           </w:tcPr>
           <w:p>
             <w:r/>
@@ -1951,7 +1949,7 @@
         </w:tc>
         <w:tc>
           <w:tcPr>
-            <w:tcW w:type="dxa" w:w="794"/>
+            <w:tcW w:type="dxa" w:w="850"/>
           </w:tcPr>
           <w:p>
             <w:r/>
@@ -1995,7 +1993,7 @@
         </w:tc>
         <w:tc>
           <w:tcPr>
-            <w:tcW w:type="dxa" w:w="5386"/>
+            <w:tcW w:type="dxa" w:w="5669"/>
           </w:tcPr>
           <w:p>
             <w:r/>
@@ -2009,7 +2007,7 @@
         </w:tc>
         <w:tc>
           <w:tcPr>
-            <w:tcW w:type="dxa" w:w="794"/>
+            <w:tcW w:type="dxa" w:w="850"/>
           </w:tcPr>
           <w:p>
             <w:r/>
@@ -2059,14 +2057,15 @@
     <w:tbl>
       <w:tblPr>
         <w:tblStyle w:val="TableGrid"/>
-        <w:tblW w:type="auto" w:w="0"/>
+        <w:tblW w:type="dxa" w:w="9070"/>
         <w:tblLook w:firstColumn="1" w:firstRow="1" w:lastColumn="0" w:lastRow="0" w:noHBand="0" w:noVBand="1" w:val="04A0"/>
+        <w:tblLayout w:type="fixed"/>
       </w:tblPr>
       <w:tblGrid>
-        <w:gridCol w:w="2160"/>
-        <w:gridCol w:w="2160"/>
-        <w:gridCol w:w="2160"/>
-        <w:gridCol w:w="2160"/>
+        <w:gridCol w:w="850"/>
+        <w:gridCol w:w="1133"/>
+        <w:gridCol w:w="5952"/>
+        <w:gridCol w:w="1133"/>
       </w:tblGrid>
       <w:tr>
         <w:tc>
@@ -2105,7 +2104,7 @@
         </w:tc>
         <w:tc>
           <w:tcPr>
-            <w:tcW w:type="dxa" w:w="5669"/>
+            <w:tcW w:type="dxa" w:w="5953"/>
             <w:shd w:val="clear" w:color="auto" w:fill="C0392B"/>
           </w:tcPr>
           <w:p>
@@ -2122,7 +2121,7 @@
         </w:tc>
         <w:tc>
           <w:tcPr>
-            <w:tcW w:type="dxa" w:w="1077"/>
+            <w:tcW w:type="dxa" w:w="1134"/>
             <w:shd w:val="clear" w:color="auto" w:fill="C0392B"/>
           </w:tcPr>
           <w:p>
@@ -2169,7 +2168,7 @@
         </w:tc>
         <w:tc>
           <w:tcPr>
-            <w:tcW w:type="dxa" w:w="5669"/>
+            <w:tcW w:type="dxa" w:w="5953"/>
           </w:tcPr>
           <w:p>
             <w:r/>
@@ -2183,7 +2182,7 @@
         </w:tc>
         <w:tc>
           <w:tcPr>
-            <w:tcW w:type="dxa" w:w="1077"/>
+            <w:tcW w:type="dxa" w:w="1134"/>
           </w:tcPr>
           <w:p>
             <w:r/>
@@ -2227,23 +2226,20 @@
         </w:tc>
         <w:tc>
           <w:tcPr>
-            <w:tcW w:type="dxa" w:w="5669"/>
-          </w:tcPr>
-          <w:p>
-            <w:r>
+            <w:tcW w:type="dxa" w:w="5953"/>
+          </w:tcPr>
+          <w:p>
+            <w:r>
+              <w:rPr>
+                <w:sz w:val="18"/>
+              </w:rPr>
               <w:t>Superar los ensayos de resistencia y de deslizamiento lateral de la UNE-EN 14183; base de apoyo más ancha que la plataforma</w:t>
             </w:r>
-            <w:r>
-              <w:rPr>
-                <w:sz w:val="18"/>
-              </w:rPr>
-              <w:t>Superar el ensayo de estabilidad de la UNE-EN 14183; base de apoyo más ancha que la plataforma</w:t>
-            </w:r>
-          </w:p>
-        </w:tc>
-        <w:tc>
-          <w:tcPr>
-            <w:tcW w:type="dxa" w:w="1077"/>
+          </w:p>
+        </w:tc>
+        <w:tc>
+          <w:tcPr>
+            <w:tcW w:type="dxa" w:w="1134"/>
           </w:tcPr>
           <w:p>
             <w:r/>
@@ -2287,7 +2283,7 @@
         </w:tc>
         <w:tc>
           <w:tcPr>
-            <w:tcW w:type="dxa" w:w="5669"/>
+            <w:tcW w:type="dxa" w:w="5953"/>
           </w:tcPr>
           <w:p>
             <w:r/>
@@ -2301,7 +2297,7 @@
         </w:tc>
         <w:tc>
           <w:tcPr>
-            <w:tcW w:type="dxa" w:w="1077"/>
+            <w:tcW w:type="dxa" w:w="1134"/>
           </w:tcPr>
           <w:p>
             <w:r/>
@@ -2345,7 +2341,7 @@
         </w:tc>
         <w:tc>
           <w:tcPr>
-            <w:tcW w:type="dxa" w:w="5669"/>
+            <w:tcW w:type="dxa" w:w="5953"/>
           </w:tcPr>
           <w:p>
             <w:r/>
@@ -2359,7 +2355,7 @@
         </w:tc>
         <w:tc>
           <w:tcPr>
-            <w:tcW w:type="dxa" w:w="1077"/>
+            <w:tcW w:type="dxa" w:w="1134"/>
           </w:tcPr>
           <w:p>
             <w:r/>
@@ -2403,23 +2399,20 @@
         </w:tc>
         <w:tc>
           <w:tcPr>
-            <w:tcW w:type="dxa" w:w="5669"/>
-          </w:tcPr>
-          <w:p>
-            <w:r>
+            <w:tcW w:type="dxa" w:w="5953"/>
+          </w:tcPr>
+          <w:p>
+            <w:r>
+              <w:rPr>
+                <w:sz w:val="18"/>
+              </w:rPr>
               <w:t>Peso total ≤ 3,5 kg</w:t>
             </w:r>
-            <w:r>
-              <w:rPr>
-                <w:sz w:val="18"/>
-              </w:rPr>
-              <w:t>Peso total ≤ 5 kg</w:t>
-            </w:r>
-          </w:p>
-        </w:tc>
-        <w:tc>
-          <w:tcPr>
-            <w:tcW w:type="dxa" w:w="1077"/>
+          </w:p>
+        </w:tc>
+        <w:tc>
+          <w:tcPr>
+            <w:tcW w:type="dxa" w:w="1134"/>
           </w:tcPr>
           <w:p>
             <w:r/>
@@ -2463,23 +2456,20 @@
         </w:tc>
         <w:tc>
           <w:tcPr>
-            <w:tcW w:type="dxa" w:w="5669"/>
-          </w:tcPr>
-          <w:p>
-            <w:r>
+            <w:tcW w:type="dxa" w:w="5953"/>
+          </w:tcPr>
+          <w:p>
+            <w:r>
+              <w:rPr>
+                <w:sz w:val="18"/>
+              </w:rPr>
               <w:t>Espesor plegado ≤ 50 mm</w:t>
             </w:r>
-            <w:r>
-              <w:rPr>
-                <w:sz w:val="18"/>
-              </w:rPr>
-              <w:t>Espesor plegado ≤ 80 mm</w:t>
-            </w:r>
-          </w:p>
-        </w:tc>
-        <w:tc>
-          <w:tcPr>
-            <w:tcW w:type="dxa" w:w="1077"/>
+          </w:p>
+        </w:tc>
+        <w:tc>
+          <w:tcPr>
+            <w:tcW w:type="dxa" w:w="1134"/>
           </w:tcPr>
           <w:p>
             <w:r/>
@@ -2523,7 +2513,7 @@
         </w:tc>
         <w:tc>
           <w:tcPr>
-            <w:tcW w:type="dxa" w:w="5669"/>
+            <w:tcW w:type="dxa" w:w="5953"/>
           </w:tcPr>
           <w:p>
             <w:r/>
@@ -2537,7 +2527,7 @@
         </w:tc>
         <w:tc>
           <w:tcPr>
-            <w:tcW w:type="dxa" w:w="1077"/>
+            <w:tcW w:type="dxa" w:w="1134"/>
           </w:tcPr>
           <w:p>
             <w:r/>
@@ -2581,7 +2571,7 @@
         </w:tc>
         <w:tc>
           <w:tcPr>
-            <w:tcW w:type="dxa" w:w="5669"/>
+            <w:tcW w:type="dxa" w:w="5953"/>
           </w:tcPr>
           <w:p>
             <w:r/>
@@ -2595,7 +2585,7 @@
         </w:tc>
         <w:tc>
           <w:tcPr>
-            <w:tcW w:type="dxa" w:w="1077"/>
+            <w:tcW w:type="dxa" w:w="1134"/>
           </w:tcPr>
           <w:p>
             <w:r/>
@@ -2639,7 +2629,7 @@
         </w:tc>
         <w:tc>
           <w:tcPr>
-            <w:tcW w:type="dxa" w:w="5669"/>
+            <w:tcW w:type="dxa" w:w="5953"/>
           </w:tcPr>
           <w:p>
             <w:r/>
@@ -2653,7 +2643,7 @@
         </w:tc>
         <w:tc>
           <w:tcPr>
-            <w:tcW w:type="dxa" w:w="1077"/>
+            <w:tcW w:type="dxa" w:w="1134"/>
           </w:tcPr>
           <w:p>
             <w:r/>
@@ -2697,7 +2687,7 @@
         </w:tc>
         <w:tc>
           <w:tcPr>
-            <w:tcW w:type="dxa" w:w="5669"/>
+            <w:tcW w:type="dxa" w:w="5953"/>
           </w:tcPr>
           <w:p>
             <w:r/>
@@ -2711,7 +2701,7 @@
         </w:tc>
         <w:tc>
           <w:tcPr>
-            <w:tcW w:type="dxa" w:w="1077"/>
+            <w:tcW w:type="dxa" w:w="1134"/>
           </w:tcPr>
           <w:p>
             <w:r/>
@@ -2755,7 +2745,7 @@
         </w:tc>
         <w:tc>
           <w:tcPr>
-            <w:tcW w:type="dxa" w:w="5669"/>
+            <w:tcW w:type="dxa" w:w="5953"/>
           </w:tcPr>
           <w:p>
             <w:r/>
@@ -2769,7 +2759,7 @@
         </w:tc>
         <w:tc>
           <w:tcPr>
-            <w:tcW w:type="dxa" w:w="1077"/>
+            <w:tcW w:type="dxa" w:w="1134"/>
           </w:tcPr>
           <w:p>
             <w:r/>
@@ -2813,23 +2803,20 @@
         </w:tc>
         <w:tc>
           <w:tcPr>
-            <w:tcW w:type="dxa" w:w="5669"/>
-          </w:tcPr>
-          <w:p>
-            <w:r>
+            <w:tcW w:type="dxa" w:w="5953"/>
+          </w:tcPr>
+          <w:p>
+            <w:r>
+              <w:rPr>
+                <w:sz w:val="18"/>
+              </w:rPr>
               <w:t>Precio de venta objetivo ≤ 45 € IVA incluido (ver apartado 2.1)</w:t>
             </w:r>
-            <w:r>
-              <w:rPr>
-                <w:sz w:val="18"/>
-              </w:rPr>
-              <w:t>Precio de venta objetivo ≤ 45 € (a contrastar en el estudio de mercado)</w:t>
-            </w:r>
-          </w:p>
-        </w:tc>
-        <w:tc>
-          <w:tcPr>
-            <w:tcW w:type="dxa" w:w="1077"/>
+          </w:p>
+        </w:tc>
+        <w:tc>
+          <w:tcPr>
+            <w:tcW w:type="dxa" w:w="1134"/>
           </w:tcPr>
           <w:p>
             <w:r/>
@@ -2924,13 +2911,14 @@
     <w:tbl>
       <w:tblPr>
         <w:tblStyle w:val="TableGrid"/>
-        <w:tblW w:type="auto" w:w="0"/>
+        <w:tblW w:type="dxa" w:w="9070"/>
         <w:tblLook w:firstColumn="1" w:firstRow="1" w:lastColumn="0" w:lastRow="0" w:noHBand="0" w:noVBand="1" w:val="04A0"/>
+        <w:tblLayout w:type="fixed"/>
       </w:tblPr>
       <w:tblGrid>
-        <w:gridCol w:w="2880"/>
-        <w:gridCol w:w="2880"/>
-        <w:gridCol w:w="2880"/>
+        <w:gridCol w:w="3401"/>
+        <w:gridCol w:w="3685"/>
+        <w:gridCol w:w="1984"/>
       </w:tblGrid>
       <w:tr>
         <w:tc>
@@ -2952,7 +2940,7 @@
         </w:tc>
         <w:tc>
           <w:tcPr>
-            <w:tcW w:type="dxa" w:w="3402"/>
+            <w:tcW w:type="dxa" w:w="3685"/>
             <w:shd w:val="clear" w:color="auto" w:fill="C0392B"/>
           </w:tcPr>
           <w:p>
@@ -3002,7 +2990,7 @@
         </w:tc>
         <w:tc>
           <w:tcPr>
-            <w:tcW w:type="dxa" w:w="3402"/>
+            <w:tcW w:type="dxa" w:w="3685"/>
           </w:tcPr>
           <w:p>
             <w:r/>
@@ -3046,7 +3034,7 @@
         </w:tc>
         <w:tc>
           <w:tcPr>
-            <w:tcW w:type="dxa" w:w="3402"/>
+            <w:tcW w:type="dxa" w:w="3685"/>
           </w:tcPr>
           <w:p>
             <w:r/>
@@ -3090,14 +3078,13 @@
         </w:tc>
         <w:tc>
           <w:tcPr>
-            <w:tcW w:type="dxa" w:w="3402"/>
+            <w:tcW w:type="dxa" w:w="3685"/>
           </w:tcPr>
           <w:p>
             <w:r/>
             <w:r>
               <w:rPr>
                 <w:sz w:val="17"/>
-                <w:highlight w:val="yellow"/>
               </w:rPr>
               <w:t>≈ 38 % del PVP sin IVA (hipótesis)</w:t>
             </w:r>
@@ -3135,7 +3122,7 @@
         </w:tc>
         <w:tc>
           <w:tcPr>
-            <w:tcW w:type="dxa" w:w="3402"/>
+            <w:tcW w:type="dxa" w:w="3685"/>
           </w:tcPr>
           <w:p>
             <w:r/>
@@ -3179,14 +3166,13 @@
         </w:tc>
         <w:tc>
           <w:tcPr>
-            <w:tcW w:type="dxa" w:w="3402"/>
+            <w:tcW w:type="dxa" w:w="3685"/>
           </w:tcPr>
           <w:p>
             <w:r/>
             <w:r>
               <w:rPr>
                 <w:sz w:val="17"/>
-                <w:highlight w:val="yellow"/>
               </w:rPr>
               <w:t>≈ 25 % (hipótesis)</w:t>
             </w:r>
@@ -3224,7 +3210,7 @@
         </w:tc>
         <w:tc>
           <w:tcPr>
-            <w:tcW w:type="dxa" w:w="3402"/>
+            <w:tcW w:type="dxa" w:w="3685"/>
           </w:tcPr>
           <w:p>
             <w:r/>
@@ -3298,22 +3284,23 @@
     <w:tbl>
       <w:tblPr>
         <w:tblStyle w:val="TableGrid"/>
-        <w:tblW w:type="auto" w:w="0"/>
+        <w:tblW w:type="dxa" w:w="8844"/>
         <w:tblLook w:firstColumn="1" w:firstRow="1" w:lastColumn="0" w:lastRow="0" w:noHBand="0" w:noVBand="1" w:val="04A0"/>
+        <w:tblLayout w:type="fixed"/>
       </w:tblPr>
       <w:tblGrid>
-        <w:gridCol w:w="1234"/>
-        <w:gridCol w:w="1234"/>
-        <w:gridCol w:w="1234"/>
-        <w:gridCol w:w="1234"/>
-        <w:gridCol w:w="1234"/>
-        <w:gridCol w:w="1234"/>
-        <w:gridCol w:w="1234"/>
+        <w:gridCol w:w="1927"/>
+        <w:gridCol w:w="1700"/>
+        <w:gridCol w:w="1474"/>
+        <w:gridCol w:w="850"/>
+        <w:gridCol w:w="737"/>
+        <w:gridCol w:w="1020"/>
+        <w:gridCol w:w="1133"/>
       </w:tblGrid>
       <w:tr>
         <w:tc>
           <w:tcPr>
-            <w:tcW w:type="dxa" w:w="2041"/>
+            <w:tcW w:type="dxa" w:w="1928"/>
             <w:shd w:val="clear" w:color="auto" w:fill="C0392B"/>
           </w:tcPr>
           <w:p>
@@ -3364,7 +3351,7 @@
         </w:tc>
         <w:tc>
           <w:tcPr>
-            <w:tcW w:type="dxa" w:w="794"/>
+            <w:tcW w:type="dxa" w:w="850"/>
             <w:shd w:val="clear" w:color="auto" w:fill="C0392B"/>
           </w:tcPr>
           <w:p>
@@ -3398,7 +3385,7 @@
         </w:tc>
         <w:tc>
           <w:tcPr>
-            <w:tcW w:type="dxa" w:w="907"/>
+            <w:tcW w:type="dxa" w:w="1020"/>
             <w:shd w:val="clear" w:color="auto" w:fill="C0392B"/>
           </w:tcPr>
           <w:p>
@@ -3415,7 +3402,7 @@
         </w:tc>
         <w:tc>
           <w:tcPr>
-            <w:tcW w:type="dxa" w:w="907"/>
+            <w:tcW w:type="dxa" w:w="1134"/>
             <w:shd w:val="clear" w:color="auto" w:fill="C0392B"/>
           </w:tcPr>
           <w:p>
@@ -3434,7 +3421,7 @@
       <w:tr>
         <w:tc>
           <w:tcPr>
-            <w:tcW w:type="dxa" w:w="2041"/>
+            <w:tcW w:type="dxa" w:w="1928"/>
           </w:tcPr>
           <w:p>
             <w:r/>
@@ -3476,7 +3463,7 @@
         </w:tc>
         <w:tc>
           <w:tcPr>
-            <w:tcW w:type="dxa" w:w="794"/>
+            <w:tcW w:type="dxa" w:w="850"/>
           </w:tcPr>
           <w:p>
             <w:r/>
@@ -3504,7 +3491,7 @@
         </w:tc>
         <w:tc>
           <w:tcPr>
-            <w:tcW w:type="dxa" w:w="907"/>
+            <w:tcW w:type="dxa" w:w="1020"/>
           </w:tcPr>
           <w:p>
             <w:r/>
@@ -3518,7 +3505,7 @@
         </w:tc>
         <w:tc>
           <w:tcPr>
-            <w:tcW w:type="dxa" w:w="907"/>
+            <w:tcW w:type="dxa" w:w="1134"/>
           </w:tcPr>
           <w:p>
             <w:r/>
@@ -3534,7 +3521,7 @@
       <w:tr>
         <w:tc>
           <w:tcPr>
-            <w:tcW w:type="dxa" w:w="2041"/>
+            <w:tcW w:type="dxa" w:w="1928"/>
           </w:tcPr>
           <w:p>
             <w:r/>
@@ -3576,7 +3563,7 @@
         </w:tc>
         <w:tc>
           <w:tcPr>
-            <w:tcW w:type="dxa" w:w="794"/>
+            <w:tcW w:type="dxa" w:w="850"/>
           </w:tcPr>
           <w:p>
             <w:r/>
@@ -3604,7 +3591,7 @@
         </w:tc>
         <w:tc>
           <w:tcPr>
-            <w:tcW w:type="dxa" w:w="907"/>
+            <w:tcW w:type="dxa" w:w="1020"/>
           </w:tcPr>
           <w:p>
             <w:r/>
@@ -3618,7 +3605,7 @@
         </w:tc>
         <w:tc>
           <w:tcPr>
-            <w:tcW w:type="dxa" w:w="907"/>
+            <w:tcW w:type="dxa" w:w="1134"/>
           </w:tcPr>
           <w:p>
             <w:r/>
@@ -3634,7 +3621,7 @@
       <w:tr>
         <w:tc>
           <w:tcPr>
-            <w:tcW w:type="dxa" w:w="2041"/>
+            <w:tcW w:type="dxa" w:w="1928"/>
           </w:tcPr>
           <w:p>
             <w:r/>
@@ -3676,7 +3663,7 @@
         </w:tc>
         <w:tc>
           <w:tcPr>
-            <w:tcW w:type="dxa" w:w="794"/>
+            <w:tcW w:type="dxa" w:w="850"/>
           </w:tcPr>
           <w:p>
             <w:r/>
@@ -3704,7 +3691,7 @@
         </w:tc>
         <w:tc>
           <w:tcPr>
-            <w:tcW w:type="dxa" w:w="907"/>
+            <w:tcW w:type="dxa" w:w="1020"/>
           </w:tcPr>
           <w:p>
             <w:r/>
@@ -3718,7 +3705,7 @@
         </w:tc>
         <w:tc>
           <w:tcPr>
-            <w:tcW w:type="dxa" w:w="907"/>
+            <w:tcW w:type="dxa" w:w="1134"/>
           </w:tcPr>
           <w:p>
             <w:r/>
@@ -3734,7 +3721,7 @@
       <w:tr>
         <w:tc>
           <w:tcPr>
-            <w:tcW w:type="dxa" w:w="2041"/>
+            <w:tcW w:type="dxa" w:w="1928"/>
           </w:tcPr>
           <w:p>
             <w:r/>
@@ -3776,7 +3763,7 @@
         </w:tc>
         <w:tc>
           <w:tcPr>
-            <w:tcW w:type="dxa" w:w="794"/>
+            <w:tcW w:type="dxa" w:w="850"/>
           </w:tcPr>
           <w:p>
             <w:r/>
@@ -3804,7 +3791,7 @@
         </w:tc>
         <w:tc>
           <w:tcPr>
-            <w:tcW w:type="dxa" w:w="907"/>
+            <w:tcW w:type="dxa" w:w="1020"/>
           </w:tcPr>
           <w:p>
             <w:r/>
@@ -3818,7 +3805,7 @@
         </w:tc>
         <w:tc>
           <w:tcPr>
-            <w:tcW w:type="dxa" w:w="907"/>
+            <w:tcW w:type="dxa" w:w="1134"/>
           </w:tcPr>
           <w:p>
             <w:r/>
@@ -3834,7 +3821,7 @@
       <w:tr>
         <w:tc>
           <w:tcPr>
-            <w:tcW w:type="dxa" w:w="2041"/>
+            <w:tcW w:type="dxa" w:w="1928"/>
           </w:tcPr>
           <w:p>
             <w:r/>
@@ -3876,7 +3863,7 @@
         </w:tc>
         <w:tc>
           <w:tcPr>
-            <w:tcW w:type="dxa" w:w="794"/>
+            <w:tcW w:type="dxa" w:w="850"/>
           </w:tcPr>
           <w:p>
             <w:r/>
@@ -3904,7 +3891,7 @@
         </w:tc>
         <w:tc>
           <w:tcPr>
-            <w:tcW w:type="dxa" w:w="907"/>
+            <w:tcW w:type="dxa" w:w="1020"/>
           </w:tcPr>
           <w:p>
             <w:r/>
@@ -3918,7 +3905,7 @@
         </w:tc>
         <w:tc>
           <w:tcPr>
-            <w:tcW w:type="dxa" w:w="907"/>
+            <w:tcW w:type="dxa" w:w="1134"/>
           </w:tcPr>
           <w:p>
             <w:r/>
@@ -3934,7 +3921,7 @@
       <w:tr>
         <w:tc>
           <w:tcPr>
-            <w:tcW w:type="dxa" w:w="2041"/>
+            <w:tcW w:type="dxa" w:w="1928"/>
           </w:tcPr>
           <w:p>
             <w:r/>
@@ -3976,7 +3963,7 @@
         </w:tc>
         <w:tc>
           <w:tcPr>
-            <w:tcW w:type="dxa" w:w="794"/>
+            <w:tcW w:type="dxa" w:w="850"/>
           </w:tcPr>
           <w:p>
             <w:r/>
@@ -4004,7 +3991,7 @@
         </w:tc>
         <w:tc>
           <w:tcPr>
-            <w:tcW w:type="dxa" w:w="907"/>
+            <w:tcW w:type="dxa" w:w="1020"/>
           </w:tcPr>
           <w:p>
             <w:r/>
@@ -4018,7 +4005,7 @@
         </w:tc>
         <w:tc>
           <w:tcPr>
-            <w:tcW w:type="dxa" w:w="907"/>
+            <w:tcW w:type="dxa" w:w="1134"/>
           </w:tcPr>
           <w:p>
             <w:r/>
@@ -4034,7 +4021,7 @@
       <w:tr>
         <w:tc>
           <w:tcPr>
-            <w:tcW w:type="dxa" w:w="2041"/>
+            <w:tcW w:type="dxa" w:w="1928"/>
           </w:tcPr>
           <w:p>
             <w:r/>
@@ -4076,7 +4063,7 @@
         </w:tc>
         <w:tc>
           <w:tcPr>
-            <w:tcW w:type="dxa" w:w="794"/>
+            <w:tcW w:type="dxa" w:w="850"/>
           </w:tcPr>
           <w:p>
             <w:r/>
@@ -4104,7 +4091,7 @@
         </w:tc>
         <w:tc>
           <w:tcPr>
-            <w:tcW w:type="dxa" w:w="907"/>
+            <w:tcW w:type="dxa" w:w="1020"/>
           </w:tcPr>
           <w:p>
             <w:r/>
@@ -4118,7 +4105,7 @@
         </w:tc>
         <w:tc>
           <w:tcPr>
-            <w:tcW w:type="dxa" w:w="907"/>
+            <w:tcW w:type="dxa" w:w="1134"/>
           </w:tcPr>
           <w:p>
             <w:r/>
@@ -4282,12 +4269,13 @@
     <w:tbl>
       <w:tblPr>
         <w:tblStyle w:val="TableGrid"/>
-        <w:tblW w:type="auto" w:w="0"/>
+        <w:tblW w:type="dxa" w:w="9070"/>
         <w:tblLook w:firstColumn="1" w:firstRow="1" w:lastColumn="0" w:lastRow="0" w:noHBand="0" w:noVBand="1" w:val="04A0"/>
+        <w:tblLayout w:type="fixed"/>
       </w:tblPr>
       <w:tblGrid>
-        <w:gridCol w:w="4320"/>
-        <w:gridCol w:w="4320"/>
+        <w:gridCol w:w="2267"/>
+        <w:gridCol w:w="6803"/>
       </w:tblGrid>
       <w:tr>
         <w:tc>
@@ -5317,14 +5305,15 @@
     <w:tbl>
       <w:tblPr>
         <w:tblStyle w:val="TableGrid"/>
-        <w:tblW w:type="auto" w:w="0"/>
+        <w:tblW w:type="dxa" w:w="9070"/>
         <w:tblLook w:firstColumn="1" w:firstRow="1" w:lastColumn="0" w:lastRow="0" w:noHBand="0" w:noVBand="1" w:val="04A0"/>
+        <w:tblLayout w:type="fixed"/>
       </w:tblPr>
       <w:tblGrid>
-        <w:gridCol w:w="2160"/>
-        <w:gridCol w:w="2160"/>
-        <w:gridCol w:w="2160"/>
-        <w:gridCol w:w="2160"/>
+        <w:gridCol w:w="1587"/>
+        <w:gridCol w:w="2381"/>
+        <w:gridCol w:w="2551"/>
+        <w:gridCol w:w="2551"/>
       </w:tblGrid>
       <w:tr>
         <w:tc>
@@ -5363,7 +5352,7 @@
         </w:tc>
         <w:tc>
           <w:tcPr>
-            <w:tcW w:type="dxa" w:w="2494"/>
+            <w:tcW w:type="dxa" w:w="2551"/>
             <w:shd w:val="clear" w:color="auto" w:fill="C0392B"/>
           </w:tcPr>
           <w:p>
@@ -5380,7 +5369,7 @@
         </w:tc>
         <w:tc>
           <w:tcPr>
-            <w:tcW w:type="dxa" w:w="2494"/>
+            <w:tcW w:type="dxa" w:w="2551"/>
             <w:shd w:val="clear" w:color="auto" w:fill="C0392B"/>
           </w:tcPr>
           <w:p>
@@ -5427,7 +5416,7 @@
         </w:tc>
         <w:tc>
           <w:tcPr>
-            <w:tcW w:type="dxa" w:w="2494"/>
+            <w:tcW w:type="dxa" w:w="2551"/>
           </w:tcPr>
           <w:p>
             <w:r/>
@@ -5441,7 +5430,7 @@
         </w:tc>
         <w:tc>
           <w:tcPr>
-            <w:tcW w:type="dxa" w:w="2494"/>
+            <w:tcW w:type="dxa" w:w="2551"/>
           </w:tcPr>
           <w:p>
             <w:r/>
@@ -5485,7 +5474,7 @@
         </w:tc>
         <w:tc>
           <w:tcPr>
-            <w:tcW w:type="dxa" w:w="2494"/>
+            <w:tcW w:type="dxa" w:w="2551"/>
           </w:tcPr>
           <w:p>
             <w:r/>
@@ -5499,7 +5488,7 @@
         </w:tc>
         <w:tc>
           <w:tcPr>
-            <w:tcW w:type="dxa" w:w="2494"/>
+            <w:tcW w:type="dxa" w:w="2551"/>
           </w:tcPr>
           <w:p>
             <w:r/>
@@ -5543,7 +5532,7 @@
         </w:tc>
         <w:tc>
           <w:tcPr>
-            <w:tcW w:type="dxa" w:w="2494"/>
+            <w:tcW w:type="dxa" w:w="2551"/>
           </w:tcPr>
           <w:p>
             <w:r/>
@@ -5557,7 +5546,7 @@
         </w:tc>
         <w:tc>
           <w:tcPr>
-            <w:tcW w:type="dxa" w:w="2494"/>
+            <w:tcW w:type="dxa" w:w="2551"/>
           </w:tcPr>
           <w:p>
             <w:r/>
@@ -5601,7 +5590,7 @@
         </w:tc>
         <w:tc>
           <w:tcPr>
-            <w:tcW w:type="dxa" w:w="2494"/>
+            <w:tcW w:type="dxa" w:w="2551"/>
           </w:tcPr>
           <w:p>
             <w:r/>
@@ -5615,7 +5604,7 @@
         </w:tc>
         <w:tc>
           <w:tcPr>
-            <w:tcW w:type="dxa" w:w="2494"/>
+            <w:tcW w:type="dxa" w:w="2551"/>
           </w:tcPr>
           <w:p>
             <w:r/>
@@ -5659,7 +5648,7 @@
         </w:tc>
         <w:tc>
           <w:tcPr>
-            <w:tcW w:type="dxa" w:w="2494"/>
+            <w:tcW w:type="dxa" w:w="2551"/>
           </w:tcPr>
           <w:p>
             <w:r/>
@@ -5673,7 +5662,7 @@
         </w:tc>
         <w:tc>
           <w:tcPr>
-            <w:tcW w:type="dxa" w:w="2494"/>
+            <w:tcW w:type="dxa" w:w="2551"/>
           </w:tcPr>
           <w:p>
             <w:r/>
@@ -5717,7 +5706,7 @@
         </w:tc>
         <w:tc>
           <w:tcPr>
-            <w:tcW w:type="dxa" w:w="2494"/>
+            <w:tcW w:type="dxa" w:w="2551"/>
           </w:tcPr>
           <w:p>
             <w:r/>
@@ -5731,7 +5720,7 @@
         </w:tc>
         <w:tc>
           <w:tcPr>
-            <w:tcW w:type="dxa" w:w="2494"/>
+            <w:tcW w:type="dxa" w:w="2551"/>
           </w:tcPr>
           <w:p>
             <w:r/>
@@ -5775,7 +5764,7 @@
         </w:tc>
         <w:tc>
           <w:tcPr>
-            <w:tcW w:type="dxa" w:w="2494"/>
+            <w:tcW w:type="dxa" w:w="2551"/>
           </w:tcPr>
           <w:p>
             <w:r/>
@@ -5789,7 +5778,7 @@
         </w:tc>
         <w:tc>
           <w:tcPr>
-            <w:tcW w:type="dxa" w:w="2494"/>
+            <w:tcW w:type="dxa" w:w="2551"/>
           </w:tcPr>
           <w:p>
             <w:r/>
@@ -5833,7 +5822,7 @@
         </w:tc>
         <w:tc>
           <w:tcPr>
-            <w:tcW w:type="dxa" w:w="2494"/>
+            <w:tcW w:type="dxa" w:w="2551"/>
           </w:tcPr>
           <w:p>
             <w:r/>
@@ -5847,7 +5836,7 @@
         </w:tc>
         <w:tc>
           <w:tcPr>
-            <w:tcW w:type="dxa" w:w="2494"/>
+            <w:tcW w:type="dxa" w:w="2551"/>
           </w:tcPr>
           <w:p>
             <w:r/>
@@ -5891,7 +5880,7 @@
         </w:tc>
         <w:tc>
           <w:tcPr>
-            <w:tcW w:type="dxa" w:w="2494"/>
+            <w:tcW w:type="dxa" w:w="2551"/>
           </w:tcPr>
           <w:p>
             <w:r/>
@@ -5905,7 +5894,7 @@
         </w:tc>
         <w:tc>
           <w:tcPr>
-            <w:tcW w:type="dxa" w:w="2494"/>
+            <w:tcW w:type="dxa" w:w="2551"/>
           </w:tcPr>
           <w:p>
             <w:r/>
@@ -5960,109 +5949,165 @@
         <w:pStyle w:val="Heading3"/>
       </w:pPr>
       <w:r>
+        <w:rPr>
+          <w:b w:val="0"/>
+          <w:i w:val="0"/>
+        </w:rPr>
         <w:t>2.5.1. PATENTE PRIMERA: ES 1 070 877 U — Dispositivo de enclavamiento para taburetes plegables y similares</w:t>
+      </w:r>
+    </w:p>
+    <w:p>
+      <w:pPr>
+        <w:pStyle w:val="ListBullet"/>
+      </w:pPr>
+      <w:r>
+        <w:rPr>
+          <w:b w:val="0"/>
+          <w:i w:val="0"/>
+        </w:rPr>
+        <w:t>Tipo: modelo de utilidad español (clasificación A47C 7/00).</w:t>
+      </w:r>
+    </w:p>
+    <w:p>
+      <w:pPr>
+        <w:pStyle w:val="ListBullet"/>
+      </w:pPr>
+      <w:r>
+        <w:rPr>
+          <w:b w:val="0"/>
+          <w:i w:val="0"/>
+        </w:rPr>
+        <w:t>Solicitante: Gesco, S.L. (Casarrubios del Monte, Toledo). Inventor: Jorge Pajares Calvo.</w:t>
+      </w:r>
+    </w:p>
+    <w:p>
+      <w:pPr>
+        <w:pStyle w:val="ListBullet"/>
+      </w:pPr>
+      <w:r>
+        <w:rPr>
+          <w:b w:val="0"/>
+          <w:i w:val="0"/>
+        </w:rPr>
+        <w:t>Nº de solicitud: U 200901059. Fecha de presentación: 26/06/2009. Publicación: 12/11/2009.</w:t>
+      </w:r>
+    </w:p>
+    <w:p>
+      <w:pPr>
+        <w:pStyle w:val="ListBullet"/>
+      </w:pPr>
+      <w:r>
+        <w:rPr>
+          <w:b w:val="0"/>
+          <w:i w:val="0"/>
+        </w:rPr>
+        <w:t>Situación: caducado (la protección máxima de un modelo de utilidad es de 10 años, por lo que terminó como muy tarde en 2019).</w:t>
+      </w:r>
+    </w:p>
+    <w:p>
+      <w:r>
+        <w:rPr>
+          <w:b/>
+          <w:i w:val="0"/>
+        </w:rPr>
+        <w:t>Resumen:</w:t>
       </w:r>
     </w:p>
     <w:p>
       <w:r>
         <w:rPr>
           <w:b w:val="0"/>
+          <w:i w:val="0"/>
         </w:rPr>
-        <w:t xml:space="preserve">Tipo: </w:t>
+        <w:t>Dispositivo que mantiene desplegado un taburete plegable. En una de las patas, junto a la articulación con la plataforma superior, hay un vástago que atraviesa la pata y que un muelle mantiene sobresaliendo. La pared lateral de la plataforma tiene un orificio enfrentado al vástago y, antes de él, una zona abombada hacia fuera. Al desplegar el taburete, esa zona empuja el vástago hacia dentro; cuando el vástago llega al orificio, el muelle lo vuelve a sacar y queda encajado, bloqueando el taburete abierto.</w:t>
       </w:r>
+    </w:p>
+    <w:p>
       <w:r>
         <w:rPr>
-          <w:b w:val="0"/>
+          <w:b/>
+          <w:i w:val="0"/>
         </w:rPr>
-        <w:t xml:space="preserve">modelo de utilidad español. </w:t>
-      </w:r>
-      <w:r>
-        <w:rPr>
-          <w:b w:val="0"/>
-        </w:rPr>
-        <w:t xml:space="preserve">Solicitante: </w:t>
-      </w:r>
-      <w:r>
-        <w:rPr>
-          <w:b w:val="0"/>
-        </w:rPr>
-        <w:t xml:space="preserve">Gesco, S.L. </w:t>
-      </w:r>
-      <w:r>
-        <w:rPr>
-          <w:b w:val="0"/>
-        </w:rPr>
-        <w:t xml:space="preserve">Inventor: </w:t>
-      </w:r>
-      <w:r>
-        <w:rPr>
-          <w:b w:val="0"/>
-        </w:rPr>
-        <w:t xml:space="preserve">Jorge Calvo Pajares. </w:t>
-      </w:r>
-      <w:r>
-        <w:rPr>
-          <w:b w:val="0"/>
-        </w:rPr>
-        <w:t xml:space="preserve">Nº de solicitud: </w:t>
-      </w:r>
-      <w:r>
-        <w:rPr>
-          <w:b w:val="0"/>
-        </w:rPr>
-        <w:t xml:space="preserve">U200901059, presentada el 26/06/2009. </w:t>
-      </w:r>
-      <w:r>
-        <w:rPr>
-          <w:b w:val="0"/>
-        </w:rPr>
-        <w:t xml:space="preserve">Estado: </w:t>
-      </w:r>
-      <w:r>
-        <w:rPr>
-          <w:b w:val="0"/>
-        </w:rPr>
-        <w:t>caducado.</w:t>
+        <w:t>Reivindicación 1 (texto literal):</w:t>
       </w:r>
     </w:p>
     <w:p>
       <w:r>
         <w:rPr>
           <w:b w:val="0"/>
+          <w:i/>
         </w:rPr>
-        <w:t>Resumen: dispositivo de enclavamiento para taburetes plegables destinado a mantener el taburete en la posición de desplegado con plenas garantías de seguridad.</w:t>
+        <w:t>«Dispositivo de enclavamiento para taburetes plegables y similares, destinado a mantener el taburete en la condición de desplegado con plenas garantías de eficacia y seguridad para el usuario, caracterizado porque comprende en relación con al menos una de las patas (1) del taburete, en las proximidades del punto de articulación (4) entre la pata (1) y la pared lateral (3a) de la plataforma o peldaño (3) superior del taburete, la provisión de un elemento de vástago (8) escamoteable, retraíble contra la acción de un resorte (11), cuyo vástago (8) se extiende a través del espesor total de la pata (1) mencionada y presenta una porción que sobresale desde el plano superficial de dicha pata en una extensión considerable predeterminada, mientras que la citada pared (3a) lateral de dicha plataforma (3) superior del taburete presenta un orificio (9) en posición correspondientemente enfrentada a dicho vástago (8) escamoteable, dimensionado para recibir y retener a este último, desde cuyo orificio y en dirección hacia el borde libre de la pared existe una porción (10) deformada, expandida hacia fuera, que durante el despliegue del taburete alcanza y actúa sobre el extremo libre semiesférico de dicho vástago (8) para empujarlo en contra de la acción del resorte (11) y permitir el alojamiento de éste en el interior del orificio (9) cuando se alcanza el enfrentamiento mutuo de ambos, merced a la recuperación de dicho resorte (11).»</w:t>
+      </w:r>
+    </w:p>
+    <w:p>
+      <w:pPr>
+        <w:jc w:val="center"/>
+      </w:pPr>
+      <w:r>
+        <w:drawing>
+          <wp:inline xmlns:a="http://schemas.openxmlformats.org/drawingml/2006/main" xmlns:pic="http://schemas.openxmlformats.org/drawingml/2006/picture">
+            <wp:extent cx="3240000" cy="4028840"/>
+            <wp:docPr id="9" name="Picture 9"/>
+            <wp:cNvGraphicFramePr>
+              <a:graphicFrameLocks noChangeAspect="1"/>
+            </wp:cNvGraphicFramePr>
+            <a:graphic>
+              <a:graphicData uri="http://schemas.openxmlformats.org/drawingml/2006/picture">
+                <pic:pic>
+                  <pic:nvPicPr>
+                    <pic:cNvPr id="0" name="patente1_ES1070877U.png"/>
+                    <pic:cNvPicPr/>
+                  </pic:nvPicPr>
+                  <pic:blipFill>
+                    <a:blip r:embed="rId18"/>
+                    <a:stretch>
+                      <a:fillRect/>
+                    </a:stretch>
+                  </pic:blipFill>
+                  <pic:spPr>
+                    <a:xfrm>
+                      <a:off x="0" y="0"/>
+                      <a:ext cx="3240000" cy="4028840"/>
+                    </a:xfrm>
+                    <a:prstGeom prst="rect"/>
+                  </pic:spPr>
+                </pic:pic>
+              </a:graphicData>
+            </a:graphic>
+          </wp:inline>
+        </w:drawing>
+      </w:r>
+    </w:p>
+    <w:p>
+      <w:pPr>
+        <w:jc w:val="center"/>
+      </w:pPr>
+      <w:r>
+        <w:rPr>
+          <w:b w:val="0"/>
+          <w:i/>
+          <w:sz w:val="18"/>
+        </w:rPr>
+        <w:t>Ilustración 6. Figura 1 del modelo de utilidad ES 1 070 877 U, con el detalle D del vástago de bloqueo. Fuente: OEPM / Google Patents.</w:t>
+      </w:r>
+    </w:p>
+    <w:p>
+      <w:r>
+        <w:rPr>
+          <w:b/>
+          <w:i w:val="0"/>
+        </w:rPr>
+        <w:t>¿Afecta a nuestro producto?</w:t>
       </w:r>
     </w:p>
     <w:p>
       <w:r>
         <w:rPr>
           <w:b w:val="0"/>
+          <w:i w:val="0"/>
         </w:rPr>
-        <w:t xml:space="preserve">Reivindicación principal: dispositivo de enclavamiento que, montado entre los elementos articulados del taburete, bloquea automáticamente la estructura al desplegarla e impide su plegado mientras no se accione el propio dispositivo. </w:t>
-      </w:r>
-      <w:r>
-        <w:rPr>
-          <w:b w:val="0"/>
-          <w:highlight w:val="yellow"/>
-        </w:rPr>
-        <w:t>[Comprobar y copiar el texto literal de la reivindicación 1 en Google Patents / INVENES]</w:t>
-      </w:r>
-    </w:p>
-    <w:p>
-      <w:r>
-        <w:rPr>
-          <w:b w:val="0"/>
-          <w:highlight w:val="yellow"/>
-        </w:rPr>
-        <w:t>[Insertar aquí el dibujo principal de la patente]</w:t>
-      </w:r>
-    </w:p>
-    <w:p>
-      <w:r>
-        <w:rPr>
-          <w:b w:val="0"/>
-        </w:rPr>
-        <w:t>¿Afecta a nuestro producto? No. Aunque nuestro taburete también llevará un bloqueo en posición abierta, el modelo de utilidad está caducado (su protección máxima era de 10 años, hasta 2019), por lo que su contenido es de dominio público y puede usarse libremente.</w:t>
+        <w:t>No. Es el documento más parecido a nuestro producto, porque se trata precisamente de un taburete de dos peldaños con bloqueo automático al abrirlo. Sin embargo, el modelo de utilidad está caducado, así que su solución es de dominio público y se puede usar libremente. De hecho, es una buena referencia para el bloqueo automático que se busca (principio TRIZ 10, acción previa).</w:t>
       </w:r>
     </w:p>
     <w:p>
@@ -6070,90 +6115,165 @@
         <w:pStyle w:val="Heading3"/>
       </w:pPr>
       <w:r>
+        <w:rPr>
+          <w:b w:val="0"/>
+          <w:i w:val="0"/>
+        </w:rPr>
         <w:t>2.5.2. PATENTE SEGUNDA: US 6 454 050 B2 — Foldable step stool with leg lock and handle</w:t>
+      </w:r>
+    </w:p>
+    <w:p>
+      <w:pPr>
+        <w:pStyle w:val="ListBullet"/>
+      </w:pPr>
+      <w:r>
+        <w:rPr>
+          <w:b w:val="0"/>
+          <w:i w:val="0"/>
+        </w:rPr>
+        <w:t>Tipo: patente de Estados Unidos.</w:t>
+      </w:r>
+    </w:p>
+    <w:p>
+      <w:pPr>
+        <w:pStyle w:val="ListBullet"/>
+      </w:pPr>
+      <w:r>
+        <w:rPr>
+          <w:b w:val="0"/>
+          <w:i w:val="0"/>
+        </w:rPr>
+        <w:t>Titular original: Cosco Management, Inc. (actualmente Dorel Home Furnishings). Inventores: William B. Gibson y otros.</w:t>
+      </w:r>
+    </w:p>
+    <w:p>
+      <w:pPr>
+        <w:pStyle w:val="ListBullet"/>
+      </w:pPr>
+      <w:r>
+        <w:rPr>
+          <w:b w:val="0"/>
+          <w:i w:val="0"/>
+        </w:rPr>
+        <w:t>Fecha de solicitud: 17/04/2001, con prioridad de 11/08/2000. Concesión: 24/09/2002.</w:t>
+      </w:r>
+    </w:p>
+    <w:p>
+      <w:pPr>
+        <w:pStyle w:val="ListBullet"/>
+      </w:pPr>
+      <w:r>
+        <w:rPr>
+          <w:b w:val="0"/>
+          <w:i w:val="0"/>
+        </w:rPr>
+        <w:t>Situación: expirada.</w:t>
+      </w:r>
+    </w:p>
+    <w:p>
+      <w:r>
+        <w:rPr>
+          <w:b/>
+          <w:i w:val="0"/>
+        </w:rPr>
+        <w:t>Resumen:</w:t>
       </w:r>
     </w:p>
     <w:p>
       <w:r>
         <w:rPr>
           <w:b w:val="0"/>
+          <w:i w:val="0"/>
         </w:rPr>
-        <w:t xml:space="preserve">Tipo: </w:t>
+        <w:t>Taburete-escalera plegable con un bastidor formado por una pata delantera y una pata trasera que se mueven una respecto a la otra, y un asa de transporte que gira sobre una de las patas. Una pieza de retención unida al asa gira con ella y bloquea la pata delantera con la trasera cuando el taburete está plegado, de modo que no se abre al transportarlo.</w:t>
       </w:r>
+    </w:p>
+    <w:p>
       <w:r>
         <w:rPr>
-          <w:b w:val="0"/>
+          <w:b/>
+          <w:i w:val="0"/>
         </w:rPr>
-        <w:t xml:space="preserve">patente de Estados Unidos. </w:t>
-      </w:r>
-      <w:r>
-        <w:rPr>
-          <w:b w:val="0"/>
-        </w:rPr>
-        <w:t xml:space="preserve">Titular original: </w:t>
-      </w:r>
-      <w:r>
-        <w:rPr>
-          <w:b w:val="0"/>
-        </w:rPr>
-        <w:t xml:space="preserve">Cosco Management Inc. (actualmente Dorel Home Furnishings). </w:t>
-      </w:r>
-      <w:r>
-        <w:rPr>
-          <w:b w:val="0"/>
-        </w:rPr>
-        <w:t xml:space="preserve">Fecha de solicitud: </w:t>
-      </w:r>
-      <w:r>
-        <w:rPr>
-          <w:b w:val="0"/>
-        </w:rPr>
-        <w:t xml:space="preserve">29/06/2001, con prioridad de 11/08/2000. </w:t>
-      </w:r>
-      <w:r>
-        <w:rPr>
-          <w:b w:val="0"/>
-        </w:rPr>
-        <w:t xml:space="preserve">Estado: </w:t>
-      </w:r>
-      <w:r>
-        <w:rPr>
-          <w:b w:val="0"/>
-        </w:rPr>
-        <w:t>expirada.</w:t>
+        <w:t>Reivindicación 1 (traducción propia):</w:t>
       </w:r>
     </w:p>
     <w:p>
       <w:r>
         <w:rPr>
           <w:b w:val="0"/>
+          <w:i/>
         </w:rPr>
-        <w:t>Resumen: taburete plegable con un bastidor formado por una pata delantera y una pata trasera que se mueven una respecto de la otra, y un asa de transporte que gira sobre la pata delantera. Al girar el asa, una pieza de retención unida a ella bloquea la pata trasera con la delantera.</w:t>
+        <w:t>«Taburete-escalera que comprende un bastidor con una pata delantera y una pata trasera acoplada a la delantera para moverse respecto a ella, un asa, un soporte de pivote configurado para que el asa gire sobre la pata delantera alrededor de un eje, y un elemento de retención unido al asa, que gira con ella y está dispuesto para atrapar una parte de la pata trasera entre el soporte de pivote y el propio elemento de retención cuando el asa se lleva a una posición determinada respecto a la pata trasera, bloqueando la pata delantera con la trasera cuando ambas están juntas en posición plegada.»</w:t>
+      </w:r>
+    </w:p>
+    <w:p>
+      <w:pPr>
+        <w:jc w:val="center"/>
+      </w:pPr>
+      <w:r>
+        <w:drawing>
+          <wp:inline xmlns:a="http://schemas.openxmlformats.org/drawingml/2006/main" xmlns:pic="http://schemas.openxmlformats.org/drawingml/2006/picture">
+            <wp:extent cx="3240000" cy="5031101"/>
+            <wp:docPr id="10" name="Picture 10"/>
+            <wp:cNvGraphicFramePr>
+              <a:graphicFrameLocks noChangeAspect="1"/>
+            </wp:cNvGraphicFramePr>
+            <a:graphic>
+              <a:graphicData uri="http://schemas.openxmlformats.org/drawingml/2006/picture">
+                <pic:pic>
+                  <pic:nvPicPr>
+                    <pic:cNvPr id="0" name="patente2_US6454050.png"/>
+                    <pic:cNvPicPr/>
+                  </pic:nvPicPr>
+                  <pic:blipFill>
+                    <a:blip r:embed="rId19"/>
+                    <a:stretch>
+                      <a:fillRect/>
+                    </a:stretch>
+                  </pic:blipFill>
+                  <pic:spPr>
+                    <a:xfrm>
+                      <a:off x="0" y="0"/>
+                      <a:ext cx="3240000" cy="5031101"/>
+                    </a:xfrm>
+                    <a:prstGeom prst="rect"/>
+                  </pic:spPr>
+                </pic:pic>
+              </a:graphicData>
+            </a:graphic>
+          </wp:inline>
+        </w:drawing>
+      </w:r>
+    </w:p>
+    <w:p>
+      <w:pPr>
+        <w:jc w:val="center"/>
+      </w:pPr>
+      <w:r>
+        <w:rPr>
+          <w:b w:val="0"/>
+          <w:i/>
+          <w:sz w:val="18"/>
+        </w:rPr>
+        <w:t>Ilustración 7. Figuras 1 y 2 de la patente US 6 454 050 B2. Fuente: USPTO / Google Patents.</w:t>
+      </w:r>
+    </w:p>
+    <w:p>
+      <w:r>
+        <w:rPr>
+          <w:b/>
+          <w:i w:val="0"/>
+        </w:rPr>
+        <w:t>¿Afecta a nuestro producto?</w:t>
       </w:r>
     </w:p>
     <w:p>
       <w:r>
         <w:rPr>
           <w:b w:val="0"/>
+          <w:i w:val="0"/>
         </w:rPr>
-        <w:t>Reivindicación principal: taburete que comprende un bastidor con pata delantera y pata trasera acopladas para moverse entre sí, un asa, un soporte de pivote que permite el giro del asa sobre la pata delantera y un retenedor unido al asa que atrapa una parte de la pata trasera para bloquear ambas patas cuando el asa llega a una posición determinada.</w:t>
-      </w:r>
-    </w:p>
-    <w:p>
-      <w:r>
-        <w:rPr>
-          <w:b w:val="0"/>
-          <w:highlight w:val="yellow"/>
-        </w:rPr>
-        <w:t>[Insertar aquí el dibujo principal de la patente]</w:t>
-      </w:r>
-    </w:p>
-    <w:p>
-      <w:r>
-        <w:rPr>
-          <w:b w:val="0"/>
-        </w:rPr>
-        <w:t>¿Afecta a nuestro producto? No. Es una patente estadounidense, sin efectos en España, y además ha expirado (más de 20 años desde su solicitud). Es interesante porque combina asa y bloqueo en una sola pieza, una idea que podría aprovecharse.</w:t>
+        <w:t>No. Es una patente estadounidense, sin efectos en España, y además ha expirado. Aporta una idea interesante: usar la propia asa de transporte para mantener el taburete cerrado mientras se lleva, algo que también es útil en nuestro producto para que no se abra al colgarlo en la pared.</w:t>
       </w:r>
     </w:p>
     <w:p>
@@ -6161,102 +6281,165 @@
         <w:pStyle w:val="Heading3"/>
       </w:pPr>
       <w:r>
+        <w:rPr>
+          <w:b w:val="0"/>
+          <w:i w:val="0"/>
+        </w:rPr>
         <w:t>2.5.3. PATENTE TERCERA: US 6 966 404 B2 — Folding step stool</w:t>
+      </w:r>
+    </w:p>
+    <w:p>
+      <w:pPr>
+        <w:pStyle w:val="ListBullet"/>
+      </w:pPr>
+      <w:r>
+        <w:rPr>
+          <w:b w:val="0"/>
+          <w:i w:val="0"/>
+        </w:rPr>
+        <w:t>Tipo: patente de Estados Unidos.</w:t>
+      </w:r>
+    </w:p>
+    <w:p>
+      <w:pPr>
+        <w:pStyle w:val="ListBullet"/>
+      </w:pPr>
+      <w:r>
+        <w:rPr>
+          <w:b w:val="0"/>
+          <w:i w:val="0"/>
+        </w:rPr>
+        <w:t>Titular original: Cosco Management, Inc. (actualmente Dorel Home Furnishings). Inventor: Paul K. Meeker.</w:t>
+      </w:r>
+    </w:p>
+    <w:p>
+      <w:pPr>
+        <w:pStyle w:val="ListBullet"/>
+      </w:pPr>
+      <w:r>
+        <w:rPr>
+          <w:b w:val="0"/>
+          <w:i w:val="0"/>
+        </w:rPr>
+        <w:t>Fecha de solicitud: 19/05/2003. Concesión: 22/11/2005.</w:t>
+      </w:r>
+    </w:p>
+    <w:p>
+      <w:pPr>
+        <w:pStyle w:val="ListBullet"/>
+      </w:pPr>
+      <w:r>
+        <w:rPr>
+          <w:b w:val="0"/>
+          <w:i w:val="0"/>
+        </w:rPr>
+        <w:t>Situación: expirada por impago de tasas.</w:t>
+      </w:r>
+    </w:p>
+    <w:p>
+      <w:r>
+        <w:rPr>
+          <w:b/>
+          <w:i w:val="0"/>
+        </w:rPr>
+        <w:t>Resumen:</w:t>
       </w:r>
     </w:p>
     <w:p>
       <w:r>
         <w:rPr>
           <w:b w:val="0"/>
+          <w:i w:val="0"/>
         </w:rPr>
-        <w:t xml:space="preserve">Tipo: </w:t>
+        <w:t>Taburete de un escalón con dos patas que giran respecto al escalón. Cada pata tiene un soporte de bloqueo que la mantiene fija en posición de uso y, al accionarlo, permite plegar las patas paralelas al escalón para guardarlo. El escalón tiene unas aberturas que sirven de asa y una ventana por la que se ve el soporte de bloqueo cuando está bien cerrado.</w:t>
       </w:r>
+    </w:p>
+    <w:p>
       <w:r>
         <w:rPr>
-          <w:b w:val="0"/>
+          <w:b/>
+          <w:i w:val="0"/>
         </w:rPr>
-        <w:t xml:space="preserve">patente de Estados Unidos. </w:t>
-      </w:r>
-      <w:r>
-        <w:rPr>
-          <w:b w:val="0"/>
-        </w:rPr>
-        <w:t xml:space="preserve">Inventor: </w:t>
-      </w:r>
-      <w:r>
-        <w:rPr>
-          <w:b w:val="0"/>
-        </w:rPr>
-        <w:t xml:space="preserve">Paul K. Meeker. </w:t>
-      </w:r>
-      <w:r>
-        <w:rPr>
-          <w:b w:val="0"/>
-        </w:rPr>
-        <w:t xml:space="preserve">Titular original: </w:t>
-      </w:r>
-      <w:r>
-        <w:rPr>
-          <w:b w:val="0"/>
-        </w:rPr>
-        <w:t xml:space="preserve">Cosco Management Inc. </w:t>
-      </w:r>
-      <w:r>
-        <w:rPr>
-          <w:b w:val="0"/>
-        </w:rPr>
-        <w:t xml:space="preserve">Fecha de solicitud: </w:t>
-      </w:r>
-      <w:r>
-        <w:rPr>
-          <w:b w:val="0"/>
-        </w:rPr>
-        <w:t xml:space="preserve">19/05/2003. </w:t>
-      </w:r>
-      <w:r>
-        <w:rPr>
-          <w:b w:val="0"/>
-        </w:rPr>
-        <w:t xml:space="preserve">Estado: </w:t>
-      </w:r>
-      <w:r>
-        <w:rPr>
-          <w:b w:val="0"/>
-        </w:rPr>
-        <w:t>expirada (impago de tasas).</w:t>
+        <w:t>Reivindicación 1 (traducción propia):</w:t>
       </w:r>
     </w:p>
     <w:p>
       <w:r>
         <w:rPr>
           <w:b w:val="0"/>
+          <w:i/>
         </w:rPr>
-        <w:t>Resumen: taburete plegable con un escalón superior y al menos dos patas plegables unidas a él. Unos mecanismos de bloqueo, que deslizan por la cara inferior del escalón y giran respecto a cada pata, mantienen las patas en posición abierta; al accionarlos, las patas se pliegan paralelas al escalón. El escalón tiene unas aberturas que forman un asa de transporte.</w:t>
+        <w:t>«Taburete-escalera que comprende un escalón con una superficie superior y una cara inferior; una primera y una segunda pata, cada una unida de forma pivotante al escalón, dispuestas extremo con extremo y paralelas al escalón en la posición cerrada de almacenaje, y separadas y no paralelas en la posición abierta de uso; y un conjunto de bloqueo para cada pata, con un soporte de bloqueo cuyo extremo inferior está unido a la cara interior de la pata y cuyo extremo superior está unido a la cara inferior del escalón, que mantiene cada pata fija respecto al escalón en la posición abierta; donde la superficie superior tiene una abertura con una plataforma rebajada y una abertura indicadora visual que deja ver una parte del soporte de bloqueo cuando este está en posición bloqueada.»</w:t>
+      </w:r>
+    </w:p>
+    <w:p>
+      <w:pPr>
+        <w:jc w:val="center"/>
+      </w:pPr>
+      <w:r>
+        <w:drawing>
+          <wp:inline xmlns:a="http://schemas.openxmlformats.org/drawingml/2006/main" xmlns:pic="http://schemas.openxmlformats.org/drawingml/2006/picture">
+            <wp:extent cx="3240000" cy="4268624"/>
+            <wp:docPr id="11" name="Picture 11"/>
+            <wp:cNvGraphicFramePr>
+              <a:graphicFrameLocks noChangeAspect="1"/>
+            </wp:cNvGraphicFramePr>
+            <a:graphic>
+              <a:graphicData uri="http://schemas.openxmlformats.org/drawingml/2006/picture">
+                <pic:pic>
+                  <pic:nvPicPr>
+                    <pic:cNvPr id="0" name="patente3_US6966404.png"/>
+                    <pic:cNvPicPr/>
+                  </pic:nvPicPr>
+                  <pic:blipFill>
+                    <a:blip r:embed="rId20"/>
+                    <a:stretch>
+                      <a:fillRect/>
+                    </a:stretch>
+                  </pic:blipFill>
+                  <pic:spPr>
+                    <a:xfrm>
+                      <a:off x="0" y="0"/>
+                      <a:ext cx="3240000" cy="4268624"/>
+                    </a:xfrm>
+                    <a:prstGeom prst="rect"/>
+                  </pic:spPr>
+                </pic:pic>
+              </a:graphicData>
+            </a:graphic>
+          </wp:inline>
+        </w:drawing>
+      </w:r>
+    </w:p>
+    <w:p>
+      <w:pPr>
+        <w:jc w:val="center"/>
+      </w:pPr>
+      <w:r>
+        <w:rPr>
+          <w:b w:val="0"/>
+          <w:i/>
+          <w:sz w:val="18"/>
+        </w:rPr>
+        <w:t>Ilustración 8. Figuras 1 y 2 de la patente US 6 966 404 B2. Fuente: USPTO / Google Patents.</w:t>
+      </w:r>
+    </w:p>
+    <w:p>
+      <w:r>
+        <w:rPr>
+          <w:b/>
+          <w:i w:val="0"/>
+        </w:rPr>
+        <w:t>¿Afecta a nuestro producto?</w:t>
       </w:r>
     </w:p>
     <w:p>
       <w:r>
         <w:rPr>
           <w:b w:val="0"/>
+          <w:i w:val="0"/>
         </w:rPr>
-        <w:t>Reivindicación principal: taburete que comprende un escalón, al menos dos patas plegables unidas al escalón y un mecanismo de bloqueo acoplado de forma deslizante a la cara inferior del escalón y de forma pivotante a cada pata, que bloquea y sostiene cada pata en la posición abierta de uso.</w:t>
-      </w:r>
-    </w:p>
-    <w:p>
-      <w:r>
-        <w:rPr>
-          <w:b w:val="0"/>
-          <w:highlight w:val="yellow"/>
-        </w:rPr>
-        <w:t>[Insertar aquí el dibujo principal de la patente]</w:t>
-      </w:r>
-    </w:p>
-    <w:p>
-      <w:r>
-        <w:rPr>
-          <w:b w:val="0"/>
-        </w:rPr>
-        <w:t>¿Afecta a nuestro producto? No, por los mismos motivos que la anterior (patente estadounidense y expirada). Su idea del asa formada por aberturas en el escalón es aplicable a la plataforma de nuestro taburete.</w:t>
+        <w:t>No. Es una patente estadounidense, sin efectos en España, y ha expirado. Aporta dos ideas útiles: el asa formada por aberturas en la plataforma y, sobre todo, el indicador visual de bloqueo, que responde a la función comunicativa «mostrar cómo se abre y cuándo está bloqueado» del apartado 1.4.</w:t>
       </w:r>
     </w:p>
     <w:p>
@@ -6264,109 +6447,165 @@
         <w:pStyle w:val="Heading3"/>
       </w:pPr>
       <w:r>
+        <w:rPr>
+          <w:b w:val="0"/>
+          <w:i w:val="0"/>
+        </w:rPr>
         <w:t>2.5.4. PATENTE CUARTA: US 12 419 421 B2 — Foldable locking step stool</w:t>
+      </w:r>
+    </w:p>
+    <w:p>
+      <w:pPr>
+        <w:pStyle w:val="ListBullet"/>
+      </w:pPr>
+      <w:r>
+        <w:rPr>
+          <w:b w:val="0"/>
+          <w:i w:val="0"/>
+        </w:rPr>
+        <w:t>Tipo: patente de Estados Unidos (clasificación A47C 4/10).</w:t>
+      </w:r>
+    </w:p>
+    <w:p>
+      <w:pPr>
+        <w:pStyle w:val="ListBullet"/>
+      </w:pPr>
+      <w:r>
+        <w:rPr>
+          <w:b w:val="0"/>
+          <w:i w:val="0"/>
+        </w:rPr>
+        <w:t>Titular: Jool Products, LLC (Lakewood, Nueva Jersey). Inventores: Judah Bergman, Yishak Sultan y Jiaxuan Ma.</w:t>
+      </w:r>
+    </w:p>
+    <w:p>
+      <w:pPr>
+        <w:pStyle w:val="ListBullet"/>
+      </w:pPr>
+      <w:r>
+        <w:rPr>
+          <w:b w:val="0"/>
+          <w:i w:val="0"/>
+        </w:rPr>
+        <w:t>Nº de solicitud: 17/743,098. Fecha de solicitud: 12/05/2022. Publicación de la solicitud: US 2023/0363538 A1 (16/11/2023). Concesión: 23/09/2025.</w:t>
+      </w:r>
+    </w:p>
+    <w:p>
+      <w:pPr>
+        <w:pStyle w:val="ListBullet"/>
+      </w:pPr>
+      <w:r>
+        <w:rPr>
+          <w:b w:val="0"/>
+          <w:i w:val="0"/>
+        </w:rPr>
+        <w:t>Situación: en vigor en Estados Unidos.</w:t>
+      </w:r>
+    </w:p>
+    <w:p>
+      <w:r>
+        <w:rPr>
+          <w:b/>
+          <w:i w:val="0"/>
+        </w:rPr>
+        <w:t>Resumen:</w:t>
       </w:r>
     </w:p>
     <w:p>
       <w:r>
         <w:rPr>
           <w:b w:val="0"/>
+          <w:i w:val="0"/>
         </w:rPr>
-        <w:t xml:space="preserve">Tipo: </w:t>
+        <w:t>Taburete plegable cuya plataforma se divide en dos mitades unidas por una bisagra. Tiene un mecanismo de bloqueo a prueba de niños formado por dos deslizadores, uno en cada lado de la plataforma, que hay que accionar a la vez para liberar dos pestillos con muelle y poder plegarlo. Así se evita que un niño lo cierre y se pille los dedos. Incluye agarres antideslizantes sobremoldeados y un asa integrada que queda oculta cuando el taburete está en uso.</w:t>
       </w:r>
+    </w:p>
+    <w:p>
       <w:r>
         <w:rPr>
-          <w:b w:val="0"/>
+          <w:b/>
+          <w:i w:val="0"/>
         </w:rPr>
-        <w:t xml:space="preserve">patente de Estados Unidos. </w:t>
-      </w:r>
-      <w:r>
-        <w:rPr>
-          <w:b w:val="0"/>
-        </w:rPr>
-        <w:t xml:space="preserve">Titular: </w:t>
-      </w:r>
-      <w:r>
-        <w:rPr>
-          <w:b w:val="0"/>
-        </w:rPr>
-        <w:t xml:space="preserve">Jool Products LLC. </w:t>
-      </w:r>
-      <w:r>
-        <w:rPr>
-          <w:b w:val="0"/>
-        </w:rPr>
-        <w:t xml:space="preserve">Inventores: </w:t>
-      </w:r>
-      <w:r>
-        <w:rPr>
-          <w:b w:val="0"/>
-        </w:rPr>
-        <w:t xml:space="preserve">Judah Bergman, Yishak Sultan y otros. </w:t>
-      </w:r>
-      <w:r>
-        <w:rPr>
-          <w:b w:val="0"/>
-        </w:rPr>
-        <w:t xml:space="preserve">Nº de solicitud: </w:t>
-      </w:r>
-      <w:r>
-        <w:rPr>
-          <w:b w:val="0"/>
-        </w:rPr>
-        <w:t xml:space="preserve">US 17/743,098 (publicada como US 2023/0363538 A1). </w:t>
-      </w:r>
-      <w:r>
-        <w:rPr>
-          <w:b w:val="0"/>
-        </w:rPr>
-        <w:t xml:space="preserve">Estado: </w:t>
-      </w:r>
-      <w:r>
-        <w:rPr>
-          <w:b w:val="0"/>
-        </w:rPr>
-        <w:t>en vigor (concedida en 2025).</w:t>
+        <w:t>Reivindicación 1 (traducción propia):</w:t>
       </w:r>
     </w:p>
     <w:p>
       <w:r>
         <w:rPr>
           <w:b w:val="0"/>
+          <w:i/>
         </w:rPr>
-        <w:t>Resumen: taburete plegable cuya plataforma se divide en dos mitades unidas por una bisagra. Dispone de un mecanismo de bloqueo a prueba de niños formado por dos deslizadores que hay que accionar a la vez para liberar unos pestillos y poder plegarlo, evitando así que el usuario se pille los dedos. Incluye agarres sobremoldeados y un asa integrada que queda oculta durante el uso.</w:t>
+        <w:t>«Taburete plegable con bloqueo que comprende: una plataforma configurada para plegarse mediante bisagra en un primer y un segundo miembro; patas unidas mediante bisagra a la plataforma; y un mecanismo de bloqueo a prueba de niños; con una posición abierta, en la que ambos miembros de la plataforma quedan bloqueados en un mismo plano y el taburete está listo para usarse, y una posición cerrada, en la que quedan desbloqueados y plegados para moverlo o guardarlo; donde el mecanismo comprende un primer y un segundo deslizador situados en bordes laterales opuestos de la plataforma, cada uno accionable manualmente solo hacia fuera y conectado a un pestillo con muelle que encaja en un hueco de los miembros de la plataforma, estando los pestillos enlazados de forma que es necesario desplazar ambos deslizadores a la vez para liberar los dos pestillos.»</w:t>
+      </w:r>
+    </w:p>
+    <w:p>
+      <w:pPr>
+        <w:jc w:val="center"/>
+      </w:pPr>
+      <w:r>
+        <w:drawing>
+          <wp:inline xmlns:a="http://schemas.openxmlformats.org/drawingml/2006/main" xmlns:pic="http://schemas.openxmlformats.org/drawingml/2006/picture">
+            <wp:extent cx="5040000" cy="2857556"/>
+            <wp:docPr id="12" name="Picture 12"/>
+            <wp:cNvGraphicFramePr>
+              <a:graphicFrameLocks noChangeAspect="1"/>
+            </wp:cNvGraphicFramePr>
+            <a:graphic>
+              <a:graphicData uri="http://schemas.openxmlformats.org/drawingml/2006/picture">
+                <pic:pic>
+                  <pic:nvPicPr>
+                    <pic:cNvPr id="0" name="patente4_US12419421.png"/>
+                    <pic:cNvPicPr/>
+                  </pic:nvPicPr>
+                  <pic:blipFill>
+                    <a:blip r:embed="rId21"/>
+                    <a:stretch>
+                      <a:fillRect/>
+                    </a:stretch>
+                  </pic:blipFill>
+                  <pic:spPr>
+                    <a:xfrm>
+                      <a:off x="0" y="0"/>
+                      <a:ext cx="5040000" cy="2857556"/>
+                    </a:xfrm>
+                    <a:prstGeom prst="rect"/>
+                  </pic:spPr>
+                </pic:pic>
+              </a:graphicData>
+            </a:graphic>
+          </wp:inline>
+        </w:drawing>
+      </w:r>
+    </w:p>
+    <w:p>
+      <w:pPr>
+        <w:jc w:val="center"/>
+      </w:pPr>
+      <w:r>
+        <w:rPr>
+          <w:b w:val="0"/>
+          <w:i/>
+          <w:sz w:val="18"/>
+        </w:rPr>
+        <w:t>Ilustración 9. Figuras 1 y 3 de la patente US 12 419 421 B2. Fuente: USPTO.</w:t>
+      </w:r>
+    </w:p>
+    <w:p>
+      <w:r>
+        <w:rPr>
+          <w:b/>
+          <w:i w:val="0"/>
+        </w:rPr>
+        <w:t>¿Afecta a nuestro producto?</w:t>
       </w:r>
     </w:p>
     <w:p>
       <w:r>
         <w:rPr>
           <w:b w:val="0"/>
+          <w:i w:val="0"/>
         </w:rPr>
-        <w:t>Reivindicación principal: taburete plegable que comprende una plataforma que se pliega mediante bisagra en un primer y un segundo miembro, patas unidas con bisagra a la plataforma y un mecanismo de bloqueo a prueba de niños, de forma que en posición abierta ambos miembros quedan bloqueados en un mismo plano y en posición cerrada quedan desbloqueados y plegados; el mecanismo comprende un par de elementos deslizantes que deben accionarse simultáneamente para desbloquearlo.</w:t>
-      </w:r>
-    </w:p>
-    <w:p>
-      <w:r>
-        <w:rPr>
-          <w:b w:val="0"/>
-          <w:highlight w:val="yellow"/>
-        </w:rPr>
-        <w:t>[Insertar aquí el dibujo principal de la patente]</w:t>
-      </w:r>
-    </w:p>
-    <w:p>
-      <w:r>
-        <w:rPr>
-          <w:b w:val="0"/>
-        </w:rPr>
-        <w:t xml:space="preserve">¿Afecta a nuestro producto? En principio no. La patente solo tiene efectos en Estados Unidos y nuestro diseño no divide la plataforma en dos mitades ni usa dos deslizadores simultáneos. </w:t>
-      </w:r>
-      <w:r>
-        <w:rPr>
-          <w:b w:val="0"/>
-          <w:highlight w:val="yellow"/>
-        </w:rPr>
-        <w:t>[Comprobar en Espacenet si existe una solicitud europea (EP) o internacional (WO) de la misma familia]</w:t>
+        <w:t>No. La patente solo protege el invento en Estados Unidos: en su portada no figura ninguna solicitud internacional (PCT) ni prioridad extranjera, y en la búsqueda realizada no se ha encontrado ninguna solicitud europea de la misma familia. Además, nuestro diseño no divide la plataforma en dos mitades ni usa dos deslizadores simultáneos, que son elementos esenciales de la reivindicación. Si en el futuro se quisiera vender el producto en Estados Unidos, habría que evitar ese mecanismo concreto.</w:t>
       </w:r>
     </w:p>
     <w:p>
@@ -6412,13 +6651,14 @@
     <w:tbl>
       <w:tblPr>
         <w:tblStyle w:val="TableGrid"/>
-        <w:tblW w:type="auto" w:w="0"/>
+        <w:tblW w:type="dxa" w:w="9070"/>
         <w:tblLook w:firstColumn="1" w:firstRow="1" w:lastColumn="0" w:lastRow="0" w:noHBand="0" w:noVBand="1" w:val="04A0"/>
+        <w:tblLayout w:type="fixed"/>
       </w:tblPr>
       <w:tblGrid>
-        <w:gridCol w:w="2880"/>
-        <w:gridCol w:w="2880"/>
-        <w:gridCol w:w="2880"/>
+        <w:gridCol w:w="2607"/>
+        <w:gridCol w:w="5102"/>
+        <w:gridCol w:w="1360"/>
       </w:tblGrid>
       <w:tr>
         <w:tc>
@@ -6567,12 +6807,11 @@
             <w:tcW w:type="dxa" w:w="2608"/>
           </w:tcPr>
           <w:p>
-            <w:r/>
             <w:r>
               <w:rPr>
                 <w:sz w:val="17"/>
               </w:rPr>
-              <w:t>Reglamento (CE) 1907/2006 (REACH)</w:t>
+              <w:t>Real Decreto 1468/1988, Reglamento de etiquetado, presentación y publicidad de los productos industriales</w:t>
             </w:r>
           </w:p>
         </w:tc>
@@ -6581,13 +6820,11 @@
             <w:tcW w:type="dxa" w:w="5102"/>
           </w:tcPr>
           <w:p>
-            <w:r/>
             <w:r>
               <w:rPr>
                 <w:sz w:val="17"/>
-                <w:highlight w:val="yellow"/>
-              </w:rPr>
-              <w:t>Restringe sustancias peligrosas en los artículos. Afecta a tacos y recubrimientos de caucho o TPE en contacto con la piel (anexo XVII, entrada 50: HAP ≤ 1 mg/kg).</w:t>
+              </w:rPr>
+              <w:t>Información mínima obligatoria en el producto o su embalaje para la venta al consumidor: nombre del producto, fabricante o importador, características, instrucciones de uso y advertencias.</w:t>
             </w:r>
           </w:p>
         </w:tc>
@@ -6596,7 +6833,6 @@
             <w:tcW w:type="dxa" w:w="1361"/>
           </w:tcPr>
           <w:p>
-            <w:r/>
             <w:r>
               <w:rPr>
                 <w:sz w:val="17"/>
@@ -6617,7 +6853,7 @@
               <w:rPr>
                 <w:sz w:val="17"/>
               </w:rPr>
-              <w:t>Ley 7/2022 de residuos y suelos contaminados y RD 1055/2022 de envases</w:t>
+              <w:t>Reglamento (CE) 1907/2006 (REACH)</w:t>
             </w:r>
           </w:p>
         </w:tc>
@@ -6626,12 +6862,11 @@
             <w:tcW w:type="dxa" w:w="5102"/>
           </w:tcPr>
           <w:p>
-            <w:r/>
             <w:r>
               <w:rPr>
                 <w:sz w:val="17"/>
               </w:rPr>
-              <w:t>Gestión de residuos y responsabilidad ampliada del productor sobre los envases (caja de cartón).</w:t>
+              <w:t>Restringe sustancias peligrosas en los artículos. Según la entrada 50 del anexo XVII (modificada por el Reglamento (UE) 1272/2013), las partes de caucho o plástico en contacto directo y prolongado con la piel, como los tacos y los recubrimientos antideslizantes, no pueden contener más de 1 mg/kg de cada hidrocarburo aromático policíclico (HAP).</w:t>
             </w:r>
           </w:p>
         </w:tc>
@@ -6660,9 +6895,8 @@
             <w:r>
               <w:rPr>
                 <w:sz w:val="17"/>
-                <w:highlight w:val="yellow"/>
-              </w:rPr>
-              <w:t>Reglamento (UE) 2025/40 de envases y residuos de envases</w:t>
+              </w:rPr>
+              <w:t>Ley 7/2022 de residuos y suelos contaminados y RD 1055/2022 de envases</w:t>
             </w:r>
           </w:p>
         </w:tc>
@@ -6676,7 +6910,7 @@
               <w:rPr>
                 <w:sz w:val="17"/>
               </w:rPr>
-              <w:t>Reducción de envases, contenido reciclable y etiquetado de los materiales del embalaje.</w:t>
+              <w:t>Gestión de residuos y responsabilidad ampliada del productor sobre los envases (caja de cartón).</w:t>
             </w:r>
           </w:p>
         </w:tc>
@@ -6690,7 +6924,48 @@
               <w:rPr>
                 <w:sz w:val="17"/>
               </w:rPr>
-              <w:t>Obligatorio (aplicación progresiva)</w:t>
+              <w:t>Obligatorio</w:t>
+            </w:r>
+          </w:p>
+        </w:tc>
+      </w:tr>
+      <w:tr>
+        <w:tc>
+          <w:tcPr>
+            <w:tcW w:type="dxa" w:w="2608"/>
+          </w:tcPr>
+          <w:p>
+            <w:r>
+              <w:rPr>
+                <w:sz w:val="17"/>
+              </w:rPr>
+              <w:t>Reglamento (UE) 2025/40, de envases y residuos de envases</w:t>
+            </w:r>
+          </w:p>
+        </w:tc>
+        <w:tc>
+          <w:tcPr>
+            <w:tcW w:type="dxa" w:w="5102"/>
+          </w:tcPr>
+          <w:p>
+            <w:r>
+              <w:rPr>
+                <w:sz w:val="17"/>
+              </w:rPr>
+              <w:t>Publicado el 22/01/2025 y aplicable con carácter general desde el 12/08/2026; deroga la Directiva 94/62/CE. Reducción de envases, contenido reciclable y etiquetado de los materiales del embalaje.</w:t>
+            </w:r>
+          </w:p>
+        </w:tc>
+        <w:tc>
+          <w:tcPr>
+            <w:tcW w:type="dxa" w:w="1361"/>
+          </w:tcPr>
+          <w:p>
+            <w:r>
+              <w:rPr>
+                <w:sz w:val="17"/>
+              </w:rPr>
+              <w:t>Obligatorio</w:t>
             </w:r>
           </w:p>
         </w:tc>
@@ -6916,14 +7191,15 @@
     <w:tbl>
       <w:tblPr>
         <w:tblStyle w:val="TableGrid"/>
-        <w:tblW w:type="auto" w:w="0"/>
+        <w:tblW w:type="dxa" w:w="9070"/>
         <w:tblLook w:firstColumn="1" w:firstRow="1" w:lastColumn="0" w:lastRow="0" w:noHBand="0" w:noVBand="1" w:val="04A0"/>
+        <w:tblLayout w:type="fixed"/>
       </w:tblPr>
       <w:tblGrid>
-        <w:gridCol w:w="2160"/>
-        <w:gridCol w:w="2160"/>
-        <w:gridCol w:w="2160"/>
-        <w:gridCol w:w="2160"/>
+        <w:gridCol w:w="1700"/>
+        <w:gridCol w:w="1927"/>
+        <w:gridCol w:w="2607"/>
+        <w:gridCol w:w="2834"/>
       </w:tblGrid>
       <w:tr>
         <w:tc>
@@ -7245,7 +7521,7 @@
         <w:rPr>
           <w:b w:val="0"/>
         </w:rPr>
-        <w:t>En la Ilustración 6 se compara, mediante la rueda estratégica de ecodiseño vista en la asignatura, un taburete de acero típico del mercado con el objetivo del nuevo diseño. Las mejoras se centran en la selección de materiales, la reducción de material, la distribución (gracias al plegado plano) y el fin de vida.</w:t>
+        <w:t>En la Ilustración 10 se compara, mediante la rueda estratégica de ecodiseño vista en la asignatura, un taburete de acero típico del mercado con el objetivo del nuevo diseño. Las mejoras se centran en la selección de materiales, la reducción de material, la distribución (gracias al plegado plano) y el fin de vida.</w:t>
       </w:r>
     </w:p>
     <w:p>
@@ -7296,7 +7572,7 @@
           <w:i/>
           <w:sz w:val="18"/>
         </w:rPr>
-        <w:t>Ilustración 6. Rueda estratégica de ecodiseño: producto actual frente a objetivo. Valoración cualitativa propia.</w:t>
+        <w:t>Ilustración 10. Rueda estratégica de ecodiseño: producto actual frente a objetivo. Valoración cualitativa propia.</w:t>
       </w:r>
     </w:p>
     <w:p>
@@ -7605,7 +7881,7 @@
           <w:i/>
           <w:sz w:val="18"/>
         </w:rPr>
-        <w:t>Ilustración 7. Mapa mental del taburete-escalera. Elaboración propia.</w:t>
+        <w:t>Ilustración 11. Mapa mental del taburete-escalera. Elaboración propia.</w:t>
       </w:r>
     </w:p>
     <w:p>
@@ -7627,14 +7903,15 @@
     <w:tbl>
       <w:tblPr>
         <w:tblStyle w:val="TableGrid"/>
-        <w:tblW w:type="auto" w:w="0"/>
+        <w:tblW w:type="dxa" w:w="9070"/>
         <w:tblLook w:firstColumn="1" w:firstRow="1" w:lastColumn="0" w:lastRow="0" w:noHBand="0" w:noVBand="1" w:val="04A0"/>
+        <w:tblLayout w:type="fixed"/>
       </w:tblPr>
       <w:tblGrid>
-        <w:gridCol w:w="2160"/>
-        <w:gridCol w:w="2160"/>
-        <w:gridCol w:w="2160"/>
-        <w:gridCol w:w="2160"/>
+        <w:gridCol w:w="566"/>
+        <w:gridCol w:w="3685"/>
+        <w:gridCol w:w="566"/>
+        <w:gridCol w:w="4251"/>
       </w:tblGrid>
       <w:tr>
         <w:tc>
@@ -7690,7 +7967,7 @@
         </w:tc>
         <w:tc>
           <w:tcPr>
-            <w:tcW w:type="dxa" w:w="3685"/>
+            <w:tcW w:type="dxa" w:w="4252"/>
             <w:shd w:val="clear" w:color="auto" w:fill="C0392B"/>
           </w:tcPr>
           <w:p>
@@ -7751,7 +8028,7 @@
         </w:tc>
         <w:tc>
           <w:tcPr>
-            <w:tcW w:type="dxa" w:w="3685"/>
+            <w:tcW w:type="dxa" w:w="4252"/>
           </w:tcPr>
           <w:p>
             <w:r/>
@@ -7809,7 +8086,7 @@
         </w:tc>
         <w:tc>
           <w:tcPr>
-            <w:tcW w:type="dxa" w:w="3685"/>
+            <w:tcW w:type="dxa" w:w="4252"/>
           </w:tcPr>
           <w:p>
             <w:r/>
@@ -7867,7 +8144,7 @@
         </w:tc>
         <w:tc>
           <w:tcPr>
-            <w:tcW w:type="dxa" w:w="3685"/>
+            <w:tcW w:type="dxa" w:w="4252"/>
           </w:tcPr>
           <w:p>
             <w:r/>
@@ -7925,7 +8202,7 @@
         </w:tc>
         <w:tc>
           <w:tcPr>
-            <w:tcW w:type="dxa" w:w="3685"/>
+            <w:tcW w:type="dxa" w:w="4252"/>
           </w:tcPr>
           <w:p>
             <w:r/>
@@ -7983,7 +8260,7 @@
         </w:tc>
         <w:tc>
           <w:tcPr>
-            <w:tcW w:type="dxa" w:w="3685"/>
+            <w:tcW w:type="dxa" w:w="4252"/>
           </w:tcPr>
           <w:p>
             <w:r/>
@@ -8041,7 +8318,7 @@
         </w:tc>
         <w:tc>
           <w:tcPr>
-            <w:tcW w:type="dxa" w:w="3685"/>
+            <w:tcW w:type="dxa" w:w="4252"/>
           </w:tcPr>
           <w:p>
             <w:r/>
@@ -8099,7 +8376,7 @@
         </w:tc>
         <w:tc>
           <w:tcPr>
-            <w:tcW w:type="dxa" w:w="3685"/>
+            <w:tcW w:type="dxa" w:w="4252"/>
           </w:tcPr>
           <w:p>
             <w:r/>
@@ -8157,7 +8434,7 @@
         </w:tc>
         <w:tc>
           <w:tcPr>
-            <w:tcW w:type="dxa" w:w="3685"/>
+            <w:tcW w:type="dxa" w:w="4252"/>
           </w:tcPr>
           <w:p>
             <w:r/>
@@ -8215,7 +8492,7 @@
         </w:tc>
         <w:tc>
           <w:tcPr>
-            <w:tcW w:type="dxa" w:w="3685"/>
+            <w:tcW w:type="dxa" w:w="4252"/>
           </w:tcPr>
           <w:p>
             <w:r/>
@@ -8273,7 +8550,7 @@
         </w:tc>
         <w:tc>
           <w:tcPr>
-            <w:tcW w:type="dxa" w:w="3685"/>
+            <w:tcW w:type="dxa" w:w="4252"/>
           </w:tcPr>
           <w:p>
             <w:r/>
@@ -8331,7 +8608,7 @@
         </w:tc>
         <w:tc>
           <w:tcPr>
-            <w:tcW w:type="dxa" w:w="3685"/>
+            <w:tcW w:type="dxa" w:w="4252"/>
           </w:tcPr>
           <w:p>
             <w:r/>
@@ -8389,7 +8666,7 @@
         </w:tc>
         <w:tc>
           <w:tcPr>
-            <w:tcW w:type="dxa" w:w="3685"/>
+            <w:tcW w:type="dxa" w:w="4252"/>
           </w:tcPr>
           <w:p>
             <w:r/>
@@ -8447,7 +8724,7 @@
         </w:tc>
         <w:tc>
           <w:tcPr>
-            <w:tcW w:type="dxa" w:w="3685"/>
+            <w:tcW w:type="dxa" w:w="4252"/>
           </w:tcPr>
           <w:p>
             <w:r/>
@@ -8505,7 +8782,7 @@
         </w:tc>
         <w:tc>
           <w:tcPr>
-            <w:tcW w:type="dxa" w:w="3685"/>
+            <w:tcW w:type="dxa" w:w="4252"/>
           </w:tcPr>
           <w:p>
             <w:r/>
@@ -8563,7 +8840,7 @@
         </w:tc>
         <w:tc>
           <w:tcPr>
-            <w:tcW w:type="dxa" w:w="3685"/>
+            <w:tcW w:type="dxa" w:w="4252"/>
           </w:tcPr>
           <w:p>
             <w:r/>
@@ -8621,7 +8898,7 @@
         </w:tc>
         <w:tc>
           <w:tcPr>
-            <w:tcW w:type="dxa" w:w="3685"/>
+            <w:tcW w:type="dxa" w:w="4252"/>
           </w:tcPr>
           <w:p>
             <w:r/>
@@ -8679,7 +8956,7 @@
         </w:tc>
         <w:tc>
           <w:tcPr>
-            <w:tcW w:type="dxa" w:w="3685"/>
+            <w:tcW w:type="dxa" w:w="4252"/>
           </w:tcPr>
           <w:p>
             <w:r/>
@@ -8737,7 +9014,7 @@
         </w:tc>
         <w:tc>
           <w:tcPr>
-            <w:tcW w:type="dxa" w:w="3685"/>
+            <w:tcW w:type="dxa" w:w="4252"/>
           </w:tcPr>
           <w:p>
             <w:r/>
@@ -8795,7 +9072,7 @@
         </w:tc>
         <w:tc>
           <w:tcPr>
-            <w:tcW w:type="dxa" w:w="3685"/>
+            <w:tcW w:type="dxa" w:w="4252"/>
           </w:tcPr>
           <w:p>
             <w:r/>
@@ -8853,7 +9130,7 @@
         </w:tc>
         <w:tc>
           <w:tcPr>
-            <w:tcW w:type="dxa" w:w="3685"/>
+            <w:tcW w:type="dxa" w:w="4252"/>
           </w:tcPr>
           <w:p>
             <w:r/>
@@ -8911,7 +9188,7 @@
         </w:tc>
         <w:tc>
           <w:tcPr>
-            <w:tcW w:type="dxa" w:w="3685"/>
+            <w:tcW w:type="dxa" w:w="4252"/>
           </w:tcPr>
           <w:p>
             <w:r/>
@@ -8969,7 +9246,7 @@
         </w:tc>
         <w:tc>
           <w:tcPr>
-            <w:tcW w:type="dxa" w:w="3685"/>
+            <w:tcW w:type="dxa" w:w="4252"/>
           </w:tcPr>
           <w:p>
             <w:r/>
@@ -9027,7 +9304,7 @@
         </w:tc>
         <w:tc>
           <w:tcPr>
-            <w:tcW w:type="dxa" w:w="3685"/>
+            <w:tcW w:type="dxa" w:w="4252"/>
           </w:tcPr>
           <w:p>
             <w:r/>
@@ -9085,7 +9362,7 @@
         </w:tc>
         <w:tc>
           <w:tcPr>
-            <w:tcW w:type="dxa" w:w="3685"/>
+            <w:tcW w:type="dxa" w:w="4252"/>
           </w:tcPr>
           <w:p>
             <w:r/>
@@ -9143,7 +9420,7 @@
         </w:tc>
         <w:tc>
           <w:tcPr>
-            <w:tcW w:type="dxa" w:w="3685"/>
+            <w:tcW w:type="dxa" w:w="4252"/>
           </w:tcPr>
           <w:p>
             <w:r/>
@@ -9201,7 +9478,7 @@
         </w:tc>
         <w:tc>
           <w:tcPr>
-            <w:tcW w:type="dxa" w:w="3685"/>
+            <w:tcW w:type="dxa" w:w="4252"/>
           </w:tcPr>
           <w:p>
             <w:r/>
@@ -9259,7 +9536,7 @@
         </w:tc>
         <w:tc>
           <w:tcPr>
-            <w:tcW w:type="dxa" w:w="3685"/>
+            <w:tcW w:type="dxa" w:w="4252"/>
           </w:tcPr>
           <w:p>
             <w:r/>
@@ -9317,7 +9594,7 @@
         </w:tc>
         <w:tc>
           <w:tcPr>
-            <w:tcW w:type="dxa" w:w="3685"/>
+            <w:tcW w:type="dxa" w:w="4252"/>
           </w:tcPr>
           <w:p>
             <w:r/>
@@ -9375,7 +9652,7 @@
         </w:tc>
         <w:tc>
           <w:tcPr>
-            <w:tcW w:type="dxa" w:w="3685"/>
+            <w:tcW w:type="dxa" w:w="4252"/>
           </w:tcPr>
           <w:p>
             <w:r/>
@@ -9433,7 +9710,7 @@
         </w:tc>
         <w:tc>
           <w:tcPr>
-            <w:tcW w:type="dxa" w:w="3685"/>
+            <w:tcW w:type="dxa" w:w="4252"/>
           </w:tcPr>
           <w:p>
             <w:r/>
@@ -9491,7 +9768,7 @@
         </w:tc>
         <w:tc>
           <w:tcPr>
-            <w:tcW w:type="dxa" w:w="3685"/>
+            <w:tcW w:type="dxa" w:w="4252"/>
           </w:tcPr>
           <w:p>
             <w:r/>
@@ -9549,7 +9826,7 @@
         </w:tc>
         <w:tc>
           <w:tcPr>
-            <w:tcW w:type="dxa" w:w="3685"/>
+            <w:tcW w:type="dxa" w:w="4252"/>
           </w:tcPr>
           <w:p>
             <w:r/>
@@ -9607,7 +9884,7 @@
         </w:tc>
         <w:tc>
           <w:tcPr>
-            <w:tcW w:type="dxa" w:w="3685"/>
+            <w:tcW w:type="dxa" w:w="4252"/>
           </w:tcPr>
           <w:p>
             <w:r/>
@@ -9665,7 +9942,7 @@
         </w:tc>
         <w:tc>
           <w:tcPr>
-            <w:tcW w:type="dxa" w:w="3685"/>
+            <w:tcW w:type="dxa" w:w="4252"/>
           </w:tcPr>
           <w:p>
             <w:r/>
@@ -9723,7 +10000,7 @@
         </w:tc>
         <w:tc>
           <w:tcPr>
-            <w:tcW w:type="dxa" w:w="3685"/>
+            <w:tcW w:type="dxa" w:w="4252"/>
           </w:tcPr>
           <w:p>
             <w:r/>
@@ -9781,7 +10058,7 @@
         </w:tc>
         <w:tc>
           <w:tcPr>
-            <w:tcW w:type="dxa" w:w="3685"/>
+            <w:tcW w:type="dxa" w:w="4252"/>
           </w:tcPr>
           <w:p>
             <w:r/>
@@ -9839,7 +10116,7 @@
         </w:tc>
         <w:tc>
           <w:tcPr>
-            <w:tcW w:type="dxa" w:w="3685"/>
+            <w:tcW w:type="dxa" w:w="4252"/>
           </w:tcPr>
           <w:p>
             <w:r/>
@@ -9897,7 +10174,7 @@
         </w:tc>
         <w:tc>
           <w:tcPr>
-            <w:tcW w:type="dxa" w:w="3685"/>
+            <w:tcW w:type="dxa" w:w="4252"/>
           </w:tcPr>
           <w:p>
             <w:r/>
@@ -9955,7 +10232,7 @@
         </w:tc>
         <w:tc>
           <w:tcPr>
-            <w:tcW w:type="dxa" w:w="3685"/>
+            <w:tcW w:type="dxa" w:w="4252"/>
           </w:tcPr>
           <w:p>
             <w:r/>
@@ -10011,7 +10288,7 @@
         </w:tc>
         <w:tc>
           <w:tcPr>
-            <w:tcW w:type="dxa" w:w="3685"/>
+            <w:tcW w:type="dxa" w:w="4252"/>
           </w:tcPr>
           <w:p>
             <w:r/>
@@ -10163,6 +10440,11 @@
       </w:r>
     </w:p>
     <w:p>
+      <w:r>
+        <w:t>Si el mismo conflicto se plantea como contradicción técnica (mejorar 13 – Estabilidad del objeto, empeora 7 – Volumen del objeto móvil), la matriz propone los principios 28, 10, 1 y 39. De ellos resulta útil el 10 (acción previa): dejar el taburete preparado para que, al abrirlo, quede automáticamente en su posición estable, y el 1 (segmentación), ya aplicado en la contradicción primera.</w:t>
+      </w:r>
+    </w:p>
+    <w:p>
       <w:pPr>
         <w:pStyle w:val="Heading3"/>
       </w:pPr>
@@ -10201,20 +10483,24 @@
       </w:r>
     </w:p>
     <w:p>
+      <w:pPr>
+        <w:pStyle w:val="ListBullet"/>
+      </w:pPr>
       <w:r>
         <w:rPr>
           <w:b w:val="0"/>
-          <w:highlight w:val="yellow"/>
+          <w:i w:val="0"/>
         </w:rPr>
-        <w:t>Principios propuestos por la matriz: [consultar la celda 33 / 27 en el software TRIZ40 y completar]</w:t>
+        <w:t>Principios propuestos por la matriz (celda 33 / 27): 17 (otra dimensión), 27 (objetos baratos de vida corta), 8 (contrapeso) y 40 (materiales compuestos).</w:t>
       </w:r>
     </w:p>
     <w:p>
       <w:r>
         <w:rPr>
           <w:b w:val="0"/>
+          <w:i w:val="0"/>
         </w:rPr>
-        <w:t>Independientemente de la celda, para este problema se consideran especialmente útiles los siguientes principios:</w:t>
+        <w:t>Aplicación de los principios al producto:</w:t>
       </w:r>
     </w:p>
     <w:p>
@@ -10224,8 +10510,9 @@
       <w:r>
         <w:rPr>
           <w:b w:val="0"/>
+          <w:i w:val="0"/>
         </w:rPr>
-        <w:t>Principio 10, acción previa: que el bloqueo se active solo al abrir el taburete, sin que el usuario tenga que hacer nada.</w:t>
+        <w:t>Principio 8, contrapeso: aprovechar el peso del propio usuario para mantener el bloqueo. El tirante que une el peldaño con la pata trasera se diseña para quedar ligeramente pasado de su punto muerto, de forma que, al cargar el taburete, la fuerza tiende a abrirlo más en lugar de cerrarlo. Cuanto más peso, más bloqueado está.</w:t>
       </w:r>
     </w:p>
     <w:p>
@@ -10235,8 +10522,9 @@
       <w:r>
         <w:rPr>
           <w:b w:val="0"/>
+          <w:i w:val="0"/>
         </w:rPr>
-        <w:t>Principio 11, amortiguación anticipada: añadir un segundo seguro que haya que accionar para plegar (dos gestos), como hace la patente cuarta con sus dos deslizadores.</w:t>
+        <w:t>Principio 17, otra dimensión: que el pestillo de seguridad se accione en una dirección perpendicular al movimiento de plegado (por ejemplo, un deslizador lateral), de modo que un golpe o una carga en el sentido de cierre no pueda soltarlo.</w:t>
       </w:r>
     </w:p>
     <w:p>
@@ -10246,8 +10534,33 @@
       <w:r>
         <w:rPr>
           <w:b w:val="0"/>
+          <w:i w:val="0"/>
         </w:rPr>
-        <w:t>Principio 22, convertir lo dañino en útil: diseñar el tirante para que quede pasado de su punto muerto, de modo que el peso del usuario, en lugar de tender a cerrar el taburete, lo mantenga más bloqueado.</w:t>
+        <w:t>Principio 40, materiales compuestos: ya se aplica en los peldaños de polipropileno reforzado con fibra de vidrio (contradicción primera).</w:t>
+      </w:r>
+    </w:p>
+    <w:p>
+      <w:pPr>
+        <w:pStyle w:val="ListBullet"/>
+      </w:pPr>
+      <w:r>
+        <w:rPr>
+          <w:b w:val="0"/>
+          <w:i w:val="0"/>
+        </w:rPr>
+        <w:t>Principio 27, objetos baratos de vida corta: se descarta, porque va en contra del requisito de larga vida útil (R20).</w:t>
+      </w:r>
+    </w:p>
+    <w:p>
+      <w:pPr>
+        <w:pStyle w:val="ListBullet"/>
+      </w:pPr>
+      <w:r>
+        <w:rPr>
+          <w:b w:val="0"/>
+          <w:i w:val="0"/>
+        </w:rPr>
+        <w:t>Como complemento se aplica también el principio 10 (acción previa): el bloqueo se activa solo al abrir el taburete, sin que el usuario tenga que hacer nada, como en el modelo de utilidad ES 1 070 877 U.</w:t>
       </w:r>
     </w:p>
     <w:p>
@@ -10263,7 +10576,7 @@
         <w:rPr>
           <w:b w:val="0"/>
         </w:rPr>
-        <w:t>A partir del mapa mental y de las soluciones de TRIZ se ha dibujado el boceto inicial del concepto (Ilustración 8). Se trata de un taburete de tipo tijera con dos peldaños iguales de 240 mm de altura. Los largueros delanteros llevan el peldaño inferior y la plataforma superior, y la pata trasera se articula bajo la plataforma. Un tirante une el peldaño inferior con la pata trasera y bloquea la apertura. Al plegarlo, el peldaño y la plataforma giran hasta quedar verticales, alojados entre los largueros, y todo el conjunto queda en un plano de unos 50 mm de espesor.</w:t>
+        <w:t>A partir del mapa mental y de las soluciones de TRIZ se ha dibujado el boceto inicial del concepto (Ilustración 12). Se trata de un taburete de tipo tijera con dos peldaños iguales de 240 mm de altura. Los largueros delanteros llevan el peldaño inferior y la plataforma superior, y la pata trasera se articula bajo la plataforma. Un tirante une el peldaño inferior con la pata trasera y bloquea la apertura. Al plegarlo, el peldaño y la plataforma giran hasta quedar verticales, alojados entre los largueros, y todo el conjunto queda en un plano de unos 50 mm de espesor.</w:t>
       </w:r>
     </w:p>
     <w:p>
@@ -10314,7 +10627,7 @@
           <w:i/>
           <w:sz w:val="18"/>
         </w:rPr>
-        <w:t>Ilustración 8. Boceto inicial del concepto. Elaboración propia.</w:t>
+        <w:t>Ilustración 12. Boceto inicial del concepto. Elaboración propia.</w:t>
       </w:r>
     </w:p>
     <w:p>
@@ -10413,7 +10726,7 @@
         <w:rPr>
           <w:b w:val="0"/>
         </w:rPr>
-        <w:t>3. INSST. NTP 1050: Alcance máximo en el plano sagital. 2015.</w:t>
+        <w:t>3. Carmona Benjumea, A. (2003). Aspectos antropométricos de la población laboral española aplicados al diseño industrial. INSHT, Madrid.</w:t>
       </w:r>
     </w:p>
     <w:p>
@@ -10581,9 +10894,75 @@
         <w:t>18. Sanz Adán, F. Apuntes de Ingeniería Simultánea: Metodologías, EDP, Patentes, Ecodiseño, Técnicas de evaluación. Universidad de La Rioja.</w:t>
       </w:r>
     </w:p>
+    <w:p>
+      <w:pPr>
+        <w:ind w:left="510" w:hanging="340"/>
+      </w:pPr>
+      <w:r>
+        <w:rPr>
+          <w:b w:val="0"/>
+        </w:rPr>
+        <w:t>19. Pheasant, S. y Haslegrave, C. M. (2006). Bodyspace: Anthropometry, Ergonomics and the Design of Work. 3.ª ed. CRC Press.</w:t>
+      </w:r>
+    </w:p>
+    <w:p>
+      <w:pPr>
+        <w:ind w:left="510" w:hanging="340"/>
+      </w:pPr>
+      <w:r>
+        <w:rPr>
+          <w:b w:val="0"/>
+        </w:rPr>
+        <w:t>20. Reglamento (UE) n.º 1272/2013 de la Comisión, por el que se modifica el anexo XVII de REACH en relación con los HAP. https://www.boe.es/buscar/doc.php?id=DOUE-L-2013-82738</w:t>
+      </w:r>
+    </w:p>
+    <w:p>
+      <w:pPr>
+        <w:ind w:left="510" w:hanging="340"/>
+      </w:pPr>
+      <w:r>
+        <w:rPr>
+          <w:b w:val="0"/>
+        </w:rPr>
+        <w:t>21. Reglamento (UE) 2025/40, sobre los envases y residuos de envases. https://www.boe.es/buscar/doc.php?id=DOUE-L-2025-80087</w:t>
+      </w:r>
+    </w:p>
+    <w:p>
+      <w:pPr>
+        <w:ind w:left="510" w:hanging="340"/>
+      </w:pPr>
+      <w:r>
+        <w:rPr>
+          <w:b w:val="0"/>
+        </w:rPr>
+        <w:t>22. Real Decreto 1468/1988, de 2 de diciembre. https://www.boe.es/buscar/act.php?id=BOE-A-1988-28089</w:t>
+      </w:r>
+    </w:p>
+    <w:p>
+      <w:pPr>
+        <w:ind w:left="510" w:hanging="340"/>
+      </w:pPr>
+      <w:r>
+        <w:rPr>
+          <w:b w:val="0"/>
+        </w:rPr>
+        <w:t>23. USPTO. US 12,419,421 B2, Foldable locking step stool (2025). https://image-ppubs.uspto.gov/dirsearch-public/print/downloadPdf/12419421</w:t>
+      </w:r>
+    </w:p>
+    <w:p>
+      <w:pPr>
+        <w:ind w:left="510" w:hanging="340"/>
+      </w:pPr>
+      <w:r>
+        <w:rPr>
+          <w:b w:val="0"/>
+        </w:rPr>
+        <w:t>24. OEPM. ES 1 070 877 U, Dispositivo de enclavamiento para taburetes plegables y similares (2009).</w:t>
+      </w:r>
+    </w:p>
     <w:sectPr>
-      <w:pgSz w:w="12240" w:h="15840"/>
-      <w:pgMar w:top="1440" w:right="1800" w:bottom="1440" w:left="1800" w:header="720" w:footer="720" w:gutter="0"/>
+      <w:pgSz w:w="11906" w:h="16838"/>
+      <w:pgMar w:top="1417" w:right="1417" w:bottom="1417" w:left="1417" w:header="720" w:footer="720" w:gutter="0"/>
       <w:cols w:space="720"/>
       <w:docGrid w:linePitch="360"/>
     </w:sectPr>

</xml_diff>

<commit_message>
Añadir apartado 3.4 (rediseño cinemático y modelo SolidWorks) y etapa 4 de evaluación (ACV y matriz de decisión)
Co-Authored-By: Claude Opus 5.5 <noreply@anthropic.com>
Claude-Session: https://claude.ai/code/session_01GULK22xqK1fWX4r8uc4cx1
</commit_message>
<xml_diff>
--- a/trabajo/Trabajo_Taburete.docx
+++ b/trabajo/Trabajo_Taburete.docx
@@ -7208,6 +7208,9 @@
             <w:shd w:val="clear" w:color="auto" w:fill="C0392B"/>
           </w:tcPr>
           <w:p>
+            <w:pPr>
+              <w:keepNext/>
+            </w:pPr>
             <w:r/>
             <w:r>
               <w:rPr>
@@ -7225,6 +7228,9 @@
             <w:shd w:val="clear" w:color="auto" w:fill="C0392B"/>
           </w:tcPr>
           <w:p>
+            <w:pPr>
+              <w:keepNext/>
+            </w:pPr>
             <w:r/>
             <w:r>
               <w:rPr>
@@ -7242,6 +7248,9 @@
             <w:shd w:val="clear" w:color="auto" w:fill="C0392B"/>
           </w:tcPr>
           <w:p>
+            <w:pPr>
+              <w:keepNext/>
+            </w:pPr>
             <w:r/>
             <w:r>
               <w:rPr>
@@ -7259,6 +7268,9 @@
             <w:shd w:val="clear" w:color="auto" w:fill="C0392B"/>
           </w:tcPr>
           <w:p>
+            <w:pPr>
+              <w:keepNext/>
+            </w:pPr>
             <w:r/>
             <w:r>
               <w:rPr>
@@ -7277,6 +7289,9 @@
             <w:tcW w:type="dxa" w:w="1701"/>
           </w:tcPr>
           <w:p>
+            <w:pPr>
+              <w:keepNext/>
+            </w:pPr>
             <w:r/>
             <w:r>
               <w:rPr>
@@ -7291,6 +7306,9 @@
             <w:tcW w:type="dxa" w:w="1928"/>
           </w:tcPr>
           <w:p>
+            <w:pPr>
+              <w:keepNext/>
+            </w:pPr>
             <w:r/>
             <w:r>
               <w:rPr>
@@ -7305,6 +7323,9 @@
             <w:tcW w:type="dxa" w:w="2608"/>
           </w:tcPr>
           <w:p>
+            <w:pPr>
+              <w:keepNext/>
+            </w:pPr>
             <w:r/>
             <w:r>
               <w:rPr>
@@ -7319,6 +7340,9 @@
             <w:tcW w:type="dxa" w:w="2835"/>
           </w:tcPr>
           <w:p>
+            <w:pPr>
+              <w:keepNext/>
+            </w:pPr>
             <w:r/>
             <w:r>
               <w:rPr>
@@ -7335,6 +7359,9 @@
             <w:tcW w:type="dxa" w:w="1701"/>
           </w:tcPr>
           <w:p>
+            <w:pPr>
+              <w:keepNext/>
+            </w:pPr>
             <w:r/>
             <w:r>
               <w:rPr>
@@ -7349,6 +7376,9 @@
             <w:tcW w:type="dxa" w:w="1928"/>
           </w:tcPr>
           <w:p>
+            <w:pPr>
+              <w:keepNext/>
+            </w:pPr>
             <w:r/>
             <w:r>
               <w:rPr>
@@ -7363,6 +7393,9 @@
             <w:tcW w:type="dxa" w:w="2608"/>
           </w:tcPr>
           <w:p>
+            <w:pPr>
+              <w:keepNext/>
+            </w:pPr>
             <w:r/>
             <w:r>
               <w:rPr>
@@ -7377,6 +7410,9 @@
             <w:tcW w:type="dxa" w:w="2835"/>
           </w:tcPr>
           <w:p>
+            <w:pPr>
+              <w:keepNext/>
+            </w:pPr>
             <w:r/>
             <w:r>
               <w:rPr>
@@ -7393,6 +7429,9 @@
             <w:tcW w:type="dxa" w:w="1701"/>
           </w:tcPr>
           <w:p>
+            <w:pPr>
+              <w:keepNext/>
+            </w:pPr>
             <w:r/>
             <w:r>
               <w:rPr>
@@ -7407,6 +7446,9 @@
             <w:tcW w:type="dxa" w:w="1928"/>
           </w:tcPr>
           <w:p>
+            <w:pPr>
+              <w:keepNext/>
+            </w:pPr>
             <w:r/>
             <w:r>
               <w:rPr>
@@ -7421,6 +7463,9 @@
             <w:tcW w:type="dxa" w:w="2608"/>
           </w:tcPr>
           <w:p>
+            <w:pPr>
+              <w:keepNext/>
+            </w:pPr>
             <w:r/>
             <w:r>
               <w:rPr>
@@ -7435,6 +7480,9 @@
             <w:tcW w:type="dxa" w:w="2835"/>
           </w:tcPr>
           <w:p>
+            <w:pPr>
+              <w:keepNext/>
+            </w:pPr>
             <w:r/>
             <w:r>
               <w:rPr>
@@ -7451,6 +7499,9 @@
             <w:tcW w:type="dxa" w:w="1701"/>
           </w:tcPr>
           <w:p>
+            <w:pPr>
+              <w:keepNext/>
+            </w:pPr>
             <w:r/>
             <w:r>
               <w:rPr>
@@ -7465,6 +7516,9 @@
             <w:tcW w:type="dxa" w:w="1928"/>
           </w:tcPr>
           <w:p>
+            <w:pPr>
+              <w:keepNext/>
+            </w:pPr>
             <w:r/>
             <w:r>
               <w:rPr>
@@ -7479,6 +7533,9 @@
             <w:tcW w:type="dxa" w:w="2608"/>
           </w:tcPr>
           <w:p>
+            <w:pPr>
+              <w:keepNext/>
+            </w:pPr>
             <w:r/>
             <w:r>
               <w:rPr>
@@ -7493,6 +7550,9 @@
             <w:tcW w:type="dxa" w:w="2835"/>
           </w:tcPr>
           <w:p>
+            <w:pPr>
+              <w:keepNext/>
+            </w:pPr>
             <w:r/>
             <w:r>
               <w:rPr>
@@ -10646,7 +10706,7 @@
         <w:rPr>
           <w:b w:val="0"/>
         </w:rPr>
-        <w:t>Alternativa 1: largueros de tubo rectangular de acero S235 con pintura en polvo y peldaños de chapa de acero estampada.</w:t>
+        <w:t>Alternativa 1: largueros y travesaños de tubo rectangular de acero, plataforma y peldaño de chapa de acero de 1,2 mm, y bielas y tirantes de acero.</w:t>
       </w:r>
     </w:p>
     <w:p>
@@ -10657,7 +10717,7 @@
         <w:rPr>
           <w:b w:val="0"/>
         </w:rPr>
-        <w:t>Alternativa 2: largueros de perfil extruido de aluminio 6063 y peldaños de polipropileno reforzado con fibra de vidrio.</w:t>
+        <w:t>Alternativa 2: largueros, travesaños y bielas de perfil extruido de aluminio 6063-T5, y plataforma y peldaño de polipropileno inyectado.</w:t>
       </w:r>
     </w:p>
     <w:p>
@@ -10668,7 +10728,7 @@
         <w:rPr>
           <w:b w:val="0"/>
         </w:rPr>
-        <w:t>Alternativa 3: largueros y peldaños de contrachapado de abedul, con herrajes y tirantes de acero.</w:t>
+        <w:t>Alternativa 3: largueros y travesaños de haya maciza, plataforma y peldaño de contrachapado, y bielas y tirantes de acero.</w:t>
       </w:r>
     </w:p>
     <w:p>
@@ -10683,9 +10743,4055 @@
       <w:r>
         <w:rPr>
           <w:b w:val="0"/>
-          <w:highlight w:val="yellow"/>
+          <w:i w:val="0"/>
         </w:rPr>
-        <w:t>[Pendiente: modelado en SolidWorks del conjunto, con una configuración por cada alternativa de material, y capturas del modelo]</w:t>
+        <w:t>Una vez definido el concepto, se ha modelado el producto en SolidWorks. Antes de modelar las piezas definitivas se comprobó el funcionamiento del mecanismo de plegado mediante un estudio cinemático en el plano lateral, y esta comprobación obligó a modificar el boceto inicial, lo que es un buen ejemplo de cómo en la ingeniería simultánea el diseño de detalle retroalimenta a las etapas anteriores.</w:t>
+      </w:r>
+    </w:p>
+    <w:p>
+      <w:pPr>
+        <w:pStyle w:val="Heading3"/>
+      </w:pPr>
+      <w:r>
+        <w:rPr>
+          <w:b w:val="0"/>
+          <w:i w:val="0"/>
+        </w:rPr>
+        <w:t>Rediseño del mecanismo de plegado</w:t>
+      </w:r>
+    </w:p>
+    <w:p>
+      <w:r>
+        <w:rPr>
+          <w:b w:val="0"/>
+          <w:i w:val="0"/>
+        </w:rPr>
+        <w:t>En el boceto inicial la pata trasera giraba bajo la plataforma y un único tirante unía el peldaño con ella. Al estudiar el movimiento se vio que, con esa disposición, la plataforma quedaba en voladizo detrás de su articulación y el conjunto no podía llegar a plegarse en un plano. La solución adoptada (Ilustración 13) consiste en:</w:t>
+      </w:r>
+    </w:p>
+    <w:p>
+      <w:pPr>
+        <w:pStyle w:val="ListBullet"/>
+      </w:pPr>
+      <w:r>
+        <w:rPr>
+          <w:b w:val="0"/>
+          <w:i w:val="0"/>
+        </w:rPr>
+        <w:t>Llevar el pivote de las patas traseras (P) por encima de la plataforma, a 657 mm de altura, prolongando los largueros delanteros hasta unos 780 mm. Esta prolongación forma además un asidero, con lo que se cumple el requisito deseable R11.</w:t>
+      </w:r>
+    </w:p>
+    <w:p>
+      <w:pPr>
+        <w:pStyle w:val="ListBullet"/>
+      </w:pPr>
+      <w:r>
+        <w:rPr>
+          <w:b w:val="0"/>
+          <w:i w:val="0"/>
+        </w:rPr>
+        <w:t>Articular la plataforma (A) y el peldaño (S) en los largueros delanteros y unirlos a la pata trasera mediante una biela (154 mm) y un tirante (133 mm). Se forman así dos cuadriláteros articulados que comparten la pata trasera.</w:t>
+      </w:r>
+    </w:p>
+    <w:p>
+      <w:pPr>
+        <w:pStyle w:val="ListBullet"/>
+      </w:pPr>
+      <w:r>
+        <w:rPr>
+          <w:b w:val="0"/>
+          <w:i w:val="0"/>
+        </w:rPr>
+        <w:t>Al cerrar la pata trasera (un giro de 41°), las bielas obligan a la plataforma y al peldaño a girar 75° hasta quedar paralelos a los largueros. Con los puntos de unión calculados, la plataforma y el peldaño quedan exactamente alineados con el larguero en la posición plegada.</w:t>
+      </w:r>
+    </w:p>
+    <w:p>
+      <w:pPr>
+        <w:jc w:val="center"/>
+      </w:pPr>
+      <w:r>
+        <w:drawing>
+          <wp:inline xmlns:a="http://schemas.openxmlformats.org/drawingml/2006/main" xmlns:pic="http://schemas.openxmlformats.org/drawingml/2006/picture">
+            <wp:extent cx="5940000" cy="2772000"/>
+            <wp:docPr id="13" name="Picture 13"/>
+            <wp:cNvGraphicFramePr>
+              <a:graphicFrameLocks noChangeAspect="1"/>
+            </wp:cNvGraphicFramePr>
+            <a:graphic>
+              <a:graphicData uri="http://schemas.openxmlformats.org/drawingml/2006/picture">
+                <pic:pic>
+                  <pic:nvPicPr>
+                    <pic:cNvPr id="0" name="figura_esquema_cinematico.png"/>
+                    <pic:cNvPicPr/>
+                  </pic:nvPicPr>
+                  <pic:blipFill>
+                    <a:blip r:embed="rId22"/>
+                    <a:stretch>
+                      <a:fillRect/>
+                    </a:stretch>
+                  </pic:blipFill>
+                  <pic:spPr>
+                    <a:xfrm>
+                      <a:off x="0" y="0"/>
+                      <a:ext cx="5940000" cy="2772000"/>
+                    </a:xfrm>
+                    <a:prstGeom prst="rect"/>
+                  </pic:spPr>
+                </pic:pic>
+              </a:graphicData>
+            </a:graphic>
+          </wp:inline>
+        </w:drawing>
+      </w:r>
+    </w:p>
+    <w:p>
+      <w:pPr>
+        <w:jc w:val="center"/>
+      </w:pPr>
+      <w:r>
+        <w:rPr>
+          <w:b w:val="0"/>
+          <w:i/>
+          <w:sz w:val="18"/>
+        </w:rPr>
+        <w:t>Ilustración 13. Esquema cinemático definitivo: posiciones abierta, intermedia y plegada. Elaboración propia.</w:t>
+      </w:r>
+    </w:p>
+    <w:p>
+      <w:pPr>
+        <w:pStyle w:val="Heading3"/>
+      </w:pPr>
+      <w:r>
+        <w:rPr>
+          <w:b w:val="0"/>
+          <w:i w:val="0"/>
+        </w:rPr>
+        <w:t>Modelo en SolidWorks</w:t>
+      </w:r>
+    </w:p>
+    <w:p>
+      <w:r>
+        <w:rPr>
+          <w:b w:val="0"/>
+          <w:i w:val="0"/>
+        </w:rPr>
+        <w:t>El producto se ha modelado en SolidWorks 2026 como diez piezas (larguero delantero, pata trasera, travesaño del asidero, travesaño trasero, plataforma, peldaño, biela de la plataforma, tirante del peldaño, pasador y taco) y dos ensamblajes, uno en posición abierta y otro plegado. Cada pieza tiene tres configuraciones, una por alternativa de material (ALT1_ACERO, ALT2_ALUMINIO y ALT3_MADERA), en las que cambian el material asignado y, cuando es necesario, la geometría: en la alternativa de madera se suprime el hueco de los perfiles (piezas macizas) y el espesor del vaciado de la plataforma y el peldaño pasa a 15 mm, mientras que en acero es de 1,2 mm y en polipropileno de 3 mm.</w:t>
+      </w:r>
+    </w:p>
+    <w:p>
+      <w:pPr>
+        <w:jc w:val="center"/>
+      </w:pPr>
+      <w:r>
+        <w:drawing>
+          <wp:inline xmlns:a="http://schemas.openxmlformats.org/drawingml/2006/main" xmlns:pic="http://schemas.openxmlformats.org/drawingml/2006/picture">
+            <wp:extent cx="3780000" cy="2837006"/>
+            <wp:docPr id="14" name="Picture 14"/>
+            <wp:cNvGraphicFramePr>
+              <a:graphicFrameLocks noChangeAspect="1"/>
+            </wp:cNvGraphicFramePr>
+            <a:graphic>
+              <a:graphicData uri="http://schemas.openxmlformats.org/drawingml/2006/picture">
+                <pic:pic>
+                  <pic:nvPicPr>
+                    <pic:cNvPr id="0" name="sw_lateral_abierto.png"/>
+                    <pic:cNvPicPr/>
+                  </pic:nvPicPr>
+                  <pic:blipFill>
+                    <a:blip r:embed="rId23"/>
+                    <a:stretch>
+                      <a:fillRect/>
+                    </a:stretch>
+                  </pic:blipFill>
+                  <pic:spPr>
+                    <a:xfrm>
+                      <a:off x="0" y="0"/>
+                      <a:ext cx="3780000" cy="2837006"/>
+                    </a:xfrm>
+                    <a:prstGeom prst="rect"/>
+                  </pic:spPr>
+                </pic:pic>
+              </a:graphicData>
+            </a:graphic>
+          </wp:inline>
+        </w:drawing>
+      </w:r>
+    </w:p>
+    <w:p>
+      <w:pPr>
+        <w:jc w:val="center"/>
+      </w:pPr>
+      <w:r>
+        <w:rPr>
+          <w:b w:val="0"/>
+          <w:i/>
+          <w:sz w:val="18"/>
+        </w:rPr>
+        <w:t>Ilustración 14. Ensamblaje abierto, vista lateral (SolidWorks).</w:t>
+      </w:r>
+    </w:p>
+    <w:p>
+      <w:pPr>
+        <w:jc w:val="center"/>
+      </w:pPr>
+      <w:r>
+        <w:drawing>
+          <wp:inline xmlns:a="http://schemas.openxmlformats.org/drawingml/2006/main" xmlns:pic="http://schemas.openxmlformats.org/drawingml/2006/picture">
+            <wp:extent cx="3060000" cy="3014801"/>
+            <wp:docPr id="15" name="Picture 15"/>
+            <wp:cNvGraphicFramePr>
+              <a:graphicFrameLocks noChangeAspect="1"/>
+            </wp:cNvGraphicFramePr>
+            <a:graphic>
+              <a:graphicData uri="http://schemas.openxmlformats.org/drawingml/2006/picture">
+                <pic:pic>
+                  <pic:nvPicPr>
+                    <pic:cNvPr id="0" name="sw_frontal_abierto.png"/>
+                    <pic:cNvPicPr/>
+                  </pic:nvPicPr>
+                  <pic:blipFill>
+                    <a:blip r:embed="rId24"/>
+                    <a:stretch>
+                      <a:fillRect/>
+                    </a:stretch>
+                  </pic:blipFill>
+                  <pic:spPr>
+                    <a:xfrm>
+                      <a:off x="0" y="0"/>
+                      <a:ext cx="3060000" cy="3014801"/>
+                    </a:xfrm>
+                    <a:prstGeom prst="rect"/>
+                  </pic:spPr>
+                </pic:pic>
+              </a:graphicData>
+            </a:graphic>
+          </wp:inline>
+        </w:drawing>
+      </w:r>
+    </w:p>
+    <w:p>
+      <w:pPr>
+        <w:jc w:val="center"/>
+      </w:pPr>
+      <w:r>
+        <w:rPr>
+          <w:b w:val="0"/>
+          <w:i/>
+          <w:sz w:val="18"/>
+        </w:rPr>
+        <w:t>Ilustración 15. Ensamblaje abierto, vista frontal (SolidWorks).</w:t>
+      </w:r>
+    </w:p>
+    <w:p>
+      <w:pPr>
+        <w:jc w:val="center"/>
+      </w:pPr>
+      <w:r>
+        <w:drawing>
+          <wp:inline xmlns:a="http://schemas.openxmlformats.org/drawingml/2006/main" xmlns:pic="http://schemas.openxmlformats.org/drawingml/2006/picture">
+            <wp:extent cx="3240000" cy="3095446"/>
+            <wp:docPr id="16" name="Picture 16"/>
+            <wp:cNvGraphicFramePr>
+              <a:graphicFrameLocks noChangeAspect="1"/>
+            </wp:cNvGraphicFramePr>
+            <a:graphic>
+              <a:graphicData uri="http://schemas.openxmlformats.org/drawingml/2006/picture">
+                <pic:pic>
+                  <pic:nvPicPr>
+                    <pic:cNvPr id="0" name="sw_iso_plegado.png"/>
+                    <pic:cNvPicPr/>
+                  </pic:nvPicPr>
+                  <pic:blipFill>
+                    <a:blip r:embed="rId25"/>
+                    <a:stretch>
+                      <a:fillRect/>
+                    </a:stretch>
+                  </pic:blipFill>
+                  <pic:spPr>
+                    <a:xfrm>
+                      <a:off x="0" y="0"/>
+                      <a:ext cx="3240000" cy="3095446"/>
+                    </a:xfrm>
+                    <a:prstGeom prst="rect"/>
+                  </pic:spPr>
+                </pic:pic>
+              </a:graphicData>
+            </a:graphic>
+          </wp:inline>
+        </w:drawing>
+      </w:r>
+    </w:p>
+    <w:p>
+      <w:pPr>
+        <w:jc w:val="center"/>
+      </w:pPr>
+      <w:r>
+        <w:rPr>
+          <w:b w:val="0"/>
+          <w:i/>
+          <w:sz w:val="18"/>
+        </w:rPr>
+        <w:t>Ilustración 16. Ensamblaje plegado, vista isométrica (SolidWorks).</w:t>
+      </w:r>
+    </w:p>
+    <w:p>
+      <w:r>
+        <w:rPr>
+          <w:b w:val="0"/>
+          <w:i w:val="0"/>
+        </w:rPr>
+        <w:t>Con el modelo se han comprobado las principales propiedades fijadas en la etapa inicial: plataforma a 480 mm y peldaño a 240 mm del suelo, huella de 496 × 450 mm, espesor plegado de 40 mm (P6 exigía 50 mm como máximo) y ausencia de interferencias entre piezas tanto abierto como plegado. En la posición plegada las patas traseras sobresalen unos 4 cm por debajo de los largueros, lo cual no supone ningún problema porque el taburete plegado se guarda apoyado en la pared o colgado por el asa. Las masas de cada pieza, obtenidas con la herramienta de propiedades físicas, se recogen en la Tabla 10.</w:t>
+      </w:r>
+    </w:p>
+    <w:tbl>
+      <w:tblPr>
+        <w:tblStyle w:val="TableGrid"/>
+        <w:tblW w:type="auto" w:w="0"/>
+        <w:tblLook w:firstColumn="1" w:firstRow="1" w:lastColumn="0" w:lastRow="0" w:noHBand="0" w:noVBand="1" w:val="04A0"/>
+        <w:tblLayout w:type="fixed"/>
+      </w:tblPr>
+      <w:tblGrid>
+        <w:gridCol w:w="2551"/>
+        <w:gridCol w:w="737"/>
+        <w:gridCol w:w="1870"/>
+        <w:gridCol w:w="2040"/>
+        <w:gridCol w:w="1870"/>
+      </w:tblGrid>
+      <w:tr>
+        <w:tc>
+          <w:tcPr>
+            <w:tcW w:type="dxa" w:w="2551"/>
+            <w:shd w:val="clear" w:color="auto" w:fill="C0392B"/>
+          </w:tcPr>
+          <w:p>
+            <w:pPr>
+              <w:keepNext/>
+            </w:pPr>
+            <w:r/>
+            <w:r>
+              <w:rPr>
+                <w:b/>
+                <w:color w:val="FFFFFF"/>
+                <w:sz w:val="18"/>
+              </w:rPr>
+              <w:t>Pieza</w:t>
+            </w:r>
+          </w:p>
+        </w:tc>
+        <w:tc>
+          <w:tcPr>
+            <w:tcW w:type="dxa" w:w="737"/>
+            <w:shd w:val="clear" w:color="auto" w:fill="C0392B"/>
+          </w:tcPr>
+          <w:p>
+            <w:pPr>
+              <w:keepNext/>
+            </w:pPr>
+            <w:r/>
+            <w:r>
+              <w:rPr>
+                <w:b/>
+                <w:color w:val="FFFFFF"/>
+                <w:sz w:val="18"/>
+              </w:rPr>
+              <w:t>Cant.</w:t>
+            </w:r>
+          </w:p>
+        </w:tc>
+        <w:tc>
+          <w:tcPr>
+            <w:tcW w:type="dxa" w:w="1871"/>
+            <w:shd w:val="clear" w:color="auto" w:fill="C0392B"/>
+          </w:tcPr>
+          <w:p>
+            <w:pPr>
+              <w:keepNext/>
+            </w:pPr>
+            <w:r/>
+            <w:r>
+              <w:rPr>
+                <w:b/>
+                <w:color w:val="FFFFFF"/>
+                <w:sz w:val="18"/>
+              </w:rPr>
+              <w:t>Acero (g/ud.)</w:t>
+            </w:r>
+          </w:p>
+        </w:tc>
+        <w:tc>
+          <w:tcPr>
+            <w:tcW w:type="dxa" w:w="2041"/>
+            <w:shd w:val="clear" w:color="auto" w:fill="C0392B"/>
+          </w:tcPr>
+          <w:p>
+            <w:pPr>
+              <w:keepNext/>
+            </w:pPr>
+            <w:r/>
+            <w:r>
+              <w:rPr>
+                <w:b/>
+                <w:color w:val="FFFFFF"/>
+                <w:sz w:val="18"/>
+              </w:rPr>
+              <w:t>Aluminio + PP (g/ud.)</w:t>
+            </w:r>
+          </w:p>
+        </w:tc>
+        <w:tc>
+          <w:tcPr>
+            <w:tcW w:type="dxa" w:w="1871"/>
+            <w:shd w:val="clear" w:color="auto" w:fill="C0392B"/>
+          </w:tcPr>
+          <w:p>
+            <w:pPr>
+              <w:keepNext/>
+            </w:pPr>
+            <w:r/>
+            <w:r>
+              <w:rPr>
+                <w:b/>
+                <w:color w:val="FFFFFF"/>
+                <w:sz w:val="18"/>
+              </w:rPr>
+              <w:t>Madera (g/ud.)</w:t>
+            </w:r>
+          </w:p>
+        </w:tc>
+      </w:tr>
+      <w:tr>
+        <w:tc>
+          <w:tcPr>
+            <w:tcW w:type="dxa" w:w="2551"/>
+          </w:tcPr>
+          <w:p>
+            <w:pPr>
+              <w:keepNext/>
+            </w:pPr>
+            <w:r/>
+            <w:r>
+              <w:rPr>
+                <w:sz w:val="17"/>
+              </w:rPr>
+              <w:t>Larguero delantero</w:t>
+            </w:r>
+          </w:p>
+        </w:tc>
+        <w:tc>
+          <w:tcPr>
+            <w:tcW w:type="dxa" w:w="737"/>
+          </w:tcPr>
+          <w:p>
+            <w:pPr>
+              <w:keepNext/>
+            </w:pPr>
+            <w:r/>
+            <w:r>
+              <w:rPr>
+                <w:sz w:val="17"/>
+              </w:rPr>
+              <w:t>2</w:t>
+            </w:r>
+          </w:p>
+        </w:tc>
+        <w:tc>
+          <w:tcPr>
+            <w:tcW w:type="dxa" w:w="1871"/>
+          </w:tcPr>
+          <w:p>
+            <w:pPr>
+              <w:keepNext/>
+            </w:pPr>
+            <w:r/>
+            <w:r>
+              <w:rPr>
+                <w:sz w:val="17"/>
+              </w:rPr>
+              <w:t>1391,2</w:t>
+            </w:r>
+          </w:p>
+        </w:tc>
+        <w:tc>
+          <w:tcPr>
+            <w:tcW w:type="dxa" w:w="2041"/>
+          </w:tcPr>
+          <w:p>
+            <w:pPr>
+              <w:keepNext/>
+            </w:pPr>
+            <w:r/>
+            <w:r>
+              <w:rPr>
+                <w:sz w:val="17"/>
+              </w:rPr>
+              <w:t>481,6</w:t>
+            </w:r>
+          </w:p>
+        </w:tc>
+        <w:tc>
+          <w:tcPr>
+            <w:tcW w:type="dxa" w:w="1871"/>
+          </w:tcPr>
+          <w:p>
+            <w:pPr>
+              <w:keepNext/>
+            </w:pPr>
+            <w:r/>
+            <w:r>
+              <w:rPr>
+                <w:sz w:val="17"/>
+              </w:rPr>
+              <w:t>356,2</w:t>
+            </w:r>
+          </w:p>
+        </w:tc>
+      </w:tr>
+      <w:tr>
+        <w:tc>
+          <w:tcPr>
+            <w:tcW w:type="dxa" w:w="2551"/>
+          </w:tcPr>
+          <w:p>
+            <w:pPr>
+              <w:keepNext/>
+            </w:pPr>
+            <w:r/>
+            <w:r>
+              <w:rPr>
+                <w:sz w:val="17"/>
+              </w:rPr>
+              <w:t>Pata trasera</w:t>
+            </w:r>
+          </w:p>
+        </w:tc>
+        <w:tc>
+          <w:tcPr>
+            <w:tcW w:type="dxa" w:w="737"/>
+          </w:tcPr>
+          <w:p>
+            <w:pPr>
+              <w:keepNext/>
+            </w:pPr>
+            <w:r/>
+            <w:r>
+              <w:rPr>
+                <w:sz w:val="17"/>
+              </w:rPr>
+              <w:t>2</w:t>
+            </w:r>
+          </w:p>
+        </w:tc>
+        <w:tc>
+          <w:tcPr>
+            <w:tcW w:type="dxa" w:w="1871"/>
+          </w:tcPr>
+          <w:p>
+            <w:pPr>
+              <w:keepNext/>
+            </w:pPr>
+            <w:r/>
+            <w:r>
+              <w:rPr>
+                <w:sz w:val="17"/>
+              </w:rPr>
+              <w:t>1290,2</w:t>
+            </w:r>
+          </w:p>
+        </w:tc>
+        <w:tc>
+          <w:tcPr>
+            <w:tcW w:type="dxa" w:w="2041"/>
+          </w:tcPr>
+          <w:p>
+            <w:pPr>
+              <w:keepNext/>
+            </w:pPr>
+            <w:r/>
+            <w:r>
+              <w:rPr>
+                <w:sz w:val="17"/>
+              </w:rPr>
+              <w:t>446,6</w:t>
+            </w:r>
+          </w:p>
+        </w:tc>
+        <w:tc>
+          <w:tcPr>
+            <w:tcW w:type="dxa" w:w="1871"/>
+          </w:tcPr>
+          <w:p>
+            <w:pPr>
+              <w:keepNext/>
+            </w:pPr>
+            <w:r/>
+            <w:r>
+              <w:rPr>
+                <w:sz w:val="17"/>
+              </w:rPr>
+              <w:t>330,3</w:t>
+            </w:r>
+          </w:p>
+        </w:tc>
+      </w:tr>
+      <w:tr>
+        <w:tc>
+          <w:tcPr>
+            <w:tcW w:type="dxa" w:w="2551"/>
+          </w:tcPr>
+          <w:p>
+            <w:pPr>
+              <w:keepNext/>
+            </w:pPr>
+            <w:r/>
+            <w:r>
+              <w:rPr>
+                <w:sz w:val="17"/>
+              </w:rPr>
+              <w:t>Travesaño asidero</w:t>
+            </w:r>
+          </w:p>
+        </w:tc>
+        <w:tc>
+          <w:tcPr>
+            <w:tcW w:type="dxa" w:w="737"/>
+          </w:tcPr>
+          <w:p>
+            <w:pPr>
+              <w:keepNext/>
+            </w:pPr>
+            <w:r/>
+            <w:r>
+              <w:rPr>
+                <w:sz w:val="17"/>
+              </w:rPr>
+              <w:t>1</w:t>
+            </w:r>
+          </w:p>
+        </w:tc>
+        <w:tc>
+          <w:tcPr>
+            <w:tcW w:type="dxa" w:w="1871"/>
+          </w:tcPr>
+          <w:p>
+            <w:pPr>
+              <w:keepNext/>
+            </w:pPr>
+            <w:r/>
+            <w:r>
+              <w:rPr>
+                <w:sz w:val="17"/>
+              </w:rPr>
+              <w:t>460,5</w:t>
+            </w:r>
+          </w:p>
+        </w:tc>
+        <w:tc>
+          <w:tcPr>
+            <w:tcW w:type="dxa" w:w="2041"/>
+          </w:tcPr>
+          <w:p>
+            <w:pPr>
+              <w:keepNext/>
+            </w:pPr>
+            <w:r/>
+            <w:r>
+              <w:rPr>
+                <w:sz w:val="17"/>
+              </w:rPr>
+              <w:t>159,4</w:t>
+            </w:r>
+          </w:p>
+        </w:tc>
+        <w:tc>
+          <w:tcPr>
+            <w:tcW w:type="dxa" w:w="1871"/>
+          </w:tcPr>
+          <w:p>
+            <w:pPr>
+              <w:keepNext/>
+            </w:pPr>
+            <w:r/>
+            <w:r>
+              <w:rPr>
+                <w:sz w:val="17"/>
+              </w:rPr>
+              <w:t>91,8</w:t>
+            </w:r>
+          </w:p>
+        </w:tc>
+      </w:tr>
+      <w:tr>
+        <w:tc>
+          <w:tcPr>
+            <w:tcW w:type="dxa" w:w="2551"/>
+          </w:tcPr>
+          <w:p>
+            <w:pPr>
+              <w:keepNext/>
+            </w:pPr>
+            <w:r/>
+            <w:r>
+              <w:rPr>
+                <w:sz w:val="17"/>
+              </w:rPr>
+              <w:t>Travesaño trasero</w:t>
+            </w:r>
+          </w:p>
+        </w:tc>
+        <w:tc>
+          <w:tcPr>
+            <w:tcW w:type="dxa" w:w="737"/>
+          </w:tcPr>
+          <w:p>
+            <w:pPr>
+              <w:keepNext/>
+            </w:pPr>
+            <w:r/>
+            <w:r>
+              <w:rPr>
+                <w:sz w:val="17"/>
+              </w:rPr>
+              <w:t>1</w:t>
+            </w:r>
+          </w:p>
+        </w:tc>
+        <w:tc>
+          <w:tcPr>
+            <w:tcW w:type="dxa" w:w="1871"/>
+          </w:tcPr>
+          <w:p>
+            <w:pPr>
+              <w:keepNext/>
+            </w:pPr>
+            <w:r/>
+            <w:r>
+              <w:rPr>
+                <w:sz w:val="17"/>
+              </w:rPr>
+              <w:t>404,4</w:t>
+            </w:r>
+          </w:p>
+        </w:tc>
+        <w:tc>
+          <w:tcPr>
+            <w:tcW w:type="dxa" w:w="2041"/>
+          </w:tcPr>
+          <w:p>
+            <w:pPr>
+              <w:keepNext/>
+            </w:pPr>
+            <w:r/>
+            <w:r>
+              <w:rPr>
+                <w:sz w:val="17"/>
+              </w:rPr>
+              <w:t>140,0</w:t>
+            </w:r>
+          </w:p>
+        </w:tc>
+        <w:tc>
+          <w:tcPr>
+            <w:tcW w:type="dxa" w:w="1871"/>
+          </w:tcPr>
+          <w:p>
+            <w:pPr>
+              <w:keepNext/>
+            </w:pPr>
+            <w:r/>
+            <w:r>
+              <w:rPr>
+                <w:sz w:val="17"/>
+              </w:rPr>
+              <w:t>80,6</w:t>
+            </w:r>
+          </w:p>
+        </w:tc>
+      </w:tr>
+      <w:tr>
+        <w:tc>
+          <w:tcPr>
+            <w:tcW w:type="dxa" w:w="2551"/>
+          </w:tcPr>
+          <w:p>
+            <w:pPr>
+              <w:keepNext/>
+            </w:pPr>
+            <w:r/>
+            <w:r>
+              <w:rPr>
+                <w:sz w:val="17"/>
+              </w:rPr>
+              <w:t>Plataforma</w:t>
+            </w:r>
+          </w:p>
+        </w:tc>
+        <w:tc>
+          <w:tcPr>
+            <w:tcW w:type="dxa" w:w="737"/>
+          </w:tcPr>
+          <w:p>
+            <w:pPr>
+              <w:keepNext/>
+            </w:pPr>
+            <w:r/>
+            <w:r>
+              <w:rPr>
+                <w:sz w:val="17"/>
+              </w:rPr>
+              <w:t>1</w:t>
+            </w:r>
+          </w:p>
+        </w:tc>
+        <w:tc>
+          <w:tcPr>
+            <w:tcW w:type="dxa" w:w="1871"/>
+          </w:tcPr>
+          <w:p>
+            <w:pPr>
+              <w:keepNext/>
+            </w:pPr>
+            <w:r/>
+            <w:r>
+              <w:rPr>
+                <w:sz w:val="17"/>
+              </w:rPr>
+              <w:t>1296,1</w:t>
+            </w:r>
+          </w:p>
+        </w:tc>
+        <w:tc>
+          <w:tcPr>
+            <w:tcW w:type="dxa" w:w="2041"/>
+          </w:tcPr>
+          <w:p>
+            <w:pPr>
+              <w:keepNext/>
+            </w:pPr>
+            <w:r/>
+            <w:r>
+              <w:rPr>
+                <w:sz w:val="17"/>
+              </w:rPr>
+              <w:t>363,0</w:t>
+            </w:r>
+          </w:p>
+        </w:tc>
+        <w:tc>
+          <w:tcPr>
+            <w:tcW w:type="dxa" w:w="1871"/>
+          </w:tcPr>
+          <w:p>
+            <w:pPr>
+              <w:keepNext/>
+            </w:pPr>
+            <w:r/>
+            <w:r>
+              <w:rPr>
+                <w:sz w:val="17"/>
+              </w:rPr>
+              <w:t>997,8</w:t>
+            </w:r>
+          </w:p>
+        </w:tc>
+      </w:tr>
+      <w:tr>
+        <w:tc>
+          <w:tcPr>
+            <w:tcW w:type="dxa" w:w="2551"/>
+          </w:tcPr>
+          <w:p>
+            <w:pPr>
+              <w:keepNext/>
+            </w:pPr>
+            <w:r/>
+            <w:r>
+              <w:rPr>
+                <w:sz w:val="17"/>
+              </w:rPr>
+              <w:t>Peldaño</w:t>
+            </w:r>
+          </w:p>
+        </w:tc>
+        <w:tc>
+          <w:tcPr>
+            <w:tcW w:type="dxa" w:w="737"/>
+          </w:tcPr>
+          <w:p>
+            <w:pPr>
+              <w:keepNext/>
+            </w:pPr>
+            <w:r/>
+            <w:r>
+              <w:rPr>
+                <w:sz w:val="17"/>
+              </w:rPr>
+              <w:t>1</w:t>
+            </w:r>
+          </w:p>
+        </w:tc>
+        <w:tc>
+          <w:tcPr>
+            <w:tcW w:type="dxa" w:w="1871"/>
+          </w:tcPr>
+          <w:p>
+            <w:pPr>
+              <w:keepNext/>
+            </w:pPr>
+            <w:r/>
+            <w:r>
+              <w:rPr>
+                <w:sz w:val="17"/>
+              </w:rPr>
+              <w:t>1062,8</w:t>
+            </w:r>
+          </w:p>
+        </w:tc>
+        <w:tc>
+          <w:tcPr>
+            <w:tcW w:type="dxa" w:w="2041"/>
+          </w:tcPr>
+          <w:p>
+            <w:pPr>
+              <w:keepNext/>
+            </w:pPr>
+            <w:r/>
+            <w:r>
+              <w:rPr>
+                <w:sz w:val="17"/>
+              </w:rPr>
+              <w:t>297,1</w:t>
+            </w:r>
+          </w:p>
+        </w:tc>
+        <w:tc>
+          <w:tcPr>
+            <w:tcW w:type="dxa" w:w="1871"/>
+          </w:tcPr>
+          <w:p>
+            <w:pPr>
+              <w:keepNext/>
+            </w:pPr>
+            <w:r/>
+            <w:r>
+              <w:rPr>
+                <w:sz w:val="17"/>
+              </w:rPr>
+              <w:t>802,7</w:t>
+            </w:r>
+          </w:p>
+        </w:tc>
+      </w:tr>
+      <w:tr>
+        <w:tc>
+          <w:tcPr>
+            <w:tcW w:type="dxa" w:w="2551"/>
+          </w:tcPr>
+          <w:p>
+            <w:pPr>
+              <w:keepNext/>
+            </w:pPr>
+            <w:r/>
+            <w:r>
+              <w:rPr>
+                <w:sz w:val="17"/>
+              </w:rPr>
+              <w:t>Biela plataforma</w:t>
+            </w:r>
+          </w:p>
+        </w:tc>
+        <w:tc>
+          <w:tcPr>
+            <w:tcW w:type="dxa" w:w="737"/>
+          </w:tcPr>
+          <w:p>
+            <w:pPr>
+              <w:keepNext/>
+            </w:pPr>
+            <w:r/>
+            <w:r>
+              <w:rPr>
+                <w:sz w:val="17"/>
+              </w:rPr>
+              <w:t>2</w:t>
+            </w:r>
+          </w:p>
+        </w:tc>
+        <w:tc>
+          <w:tcPr>
+            <w:tcW w:type="dxa" w:w="1871"/>
+          </w:tcPr>
+          <w:p>
+            <w:pPr>
+              <w:keepNext/>
+            </w:pPr>
+            <w:r/>
+            <w:r>
+              <w:rPr>
+                <w:sz w:val="17"/>
+              </w:rPr>
+              <w:t>105,2</w:t>
+            </w:r>
+          </w:p>
+        </w:tc>
+        <w:tc>
+          <w:tcPr>
+            <w:tcW w:type="dxa" w:w="2041"/>
+          </w:tcPr>
+          <w:p>
+            <w:pPr>
+              <w:keepNext/>
+            </w:pPr>
+            <w:r/>
+            <w:r>
+              <w:rPr>
+                <w:sz w:val="17"/>
+              </w:rPr>
+              <w:t>36,4</w:t>
+            </w:r>
+          </w:p>
+        </w:tc>
+        <w:tc>
+          <w:tcPr>
+            <w:tcW w:type="dxa" w:w="1871"/>
+          </w:tcPr>
+          <w:p>
+            <w:pPr>
+              <w:keepNext/>
+            </w:pPr>
+            <w:r/>
+            <w:r>
+              <w:rPr>
+                <w:sz w:val="17"/>
+              </w:rPr>
+              <w:t>105,2</w:t>
+            </w:r>
+          </w:p>
+        </w:tc>
+      </w:tr>
+      <w:tr>
+        <w:tc>
+          <w:tcPr>
+            <w:tcW w:type="dxa" w:w="2551"/>
+          </w:tcPr>
+          <w:p>
+            <w:pPr>
+              <w:keepNext/>
+            </w:pPr>
+            <w:r/>
+            <w:r>
+              <w:rPr>
+                <w:sz w:val="17"/>
+              </w:rPr>
+              <w:t>Tirante peldaño</w:t>
+            </w:r>
+          </w:p>
+        </w:tc>
+        <w:tc>
+          <w:tcPr>
+            <w:tcW w:type="dxa" w:w="737"/>
+          </w:tcPr>
+          <w:p>
+            <w:pPr>
+              <w:keepNext/>
+            </w:pPr>
+            <w:r/>
+            <w:r>
+              <w:rPr>
+                <w:sz w:val="17"/>
+              </w:rPr>
+              <w:t>2</w:t>
+            </w:r>
+          </w:p>
+        </w:tc>
+        <w:tc>
+          <w:tcPr>
+            <w:tcW w:type="dxa" w:w="1871"/>
+          </w:tcPr>
+          <w:p>
+            <w:pPr>
+              <w:keepNext/>
+            </w:pPr>
+            <w:r/>
+            <w:r>
+              <w:rPr>
+                <w:sz w:val="17"/>
+              </w:rPr>
+              <w:t>91,7</w:t>
+            </w:r>
+          </w:p>
+        </w:tc>
+        <w:tc>
+          <w:tcPr>
+            <w:tcW w:type="dxa" w:w="2041"/>
+          </w:tcPr>
+          <w:p>
+            <w:pPr>
+              <w:keepNext/>
+            </w:pPr>
+            <w:r/>
+            <w:r>
+              <w:rPr>
+                <w:sz w:val="17"/>
+              </w:rPr>
+              <w:t>31,8</w:t>
+            </w:r>
+          </w:p>
+        </w:tc>
+        <w:tc>
+          <w:tcPr>
+            <w:tcW w:type="dxa" w:w="1871"/>
+          </w:tcPr>
+          <w:p>
+            <w:pPr>
+              <w:keepNext/>
+            </w:pPr>
+            <w:r/>
+            <w:r>
+              <w:rPr>
+                <w:sz w:val="17"/>
+              </w:rPr>
+              <w:t>91,7</w:t>
+            </w:r>
+          </w:p>
+        </w:tc>
+      </w:tr>
+      <w:tr>
+        <w:tc>
+          <w:tcPr>
+            <w:tcW w:type="dxa" w:w="2551"/>
+          </w:tcPr>
+          <w:p>
+            <w:pPr>
+              <w:keepNext/>
+            </w:pPr>
+            <w:r/>
+            <w:r>
+              <w:rPr>
+                <w:sz w:val="17"/>
+              </w:rPr>
+              <w:t>Pasador</w:t>
+            </w:r>
+          </w:p>
+        </w:tc>
+        <w:tc>
+          <w:tcPr>
+            <w:tcW w:type="dxa" w:w="737"/>
+          </w:tcPr>
+          <w:p>
+            <w:pPr>
+              <w:keepNext/>
+            </w:pPr>
+            <w:r/>
+            <w:r>
+              <w:rPr>
+                <w:sz w:val="17"/>
+              </w:rPr>
+              <w:t>10</w:t>
+            </w:r>
+          </w:p>
+        </w:tc>
+        <w:tc>
+          <w:tcPr>
+            <w:tcW w:type="dxa" w:w="1871"/>
+          </w:tcPr>
+          <w:p>
+            <w:pPr>
+              <w:keepNext/>
+            </w:pPr>
+            <w:r/>
+            <w:r>
+              <w:rPr>
+                <w:sz w:val="17"/>
+              </w:rPr>
+              <w:t>17,6</w:t>
+            </w:r>
+          </w:p>
+        </w:tc>
+        <w:tc>
+          <w:tcPr>
+            <w:tcW w:type="dxa" w:w="2041"/>
+          </w:tcPr>
+          <w:p>
+            <w:pPr>
+              <w:keepNext/>
+            </w:pPr>
+            <w:r/>
+            <w:r>
+              <w:rPr>
+                <w:sz w:val="17"/>
+              </w:rPr>
+              <w:t>17,6</w:t>
+            </w:r>
+          </w:p>
+        </w:tc>
+        <w:tc>
+          <w:tcPr>
+            <w:tcW w:type="dxa" w:w="1871"/>
+          </w:tcPr>
+          <w:p>
+            <w:pPr>
+              <w:keepNext/>
+            </w:pPr>
+            <w:r/>
+            <w:r>
+              <w:rPr>
+                <w:sz w:val="17"/>
+              </w:rPr>
+              <w:t>17,6</w:t>
+            </w:r>
+          </w:p>
+        </w:tc>
+      </w:tr>
+      <w:tr>
+        <w:tc>
+          <w:tcPr>
+            <w:tcW w:type="dxa" w:w="2551"/>
+          </w:tcPr>
+          <w:p>
+            <w:pPr>
+              <w:keepNext/>
+            </w:pPr>
+            <w:r/>
+            <w:r>
+              <w:rPr>
+                <w:sz w:val="17"/>
+              </w:rPr>
+              <w:t>Taco</w:t>
+            </w:r>
+          </w:p>
+        </w:tc>
+        <w:tc>
+          <w:tcPr>
+            <w:tcW w:type="dxa" w:w="737"/>
+          </w:tcPr>
+          <w:p>
+            <w:pPr>
+              <w:keepNext/>
+            </w:pPr>
+            <w:r/>
+            <w:r>
+              <w:rPr>
+                <w:sz w:val="17"/>
+              </w:rPr>
+              <w:t>4</w:t>
+            </w:r>
+          </w:p>
+        </w:tc>
+        <w:tc>
+          <w:tcPr>
+            <w:tcW w:type="dxa" w:w="1871"/>
+          </w:tcPr>
+          <w:p>
+            <w:pPr>
+              <w:keepNext/>
+            </w:pPr>
+            <w:r/>
+            <w:r>
+              <w:rPr>
+                <w:sz w:val="17"/>
+              </w:rPr>
+              <w:t>10,4</w:t>
+            </w:r>
+          </w:p>
+        </w:tc>
+        <w:tc>
+          <w:tcPr>
+            <w:tcW w:type="dxa" w:w="2041"/>
+          </w:tcPr>
+          <w:p>
+            <w:pPr>
+              <w:keepNext/>
+            </w:pPr>
+            <w:r/>
+            <w:r>
+              <w:rPr>
+                <w:sz w:val="17"/>
+              </w:rPr>
+              <w:t>10,4</w:t>
+            </w:r>
+          </w:p>
+        </w:tc>
+        <w:tc>
+          <w:tcPr>
+            <w:tcW w:type="dxa" w:w="1871"/>
+          </w:tcPr>
+          <w:p>
+            <w:pPr>
+              <w:keepNext/>
+            </w:pPr>
+            <w:r/>
+            <w:r>
+              <w:rPr>
+                <w:sz w:val="17"/>
+              </w:rPr>
+              <w:t>10,4</w:t>
+            </w:r>
+          </w:p>
+        </w:tc>
+      </w:tr>
+      <w:tr>
+        <w:tc>
+          <w:tcPr>
+            <w:tcW w:type="dxa" w:w="2551"/>
+          </w:tcPr>
+          <w:p>
+            <w:pPr>
+              <w:keepNext/>
+            </w:pPr>
+            <w:r/>
+            <w:r>
+              <w:rPr>
+                <w:b/>
+                <w:sz w:val="17"/>
+              </w:rPr>
+              <w:t>TOTAL (kg)</w:t>
+            </w:r>
+          </w:p>
+        </w:tc>
+        <w:tc>
+          <w:tcPr>
+            <w:tcW w:type="dxa" w:w="737"/>
+          </w:tcPr>
+          <w:p>
+            <w:pPr>
+              <w:keepNext/>
+            </w:pPr>
+            <w:r/>
+            <w:r>
+              <w:rPr>
+                <w:b/>
+                <w:sz w:val="17"/>
+              </w:rPr>
+            </w:r>
+          </w:p>
+        </w:tc>
+        <w:tc>
+          <w:tcPr>
+            <w:tcW w:type="dxa" w:w="1871"/>
+          </w:tcPr>
+          <w:p>
+            <w:pPr>
+              <w:keepNext/>
+            </w:pPr>
+            <w:r/>
+            <w:r>
+              <w:rPr>
+                <w:b/>
+                <w:sz w:val="17"/>
+              </w:rPr>
+              <w:t>9,20</w:t>
+            </w:r>
+          </w:p>
+        </w:tc>
+        <w:tc>
+          <w:tcPr>
+            <w:tcW w:type="dxa" w:w="2041"/>
+          </w:tcPr>
+          <w:p>
+            <w:pPr>
+              <w:keepNext/>
+            </w:pPr>
+            <w:r/>
+            <w:r>
+              <w:rPr>
+                <w:b/>
+                <w:sz w:val="17"/>
+              </w:rPr>
+              <w:t>3,17</w:t>
+            </w:r>
+          </w:p>
+        </w:tc>
+        <w:tc>
+          <w:tcPr>
+            <w:tcW w:type="dxa" w:w="1871"/>
+          </w:tcPr>
+          <w:p>
+            <w:pPr>
+              <w:keepNext/>
+            </w:pPr>
+            <w:r/>
+            <w:r>
+              <w:rPr>
+                <w:b/>
+                <w:sz w:val="17"/>
+              </w:rPr>
+              <w:t>3,96</w:t>
+            </w:r>
+          </w:p>
+        </w:tc>
+      </w:tr>
+    </w:tbl>
+    <w:p>
+      <w:pPr>
+        <w:jc w:val="center"/>
+      </w:pPr>
+      <w:r>
+        <w:rPr>
+          <w:b w:val="0"/>
+          <w:i/>
+          <w:sz w:val="18"/>
+        </w:rPr>
+        <w:t>Tabla 10. Masa de cada pieza por alternativa, obtenida del modelo de SolidWorks.</w:t>
+      </w:r>
+    </w:p>
+    <w:p>
+      <w:r>
+        <w:rPr>
+          <w:b w:val="0"/>
+          <w:i w:val="0"/>
+        </w:rPr>
+        <w:t>Solo la alternativa de aluminio cumple la propiedad P5 (peso máximo de 3,5 kg). La de madera se queda cerca (3,96 kg) y la de acero la supera ampliamente (9,20 kg). Hay que señalar que en la alternativa de aluminio la plataforma y el peldaño se han modelado con polipropileno sin reforzar, porque la biblioteca de materiales de SolidWorks no incluye el polipropileno con fibra de vidrio; con este material (1,12 g/cm³ frente a 0,89 g/cm³) el peso aumentaría unos 170 g, hasta unos 3,34 kg, y seguiría cumpliendo.</w:t>
+      </w:r>
+    </w:p>
+    <w:p>
+      <w:pPr>
+        <w:pStyle w:val="Heading1"/>
+      </w:pPr>
+      <w:r>
+        <w:rPr>
+          <w:b w:val="0"/>
+          <w:i w:val="0"/>
+        </w:rPr>
+        <w:t>4. ETAPA DE EVALUACIÓN</w:t>
+      </w:r>
+    </w:p>
+    <w:p>
+      <w:r>
+        <w:rPr>
+          <w:b w:val="0"/>
+          <w:i w:val="0"/>
+        </w:rPr>
+        <w:t>En esta etapa se evalúan las tres alternativas de material mediante un análisis de ciclo de vida (ACV) simplificado, calculando su huella de carbono en kg de CO₂ equivalente. Después se comparan también con el resto de criterios del EDP para elegir la alternativa más adecuada.</w:t>
+      </w:r>
+    </w:p>
+    <w:p>
+      <w:pPr>
+        <w:pStyle w:val="Heading2"/>
+      </w:pPr>
+      <w:r>
+        <w:rPr>
+          <w:b w:val="0"/>
+          <w:i w:val="0"/>
+        </w:rPr>
+        <w:t>4.1. METODOLOGÍA Y DATOS DEL ANÁLISIS</w:t>
+      </w:r>
+    </w:p>
+    <w:p>
+      <w:r>
+        <w:rPr>
+          <w:b w:val="0"/>
+          <w:i w:val="0"/>
+        </w:rPr>
+        <w:t>El análisis sigue el enfoque «de la cuna a la tumba» de las normas UNE-EN ISO 14040 y 14044. La unidad funcional es un taburete-escalera que permite a un usuario de hasta 150 kg alcanzar 2,30 m de altura durante 10 años de uso doméstico. Se han considerado las siguientes fases:</w:t>
+      </w:r>
+    </w:p>
+    <w:p>
+      <w:pPr>
+        <w:pStyle w:val="ListBullet"/>
+      </w:pPr>
+      <w:r>
+        <w:rPr>
+          <w:b w:val="0"/>
+          <w:i w:val="0"/>
+        </w:rPr>
+        <w:t>Producción: extracción y transformación de los materiales de cada pieza, a partir de las masas del modelo de SolidWorks (Tabla 10). En las piezas de polipropileno se suma la energía de inyección (1,47 kWh/kg).</w:t>
+      </w:r>
+    </w:p>
+    <w:p>
+      <w:pPr>
+        <w:pStyle w:val="ListBullet"/>
+      </w:pPr>
+      <w:r>
+        <w:rPr>
+          <w:b w:val="0"/>
+          <w:i w:val="0"/>
+        </w:rPr>
+        <w:t>Transporte: distribución del producto desde la fábrica hasta el punto de venta, 600 km en camión articulado.</w:t>
+      </w:r>
+    </w:p>
+    <w:p>
+      <w:pPr>
+        <w:pStyle w:val="ListBullet"/>
+      </w:pPr>
+      <w:r>
+        <w:rPr>
+          <w:b w:val="0"/>
+          <w:i w:val="0"/>
+        </w:rPr>
+        <w:t>Uso: el producto no consume energía; solo se considera la sustitución de los cuatro tacos una vez durante su vida útil.</w:t>
+      </w:r>
+    </w:p>
+    <w:p>
+      <w:pPr>
+        <w:pStyle w:val="ListBullet"/>
+      </w:pPr>
+      <w:r>
+        <w:rPr>
+          <w:b w:val="0"/>
+          <w:i w:val="0"/>
+        </w:rPr>
+        <w:t>Fin de vida: transporte de 50 km al punto limpio; reciclaje del 90 % de los metales, incineración de los plásticos y del caucho, y valorización energética de la madera (CO₂ de origen biogénico, que no se contabiliza).</w:t>
+      </w:r>
+    </w:p>
+    <w:p>
+      <w:pPr>
+        <w:pStyle w:val="ListBullet"/>
+      </w:pPr>
+      <w:r>
+        <w:rPr>
+          <w:b w:val="0"/>
+          <w:i w:val="0"/>
+        </w:rPr>
+        <w:t>Beneficio del reciclaje (módulo D, según UNE-EN 15804): emisiones evitadas por el material reciclado neto, es decir, la diferencia entre el porcentaje que se recicla al final de la vida (90 %) y el que ya contenía el material de partida (59 % en el acero y 33 % en el aluminio). Se presenta por separado para no contarlo dos veces.</w:t>
+      </w:r>
+    </w:p>
+    <w:tbl>
+      <w:tblPr>
+        <w:tblStyle w:val="TableGrid"/>
+        <w:tblW w:type="auto" w:w="0"/>
+        <w:tblLook w:firstColumn="1" w:firstRow="1" w:lastColumn="0" w:lastRow="0" w:noHBand="0" w:noVBand="1" w:val="04A0"/>
+        <w:tblLayout w:type="fixed"/>
+      </w:tblPr>
+      <w:tblGrid>
+        <w:gridCol w:w="3401"/>
+        <w:gridCol w:w="2551"/>
+        <w:gridCol w:w="3118"/>
+      </w:tblGrid>
+      <w:tr>
+        <w:tc>
+          <w:tcPr>
+            <w:tcW w:type="dxa" w:w="3402"/>
+            <w:shd w:val="clear" w:color="auto" w:fill="C0392B"/>
+          </w:tcPr>
+          <w:p>
+            <w:pPr>
+              <w:keepNext/>
+            </w:pPr>
+            <w:r/>
+            <w:r>
+              <w:rPr>
+                <w:b/>
+                <w:color w:val="FFFFFF"/>
+                <w:sz w:val="18"/>
+              </w:rPr>
+              <w:t>Material o proceso</w:t>
+            </w:r>
+          </w:p>
+        </w:tc>
+        <w:tc>
+          <w:tcPr>
+            <w:tcW w:type="dxa" w:w="2551"/>
+            <w:shd w:val="clear" w:color="auto" w:fill="C0392B"/>
+          </w:tcPr>
+          <w:p>
+            <w:pPr>
+              <w:keepNext/>
+            </w:pPr>
+            <w:r/>
+            <w:r>
+              <w:rPr>
+                <w:b/>
+                <w:color w:val="FFFFFF"/>
+                <w:sz w:val="18"/>
+              </w:rPr>
+              <w:t>Factor</w:t>
+            </w:r>
+          </w:p>
+        </w:tc>
+        <w:tc>
+          <w:tcPr>
+            <w:tcW w:type="dxa" w:w="3118"/>
+            <w:shd w:val="clear" w:color="auto" w:fill="C0392B"/>
+          </w:tcPr>
+          <w:p>
+            <w:pPr>
+              <w:keepNext/>
+            </w:pPr>
+            <w:r/>
+            <w:r>
+              <w:rPr>
+                <w:b/>
+                <w:color w:val="FFFFFF"/>
+                <w:sz w:val="18"/>
+              </w:rPr>
+              <w:t>Fuente</w:t>
+            </w:r>
+          </w:p>
+        </w:tc>
+      </w:tr>
+      <w:tr>
+        <w:tc>
+          <w:tcPr>
+            <w:tcW w:type="dxa" w:w="3402"/>
+          </w:tcPr>
+          <w:p>
+            <w:pPr>
+              <w:keepNext/>
+            </w:pPr>
+            <w:r/>
+            <w:r>
+              <w:rPr>
+                <w:sz w:val="17"/>
+              </w:rPr>
+              <w:t>Acero, tubo (59 % reciclado)</w:t>
+            </w:r>
+          </w:p>
+        </w:tc>
+        <w:tc>
+          <w:tcPr>
+            <w:tcW w:type="dxa" w:w="2551"/>
+          </w:tcPr>
+          <w:p>
+            <w:pPr>
+              <w:keepNext/>
+            </w:pPr>
+            <w:r/>
+            <w:r>
+              <w:rPr>
+                <w:sz w:val="17"/>
+              </w:rPr>
+              <w:t>1,45 kg CO₂-eq/kg</w:t>
+            </w:r>
+          </w:p>
+        </w:tc>
+        <w:tc>
+          <w:tcPr>
+            <w:tcW w:type="dxa" w:w="3118"/>
+          </w:tcPr>
+          <w:p>
+            <w:pPr>
+              <w:keepNext/>
+            </w:pPr>
+            <w:r/>
+            <w:r>
+              <w:rPr>
+                <w:sz w:val="17"/>
+              </w:rPr>
+              <w:t>ICE v2.0, Univ. de Bath</w:t>
+            </w:r>
+          </w:p>
+        </w:tc>
+      </w:tr>
+      <w:tr>
+        <w:tc>
+          <w:tcPr>
+            <w:tcW w:type="dxa" w:w="3402"/>
+          </w:tcPr>
+          <w:p>
+            <w:pPr>
+              <w:keepNext/>
+            </w:pPr>
+            <w:r/>
+            <w:r>
+              <w:rPr>
+                <w:sz w:val="17"/>
+              </w:rPr>
+              <w:t>Acero, chapa</w:t>
+            </w:r>
+          </w:p>
+        </w:tc>
+        <w:tc>
+          <w:tcPr>
+            <w:tcW w:type="dxa" w:w="2551"/>
+          </w:tcPr>
+          <w:p>
+            <w:pPr>
+              <w:keepNext/>
+            </w:pPr>
+            <w:r/>
+            <w:r>
+              <w:rPr>
+                <w:sz w:val="17"/>
+              </w:rPr>
+              <w:t>1,38 kg CO₂-eq/kg</w:t>
+            </w:r>
+          </w:p>
+        </w:tc>
+        <w:tc>
+          <w:tcPr>
+            <w:tcW w:type="dxa" w:w="3118"/>
+          </w:tcPr>
+          <w:p>
+            <w:pPr>
+              <w:keepNext/>
+            </w:pPr>
+            <w:r/>
+            <w:r>
+              <w:rPr>
+                <w:sz w:val="17"/>
+              </w:rPr>
+              <w:t>ICE v2.0</w:t>
+            </w:r>
+          </w:p>
+        </w:tc>
+      </w:tr>
+      <w:tr>
+        <w:tc>
+          <w:tcPr>
+            <w:tcW w:type="dxa" w:w="3402"/>
+          </w:tcPr>
+          <w:p>
+            <w:pPr>
+              <w:keepNext/>
+            </w:pPr>
+            <w:r/>
+            <w:r>
+              <w:rPr>
+                <w:sz w:val="17"/>
+              </w:rPr>
+              <w:t>Acero, barra (bielas, pasadores)</w:t>
+            </w:r>
+          </w:p>
+        </w:tc>
+        <w:tc>
+          <w:tcPr>
+            <w:tcW w:type="dxa" w:w="2551"/>
+          </w:tcPr>
+          <w:p>
+            <w:pPr>
+              <w:keepNext/>
+            </w:pPr>
+            <w:r/>
+            <w:r>
+              <w:rPr>
+                <w:sz w:val="17"/>
+              </w:rPr>
+              <w:t>1,40 kg CO₂-eq/kg</w:t>
+            </w:r>
+          </w:p>
+        </w:tc>
+        <w:tc>
+          <w:tcPr>
+            <w:tcW w:type="dxa" w:w="3118"/>
+          </w:tcPr>
+          <w:p>
+            <w:pPr>
+              <w:keepNext/>
+            </w:pPr>
+            <w:r/>
+            <w:r>
+              <w:rPr>
+                <w:sz w:val="17"/>
+              </w:rPr>
+              <w:t>ICE v2.0</w:t>
+            </w:r>
+          </w:p>
+        </w:tc>
+      </w:tr>
+      <w:tr>
+        <w:tc>
+          <w:tcPr>
+            <w:tcW w:type="dxa" w:w="3402"/>
+          </w:tcPr>
+          <w:p>
+            <w:pPr>
+              <w:keepNext/>
+            </w:pPr>
+            <w:r/>
+            <w:r>
+              <w:rPr>
+                <w:sz w:val="17"/>
+              </w:rPr>
+              <w:t>Aluminio extruido (33 % reciclado)</w:t>
+            </w:r>
+          </w:p>
+        </w:tc>
+        <w:tc>
+          <w:tcPr>
+            <w:tcW w:type="dxa" w:w="2551"/>
+          </w:tcPr>
+          <w:p>
+            <w:pPr>
+              <w:keepNext/>
+            </w:pPr>
+            <w:r/>
+            <w:r>
+              <w:rPr>
+                <w:sz w:val="17"/>
+              </w:rPr>
+              <w:t>9,08 kg CO₂-eq/kg</w:t>
+            </w:r>
+          </w:p>
+        </w:tc>
+        <w:tc>
+          <w:tcPr>
+            <w:tcW w:type="dxa" w:w="3118"/>
+          </w:tcPr>
+          <w:p>
+            <w:pPr>
+              <w:keepNext/>
+            </w:pPr>
+            <w:r/>
+            <w:r>
+              <w:rPr>
+                <w:sz w:val="17"/>
+              </w:rPr>
+              <w:t>ICE v2.0</w:t>
+            </w:r>
+          </w:p>
+        </w:tc>
+      </w:tr>
+      <w:tr>
+        <w:tc>
+          <w:tcPr>
+            <w:tcW w:type="dxa" w:w="3402"/>
+          </w:tcPr>
+          <w:p>
+            <w:pPr>
+              <w:keepNext/>
+            </w:pPr>
+            <w:r/>
+            <w:r>
+              <w:rPr>
+                <w:sz w:val="17"/>
+              </w:rPr>
+              <w:t>Polipropileno</w:t>
+            </w:r>
+          </w:p>
+        </w:tc>
+        <w:tc>
+          <w:tcPr>
+            <w:tcW w:type="dxa" w:w="2551"/>
+          </w:tcPr>
+          <w:p>
+            <w:pPr>
+              <w:keepNext/>
+            </w:pPr>
+            <w:r/>
+            <w:r>
+              <w:rPr>
+                <w:sz w:val="17"/>
+              </w:rPr>
+              <w:t>4,98 kg CO₂/kg</w:t>
+            </w:r>
+          </w:p>
+        </w:tc>
+        <w:tc>
+          <w:tcPr>
+            <w:tcW w:type="dxa" w:w="3118"/>
+          </w:tcPr>
+          <w:p>
+            <w:pPr>
+              <w:keepNext/>
+            </w:pPr>
+            <w:r/>
+            <w:r>
+              <w:rPr>
+                <w:sz w:val="17"/>
+              </w:rPr>
+              <w:t>ICE v2.0</w:t>
+            </w:r>
+          </w:p>
+        </w:tc>
+      </w:tr>
+      <w:tr>
+        <w:tc>
+          <w:tcPr>
+            <w:tcW w:type="dxa" w:w="3402"/>
+          </w:tcPr>
+          <w:p>
+            <w:pPr>
+              <w:keepNext/>
+            </w:pPr>
+            <w:r/>
+            <w:r>
+              <w:rPr>
+                <w:sz w:val="17"/>
+              </w:rPr>
+              <w:t>Madera de frondosa (haya), fósil</w:t>
+            </w:r>
+          </w:p>
+        </w:tc>
+        <w:tc>
+          <w:tcPr>
+            <w:tcW w:type="dxa" w:w="2551"/>
+          </w:tcPr>
+          <w:p>
+            <w:pPr>
+              <w:keepNext/>
+            </w:pPr>
+            <w:r/>
+            <w:r>
+              <w:rPr>
+                <w:sz w:val="17"/>
+              </w:rPr>
+              <w:t>0,24 kg CO₂-eq/kg</w:t>
+            </w:r>
+          </w:p>
+        </w:tc>
+        <w:tc>
+          <w:tcPr>
+            <w:tcW w:type="dxa" w:w="3118"/>
+          </w:tcPr>
+          <w:p>
+            <w:pPr>
+              <w:keepNext/>
+            </w:pPr>
+            <w:r/>
+            <w:r>
+              <w:rPr>
+                <w:sz w:val="17"/>
+              </w:rPr>
+              <w:t>ICE v2.0</w:t>
+            </w:r>
+          </w:p>
+        </w:tc>
+      </w:tr>
+      <w:tr>
+        <w:tc>
+          <w:tcPr>
+            <w:tcW w:type="dxa" w:w="3402"/>
+          </w:tcPr>
+          <w:p>
+            <w:pPr>
+              <w:keepNext/>
+            </w:pPr>
+            <w:r/>
+            <w:r>
+              <w:rPr>
+                <w:sz w:val="17"/>
+              </w:rPr>
+              <w:t>Contrachapado, fósil</w:t>
+            </w:r>
+          </w:p>
+        </w:tc>
+        <w:tc>
+          <w:tcPr>
+            <w:tcW w:type="dxa" w:w="2551"/>
+          </w:tcPr>
+          <w:p>
+            <w:pPr>
+              <w:keepNext/>
+            </w:pPr>
+            <w:r/>
+            <w:r>
+              <w:rPr>
+                <w:sz w:val="17"/>
+              </w:rPr>
+              <w:t>0,45 kg CO₂-eq/kg</w:t>
+            </w:r>
+          </w:p>
+        </w:tc>
+        <w:tc>
+          <w:tcPr>
+            <w:tcW w:type="dxa" w:w="3118"/>
+          </w:tcPr>
+          <w:p>
+            <w:pPr>
+              <w:keepNext/>
+            </w:pPr>
+            <w:r/>
+            <w:r>
+              <w:rPr>
+                <w:sz w:val="17"/>
+              </w:rPr>
+              <w:t>ICE v2.0</w:t>
+            </w:r>
+          </w:p>
+        </w:tc>
+      </w:tr>
+      <w:tr>
+        <w:tc>
+          <w:tcPr>
+            <w:tcW w:type="dxa" w:w="3402"/>
+          </w:tcPr>
+          <w:p>
+            <w:pPr>
+              <w:keepNext/>
+            </w:pPr>
+            <w:r/>
+            <w:r>
+              <w:rPr>
+                <w:sz w:val="17"/>
+              </w:rPr>
+              <w:t>Caucho</w:t>
+            </w:r>
+          </w:p>
+        </w:tc>
+        <w:tc>
+          <w:tcPr>
+            <w:tcW w:type="dxa" w:w="2551"/>
+          </w:tcPr>
+          <w:p>
+            <w:pPr>
+              <w:keepNext/>
+            </w:pPr>
+            <w:r/>
+            <w:r>
+              <w:rPr>
+                <w:sz w:val="17"/>
+              </w:rPr>
+              <w:t>3,61 kg CO₂/kg</w:t>
+            </w:r>
+          </w:p>
+        </w:tc>
+        <w:tc>
+          <w:tcPr>
+            <w:tcW w:type="dxa" w:w="3118"/>
+          </w:tcPr>
+          <w:p>
+            <w:pPr>
+              <w:keepNext/>
+            </w:pPr>
+            <w:r/>
+            <w:r>
+              <w:rPr>
+                <w:sz w:val="17"/>
+              </w:rPr>
+              <w:t>ICE v2.0</w:t>
+            </w:r>
+          </w:p>
+        </w:tc>
+      </w:tr>
+      <w:tr>
+        <w:tc>
+          <w:tcPr>
+            <w:tcW w:type="dxa" w:w="3402"/>
+          </w:tcPr>
+          <w:p>
+            <w:pPr>
+              <w:keepNext/>
+            </w:pPr>
+            <w:r/>
+            <w:r>
+              <w:rPr>
+                <w:sz w:val="17"/>
+              </w:rPr>
+              <w:t>Electricidad (inyección)</w:t>
+            </w:r>
+          </w:p>
+        </w:tc>
+        <w:tc>
+          <w:tcPr>
+            <w:tcW w:type="dxa" w:w="2551"/>
+          </w:tcPr>
+          <w:p>
+            <w:pPr>
+              <w:keepNext/>
+            </w:pPr>
+            <w:r/>
+            <w:r>
+              <w:rPr>
+                <w:sz w:val="17"/>
+              </w:rPr>
+              <w:t>0,283 kg CO₂-eq/kWh</w:t>
+            </w:r>
+          </w:p>
+        </w:tc>
+        <w:tc>
+          <w:tcPr>
+            <w:tcW w:type="dxa" w:w="3118"/>
+          </w:tcPr>
+          <w:p>
+            <w:pPr>
+              <w:keepNext/>
+            </w:pPr>
+            <w:r/>
+            <w:r>
+              <w:rPr>
+                <w:sz w:val="17"/>
+              </w:rPr>
+              <w:t>MITECO 2024, sin garantía de origen</w:t>
+            </w:r>
+          </w:p>
+        </w:tc>
+      </w:tr>
+      <w:tr>
+        <w:tc>
+          <w:tcPr>
+            <w:tcW w:type="dxa" w:w="3402"/>
+          </w:tcPr>
+          <w:p>
+            <w:pPr>
+              <w:keepNext/>
+            </w:pPr>
+            <w:r/>
+            <w:r>
+              <w:rPr>
+                <w:sz w:val="17"/>
+              </w:rPr>
+              <w:t>Camión articulado &gt; 33 t, carga media</w:t>
+            </w:r>
+          </w:p>
+        </w:tc>
+        <w:tc>
+          <w:tcPr>
+            <w:tcW w:type="dxa" w:w="2551"/>
+          </w:tcPr>
+          <w:p>
+            <w:pPr>
+              <w:keepNext/>
+            </w:pPr>
+            <w:r/>
+            <w:r>
+              <w:rPr>
+                <w:sz w:val="17"/>
+              </w:rPr>
+              <w:t>0,0672 kg CO₂-eq/t·km</w:t>
+            </w:r>
+          </w:p>
+        </w:tc>
+        <w:tc>
+          <w:tcPr>
+            <w:tcW w:type="dxa" w:w="3118"/>
+          </w:tcPr>
+          <w:p>
+            <w:pPr>
+              <w:keepNext/>
+            </w:pPr>
+            <w:r/>
+            <w:r>
+              <w:rPr>
+                <w:sz w:val="17"/>
+              </w:rPr>
+              <w:t>DEFRA 2024</w:t>
+            </w:r>
+          </w:p>
+        </w:tc>
+      </w:tr>
+      <w:tr>
+        <w:tc>
+          <w:tcPr>
+            <w:tcW w:type="dxa" w:w="3402"/>
+          </w:tcPr>
+          <w:p>
+            <w:pPr>
+              <w:keepNext/>
+            </w:pPr>
+            <w:r/>
+            <w:r>
+              <w:rPr>
+                <w:sz w:val="17"/>
+              </w:rPr>
+              <w:t>Incineración de plásticos</w:t>
+            </w:r>
+          </w:p>
+        </w:tc>
+        <w:tc>
+          <w:tcPr>
+            <w:tcW w:type="dxa" w:w="2551"/>
+          </w:tcPr>
+          <w:p>
+            <w:pPr>
+              <w:keepNext/>
+            </w:pPr>
+            <w:r/>
+            <w:r>
+              <w:rPr>
+                <w:sz w:val="17"/>
+              </w:rPr>
+              <w:t>3,14 kg CO₂/kg</w:t>
+            </w:r>
+          </w:p>
+        </w:tc>
+        <w:tc>
+          <w:tcPr>
+            <w:tcW w:type="dxa" w:w="3118"/>
+          </w:tcPr>
+          <w:p>
+            <w:pPr>
+              <w:keepNext/>
+            </w:pPr>
+            <w:r/>
+            <w:r>
+              <w:rPr>
+                <w:sz w:val="17"/>
+              </w:rPr>
+              <w:t>Estequiometría del polipropileno</w:t>
+            </w:r>
+          </w:p>
+        </w:tc>
+      </w:tr>
+      <w:tr>
+        <w:tc>
+          <w:tcPr>
+            <w:tcW w:type="dxa" w:w="3402"/>
+          </w:tcPr>
+          <w:p>
+            <w:pPr>
+              <w:keepNext/>
+            </w:pPr>
+            <w:r/>
+            <w:r>
+              <w:rPr>
+                <w:sz w:val="17"/>
+              </w:rPr>
+              <w:t>Acero virgen / reciclado</w:t>
+            </w:r>
+          </w:p>
+        </w:tc>
+        <w:tc>
+          <w:tcPr>
+            <w:tcW w:type="dxa" w:w="2551"/>
+          </w:tcPr>
+          <w:p>
+            <w:pPr>
+              <w:keepNext/>
+            </w:pPr>
+            <w:r/>
+            <w:r>
+              <w:rPr>
+                <w:sz w:val="17"/>
+              </w:rPr>
+              <w:t>2,89 / 0,47 kg CO₂-eq/kg</w:t>
+            </w:r>
+          </w:p>
+        </w:tc>
+        <w:tc>
+          <w:tcPr>
+            <w:tcW w:type="dxa" w:w="3118"/>
+          </w:tcPr>
+          <w:p>
+            <w:pPr>
+              <w:keepNext/>
+            </w:pPr>
+            <w:r/>
+            <w:r>
+              <w:rPr>
+                <w:sz w:val="17"/>
+              </w:rPr>
+              <w:t>ICE v2.0 (para el módulo D)</w:t>
+            </w:r>
+          </w:p>
+        </w:tc>
+      </w:tr>
+      <w:tr>
+        <w:tc>
+          <w:tcPr>
+            <w:tcW w:type="dxa" w:w="3402"/>
+          </w:tcPr>
+          <w:p>
+            <w:pPr>
+              <w:keepNext/>
+            </w:pPr>
+            <w:r/>
+            <w:r>
+              <w:rPr>
+                <w:sz w:val="17"/>
+              </w:rPr>
+              <w:t>Aluminio virgen / reciclado</w:t>
+            </w:r>
+          </w:p>
+        </w:tc>
+        <w:tc>
+          <w:tcPr>
+            <w:tcW w:type="dxa" w:w="2551"/>
+          </w:tcPr>
+          <w:p>
+            <w:pPr>
+              <w:keepNext/>
+            </w:pPr>
+            <w:r/>
+            <w:r>
+              <w:rPr>
+                <w:sz w:val="17"/>
+              </w:rPr>
+              <w:t>12,50 / 2,12 kg CO₂-eq/kg</w:t>
+            </w:r>
+          </w:p>
+        </w:tc>
+        <w:tc>
+          <w:tcPr>
+            <w:tcW w:type="dxa" w:w="3118"/>
+          </w:tcPr>
+          <w:p>
+            <w:pPr>
+              <w:keepNext/>
+            </w:pPr>
+            <w:r/>
+            <w:r>
+              <w:rPr>
+                <w:sz w:val="17"/>
+              </w:rPr>
+              <w:t>ICE v2.0 (para el módulo D)</w:t>
+            </w:r>
+          </w:p>
+        </w:tc>
+      </w:tr>
+    </w:tbl>
+    <w:p>
+      <w:pPr>
+        <w:jc w:val="center"/>
+      </w:pPr>
+      <w:r>
+        <w:rPr>
+          <w:b w:val="0"/>
+          <w:i/>
+          <w:sz w:val="18"/>
+        </w:rPr>
+        <w:t>Tabla 11. Factores de emisión utilizados en el análisis de ciclo de vida.</w:t>
+      </w:r>
+    </w:p>
+    <w:p>
+      <w:r>
+        <w:rPr>
+          <w:b w:val="0"/>
+          <w:i w:val="0"/>
+        </w:rPr>
+        <w:t>Se trata de un ACV simplificado: no incluye el embalaje, la pintura o el anodizado, ni las mermas de fabricación, y los factores de emisión son valores medios de bases de datos, por lo que los resultados deben interpretarse de forma comparativa entre alternativas y no como valores absolutos.</w:t>
+      </w:r>
+    </w:p>
+    <w:p>
+      <w:pPr>
+        <w:pStyle w:val="Heading2"/>
+      </w:pPr>
+      <w:r>
+        <w:rPr>
+          <w:b w:val="0"/>
+          <w:i w:val="0"/>
+        </w:rPr>
+        <w:t>4.2. ALTERNATIVA 1: ACERO</w:t>
+      </w:r>
+    </w:p>
+    <w:p>
+      <w:r>
+        <w:rPr>
+          <w:b w:val="0"/>
+          <w:i w:val="0"/>
+        </w:rPr>
+        <w:t>En la alternativa de acero la fase de producción supone el 95 % del total. Los componentes que más contribuyen son los largueros delanteros y las patas traseras, que por su longitud concentran la mayor parte de la masa, seguidos de la plataforma y el peldaño de chapa. El peso elevado (9,20 kg) también hace que su transporte sea el que más emite, aunque en valor absoluto sigue siendo pequeño. Al final de su vida el acero se recicla con facilidad, lo que da un beneficio de -6,9 kg CO₂-eq.</w:t>
+      </w:r>
+    </w:p>
+    <w:tbl>
+      <w:tblPr>
+        <w:tblStyle w:val="TableGrid"/>
+        <w:tblW w:type="auto" w:w="0"/>
+        <w:tblLook w:firstColumn="1" w:firstRow="1" w:lastColumn="0" w:lastRow="0" w:noHBand="0" w:noVBand="1" w:val="04A0"/>
+        <w:tblLayout w:type="fixed"/>
+      </w:tblPr>
+      <w:tblGrid>
+        <w:gridCol w:w="4535"/>
+        <w:gridCol w:w="2267"/>
+      </w:tblGrid>
+      <w:tr>
+        <w:tc>
+          <w:tcPr>
+            <w:tcW w:type="dxa" w:w="4535"/>
+            <w:shd w:val="clear" w:color="auto" w:fill="C0392B"/>
+          </w:tcPr>
+          <w:p>
+            <w:pPr>
+              <w:keepNext/>
+            </w:pPr>
+            <w:r/>
+            <w:r>
+              <w:rPr>
+                <w:b/>
+                <w:color w:val="FFFFFF"/>
+                <w:sz w:val="18"/>
+              </w:rPr>
+              <w:t>Fase</w:t>
+            </w:r>
+          </w:p>
+        </w:tc>
+        <w:tc>
+          <w:tcPr>
+            <w:tcW w:type="dxa" w:w="2268"/>
+            <w:shd w:val="clear" w:color="auto" w:fill="C0392B"/>
+          </w:tcPr>
+          <w:p>
+            <w:pPr>
+              <w:keepNext/>
+            </w:pPr>
+            <w:r/>
+            <w:r>
+              <w:rPr>
+                <w:b/>
+                <w:color w:val="FFFFFF"/>
+                <w:sz w:val="18"/>
+              </w:rPr>
+              <w:t>kg CO₂-eq</w:t>
+            </w:r>
+          </w:p>
+        </w:tc>
+      </w:tr>
+      <w:tr>
+        <w:tc>
+          <w:tcPr>
+            <w:tcW w:type="dxa" w:w="4535"/>
+          </w:tcPr>
+          <w:p>
+            <w:pPr>
+              <w:keepNext/>
+            </w:pPr>
+            <w:r/>
+            <w:r>
+              <w:rPr>
+                <w:sz w:val="17"/>
+              </w:rPr>
+              <w:t>Producción</w:t>
+            </w:r>
+          </w:p>
+        </w:tc>
+        <w:tc>
+          <w:tcPr>
+            <w:tcW w:type="dxa" w:w="2268"/>
+          </w:tcPr>
+          <w:p>
+            <w:pPr>
+              <w:keepNext/>
+            </w:pPr>
+            <w:r/>
+            <w:r>
+              <w:rPr>
+                <w:sz w:val="17"/>
+              </w:rPr>
+              <w:t>13,23</w:t>
+            </w:r>
+          </w:p>
+        </w:tc>
+      </w:tr>
+      <w:tr>
+        <w:tc>
+          <w:tcPr>
+            <w:tcW w:type="dxa" w:w="4535"/>
+          </w:tcPr>
+          <w:p>
+            <w:pPr>
+              <w:keepNext/>
+            </w:pPr>
+            <w:r/>
+            <w:r>
+              <w:rPr>
+                <w:sz w:val="17"/>
+              </w:rPr>
+              <w:t>Transporte</w:t>
+            </w:r>
+          </w:p>
+        </w:tc>
+        <w:tc>
+          <w:tcPr>
+            <w:tcW w:type="dxa" w:w="2268"/>
+          </w:tcPr>
+          <w:p>
+            <w:pPr>
+              <w:keepNext/>
+            </w:pPr>
+            <w:r/>
+            <w:r>
+              <w:rPr>
+                <w:sz w:val="17"/>
+              </w:rPr>
+              <w:t>0,37</w:t>
+            </w:r>
+          </w:p>
+        </w:tc>
+      </w:tr>
+      <w:tr>
+        <w:tc>
+          <w:tcPr>
+            <w:tcW w:type="dxa" w:w="4535"/>
+          </w:tcPr>
+          <w:p>
+            <w:pPr>
+              <w:keepNext/>
+            </w:pPr>
+            <w:r/>
+            <w:r>
+              <w:rPr>
+                <w:sz w:val="17"/>
+              </w:rPr>
+              <w:t>Uso</w:t>
+            </w:r>
+          </w:p>
+        </w:tc>
+        <w:tc>
+          <w:tcPr>
+            <w:tcW w:type="dxa" w:w="2268"/>
+          </w:tcPr>
+          <w:p>
+            <w:pPr>
+              <w:keepNext/>
+            </w:pPr>
+            <w:r/>
+            <w:r>
+              <w:rPr>
+                <w:sz w:val="17"/>
+              </w:rPr>
+              <w:t>0,15</w:t>
+            </w:r>
+          </w:p>
+        </w:tc>
+      </w:tr>
+      <w:tr>
+        <w:tc>
+          <w:tcPr>
+            <w:tcW w:type="dxa" w:w="4535"/>
+          </w:tcPr>
+          <w:p>
+            <w:pPr>
+              <w:keepNext/>
+            </w:pPr>
+            <w:r/>
+            <w:r>
+              <w:rPr>
+                <w:sz w:val="17"/>
+              </w:rPr>
+              <w:t>Fin de vida</w:t>
+            </w:r>
+          </w:p>
+        </w:tc>
+        <w:tc>
+          <w:tcPr>
+            <w:tcW w:type="dxa" w:w="2268"/>
+          </w:tcPr>
+          <w:p>
+            <w:pPr>
+              <w:keepNext/>
+            </w:pPr>
+            <w:r/>
+            <w:r>
+              <w:rPr>
+                <w:sz w:val="17"/>
+              </w:rPr>
+              <w:t>0,16</w:t>
+            </w:r>
+          </w:p>
+        </w:tc>
+      </w:tr>
+      <w:tr>
+        <w:tc>
+          <w:tcPr>
+            <w:tcW w:type="dxa" w:w="4535"/>
+          </w:tcPr>
+          <w:p>
+            <w:pPr>
+              <w:keepNext/>
+            </w:pPr>
+            <w:r/>
+            <w:r>
+              <w:rPr>
+                <w:b/>
+                <w:sz w:val="17"/>
+              </w:rPr>
+              <w:t>TOTAL ciclo de vida (A–C)</w:t>
+            </w:r>
+          </w:p>
+        </w:tc>
+        <w:tc>
+          <w:tcPr>
+            <w:tcW w:type="dxa" w:w="2268"/>
+          </w:tcPr>
+          <w:p>
+            <w:pPr>
+              <w:keepNext/>
+            </w:pPr>
+            <w:r/>
+            <w:r>
+              <w:rPr>
+                <w:b/>
+                <w:sz w:val="17"/>
+              </w:rPr>
+              <w:t>13,92</w:t>
+            </w:r>
+          </w:p>
+        </w:tc>
+      </w:tr>
+      <w:tr>
+        <w:tc>
+          <w:tcPr>
+            <w:tcW w:type="dxa" w:w="4535"/>
+          </w:tcPr>
+          <w:p>
+            <w:pPr>
+              <w:keepNext/>
+            </w:pPr>
+            <w:r/>
+            <w:r>
+              <w:rPr>
+                <w:sz w:val="17"/>
+              </w:rPr>
+              <w:t>Beneficio del reciclaje (módulo D)</w:t>
+            </w:r>
+          </w:p>
+        </w:tc>
+        <w:tc>
+          <w:tcPr>
+            <w:tcW w:type="dxa" w:w="2268"/>
+          </w:tcPr>
+          <w:p>
+            <w:pPr>
+              <w:keepNext/>
+            </w:pPr>
+            <w:r/>
+            <w:r>
+              <w:rPr>
+                <w:sz w:val="17"/>
+              </w:rPr>
+              <w:t>-6,87</w:t>
+            </w:r>
+          </w:p>
+        </w:tc>
+      </w:tr>
+    </w:tbl>
+    <w:p>
+      <w:pPr>
+        <w:jc w:val="center"/>
+      </w:pPr>
+      <w:r>
+        <w:rPr>
+          <w:b w:val="0"/>
+          <w:i/>
+          <w:sz w:val="18"/>
+        </w:rPr>
+        <w:t>Tabla 12. Huella de carbono de la Alternativa 1: acero.</w:t>
+      </w:r>
+    </w:p>
+    <w:p>
+      <w:pPr>
+        <w:pStyle w:val="Heading2"/>
+      </w:pPr>
+      <w:r>
+        <w:rPr>
+          <w:b w:val="0"/>
+          <w:i w:val="0"/>
+        </w:rPr>
+        <w:t>4.3. ALTERNATIVA 2: ALUMINIO Y POLIPROPILENO</w:t>
+      </w:r>
+    </w:p>
+    <w:p>
+      <w:r>
+        <w:rPr>
+          <w:b w:val="0"/>
+          <w:i w:val="0"/>
+        </w:rPr>
+        <w:t>La alternativa de aluminio es la de mayor huella de carbono, a pesar de ser la más ligera. El motivo es el alto factor de emisión del aluminio extruido (9,08 kg CO₂-eq/kg), que hace que los largueros y las patas traseras supongan por sí solos más de 16 kg CO₂-eq. La plataforma y el peldaño de polipropileno añaden unos 3,6 kg CO₂-eq en producción y otros 2 kg en su incineración al final de su vida. En cambio, es la alternativa con mayor beneficio de reciclaje (-13,7 kg CO₂-eq), porque el aluminio reciclado evita mucha energía respecto al primario.</w:t>
+      </w:r>
+    </w:p>
+    <w:tbl>
+      <w:tblPr>
+        <w:tblStyle w:val="TableGrid"/>
+        <w:tblW w:type="auto" w:w="0"/>
+        <w:tblLook w:firstColumn="1" w:firstRow="1" w:lastColumn="0" w:lastRow="0" w:noHBand="0" w:noVBand="1" w:val="04A0"/>
+        <w:tblLayout w:type="fixed"/>
+      </w:tblPr>
+      <w:tblGrid>
+        <w:gridCol w:w="4535"/>
+        <w:gridCol w:w="2267"/>
+      </w:tblGrid>
+      <w:tr>
+        <w:tc>
+          <w:tcPr>
+            <w:tcW w:type="dxa" w:w="4535"/>
+            <w:shd w:val="clear" w:color="auto" w:fill="C0392B"/>
+          </w:tcPr>
+          <w:p>
+            <w:pPr>
+              <w:keepNext/>
+            </w:pPr>
+            <w:r/>
+            <w:r>
+              <w:rPr>
+                <w:b/>
+                <w:color w:val="FFFFFF"/>
+                <w:sz w:val="18"/>
+              </w:rPr>
+              <w:t>Fase</w:t>
+            </w:r>
+          </w:p>
+        </w:tc>
+        <w:tc>
+          <w:tcPr>
+            <w:tcW w:type="dxa" w:w="2268"/>
+            <w:shd w:val="clear" w:color="auto" w:fill="C0392B"/>
+          </w:tcPr>
+          <w:p>
+            <w:pPr>
+              <w:keepNext/>
+            </w:pPr>
+            <w:r/>
+            <w:r>
+              <w:rPr>
+                <w:b/>
+                <w:color w:val="FFFFFF"/>
+                <w:sz w:val="18"/>
+              </w:rPr>
+              <w:t>kg CO₂-eq</w:t>
+            </w:r>
+          </w:p>
+        </w:tc>
+      </w:tr>
+      <w:tr>
+        <w:tc>
+          <w:tcPr>
+            <w:tcW w:type="dxa" w:w="4535"/>
+          </w:tcPr>
+          <w:p>
+            <w:pPr>
+              <w:keepNext/>
+            </w:pPr>
+            <w:r/>
+            <w:r>
+              <w:rPr>
+                <w:sz w:val="17"/>
+              </w:rPr>
+              <w:t>Producción</w:t>
+            </w:r>
+          </w:p>
+        </w:tc>
+        <w:tc>
+          <w:tcPr>
+            <w:tcW w:type="dxa" w:w="2268"/>
+          </w:tcPr>
+          <w:p>
+            <w:pPr>
+              <w:keepNext/>
+            </w:pPr>
+            <w:r/>
+            <w:r>
+              <w:rPr>
+                <w:sz w:val="17"/>
+              </w:rPr>
+              <w:t>24,77</w:t>
+            </w:r>
+          </w:p>
+        </w:tc>
+      </w:tr>
+      <w:tr>
+        <w:tc>
+          <w:tcPr>
+            <w:tcW w:type="dxa" w:w="4535"/>
+          </w:tcPr>
+          <w:p>
+            <w:pPr>
+              <w:keepNext/>
+            </w:pPr>
+            <w:r/>
+            <w:r>
+              <w:rPr>
+                <w:sz w:val="17"/>
+              </w:rPr>
+              <w:t>Transporte</w:t>
+            </w:r>
+          </w:p>
+        </w:tc>
+        <w:tc>
+          <w:tcPr>
+            <w:tcW w:type="dxa" w:w="2268"/>
+          </w:tcPr>
+          <w:p>
+            <w:pPr>
+              <w:keepNext/>
+            </w:pPr>
+            <w:r/>
+            <w:r>
+              <w:rPr>
+                <w:sz w:val="17"/>
+              </w:rPr>
+              <w:t>0,13</w:t>
+            </w:r>
+          </w:p>
+        </w:tc>
+      </w:tr>
+      <w:tr>
+        <w:tc>
+          <w:tcPr>
+            <w:tcW w:type="dxa" w:w="4535"/>
+          </w:tcPr>
+          <w:p>
+            <w:pPr>
+              <w:keepNext/>
+            </w:pPr>
+            <w:r/>
+            <w:r>
+              <w:rPr>
+                <w:sz w:val="17"/>
+              </w:rPr>
+              <w:t>Uso</w:t>
+            </w:r>
+          </w:p>
+        </w:tc>
+        <w:tc>
+          <w:tcPr>
+            <w:tcW w:type="dxa" w:w="2268"/>
+          </w:tcPr>
+          <w:p>
+            <w:pPr>
+              <w:keepNext/>
+            </w:pPr>
+            <w:r/>
+            <w:r>
+              <w:rPr>
+                <w:sz w:val="17"/>
+              </w:rPr>
+              <w:t>0,15</w:t>
+            </w:r>
+          </w:p>
+        </w:tc>
+      </w:tr>
+      <w:tr>
+        <w:tc>
+          <w:tcPr>
+            <w:tcW w:type="dxa" w:w="4535"/>
+          </w:tcPr>
+          <w:p>
+            <w:pPr>
+              <w:keepNext/>
+            </w:pPr>
+            <w:r/>
+            <w:r>
+              <w:rPr>
+                <w:sz w:val="17"/>
+              </w:rPr>
+              <w:t>Fin de vida</w:t>
+            </w:r>
+          </w:p>
+        </w:tc>
+        <w:tc>
+          <w:tcPr>
+            <w:tcW w:type="dxa" w:w="2268"/>
+          </w:tcPr>
+          <w:p>
+            <w:pPr>
+              <w:keepNext/>
+            </w:pPr>
+            <w:r/>
+            <w:r>
+              <w:rPr>
+                <w:sz w:val="17"/>
+              </w:rPr>
+              <w:t>2,21</w:t>
+            </w:r>
+          </w:p>
+        </w:tc>
+      </w:tr>
+      <w:tr>
+        <w:tc>
+          <w:tcPr>
+            <w:tcW w:type="dxa" w:w="4535"/>
+          </w:tcPr>
+          <w:p>
+            <w:pPr>
+              <w:keepNext/>
+            </w:pPr>
+            <w:r/>
+            <w:r>
+              <w:rPr>
+                <w:b/>
+                <w:sz w:val="17"/>
+              </w:rPr>
+              <w:t>TOTAL ciclo de vida (A–C)</w:t>
+            </w:r>
+          </w:p>
+        </w:tc>
+        <w:tc>
+          <w:tcPr>
+            <w:tcW w:type="dxa" w:w="2268"/>
+          </w:tcPr>
+          <w:p>
+            <w:pPr>
+              <w:keepNext/>
+            </w:pPr>
+            <w:r/>
+            <w:r>
+              <w:rPr>
+                <w:b/>
+                <w:sz w:val="17"/>
+              </w:rPr>
+              <w:t>27,26</w:t>
+            </w:r>
+          </w:p>
+        </w:tc>
+      </w:tr>
+      <w:tr>
+        <w:tc>
+          <w:tcPr>
+            <w:tcW w:type="dxa" w:w="4535"/>
+          </w:tcPr>
+          <w:p>
+            <w:pPr>
+              <w:keepNext/>
+            </w:pPr>
+            <w:r/>
+            <w:r>
+              <w:rPr>
+                <w:sz w:val="17"/>
+              </w:rPr>
+              <w:t>Beneficio del reciclaje (módulo D)</w:t>
+            </w:r>
+          </w:p>
+        </w:tc>
+        <w:tc>
+          <w:tcPr>
+            <w:tcW w:type="dxa" w:w="2268"/>
+          </w:tcPr>
+          <w:p>
+            <w:pPr>
+              <w:keepNext/>
+            </w:pPr>
+            <w:r/>
+            <w:r>
+              <w:rPr>
+                <w:sz w:val="17"/>
+              </w:rPr>
+              <w:t>-13,69</w:t>
+            </w:r>
+          </w:p>
+        </w:tc>
+      </w:tr>
+    </w:tbl>
+    <w:p>
+      <w:pPr>
+        <w:jc w:val="center"/>
+      </w:pPr>
+      <w:r>
+        <w:rPr>
+          <w:b w:val="0"/>
+          <w:i/>
+          <w:sz w:val="18"/>
+        </w:rPr>
+        <w:t>Tabla 13. Huella de carbono de la Alternativa 2: aluminio y polipropileno.</w:t>
+      </w:r>
+    </w:p>
+    <w:p>
+      <w:pPr>
+        <w:pStyle w:val="Heading2"/>
+      </w:pPr>
+      <w:r>
+        <w:rPr>
+          <w:b w:val="0"/>
+          <w:i w:val="0"/>
+        </w:rPr>
+        <w:t>4.4. ALTERNATIVA 3: MADERA</w:t>
+      </w:r>
+    </w:p>
+    <w:p>
+      <w:r>
+        <w:rPr>
+          <w:b w:val="0"/>
+          <w:i w:val="0"/>
+        </w:rPr>
+        <w:t>La alternativa de madera es claramente la de menor huella de carbono. La madera tiene un factor de emisión fósil muy bajo y el CO₂ que se libera en su valorización al final de su vida es de origen biogénico. En esta alternativa las piezas que más emiten son, curiosamente, las de acero (bielas, tirantes y pasadores), que suponen más de un tercio de la producción.</w:t>
+      </w:r>
+    </w:p>
+    <w:tbl>
+      <w:tblPr>
+        <w:tblStyle w:val="TableGrid"/>
+        <w:tblW w:type="auto" w:w="0"/>
+        <w:tblLook w:firstColumn="1" w:firstRow="1" w:lastColumn="0" w:lastRow="0" w:noHBand="0" w:noVBand="1" w:val="04A0"/>
+        <w:tblLayout w:type="fixed"/>
+      </w:tblPr>
+      <w:tblGrid>
+        <w:gridCol w:w="4535"/>
+        <w:gridCol w:w="2267"/>
+      </w:tblGrid>
+      <w:tr>
+        <w:tc>
+          <w:tcPr>
+            <w:tcW w:type="dxa" w:w="4535"/>
+            <w:shd w:val="clear" w:color="auto" w:fill="C0392B"/>
+          </w:tcPr>
+          <w:p>
+            <w:pPr>
+              <w:keepNext/>
+            </w:pPr>
+            <w:r/>
+            <w:r>
+              <w:rPr>
+                <w:b/>
+                <w:color w:val="FFFFFF"/>
+                <w:sz w:val="18"/>
+              </w:rPr>
+              <w:t>Fase</w:t>
+            </w:r>
+          </w:p>
+        </w:tc>
+        <w:tc>
+          <w:tcPr>
+            <w:tcW w:type="dxa" w:w="2268"/>
+            <w:shd w:val="clear" w:color="auto" w:fill="C0392B"/>
+          </w:tcPr>
+          <w:p>
+            <w:pPr>
+              <w:keepNext/>
+            </w:pPr>
+            <w:r/>
+            <w:r>
+              <w:rPr>
+                <w:b/>
+                <w:color w:val="FFFFFF"/>
+                <w:sz w:val="18"/>
+              </w:rPr>
+              <w:t>kg CO₂-eq</w:t>
+            </w:r>
+          </w:p>
+        </w:tc>
+      </w:tr>
+      <w:tr>
+        <w:tc>
+          <w:tcPr>
+            <w:tcW w:type="dxa" w:w="4535"/>
+          </w:tcPr>
+          <w:p>
+            <w:pPr>
+              <w:keepNext/>
+            </w:pPr>
+            <w:r/>
+            <w:r>
+              <w:rPr>
+                <w:sz w:val="17"/>
+              </w:rPr>
+              <w:t>Producción</w:t>
+            </w:r>
+          </w:p>
+        </w:tc>
+        <w:tc>
+          <w:tcPr>
+            <w:tcW w:type="dxa" w:w="2268"/>
+          </w:tcPr>
+          <w:p>
+            <w:pPr>
+              <w:keepNext/>
+            </w:pPr>
+            <w:r/>
+            <w:r>
+              <w:rPr>
+                <w:sz w:val="17"/>
+              </w:rPr>
+              <w:t>2,13</w:t>
+            </w:r>
+          </w:p>
+        </w:tc>
+      </w:tr>
+      <w:tr>
+        <w:tc>
+          <w:tcPr>
+            <w:tcW w:type="dxa" w:w="4535"/>
+          </w:tcPr>
+          <w:p>
+            <w:pPr>
+              <w:keepNext/>
+            </w:pPr>
+            <w:r/>
+            <w:r>
+              <w:rPr>
+                <w:sz w:val="17"/>
+              </w:rPr>
+              <w:t>Transporte</w:t>
+            </w:r>
+          </w:p>
+        </w:tc>
+        <w:tc>
+          <w:tcPr>
+            <w:tcW w:type="dxa" w:w="2268"/>
+          </w:tcPr>
+          <w:p>
+            <w:pPr>
+              <w:keepNext/>
+            </w:pPr>
+            <w:r/>
+            <w:r>
+              <w:rPr>
+                <w:sz w:val="17"/>
+              </w:rPr>
+              <w:t>0,16</w:t>
+            </w:r>
+          </w:p>
+        </w:tc>
+      </w:tr>
+      <w:tr>
+        <w:tc>
+          <w:tcPr>
+            <w:tcW w:type="dxa" w:w="4535"/>
+          </w:tcPr>
+          <w:p>
+            <w:pPr>
+              <w:keepNext/>
+            </w:pPr>
+            <w:r/>
+            <w:r>
+              <w:rPr>
+                <w:sz w:val="17"/>
+              </w:rPr>
+              <w:t>Uso</w:t>
+            </w:r>
+          </w:p>
+        </w:tc>
+        <w:tc>
+          <w:tcPr>
+            <w:tcW w:type="dxa" w:w="2268"/>
+          </w:tcPr>
+          <w:p>
+            <w:pPr>
+              <w:keepNext/>
+            </w:pPr>
+            <w:r/>
+            <w:r>
+              <w:rPr>
+                <w:sz w:val="17"/>
+              </w:rPr>
+              <w:t>0,15</w:t>
+            </w:r>
+          </w:p>
+        </w:tc>
+      </w:tr>
+      <w:tr>
+        <w:tc>
+          <w:tcPr>
+            <w:tcW w:type="dxa" w:w="4535"/>
+          </w:tcPr>
+          <w:p>
+            <w:pPr>
+              <w:keepNext/>
+            </w:pPr>
+            <w:r/>
+            <w:r>
+              <w:rPr>
+                <w:sz w:val="17"/>
+              </w:rPr>
+              <w:t>Fin de vida</w:t>
+            </w:r>
+          </w:p>
+        </w:tc>
+        <w:tc>
+          <w:tcPr>
+            <w:tcW w:type="dxa" w:w="2268"/>
+          </w:tcPr>
+          <w:p>
+            <w:pPr>
+              <w:keepNext/>
+            </w:pPr>
+            <w:r/>
+            <w:r>
+              <w:rPr>
+                <w:sz w:val="17"/>
+              </w:rPr>
+              <w:t>0,14</w:t>
+            </w:r>
+          </w:p>
+        </w:tc>
+      </w:tr>
+      <w:tr>
+        <w:tc>
+          <w:tcPr>
+            <w:tcW w:type="dxa" w:w="4535"/>
+          </w:tcPr>
+          <w:p>
+            <w:pPr>
+              <w:keepNext/>
+            </w:pPr>
+            <w:r/>
+            <w:r>
+              <w:rPr>
+                <w:b/>
+                <w:sz w:val="17"/>
+              </w:rPr>
+              <w:t>TOTAL ciclo de vida (A–C)</w:t>
+            </w:r>
+          </w:p>
+        </w:tc>
+        <w:tc>
+          <w:tcPr>
+            <w:tcW w:type="dxa" w:w="2268"/>
+          </w:tcPr>
+          <w:p>
+            <w:pPr>
+              <w:keepNext/>
+            </w:pPr>
+            <w:r/>
+            <w:r>
+              <w:rPr>
+                <w:b/>
+                <w:sz w:val="17"/>
+              </w:rPr>
+              <w:t>2,58</w:t>
+            </w:r>
+          </w:p>
+        </w:tc>
+      </w:tr>
+      <w:tr>
+        <w:tc>
+          <w:tcPr>
+            <w:tcW w:type="dxa" w:w="4535"/>
+          </w:tcPr>
+          <w:p>
+            <w:pPr>
+              <w:keepNext/>
+            </w:pPr>
+            <w:r/>
+            <w:r>
+              <w:rPr>
+                <w:sz w:val="17"/>
+              </w:rPr>
+              <w:t>Beneficio del reciclaje (módulo D)</w:t>
+            </w:r>
+          </w:p>
+        </w:tc>
+        <w:tc>
+          <w:tcPr>
+            <w:tcW w:type="dxa" w:w="2268"/>
+          </w:tcPr>
+          <w:p>
+            <w:pPr>
+              <w:keepNext/>
+            </w:pPr>
+            <w:r/>
+            <w:r>
+              <w:rPr>
+                <w:sz w:val="17"/>
+              </w:rPr>
+              <w:t>-0,43</w:t>
+            </w:r>
+          </w:p>
+        </w:tc>
+      </w:tr>
+    </w:tbl>
+    <w:p>
+      <w:pPr>
+        <w:jc w:val="center"/>
+      </w:pPr>
+      <w:r>
+        <w:rPr>
+          <w:b w:val="0"/>
+          <w:i/>
+          <w:sz w:val="18"/>
+        </w:rPr>
+        <w:t>Tabla 14. Huella de carbono de la Alternativa 3: madera.</w:t>
+      </w:r>
+    </w:p>
+    <w:p>
+      <w:pPr>
+        <w:pStyle w:val="Heading2"/>
+      </w:pPr>
+      <w:r>
+        <w:rPr>
+          <w:b w:val="0"/>
+          <w:i w:val="0"/>
+        </w:rPr>
+        <w:t>4.5. COMPARATIVA Y CONCLUSIONES</w:t>
+      </w:r>
+    </w:p>
+    <w:p>
+      <w:pPr>
+        <w:jc w:val="center"/>
+      </w:pPr>
+      <w:r>
+        <w:drawing>
+          <wp:inline xmlns:a="http://schemas.openxmlformats.org/drawingml/2006/main" xmlns:pic="http://schemas.openxmlformats.org/drawingml/2006/picture">
+            <wp:extent cx="5580000" cy="3151059"/>
+            <wp:docPr id="17" name="Picture 17"/>
+            <wp:cNvGraphicFramePr>
+              <a:graphicFrameLocks noChangeAspect="1"/>
+            </wp:cNvGraphicFramePr>
+            <a:graphic>
+              <a:graphicData uri="http://schemas.openxmlformats.org/drawingml/2006/picture">
+                <pic:pic>
+                  <pic:nvPicPr>
+                    <pic:cNvPr id="0" name="figura_acv_fases.png"/>
+                    <pic:cNvPicPr/>
+                  </pic:nvPicPr>
+                  <pic:blipFill>
+                    <a:blip r:embed="rId26"/>
+                    <a:stretch>
+                      <a:fillRect/>
+                    </a:stretch>
+                  </pic:blipFill>
+                  <pic:spPr>
+                    <a:xfrm>
+                      <a:off x="0" y="0"/>
+                      <a:ext cx="5580000" cy="3151059"/>
+                    </a:xfrm>
+                    <a:prstGeom prst="rect"/>
+                  </pic:spPr>
+                </pic:pic>
+              </a:graphicData>
+            </a:graphic>
+          </wp:inline>
+        </w:drawing>
+      </w:r>
+    </w:p>
+    <w:p>
+      <w:pPr>
+        <w:jc w:val="center"/>
+      </w:pPr>
+      <w:r>
+        <w:rPr>
+          <w:b w:val="0"/>
+          <w:i/>
+          <w:sz w:val="18"/>
+        </w:rPr>
+        <w:t>Ilustración 17. Huella de carbono de las tres alternativas por fase del ciclo de vida. Elaboración propia.</w:t>
+      </w:r>
+    </w:p>
+    <w:p>
+      <w:pPr>
+        <w:jc w:val="center"/>
+      </w:pPr>
+      <w:r>
+        <w:drawing>
+          <wp:inline xmlns:a="http://schemas.openxmlformats.org/drawingml/2006/main" xmlns:pic="http://schemas.openxmlformats.org/drawingml/2006/picture">
+            <wp:extent cx="5940000" cy="2128500"/>
+            <wp:docPr id="18" name="Picture 18"/>
+            <wp:cNvGraphicFramePr>
+              <a:graphicFrameLocks noChangeAspect="1"/>
+            </wp:cNvGraphicFramePr>
+            <a:graphic>
+              <a:graphicData uri="http://schemas.openxmlformats.org/drawingml/2006/picture">
+                <pic:pic>
+                  <pic:nvPicPr>
+                    <pic:cNvPr id="0" name="figura_acv_componentes.png"/>
+                    <pic:cNvPicPr/>
+                  </pic:nvPicPr>
+                  <pic:blipFill>
+                    <a:blip r:embed="rId27"/>
+                    <a:stretch>
+                      <a:fillRect/>
+                    </a:stretch>
+                  </pic:blipFill>
+                  <pic:spPr>
+                    <a:xfrm>
+                      <a:off x="0" y="0"/>
+                      <a:ext cx="5940000" cy="2128500"/>
+                    </a:xfrm>
+                    <a:prstGeom prst="rect"/>
+                  </pic:spPr>
+                </pic:pic>
+              </a:graphicData>
+            </a:graphic>
+          </wp:inline>
+        </w:drawing>
+      </w:r>
+    </w:p>
+    <w:p>
+      <w:pPr>
+        <w:jc w:val="center"/>
+      </w:pPr>
+      <w:r>
+        <w:rPr>
+          <w:b w:val="0"/>
+          <w:i/>
+          <w:sz w:val="18"/>
+        </w:rPr>
+        <w:t>Ilustración 18. Huella de carbono de la fase de producción por componente. Elaboración propia.</w:t>
+      </w:r>
+    </w:p>
+    <w:p>
+      <w:r>
+        <w:rPr>
+          <w:b w:val="0"/>
+          <w:i w:val="0"/>
+        </w:rPr>
+        <w:t>Desde el punto de vista ambiental, la alternativa de madera es la mejor con mucha diferencia (2,6 kg CO₂-eq), seguida de la de acero (13,9) y la de aluminio (27,3), que emite unas diez veces más que la de madera. En las tres alternativas la fase de producción es la dominante, mientras que el transporte y el uso son prácticamente despreciables, algo lógico en un producto que no consume energía. Por tanto, las decisiones de diseño con más efecto sobre el medio ambiente son la elección del material y la cantidad de material empleado.</w:t>
+      </w:r>
+    </w:p>
+    <w:p>
+      <w:r>
+        <w:rPr>
+          <w:b w:val="0"/>
+          <w:i w:val="0"/>
+        </w:rPr>
+        <w:t>Sin embargo, la huella de carbono no es el único criterio del EDP. Para tomar la decisión se ha elaborado una matriz de decisión ponderada con los criterios más importantes, puntuados de 1 (peor) a 5 (mejor):</w:t>
+      </w:r>
+    </w:p>
+    <w:tbl>
+      <w:tblPr>
+        <w:tblStyle w:val="TableGrid"/>
+        <w:tblW w:type="auto" w:w="0"/>
+        <w:tblLook w:firstColumn="1" w:firstRow="1" w:lastColumn="0" w:lastRow="0" w:noHBand="0" w:noVBand="1" w:val="04A0"/>
+        <w:tblLayout w:type="fixed"/>
+      </w:tblPr>
+      <w:tblGrid>
+        <w:gridCol w:w="3401"/>
+        <w:gridCol w:w="1020"/>
+        <w:gridCol w:w="1417"/>
+        <w:gridCol w:w="1700"/>
+        <w:gridCol w:w="1417"/>
+      </w:tblGrid>
+      <w:tr>
+        <w:tc>
+          <w:tcPr>
+            <w:tcW w:type="dxa" w:w="3402"/>
+            <w:shd w:val="clear" w:color="auto" w:fill="C0392B"/>
+          </w:tcPr>
+          <w:p>
+            <w:pPr>
+              <w:keepNext/>
+            </w:pPr>
+            <w:r/>
+            <w:r>
+              <w:rPr>
+                <w:b/>
+                <w:color w:val="FFFFFF"/>
+                <w:sz w:val="18"/>
+              </w:rPr>
+              <w:t>Criterio</w:t>
+            </w:r>
+          </w:p>
+        </w:tc>
+        <w:tc>
+          <w:tcPr>
+            <w:tcW w:type="dxa" w:w="1020"/>
+            <w:shd w:val="clear" w:color="auto" w:fill="C0392B"/>
+          </w:tcPr>
+          <w:p>
+            <w:pPr>
+              <w:keepNext/>
+            </w:pPr>
+            <w:r/>
+            <w:r>
+              <w:rPr>
+                <w:b/>
+                <w:color w:val="FFFFFF"/>
+                <w:sz w:val="18"/>
+              </w:rPr>
+              <w:t>Peso</w:t>
+            </w:r>
+          </w:p>
+        </w:tc>
+        <w:tc>
+          <w:tcPr>
+            <w:tcW w:type="dxa" w:w="1417"/>
+            <w:shd w:val="clear" w:color="auto" w:fill="C0392B"/>
+          </w:tcPr>
+          <w:p>
+            <w:pPr>
+              <w:keepNext/>
+            </w:pPr>
+            <w:r/>
+            <w:r>
+              <w:rPr>
+                <w:b/>
+                <w:color w:val="FFFFFF"/>
+                <w:sz w:val="18"/>
+              </w:rPr>
+              <w:t>Acero</w:t>
+            </w:r>
+          </w:p>
+        </w:tc>
+        <w:tc>
+          <w:tcPr>
+            <w:tcW w:type="dxa" w:w="1701"/>
+            <w:shd w:val="clear" w:color="auto" w:fill="C0392B"/>
+          </w:tcPr>
+          <w:p>
+            <w:pPr>
+              <w:keepNext/>
+            </w:pPr>
+            <w:r/>
+            <w:r>
+              <w:rPr>
+                <w:b/>
+                <w:color w:val="FFFFFF"/>
+                <w:sz w:val="18"/>
+              </w:rPr>
+              <w:t>Aluminio + PP</w:t>
+            </w:r>
+          </w:p>
+        </w:tc>
+        <w:tc>
+          <w:tcPr>
+            <w:tcW w:type="dxa" w:w="1417"/>
+            <w:shd w:val="clear" w:color="auto" w:fill="C0392B"/>
+          </w:tcPr>
+          <w:p>
+            <w:pPr>
+              <w:keepNext/>
+            </w:pPr>
+            <w:r/>
+            <w:r>
+              <w:rPr>
+                <w:b/>
+                <w:color w:val="FFFFFF"/>
+                <w:sz w:val="18"/>
+              </w:rPr>
+              <w:t>Madera</w:t>
+            </w:r>
+          </w:p>
+        </w:tc>
+      </w:tr>
+      <w:tr>
+        <w:tc>
+          <w:tcPr>
+            <w:tcW w:type="dxa" w:w="3402"/>
+          </w:tcPr>
+          <w:p>
+            <w:pPr>
+              <w:keepNext/>
+            </w:pPr>
+            <w:r/>
+            <w:r>
+              <w:rPr>
+                <w:sz w:val="17"/>
+              </w:rPr>
+              <w:t>Huella de carbono (ACV)</w:t>
+            </w:r>
+          </w:p>
+        </w:tc>
+        <w:tc>
+          <w:tcPr>
+            <w:tcW w:type="dxa" w:w="1020"/>
+          </w:tcPr>
+          <w:p>
+            <w:pPr>
+              <w:keepNext/>
+            </w:pPr>
+            <w:r/>
+            <w:r>
+              <w:rPr>
+                <w:sz w:val="17"/>
+              </w:rPr>
+              <w:t>30 %</w:t>
+            </w:r>
+          </w:p>
+        </w:tc>
+        <w:tc>
+          <w:tcPr>
+            <w:tcW w:type="dxa" w:w="1417"/>
+          </w:tcPr>
+          <w:p>
+            <w:pPr>
+              <w:keepNext/>
+            </w:pPr>
+            <w:r/>
+            <w:r>
+              <w:rPr>
+                <w:sz w:val="17"/>
+              </w:rPr>
+              <w:t>3</w:t>
+            </w:r>
+          </w:p>
+        </w:tc>
+        <w:tc>
+          <w:tcPr>
+            <w:tcW w:type="dxa" w:w="1701"/>
+          </w:tcPr>
+          <w:p>
+            <w:pPr>
+              <w:keepNext/>
+            </w:pPr>
+            <w:r/>
+            <w:r>
+              <w:rPr>
+                <w:sz w:val="17"/>
+              </w:rPr>
+              <w:t>1</w:t>
+            </w:r>
+          </w:p>
+        </w:tc>
+        <w:tc>
+          <w:tcPr>
+            <w:tcW w:type="dxa" w:w="1417"/>
+          </w:tcPr>
+          <w:p>
+            <w:pPr>
+              <w:keepNext/>
+            </w:pPr>
+            <w:r/>
+            <w:r>
+              <w:rPr>
+                <w:sz w:val="17"/>
+              </w:rPr>
+              <w:t>5</w:t>
+            </w:r>
+          </w:p>
+        </w:tc>
+      </w:tr>
+      <w:tr>
+        <w:tc>
+          <w:tcPr>
+            <w:tcW w:type="dxa" w:w="3402"/>
+          </w:tcPr>
+          <w:p>
+            <w:pPr>
+              <w:keepNext/>
+            </w:pPr>
+            <w:r/>
+            <w:r>
+              <w:rPr>
+                <w:sz w:val="17"/>
+              </w:rPr>
+              <w:t>Peso (requisito ≤ 3,5 kg)</w:t>
+            </w:r>
+          </w:p>
+        </w:tc>
+        <w:tc>
+          <w:tcPr>
+            <w:tcW w:type="dxa" w:w="1020"/>
+          </w:tcPr>
+          <w:p>
+            <w:pPr>
+              <w:keepNext/>
+            </w:pPr>
+            <w:r/>
+            <w:r>
+              <w:rPr>
+                <w:sz w:val="17"/>
+              </w:rPr>
+              <w:t>25 %</w:t>
+            </w:r>
+          </w:p>
+        </w:tc>
+        <w:tc>
+          <w:tcPr>
+            <w:tcW w:type="dxa" w:w="1417"/>
+          </w:tcPr>
+          <w:p>
+            <w:pPr>
+              <w:keepNext/>
+            </w:pPr>
+            <w:r/>
+            <w:r>
+              <w:rPr>
+                <w:sz w:val="17"/>
+              </w:rPr>
+              <w:t>1</w:t>
+            </w:r>
+          </w:p>
+        </w:tc>
+        <w:tc>
+          <w:tcPr>
+            <w:tcW w:type="dxa" w:w="1701"/>
+          </w:tcPr>
+          <w:p>
+            <w:pPr>
+              <w:keepNext/>
+            </w:pPr>
+            <w:r/>
+            <w:r>
+              <w:rPr>
+                <w:sz w:val="17"/>
+              </w:rPr>
+              <w:t>5</w:t>
+            </w:r>
+          </w:p>
+        </w:tc>
+        <w:tc>
+          <w:tcPr>
+            <w:tcW w:type="dxa" w:w="1417"/>
+          </w:tcPr>
+          <w:p>
+            <w:pPr>
+              <w:keepNext/>
+            </w:pPr>
+            <w:r/>
+            <w:r>
+              <w:rPr>
+                <w:sz w:val="17"/>
+              </w:rPr>
+              <w:t>4</w:t>
+            </w:r>
+          </w:p>
+        </w:tc>
+      </w:tr>
+      <w:tr>
+        <w:tc>
+          <w:tcPr>
+            <w:tcW w:type="dxa" w:w="3402"/>
+          </w:tcPr>
+          <w:p>
+            <w:pPr>
+              <w:keepNext/>
+            </w:pPr>
+            <w:r/>
+            <w:r>
+              <w:rPr>
+                <w:sz w:val="17"/>
+              </w:rPr>
+              <w:t>Coste estimado</w:t>
+            </w:r>
+          </w:p>
+        </w:tc>
+        <w:tc>
+          <w:tcPr>
+            <w:tcW w:type="dxa" w:w="1020"/>
+          </w:tcPr>
+          <w:p>
+            <w:pPr>
+              <w:keepNext/>
+            </w:pPr>
+            <w:r/>
+            <w:r>
+              <w:rPr>
+                <w:sz w:val="17"/>
+              </w:rPr>
+              <w:t>20 %</w:t>
+            </w:r>
+          </w:p>
+        </w:tc>
+        <w:tc>
+          <w:tcPr>
+            <w:tcW w:type="dxa" w:w="1417"/>
+          </w:tcPr>
+          <w:p>
+            <w:pPr>
+              <w:keepNext/>
+            </w:pPr>
+            <w:r/>
+            <w:r>
+              <w:rPr>
+                <w:sz w:val="17"/>
+              </w:rPr>
+              <w:t>5</w:t>
+            </w:r>
+          </w:p>
+        </w:tc>
+        <w:tc>
+          <w:tcPr>
+            <w:tcW w:type="dxa" w:w="1701"/>
+          </w:tcPr>
+          <w:p>
+            <w:pPr>
+              <w:keepNext/>
+            </w:pPr>
+            <w:r/>
+            <w:r>
+              <w:rPr>
+                <w:sz w:val="17"/>
+              </w:rPr>
+              <w:t>3</w:t>
+            </w:r>
+          </w:p>
+        </w:tc>
+        <w:tc>
+          <w:tcPr>
+            <w:tcW w:type="dxa" w:w="1417"/>
+          </w:tcPr>
+          <w:p>
+            <w:pPr>
+              <w:keepNext/>
+            </w:pPr>
+            <w:r/>
+            <w:r>
+              <w:rPr>
+                <w:sz w:val="17"/>
+              </w:rPr>
+              <w:t>3</w:t>
+            </w:r>
+          </w:p>
+        </w:tc>
+      </w:tr>
+      <w:tr>
+        <w:tc>
+          <w:tcPr>
+            <w:tcW w:type="dxa" w:w="3402"/>
+          </w:tcPr>
+          <w:p>
+            <w:pPr>
+              <w:keepNext/>
+            </w:pPr>
+            <w:r/>
+            <w:r>
+              <w:rPr>
+                <w:sz w:val="17"/>
+              </w:rPr>
+              <w:t>Durabilidad y resistencia a la humedad</w:t>
+            </w:r>
+          </w:p>
+        </w:tc>
+        <w:tc>
+          <w:tcPr>
+            <w:tcW w:type="dxa" w:w="1020"/>
+          </w:tcPr>
+          <w:p>
+            <w:pPr>
+              <w:keepNext/>
+            </w:pPr>
+            <w:r/>
+            <w:r>
+              <w:rPr>
+                <w:sz w:val="17"/>
+              </w:rPr>
+              <w:t>15 %</w:t>
+            </w:r>
+          </w:p>
+        </w:tc>
+        <w:tc>
+          <w:tcPr>
+            <w:tcW w:type="dxa" w:w="1417"/>
+          </w:tcPr>
+          <w:p>
+            <w:pPr>
+              <w:keepNext/>
+            </w:pPr>
+            <w:r/>
+            <w:r>
+              <w:rPr>
+                <w:sz w:val="17"/>
+              </w:rPr>
+              <w:t>3</w:t>
+            </w:r>
+          </w:p>
+        </w:tc>
+        <w:tc>
+          <w:tcPr>
+            <w:tcW w:type="dxa" w:w="1701"/>
+          </w:tcPr>
+          <w:p>
+            <w:pPr>
+              <w:keepNext/>
+            </w:pPr>
+            <w:r/>
+            <w:r>
+              <w:rPr>
+                <w:sz w:val="17"/>
+              </w:rPr>
+              <w:t>5</w:t>
+            </w:r>
+          </w:p>
+        </w:tc>
+        <w:tc>
+          <w:tcPr>
+            <w:tcW w:type="dxa" w:w="1417"/>
+          </w:tcPr>
+          <w:p>
+            <w:pPr>
+              <w:keepNext/>
+            </w:pPr>
+            <w:r/>
+            <w:r>
+              <w:rPr>
+                <w:sz w:val="17"/>
+              </w:rPr>
+              <w:t>2</w:t>
+            </w:r>
+          </w:p>
+        </w:tc>
+      </w:tr>
+      <w:tr>
+        <w:tc>
+          <w:tcPr>
+            <w:tcW w:type="dxa" w:w="3402"/>
+          </w:tcPr>
+          <w:p>
+            <w:pPr>
+              <w:keepNext/>
+            </w:pPr>
+            <w:r/>
+            <w:r>
+              <w:rPr>
+                <w:sz w:val="17"/>
+              </w:rPr>
+              <w:t>Estética y percepción de calidad</w:t>
+            </w:r>
+          </w:p>
+        </w:tc>
+        <w:tc>
+          <w:tcPr>
+            <w:tcW w:type="dxa" w:w="1020"/>
+          </w:tcPr>
+          <w:p>
+            <w:pPr>
+              <w:keepNext/>
+            </w:pPr>
+            <w:r/>
+            <w:r>
+              <w:rPr>
+                <w:sz w:val="17"/>
+              </w:rPr>
+              <w:t>10 %</w:t>
+            </w:r>
+          </w:p>
+        </w:tc>
+        <w:tc>
+          <w:tcPr>
+            <w:tcW w:type="dxa" w:w="1417"/>
+          </w:tcPr>
+          <w:p>
+            <w:pPr>
+              <w:keepNext/>
+            </w:pPr>
+            <w:r/>
+            <w:r>
+              <w:rPr>
+                <w:sz w:val="17"/>
+              </w:rPr>
+              <w:t>3</w:t>
+            </w:r>
+          </w:p>
+        </w:tc>
+        <w:tc>
+          <w:tcPr>
+            <w:tcW w:type="dxa" w:w="1701"/>
+          </w:tcPr>
+          <w:p>
+            <w:pPr>
+              <w:keepNext/>
+            </w:pPr>
+            <w:r/>
+            <w:r>
+              <w:rPr>
+                <w:sz w:val="17"/>
+              </w:rPr>
+              <w:t>4</w:t>
+            </w:r>
+          </w:p>
+        </w:tc>
+        <w:tc>
+          <w:tcPr>
+            <w:tcW w:type="dxa" w:w="1417"/>
+          </w:tcPr>
+          <w:p>
+            <w:pPr>
+              <w:keepNext/>
+            </w:pPr>
+            <w:r/>
+            <w:r>
+              <w:rPr>
+                <w:sz w:val="17"/>
+              </w:rPr>
+              <w:t>5</w:t>
+            </w:r>
+          </w:p>
+        </w:tc>
+      </w:tr>
+      <w:tr>
+        <w:tc>
+          <w:tcPr>
+            <w:tcW w:type="dxa" w:w="3402"/>
+          </w:tcPr>
+          <w:p>
+            <w:pPr>
+              <w:keepNext/>
+            </w:pPr>
+            <w:r/>
+            <w:r>
+              <w:rPr>
+                <w:b/>
+                <w:sz w:val="17"/>
+              </w:rPr>
+              <w:t>TOTAL ponderado</w:t>
+            </w:r>
+          </w:p>
+        </w:tc>
+        <w:tc>
+          <w:tcPr>
+            <w:tcW w:type="dxa" w:w="1020"/>
+          </w:tcPr>
+          <w:p>
+            <w:pPr>
+              <w:keepNext/>
+            </w:pPr>
+            <w:r/>
+            <w:r>
+              <w:rPr>
+                <w:b/>
+                <w:sz w:val="17"/>
+              </w:rPr>
+              <w:t>100 %</w:t>
+            </w:r>
+          </w:p>
+        </w:tc>
+        <w:tc>
+          <w:tcPr>
+            <w:tcW w:type="dxa" w:w="1417"/>
+          </w:tcPr>
+          <w:p>
+            <w:pPr>
+              <w:keepNext/>
+            </w:pPr>
+            <w:r/>
+            <w:r>
+              <w:rPr>
+                <w:b/>
+                <w:sz w:val="17"/>
+              </w:rPr>
+              <w:t>2,90</w:t>
+            </w:r>
+          </w:p>
+        </w:tc>
+        <w:tc>
+          <w:tcPr>
+            <w:tcW w:type="dxa" w:w="1701"/>
+          </w:tcPr>
+          <w:p>
+            <w:pPr>
+              <w:keepNext/>
+            </w:pPr>
+            <w:r/>
+            <w:r>
+              <w:rPr>
+                <w:b/>
+                <w:sz w:val="17"/>
+              </w:rPr>
+              <w:t>3,30</w:t>
+            </w:r>
+          </w:p>
+        </w:tc>
+        <w:tc>
+          <w:tcPr>
+            <w:tcW w:type="dxa" w:w="1417"/>
+          </w:tcPr>
+          <w:p>
+            <w:pPr>
+              <w:keepNext/>
+            </w:pPr>
+            <w:r/>
+            <w:r>
+              <w:rPr>
+                <w:b/>
+                <w:sz w:val="17"/>
+              </w:rPr>
+              <w:t>3,90</w:t>
+            </w:r>
+          </w:p>
+        </w:tc>
+      </w:tr>
+    </w:tbl>
+    <w:p>
+      <w:pPr>
+        <w:jc w:val="center"/>
+      </w:pPr>
+      <w:r>
+        <w:rPr>
+          <w:b w:val="0"/>
+          <w:i/>
+          <w:sz w:val="18"/>
+        </w:rPr>
+        <w:t>Tabla 15. Matriz de decisión ponderada. Las puntuaciones de coste, durabilidad y estética son valoraciones cualitativas propias.</w:t>
+      </w:r>
+    </w:p>
+    <w:p>
+      <w:r>
+        <w:rPr>
+          <w:b/>
+          <w:i w:val="0"/>
+        </w:rPr>
+        <w:t>Conclusiones:</w:t>
+      </w:r>
+    </w:p>
+    <w:p>
+      <w:pPr>
+        <w:pStyle w:val="ListBullet"/>
+      </w:pPr>
+      <w:r>
+        <w:rPr>
+          <w:b w:val="0"/>
+          <w:i w:val="0"/>
+        </w:rPr>
+        <w:t>La alternativa mejor valorada es la de madera, por su muy baja huella de carbono y su buena estética. Para que sea la solución definitiva debe rediseñarse para cumplir el peso máximo: reduciendo el espesor de la plataforma y el peldaño de 15 a 12 mm se ahorran unos 0,36 kg, y fabricando las bielas y los tirantes en aluminio, como en la alternativa 2, otros 0,26 kg, con lo que el peso quedaría en unos 3,34 kg. Además, debe tratarse con un barniz resistente a la humedad para su uso en baños y cocinas.</w:t>
+      </w:r>
+    </w:p>
+    <w:p>
+      <w:pPr>
+        <w:pStyle w:val="ListBullet"/>
+      </w:pPr>
+      <w:r>
+        <w:rPr>
+          <w:b w:val="0"/>
+          <w:i w:val="0"/>
+        </w:rPr>
+        <w:t>La alternativa de aluminio es la única que cumple ahora mismo todas las propiedades del EDP, pero tiene la mayor huella de carbono. Si se fabricara con aluminio reciclado (unos 2,1 kg CO₂-eq/kg en lugar de 9,08), su huella bajaría de 27,3 a unos 11,3 kg CO₂-eq, por debajo de la de acero.</w:t>
+      </w:r>
+    </w:p>
+    <w:p>
+      <w:pPr>
+        <w:pStyle w:val="ListBullet"/>
+      </w:pPr>
+      <w:r>
+        <w:rPr>
+          <w:b w:val="0"/>
+          <w:i w:val="0"/>
+        </w:rPr>
+        <w:t>La alternativa de acero es la más barata y robusta, pero su peso (9,20 kg) es incompatible con el requisito de transporte con una mano, por lo que se descarta.</w:t>
+      </w:r>
+    </w:p>
+    <w:p>
+      <w:r>
+        <w:rPr>
+          <w:b w:val="0"/>
+          <w:i w:val="0"/>
+        </w:rPr>
+        <w:t>Por todo ello, se propone continuar el desarrollo con la alternativa de madera, aplicando las mejoras indicadas, y mantener la de aluminio reciclado como alternativa en caso de que las pruebas de humedad o de resistencia de la madera no fueran satisfactorias.</w:t>
       </w:r>
     </w:p>
     <w:p>
@@ -10958,6 +15064,61 @@
           <w:b w:val="0"/>
         </w:rPr>
         <w:t>24. OEPM. ES 1 070 877 U, Dispositivo de enclavamiento para taburetes plegables y similares (2009).</w:t>
+      </w:r>
+    </w:p>
+    <w:p>
+      <w:pPr>
+        <w:ind w:left="510" w:hanging="340"/>
+      </w:pPr>
+      <w:r>
+        <w:rPr>
+          <w:b w:val="0"/>
+        </w:rPr>
+        <w:t>25. Hammond, G. y Jones, C. (2011). Inventory of Carbon &amp; Energy (ICE) Version 2.0. University of Bath.</w:t>
+      </w:r>
+    </w:p>
+    <w:p>
+      <w:pPr>
+        <w:ind w:left="510" w:hanging="340"/>
+      </w:pPr>
+      <w:r>
+        <w:rPr>
+          <w:b w:val="0"/>
+        </w:rPr>
+        <w:t>26. UK Government (DEFRA/DESNZ). Greenhouse gas reporting: conversion factors 2024.</w:t>
+      </w:r>
+    </w:p>
+    <w:p>
+      <w:pPr>
+        <w:ind w:left="510" w:hanging="340"/>
+      </w:pPr>
+      <w:r>
+        <w:rPr>
+          <w:b w:val="0"/>
+        </w:rPr>
+        <w:t>27. MITECO. Factores de emisión. Registro de huella de carbono, compensación y proyectos de absorción, 2024.</w:t>
+      </w:r>
+    </w:p>
+    <w:p>
+      <w:pPr>
+        <w:ind w:left="510" w:hanging="340"/>
+      </w:pPr>
+      <w:r>
+        <w:rPr>
+          <w:b w:val="0"/>
+        </w:rPr>
+        <w:t>28. UNE-EN ISO 14040:2006 y UNE-EN ISO 14044:2006. Gestión ambiental. Análisis del ciclo de vida.</w:t>
+      </w:r>
+    </w:p>
+    <w:p>
+      <w:pPr>
+        <w:ind w:left="510" w:hanging="340"/>
+      </w:pPr>
+      <w:r>
+        <w:rPr>
+          <w:b w:val="0"/>
+        </w:rPr>
+        <w:t>29. UNE-EN 15804:2012+A2:2020. Sostenibilidad en la construcción. Declaraciones ambientales de producto.</w:t>
       </w:r>
     </w:p>
     <w:sectPr>

</xml_diff>

<commit_message>
Añade etapa de rediseño (QFD, AMFEC, análisis del valor), anexos con planos, portada e índice
Co-Authored-By: Claude Opus 5.5 <noreply@anthropic.com>
Claude-Session: https://claude.ai/code/session_01GULK22xqK1fWX4r8uc4cx1
</commit_message>
<xml_diff>
--- a/trabajo/Trabajo_Taburete.docx
+++ b/trabajo/Trabajo_Taburete.docx
@@ -4,7 +4,235 @@
   <w:body>
     <w:p>
       <w:pPr>
+        <w:jc w:val="center"/>
+      </w:pPr>
+    </w:p>
+    <w:p>
+      <w:pPr>
+        <w:jc w:val="center"/>
+      </w:pPr>
+    </w:p>
+    <w:p>
+      <w:pPr>
+        <w:jc w:val="center"/>
+      </w:pPr>
+    </w:p>
+    <w:p>
+      <w:pPr>
+        <w:jc w:val="center"/>
+      </w:pPr>
+      <w:r>
+        <w:rPr>
+          <w:b/>
+          <w:i w:val="0"/>
+          <w:sz w:val="28"/>
+        </w:rPr>
+        <w:t>UNIVERSIDAD DE LA RIOJA</w:t>
+      </w:r>
+    </w:p>
+    <w:p>
+      <w:pPr>
+        <w:jc w:val="center"/>
+      </w:pPr>
+      <w:r>
+        <w:rPr>
+          <w:b w:val="0"/>
+          <w:i w:val="0"/>
+          <w:sz w:val="22"/>
+        </w:rPr>
+        <w:t>Grado en Ingeniería Mecánica · 4.º curso</w:t>
+      </w:r>
+    </w:p>
+    <w:p>
+      <w:pPr>
+        <w:jc w:val="center"/>
+      </w:pPr>
+      <w:r>
+        <w:rPr>
+          <w:b w:val="0"/>
+          <w:i/>
+          <w:sz w:val="22"/>
+        </w:rPr>
+        <w:t>Ingeniería Simultánea</w:t>
+      </w:r>
+    </w:p>
+    <w:p>
+      <w:pPr>
+        <w:jc w:val="center"/>
+      </w:pPr>
+    </w:p>
+    <w:p>
+      <w:pPr>
+        <w:jc w:val="center"/>
+      </w:pPr>
+    </w:p>
+    <w:p>
+      <w:pPr>
+        <w:jc w:val="center"/>
+      </w:pPr>
+    </w:p>
+    <w:p>
+      <w:pPr>
+        <w:jc w:val="center"/>
+      </w:pPr>
+    </w:p>
+    <w:p>
+      <w:pPr>
+        <w:jc w:val="center"/>
+      </w:pPr>
+      <w:r>
+        <w:rPr>
+          <w:b/>
+          <w:i w:val="0"/>
+          <w:color w:val="C0392B"/>
+          <w:sz w:val="48"/>
+        </w:rPr>
+        <w:t>DISEÑO DE UN TABURETE-ESCALERA</w:t>
+      </w:r>
+    </w:p>
+    <w:p>
+      <w:pPr>
+        <w:jc w:val="center"/>
+      </w:pPr>
+      <w:r>
+        <w:rPr>
+          <w:b/>
+          <w:i w:val="0"/>
+          <w:color w:val="C0392B"/>
+          <w:sz w:val="48"/>
+        </w:rPr>
+        <w:t>PLEGABLE DE USO DOMÉSTICO</w:t>
+      </w:r>
+    </w:p>
+    <w:p>
+      <w:pPr>
+        <w:jc w:val="center"/>
+      </w:pPr>
+    </w:p>
+    <w:p>
+      <w:pPr>
+        <w:jc w:val="center"/>
+      </w:pPr>
+      <w:r>
+        <w:rPr>
+          <w:b w:val="0"/>
+          <w:i w:val="0"/>
+          <w:sz w:val="24"/>
+        </w:rPr>
+        <w:t>Trabajo de la asignatura</w:t>
+      </w:r>
+    </w:p>
+    <w:p>
+      <w:pPr>
+        <w:jc w:val="center"/>
+      </w:pPr>
+      <w:r>
+        <w:drawing>
+          <wp:inline xmlns:a="http://schemas.openxmlformats.org/drawingml/2006/main" xmlns:pic="http://schemas.openxmlformats.org/drawingml/2006/picture">
+            <wp:extent cx="2520000" cy="1891338"/>
+            <wp:docPr id="26" name="Picture 26"/>
+            <wp:cNvGraphicFramePr>
+              <a:graphicFrameLocks noChangeAspect="1"/>
+            </wp:cNvGraphicFramePr>
+            <a:graphic>
+              <a:graphicData uri="http://schemas.openxmlformats.org/drawingml/2006/picture">
+                <pic:pic>
+                  <pic:nvPicPr>
+                    <pic:cNvPr id="0" name="image.png"/>
+                    <pic:cNvPicPr/>
+                  </pic:nvPicPr>
+                  <pic:blipFill>
+                    <a:blip r:embed="rId23"/>
+                    <a:stretch>
+                      <a:fillRect/>
+                    </a:stretch>
+                  </pic:blipFill>
+                  <pic:spPr>
+                    <a:xfrm>
+                      <a:off x="0" y="0"/>
+                      <a:ext cx="2520000" cy="1891338"/>
+                    </a:xfrm>
+                    <a:prstGeom prst="rect"/>
+                  </pic:spPr>
+                </pic:pic>
+              </a:graphicData>
+            </a:graphic>
+          </wp:inline>
+        </w:drawing>
+      </w:r>
+    </w:p>
+    <w:p>
+      <w:pPr>
+        <w:jc w:val="center"/>
+      </w:pPr>
+    </w:p>
+    <w:p>
+      <w:pPr>
+        <w:jc w:val="center"/>
+      </w:pPr>
+    </w:p>
+    <w:p>
+      <w:pPr>
+        <w:jc w:val="center"/>
+      </w:pPr>
+    </w:p>
+    <w:p>
+      <w:pPr>
+        <w:jc w:val="center"/>
+      </w:pPr>
+      <w:r>
+        <w:rPr>
+          <w:b w:val="0"/>
+          <w:i w:val="0"/>
+          <w:sz w:val="22"/>
+        </w:rPr>
+        <w:t xml:space="preserve">Alumno: </w:t>
+      </w:r>
+      <w:r>
+        <w:rPr>
+          <w:sz w:val="22"/>
+          <w:highlight w:val="yellow"/>
+        </w:rPr>
+        <w:t>[nombre y apellidos]</w:t>
+      </w:r>
+    </w:p>
+    <w:p>
+      <w:pPr>
+        <w:jc w:val="center"/>
+      </w:pPr>
+      <w:r>
+        <w:rPr>
+          <w:b w:val="0"/>
+          <w:i w:val="0"/>
+          <w:sz w:val="22"/>
+        </w:rPr>
+        <w:t>Curso 2026-2027</w:t>
+      </w:r>
+    </w:p>
+    <w:p>
+      <w:pPr>
         <w:pStyle w:val="Heading1"/>
+      </w:pPr>
+      <w:r>
+        <w:t>ÍNDICE</w:t>
+      </w:r>
+    </w:p>
+    <w:p>
+      <w:fldSimple w:instr="TOC \o &quot;1-3&quot; \h \z \u">
+        <w:r>
+          <w:t>Haz clic derecho aquí y elige «Actualizar campo» para generar el índice.</w:t>
+        </w:r>
+      </w:fldSimple>
+    </w:p>
+    <w:p>
+      <w:r>
+        <w:br w:type="page"/>
+      </w:r>
+    </w:p>
+    <w:p>
+      <w:pPr>
+        <w:pStyle w:val="Heading1"/>
+        <w:pageBreakBefore/>
       </w:pPr>
       <w:r>
         <w:t>1. ETAPA INICIAL</w:t>
@@ -2871,6 +3099,7 @@
     <w:p>
       <w:pPr>
         <w:pStyle w:val="Heading1"/>
+        <w:pageBreakBefore/>
       </w:pPr>
       <w:r>
         <w:t>2. ETAPA DE INFORMACIÓN</w:t>
@@ -7864,6 +8093,7 @@
     <w:p>
       <w:pPr>
         <w:pStyle w:val="Heading1"/>
+        <w:pageBreakBefore/>
       </w:pPr>
       <w:r>
         <w:t>3. ETAPA TÉCNICO-CREATIVA</w:t>
@@ -12146,6 +12376,7 @@
     <w:p>
       <w:pPr>
         <w:pStyle w:val="Heading1"/>
+        <w:pageBreakBefore/>
       </w:pPr>
       <w:r>
         <w:rPr>
@@ -14796,7 +15027,2637 @@
     </w:p>
     <w:p>
       <w:pPr>
+        <w:pStyle w:val="Heading1"/>
+        <w:pageBreakBefore/>
+      </w:pPr>
+      <w:r>
+        <w:rPr>
+          <w:b w:val="0"/>
+          <w:i w:val="0"/>
+        </w:rPr>
+        <w:t>5. ETAPA DE REDISEÑO</w:t>
+      </w:r>
+    </w:p>
+    <w:p>
+      <w:r>
+        <w:rPr>
+          <w:b w:val="0"/>
+          <w:i w:val="0"/>
+        </w:rPr>
+        <w:t>Una vez elegida la solución, se han aplicado las técnicas de rediseño vistas en la asignatura (QFD, AMFEC y análisis del valor) para detectar los puntos débiles del diseño y proponer mejoras antes de pasar a la fabricación de prototipos. El análisis se ha hecho sobre la alternativa 2 (aluminio), que es la que actualmente cumple todas las propiedades del EDP, aunque las conclusiones son aplicables también a la de madera.</w:t>
+      </w:r>
+    </w:p>
+    <w:p>
+      <w:pPr>
         <w:pStyle w:val="Heading2"/>
+      </w:pPr>
+      <w:r>
+        <w:rPr>
+          <w:b w:val="0"/>
+          <w:i w:val="0"/>
+        </w:rPr>
+        <w:t>5.1. DESPLIEGUE DE LA FUNCIÓN CALIDAD (QFD)</w:t>
+      </w:r>
+    </w:p>
+    <w:p>
+      <w:r>
+        <w:rPr>
+          <w:b w:val="0"/>
+          <w:i w:val="0"/>
+        </w:rPr>
+        <w:t>El QFD traduce lo que pide el cliente (los «qués») en características técnicas medibles (los «cómos»). En la casa de la calidad (Ilustración 19) se han relacionado los nueve requisitos principales del cliente, con su importancia de 1 a 5, con nueve características técnicas del producto. La intensidad de cada relación se ha puntuado con 9 (fuerte), 3 (media) o 1 (débil), y en el tejado se indican las sinergias y los conflictos entre características. A la derecha se compara la percepción del cliente de nuestro diseño con dos productos de la competencia analizados en el apartado 2.2.</w:t>
+      </w:r>
+    </w:p>
+    <w:p>
+      <w:pPr>
+        <w:jc w:val="center"/>
+      </w:pPr>
+      <w:r>
+        <w:drawing>
+          <wp:inline xmlns:a="http://schemas.openxmlformats.org/drawingml/2006/main" xmlns:pic="http://schemas.openxmlformats.org/drawingml/2006/picture">
+            <wp:extent cx="5940000" cy="3805989"/>
+            <wp:docPr id="19" name="Picture 19"/>
+            <wp:cNvGraphicFramePr>
+              <a:graphicFrameLocks noChangeAspect="1"/>
+            </wp:cNvGraphicFramePr>
+            <a:graphic>
+              <a:graphicData uri="http://schemas.openxmlformats.org/drawingml/2006/picture">
+                <pic:pic>
+                  <pic:nvPicPr>
+                    <pic:cNvPr id="0" name="figura_qfd.png"/>
+                    <pic:cNvPicPr/>
+                  </pic:nvPicPr>
+                  <pic:blipFill>
+                    <a:blip r:embed="rId28"/>
+                    <a:stretch>
+                      <a:fillRect/>
+                    </a:stretch>
+                  </pic:blipFill>
+                  <pic:spPr>
+                    <a:xfrm>
+                      <a:off x="0" y="0"/>
+                      <a:ext cx="5940000" cy="3805989"/>
+                    </a:xfrm>
+                    <a:prstGeom prst="rect"/>
+                  </pic:spPr>
+                </pic:pic>
+              </a:graphicData>
+            </a:graphic>
+          </wp:inline>
+        </w:drawing>
+      </w:r>
+    </w:p>
+    <w:p>
+      <w:pPr>
+        <w:jc w:val="center"/>
+      </w:pPr>
+      <w:r>
+        <w:rPr>
+          <w:b w:val="0"/>
+          <w:i/>
+          <w:sz w:val="18"/>
+        </w:rPr>
+        <w:t>Ilustración 19. Casa de la calidad (QFD) del taburete-escalera. Elaboración propia.</w:t>
+      </w:r>
+    </w:p>
+    <w:p>
+      <w:r>
+        <w:rPr>
+          <w:b w:val="0"/>
+          <w:i w:val="0"/>
+        </w:rPr>
+        <w:t>Las características técnicas más importantes resultan ser el peso total (15,7 %), la carga máxima (13,7 %), la altura de la plataforma y el espesor plegado (alrededor del 12,5 % cada una) y el número de piezas distintas (12,0 %). Esto confirma que el esfuerzo de diseño debe centrarse en conseguir un producto ligero y compacto sin perder resistencia, que es precisamente la contradicción técnica que se resolvió con TRIZ. El tejado muestra el principal conflicto: aumentar la carga máxima tiende a aumentar el peso, mientras que reducir el peso favorece a la vez el espesor plegado, el coste y la huella de carbono.</w:t>
+      </w:r>
+    </w:p>
+    <w:p>
+      <w:r>
+        <w:rPr>
+          <w:b w:val="0"/>
+          <w:i w:val="0"/>
+        </w:rPr>
+        <w:t>En la comparación con la competencia, nuestro diseño iguala al Hailo K20 en seguridad, altura y comodidad y lo supera claramente en peso y precio, mientras que frente al Altipesa ofrece más seguridad y un peldaño mucho más cómodo. Su punto débil es el medio ambiente, por la elevada huella de carbono del aluminio (apartado 4), lo que refuerza la propuesta de usar aluminio reciclado o pasar a la alternativa de madera.</w:t>
+      </w:r>
+    </w:p>
+    <w:p>
+      <w:pPr>
+        <w:pStyle w:val="Heading2"/>
+      </w:pPr>
+      <w:r>
+        <w:rPr>
+          <w:b w:val="0"/>
+          <w:i w:val="0"/>
+        </w:rPr>
+        <w:t>5.2. ANÁLISIS MODAL DE FALLOS, EFECTOS Y CRITICIDAD (AMFEC)</w:t>
+      </w:r>
+    </w:p>
+    <w:p>
+      <w:r>
+        <w:rPr>
+          <w:b w:val="0"/>
+          <w:i w:val="0"/>
+        </w:rPr>
+        <w:t>Con el AMFEC se han identificado los modos de fallo potenciales del producto, valorando para cada uno la probabilidad de que ocurra (O), su gravedad (G) y la probabilidad de que no se detecte antes de llegar al usuario (D), todos de 1 a 10. El producto de los tres da el índice de prioridad de riesgo (IPR = O × G × D), que indica sobre qué fallos hay que actuar primero. Tras proponer una acción correctora se ha vuelto a estimar el IPR.</w:t>
+      </w:r>
+    </w:p>
+    <w:tbl>
+      <w:tblPr>
+        <w:tblStyle w:val="TableGrid"/>
+        <w:tblW w:type="auto" w:w="0"/>
+        <w:tblLook w:firstColumn="1" w:firstRow="1" w:lastColumn="0" w:lastRow="0" w:noHBand="0" w:noVBand="1" w:val="04A0"/>
+        <w:tblLayout w:type="fixed"/>
+      </w:tblPr>
+      <w:tblGrid>
+        <w:gridCol w:w="1190"/>
+        <w:gridCol w:w="1303"/>
+        <w:gridCol w:w="1133"/>
+        <w:gridCol w:w="1247"/>
+        <w:gridCol w:w="396"/>
+        <w:gridCol w:w="396"/>
+        <w:gridCol w:w="396"/>
+        <w:gridCol w:w="510"/>
+        <w:gridCol w:w="1927"/>
+        <w:gridCol w:w="566"/>
+      </w:tblGrid>
+      <w:tr>
+        <w:tc>
+          <w:tcPr>
+            <w:tcW w:type="dxa" w:w="1191"/>
+            <w:shd w:val="clear" w:color="auto" w:fill="C0392B"/>
+          </w:tcPr>
+          <w:p>
+            <w:pPr>
+              <w:keepNext/>
+            </w:pPr>
+            <w:r/>
+            <w:r>
+              <w:rPr>
+                <w:b/>
+                <w:color w:val="FFFFFF"/>
+                <w:sz w:val="15"/>
+              </w:rPr>
+              <w:t>Componente</w:t>
+            </w:r>
+          </w:p>
+        </w:tc>
+        <w:tc>
+          <w:tcPr>
+            <w:tcW w:type="dxa" w:w="1304"/>
+            <w:shd w:val="clear" w:color="auto" w:fill="C0392B"/>
+          </w:tcPr>
+          <w:p>
+            <w:pPr>
+              <w:keepNext/>
+            </w:pPr>
+            <w:r/>
+            <w:r>
+              <w:rPr>
+                <w:b/>
+                <w:color w:val="FFFFFF"/>
+                <w:sz w:val="15"/>
+              </w:rPr>
+              <w:t>Modo de fallo</w:t>
+            </w:r>
+          </w:p>
+        </w:tc>
+        <w:tc>
+          <w:tcPr>
+            <w:tcW w:type="dxa" w:w="1134"/>
+            <w:shd w:val="clear" w:color="auto" w:fill="C0392B"/>
+          </w:tcPr>
+          <w:p>
+            <w:pPr>
+              <w:keepNext/>
+            </w:pPr>
+            <w:r/>
+            <w:r>
+              <w:rPr>
+                <w:b/>
+                <w:color w:val="FFFFFF"/>
+                <w:sz w:val="15"/>
+              </w:rPr>
+              <w:t>Efecto</w:t>
+            </w:r>
+          </w:p>
+        </w:tc>
+        <w:tc>
+          <w:tcPr>
+            <w:tcW w:type="dxa" w:w="1247"/>
+            <w:shd w:val="clear" w:color="auto" w:fill="C0392B"/>
+          </w:tcPr>
+          <w:p>
+            <w:pPr>
+              <w:keepNext/>
+            </w:pPr>
+            <w:r/>
+            <w:r>
+              <w:rPr>
+                <w:b/>
+                <w:color w:val="FFFFFF"/>
+                <w:sz w:val="15"/>
+              </w:rPr>
+              <w:t>Causa</w:t>
+            </w:r>
+          </w:p>
+        </w:tc>
+        <w:tc>
+          <w:tcPr>
+            <w:tcW w:type="dxa" w:w="397"/>
+            <w:shd w:val="clear" w:color="auto" w:fill="C0392B"/>
+          </w:tcPr>
+          <w:p>
+            <w:pPr>
+              <w:keepNext/>
+            </w:pPr>
+            <w:r/>
+            <w:r>
+              <w:rPr>
+                <w:b/>
+                <w:color w:val="FFFFFF"/>
+                <w:sz w:val="15"/>
+              </w:rPr>
+              <w:t>O</w:t>
+            </w:r>
+          </w:p>
+        </w:tc>
+        <w:tc>
+          <w:tcPr>
+            <w:tcW w:type="dxa" w:w="397"/>
+            <w:shd w:val="clear" w:color="auto" w:fill="C0392B"/>
+          </w:tcPr>
+          <w:p>
+            <w:pPr>
+              <w:keepNext/>
+            </w:pPr>
+            <w:r/>
+            <w:r>
+              <w:rPr>
+                <w:b/>
+                <w:color w:val="FFFFFF"/>
+                <w:sz w:val="15"/>
+              </w:rPr>
+              <w:t>G</w:t>
+            </w:r>
+          </w:p>
+        </w:tc>
+        <w:tc>
+          <w:tcPr>
+            <w:tcW w:type="dxa" w:w="397"/>
+            <w:shd w:val="clear" w:color="auto" w:fill="C0392B"/>
+          </w:tcPr>
+          <w:p>
+            <w:pPr>
+              <w:keepNext/>
+            </w:pPr>
+            <w:r/>
+            <w:r>
+              <w:rPr>
+                <w:b/>
+                <w:color w:val="FFFFFF"/>
+                <w:sz w:val="15"/>
+              </w:rPr>
+              <w:t>D</w:t>
+            </w:r>
+          </w:p>
+        </w:tc>
+        <w:tc>
+          <w:tcPr>
+            <w:tcW w:type="dxa" w:w="510"/>
+            <w:shd w:val="clear" w:color="auto" w:fill="C0392B"/>
+          </w:tcPr>
+          <w:p>
+            <w:pPr>
+              <w:keepNext/>
+            </w:pPr>
+            <w:r/>
+            <w:r>
+              <w:rPr>
+                <w:b/>
+                <w:color w:val="FFFFFF"/>
+                <w:sz w:val="15"/>
+              </w:rPr>
+              <w:t>IPR</w:t>
+            </w:r>
+          </w:p>
+        </w:tc>
+        <w:tc>
+          <w:tcPr>
+            <w:tcW w:type="dxa" w:w="1928"/>
+            <w:shd w:val="clear" w:color="auto" w:fill="C0392B"/>
+          </w:tcPr>
+          <w:p>
+            <w:pPr>
+              <w:keepNext/>
+            </w:pPr>
+            <w:r/>
+            <w:r>
+              <w:rPr>
+                <w:b/>
+                <w:color w:val="FFFFFF"/>
+                <w:sz w:val="15"/>
+              </w:rPr>
+              <w:t>Acción correctora</w:t>
+            </w:r>
+          </w:p>
+        </w:tc>
+        <w:tc>
+          <w:tcPr>
+            <w:tcW w:type="dxa" w:w="567"/>
+            <w:shd w:val="clear" w:color="auto" w:fill="C0392B"/>
+          </w:tcPr>
+          <w:p>
+            <w:pPr>
+              <w:keepNext/>
+            </w:pPr>
+            <w:r/>
+            <w:r>
+              <w:rPr>
+                <w:b/>
+                <w:color w:val="FFFFFF"/>
+                <w:sz w:val="15"/>
+              </w:rPr>
+              <w:t>IPR final</w:t>
+            </w:r>
+          </w:p>
+        </w:tc>
+      </w:tr>
+      <w:tr>
+        <w:tc>
+          <w:tcPr>
+            <w:tcW w:type="dxa" w:w="1191"/>
+          </w:tcPr>
+          <w:p>
+            <w:pPr>
+              <w:keepNext/>
+            </w:pPr>
+            <w:r/>
+            <w:r>
+              <w:rPr>
+                <w:sz w:val="14"/>
+              </w:rPr>
+              <w:t>Bloqueo de apertura</w:t>
+            </w:r>
+          </w:p>
+        </w:tc>
+        <w:tc>
+          <w:tcPr>
+            <w:tcW w:type="dxa" w:w="1304"/>
+          </w:tcPr>
+          <w:p>
+            <w:pPr>
+              <w:keepNext/>
+            </w:pPr>
+            <w:r/>
+            <w:r>
+              <w:rPr>
+                <w:sz w:val="14"/>
+              </w:rPr>
+              <w:t>Se desbloquea con el usuario encima</w:t>
+            </w:r>
+          </w:p>
+        </w:tc>
+        <w:tc>
+          <w:tcPr>
+            <w:tcW w:type="dxa" w:w="1134"/>
+          </w:tcPr>
+          <w:p>
+            <w:pPr>
+              <w:keepNext/>
+            </w:pPr>
+            <w:r/>
+            <w:r>
+              <w:rPr>
+                <w:sz w:val="14"/>
+              </w:rPr>
+              <w:t>Cierre del taburete y caída</w:t>
+            </w:r>
+          </w:p>
+        </w:tc>
+        <w:tc>
+          <w:tcPr>
+            <w:tcW w:type="dxa" w:w="1247"/>
+          </w:tcPr>
+          <w:p>
+            <w:pPr>
+              <w:keepNext/>
+            </w:pPr>
+            <w:r/>
+            <w:r>
+              <w:rPr>
+                <w:sz w:val="14"/>
+              </w:rPr>
+              <w:t>Holgura o desgaste del cierre; mal uso</w:t>
+            </w:r>
+          </w:p>
+        </w:tc>
+        <w:tc>
+          <w:tcPr>
+            <w:tcW w:type="dxa" w:w="397"/>
+          </w:tcPr>
+          <w:p>
+            <w:pPr>
+              <w:keepNext/>
+            </w:pPr>
+            <w:r/>
+            <w:r>
+              <w:rPr>
+                <w:sz w:val="14"/>
+              </w:rPr>
+              <w:t>3</w:t>
+            </w:r>
+          </w:p>
+        </w:tc>
+        <w:tc>
+          <w:tcPr>
+            <w:tcW w:type="dxa" w:w="397"/>
+          </w:tcPr>
+          <w:p>
+            <w:pPr>
+              <w:keepNext/>
+            </w:pPr>
+            <w:r/>
+            <w:r>
+              <w:rPr>
+                <w:sz w:val="14"/>
+              </w:rPr>
+              <w:t>10</w:t>
+            </w:r>
+          </w:p>
+        </w:tc>
+        <w:tc>
+          <w:tcPr>
+            <w:tcW w:type="dxa" w:w="397"/>
+          </w:tcPr>
+          <w:p>
+            <w:pPr>
+              <w:keepNext/>
+            </w:pPr>
+            <w:r/>
+            <w:r>
+              <w:rPr>
+                <w:sz w:val="14"/>
+              </w:rPr>
+              <w:t>5</w:t>
+            </w:r>
+          </w:p>
+        </w:tc>
+        <w:tc>
+          <w:tcPr>
+            <w:tcW w:type="dxa" w:w="510"/>
+          </w:tcPr>
+          <w:p>
+            <w:pPr>
+              <w:keepNext/>
+            </w:pPr>
+            <w:r/>
+            <w:r>
+              <w:rPr>
+                <w:sz w:val="14"/>
+              </w:rPr>
+              <w:t>150</w:t>
+            </w:r>
+          </w:p>
+        </w:tc>
+        <w:tc>
+          <w:tcPr>
+            <w:tcW w:type="dxa" w:w="1928"/>
+          </w:tcPr>
+          <w:p>
+            <w:pPr>
+              <w:keepNext/>
+            </w:pPr>
+            <w:r/>
+            <w:r>
+              <w:rPr>
+                <w:sz w:val="14"/>
+              </w:rPr>
+              <w:t>Pestillo con doble gesto e indicador visual de bloqueo; ensayo al 100 %</w:t>
+            </w:r>
+          </w:p>
+        </w:tc>
+        <w:tc>
+          <w:tcPr>
+            <w:tcW w:type="dxa" w:w="567"/>
+          </w:tcPr>
+          <w:p>
+            <w:pPr>
+              <w:keepNext/>
+            </w:pPr>
+            <w:r/>
+            <w:r>
+              <w:rPr>
+                <w:sz w:val="14"/>
+              </w:rPr>
+              <w:t>40</w:t>
+            </w:r>
+          </w:p>
+        </w:tc>
+      </w:tr>
+      <w:tr>
+        <w:tc>
+          <w:tcPr>
+            <w:tcW w:type="dxa" w:w="1191"/>
+          </w:tcPr>
+          <w:p>
+            <w:pPr>
+              <w:keepNext/>
+            </w:pPr>
+            <w:r/>
+            <w:r>
+              <w:rPr>
+                <w:sz w:val="14"/>
+              </w:rPr>
+              <w:t>Pasadores y articulaciones</w:t>
+            </w:r>
+          </w:p>
+        </w:tc>
+        <w:tc>
+          <w:tcPr>
+            <w:tcW w:type="dxa" w:w="1304"/>
+          </w:tcPr>
+          <w:p>
+            <w:pPr>
+              <w:keepNext/>
+            </w:pPr>
+            <w:r/>
+            <w:r>
+              <w:rPr>
+                <w:sz w:val="14"/>
+              </w:rPr>
+              <w:t>Holgura progresiva</w:t>
+            </w:r>
+          </w:p>
+        </w:tc>
+        <w:tc>
+          <w:tcPr>
+            <w:tcW w:type="dxa" w:w="1134"/>
+          </w:tcPr>
+          <w:p>
+            <w:pPr>
+              <w:keepNext/>
+            </w:pPr>
+            <w:r/>
+            <w:r>
+              <w:rPr>
+                <w:sz w:val="14"/>
+              </w:rPr>
+              <w:t>Inestabilidad y ruido</w:t>
+            </w:r>
+          </w:p>
+        </w:tc>
+        <w:tc>
+          <w:tcPr>
+            <w:tcW w:type="dxa" w:w="1247"/>
+          </w:tcPr>
+          <w:p>
+            <w:pPr>
+              <w:keepNext/>
+            </w:pPr>
+            <w:r/>
+            <w:r>
+              <w:rPr>
+                <w:sz w:val="14"/>
+              </w:rPr>
+              <w:t>Desgaste del aluminio en los taladros</w:t>
+            </w:r>
+          </w:p>
+        </w:tc>
+        <w:tc>
+          <w:tcPr>
+            <w:tcW w:type="dxa" w:w="397"/>
+          </w:tcPr>
+          <w:p>
+            <w:pPr>
+              <w:keepNext/>
+            </w:pPr>
+            <w:r/>
+            <w:r>
+              <w:rPr>
+                <w:sz w:val="14"/>
+              </w:rPr>
+              <w:t>4</w:t>
+            </w:r>
+          </w:p>
+        </w:tc>
+        <w:tc>
+          <w:tcPr>
+            <w:tcW w:type="dxa" w:w="397"/>
+          </w:tcPr>
+          <w:p>
+            <w:pPr>
+              <w:keepNext/>
+            </w:pPr>
+            <w:r/>
+            <w:r>
+              <w:rPr>
+                <w:sz w:val="14"/>
+              </w:rPr>
+              <w:t>6</w:t>
+            </w:r>
+          </w:p>
+        </w:tc>
+        <w:tc>
+          <w:tcPr>
+            <w:tcW w:type="dxa" w:w="397"/>
+          </w:tcPr>
+          <w:p>
+            <w:pPr>
+              <w:keepNext/>
+            </w:pPr>
+            <w:r/>
+            <w:r>
+              <w:rPr>
+                <w:sz w:val="14"/>
+              </w:rPr>
+              <w:t>6</w:t>
+            </w:r>
+          </w:p>
+        </w:tc>
+        <w:tc>
+          <w:tcPr>
+            <w:tcW w:type="dxa" w:w="510"/>
+          </w:tcPr>
+          <w:p>
+            <w:pPr>
+              <w:keepNext/>
+            </w:pPr>
+            <w:r/>
+            <w:r>
+              <w:rPr>
+                <w:sz w:val="14"/>
+              </w:rPr>
+              <w:t>144</w:t>
+            </w:r>
+          </w:p>
+        </w:tc>
+        <w:tc>
+          <w:tcPr>
+            <w:tcW w:type="dxa" w:w="1928"/>
+          </w:tcPr>
+          <w:p>
+            <w:pPr>
+              <w:keepNext/>
+            </w:pPr>
+            <w:r/>
+            <w:r>
+              <w:rPr>
+                <w:sz w:val="14"/>
+              </w:rPr>
+              <w:t>Casquillos de nylon en los taladros</w:t>
+            </w:r>
+          </w:p>
+        </w:tc>
+        <w:tc>
+          <w:tcPr>
+            <w:tcW w:type="dxa" w:w="567"/>
+          </w:tcPr>
+          <w:p>
+            <w:pPr>
+              <w:keepNext/>
+            </w:pPr>
+            <w:r/>
+            <w:r>
+              <w:rPr>
+                <w:sz w:val="14"/>
+              </w:rPr>
+              <w:t>48</w:t>
+            </w:r>
+          </w:p>
+        </w:tc>
+      </w:tr>
+      <w:tr>
+        <w:tc>
+          <w:tcPr>
+            <w:tcW w:type="dxa" w:w="1191"/>
+          </w:tcPr>
+          <w:p>
+            <w:pPr>
+              <w:keepNext/>
+            </w:pPr>
+            <w:r/>
+            <w:r>
+              <w:rPr>
+                <w:sz w:val="14"/>
+              </w:rPr>
+              <w:t>Tacos antideslizantes</w:t>
+            </w:r>
+          </w:p>
+        </w:tc>
+        <w:tc>
+          <w:tcPr>
+            <w:tcW w:type="dxa" w:w="1304"/>
+          </w:tcPr>
+          <w:p>
+            <w:pPr>
+              <w:keepNext/>
+            </w:pPr>
+            <w:r/>
+            <w:r>
+              <w:rPr>
+                <w:sz w:val="14"/>
+              </w:rPr>
+              <w:t>Desgaste o desprendimiento</w:t>
+            </w:r>
+          </w:p>
+        </w:tc>
+        <w:tc>
+          <w:tcPr>
+            <w:tcW w:type="dxa" w:w="1134"/>
+          </w:tcPr>
+          <w:p>
+            <w:pPr>
+              <w:keepNext/>
+            </w:pPr>
+            <w:r/>
+            <w:r>
+              <w:rPr>
+                <w:sz w:val="14"/>
+              </w:rPr>
+              <w:t>Deslizamiento sobre suelo liso</w:t>
+            </w:r>
+          </w:p>
+        </w:tc>
+        <w:tc>
+          <w:tcPr>
+            <w:tcW w:type="dxa" w:w="1247"/>
+          </w:tcPr>
+          <w:p>
+            <w:pPr>
+              <w:keepNext/>
+            </w:pPr>
+            <w:r/>
+            <w:r>
+              <w:rPr>
+                <w:sz w:val="14"/>
+              </w:rPr>
+              <w:t>Material blando; uso prolongado</w:t>
+            </w:r>
+          </w:p>
+        </w:tc>
+        <w:tc>
+          <w:tcPr>
+            <w:tcW w:type="dxa" w:w="397"/>
+          </w:tcPr>
+          <w:p>
+            <w:pPr>
+              <w:keepNext/>
+            </w:pPr>
+            <w:r/>
+            <w:r>
+              <w:rPr>
+                <w:sz w:val="14"/>
+              </w:rPr>
+              <w:t>4</w:t>
+            </w:r>
+          </w:p>
+        </w:tc>
+        <w:tc>
+          <w:tcPr>
+            <w:tcW w:type="dxa" w:w="397"/>
+          </w:tcPr>
+          <w:p>
+            <w:pPr>
+              <w:keepNext/>
+            </w:pPr>
+            <w:r/>
+            <w:r>
+              <w:rPr>
+                <w:sz w:val="14"/>
+              </w:rPr>
+              <w:t>8</w:t>
+            </w:r>
+          </w:p>
+        </w:tc>
+        <w:tc>
+          <w:tcPr>
+            <w:tcW w:type="dxa" w:w="397"/>
+          </w:tcPr>
+          <w:p>
+            <w:pPr>
+              <w:keepNext/>
+            </w:pPr>
+            <w:r/>
+            <w:r>
+              <w:rPr>
+                <w:sz w:val="14"/>
+              </w:rPr>
+              <w:t>4</w:t>
+            </w:r>
+          </w:p>
+        </w:tc>
+        <w:tc>
+          <w:tcPr>
+            <w:tcW w:type="dxa" w:w="510"/>
+          </w:tcPr>
+          <w:p>
+            <w:pPr>
+              <w:keepNext/>
+            </w:pPr>
+            <w:r/>
+            <w:r>
+              <w:rPr>
+                <w:sz w:val="14"/>
+              </w:rPr>
+              <w:t>128</w:t>
+            </w:r>
+          </w:p>
+        </w:tc>
+        <w:tc>
+          <w:tcPr>
+            <w:tcW w:type="dxa" w:w="1928"/>
+          </w:tcPr>
+          <w:p>
+            <w:pPr>
+              <w:keepNext/>
+            </w:pPr>
+            <w:r/>
+            <w:r>
+              <w:rPr>
+                <w:sz w:val="14"/>
+              </w:rPr>
+              <w:t>TPE de mayor dureza y taco encajado con tope; repuesto disponible</w:t>
+            </w:r>
+          </w:p>
+        </w:tc>
+        <w:tc>
+          <w:tcPr>
+            <w:tcW w:type="dxa" w:w="567"/>
+          </w:tcPr>
+          <w:p>
+            <w:pPr>
+              <w:keepNext/>
+            </w:pPr>
+            <w:r/>
+            <w:r>
+              <w:rPr>
+                <w:sz w:val="14"/>
+              </w:rPr>
+              <w:t>48</w:t>
+            </w:r>
+          </w:p>
+        </w:tc>
+      </w:tr>
+      <w:tr>
+        <w:tc>
+          <w:tcPr>
+            <w:tcW w:type="dxa" w:w="1191"/>
+          </w:tcPr>
+          <w:p>
+            <w:pPr>
+              <w:keepNext/>
+            </w:pPr>
+            <w:r/>
+            <w:r>
+              <w:rPr>
+                <w:sz w:val="14"/>
+              </w:rPr>
+              <w:t>Bielas y tirantes</w:t>
+            </w:r>
+          </w:p>
+        </w:tc>
+        <w:tc>
+          <w:tcPr>
+            <w:tcW w:type="dxa" w:w="1304"/>
+          </w:tcPr>
+          <w:p>
+            <w:pPr>
+              <w:keepNext/>
+            </w:pPr>
+            <w:r/>
+            <w:r>
+              <w:rPr>
+                <w:sz w:val="14"/>
+              </w:rPr>
+              <w:t>Fisura junto al taladro</w:t>
+            </w:r>
+          </w:p>
+        </w:tc>
+        <w:tc>
+          <w:tcPr>
+            <w:tcW w:type="dxa" w:w="1134"/>
+          </w:tcPr>
+          <w:p>
+            <w:pPr>
+              <w:keepNext/>
+            </w:pPr>
+            <w:r/>
+            <w:r>
+              <w:rPr>
+                <w:sz w:val="14"/>
+              </w:rPr>
+              <w:t>Pérdida de apoyo de la plataforma o el peldaño</w:t>
+            </w:r>
+          </w:p>
+        </w:tc>
+        <w:tc>
+          <w:tcPr>
+            <w:tcW w:type="dxa" w:w="1247"/>
+          </w:tcPr>
+          <w:p>
+            <w:pPr>
+              <w:keepNext/>
+            </w:pPr>
+            <w:r/>
+            <w:r>
+              <w:rPr>
+                <w:sz w:val="14"/>
+              </w:rPr>
+              <w:t>Poca distancia del taladro al borde</w:t>
+            </w:r>
+          </w:p>
+        </w:tc>
+        <w:tc>
+          <w:tcPr>
+            <w:tcW w:type="dxa" w:w="397"/>
+          </w:tcPr>
+          <w:p>
+            <w:pPr>
+              <w:keepNext/>
+            </w:pPr>
+            <w:r/>
+            <w:r>
+              <w:rPr>
+                <w:sz w:val="14"/>
+              </w:rPr>
+              <w:t>2</w:t>
+            </w:r>
+          </w:p>
+        </w:tc>
+        <w:tc>
+          <w:tcPr>
+            <w:tcW w:type="dxa" w:w="397"/>
+          </w:tcPr>
+          <w:p>
+            <w:pPr>
+              <w:keepNext/>
+            </w:pPr>
+            <w:r/>
+            <w:r>
+              <w:rPr>
+                <w:sz w:val="14"/>
+              </w:rPr>
+              <w:t>8</w:t>
+            </w:r>
+          </w:p>
+        </w:tc>
+        <w:tc>
+          <w:tcPr>
+            <w:tcW w:type="dxa" w:w="397"/>
+          </w:tcPr>
+          <w:p>
+            <w:pPr>
+              <w:keepNext/>
+            </w:pPr>
+            <w:r/>
+            <w:r>
+              <w:rPr>
+                <w:sz w:val="14"/>
+              </w:rPr>
+              <w:t>6</w:t>
+            </w:r>
+          </w:p>
+        </w:tc>
+        <w:tc>
+          <w:tcPr>
+            <w:tcW w:type="dxa" w:w="510"/>
+          </w:tcPr>
+          <w:p>
+            <w:pPr>
+              <w:keepNext/>
+            </w:pPr>
+            <w:r/>
+            <w:r>
+              <w:rPr>
+                <w:sz w:val="14"/>
+              </w:rPr>
+              <w:t>96</w:t>
+            </w:r>
+          </w:p>
+        </w:tc>
+        <w:tc>
+          <w:tcPr>
+            <w:tcW w:type="dxa" w:w="1928"/>
+          </w:tcPr>
+          <w:p>
+            <w:pPr>
+              <w:keepNext/>
+            </w:pPr>
+            <w:r/>
+            <w:r>
+              <w:rPr>
+                <w:sz w:val="14"/>
+              </w:rPr>
+              <w:t>Aumentar la distancia al borde a 12 mm y redondear los extremos</w:t>
+            </w:r>
+          </w:p>
+        </w:tc>
+        <w:tc>
+          <w:tcPr>
+            <w:tcW w:type="dxa" w:w="567"/>
+          </w:tcPr>
+          <w:p>
+            <w:pPr>
+              <w:keepNext/>
+            </w:pPr>
+            <w:r/>
+            <w:r>
+              <w:rPr>
+                <w:sz w:val="14"/>
+              </w:rPr>
+              <w:t>32</w:t>
+            </w:r>
+          </w:p>
+        </w:tc>
+      </w:tr>
+      <w:tr>
+        <w:tc>
+          <w:tcPr>
+            <w:tcW w:type="dxa" w:w="1191"/>
+          </w:tcPr>
+          <w:p>
+            <w:pPr>
+              <w:keepNext/>
+            </w:pPr>
+            <w:r/>
+            <w:r>
+              <w:rPr>
+                <w:sz w:val="14"/>
+              </w:rPr>
+              <w:t>Plataforma de PP</w:t>
+            </w:r>
+          </w:p>
+        </w:tc>
+        <w:tc>
+          <w:tcPr>
+            <w:tcW w:type="dxa" w:w="1304"/>
+          </w:tcPr>
+          <w:p>
+            <w:pPr>
+              <w:keepNext/>
+            </w:pPr>
+            <w:r/>
+            <w:r>
+              <w:rPr>
+                <w:sz w:val="14"/>
+              </w:rPr>
+              <w:t>Rotura o fisura por impacto o fatiga</w:t>
+            </w:r>
+          </w:p>
+        </w:tc>
+        <w:tc>
+          <w:tcPr>
+            <w:tcW w:type="dxa" w:w="1134"/>
+          </w:tcPr>
+          <w:p>
+            <w:pPr>
+              <w:keepNext/>
+            </w:pPr>
+            <w:r/>
+            <w:r>
+              <w:rPr>
+                <w:sz w:val="14"/>
+              </w:rPr>
+              <w:t>Caída del usuario</w:t>
+            </w:r>
+          </w:p>
+        </w:tc>
+        <w:tc>
+          <w:tcPr>
+            <w:tcW w:type="dxa" w:w="1247"/>
+          </w:tcPr>
+          <w:p>
+            <w:pPr>
+              <w:keepNext/>
+            </w:pPr>
+            <w:r/>
+            <w:r>
+              <w:rPr>
+                <w:sz w:val="14"/>
+              </w:rPr>
+              <w:t>Nervios insuficientes; material sin reforzar</w:t>
+            </w:r>
+          </w:p>
+        </w:tc>
+        <w:tc>
+          <w:tcPr>
+            <w:tcW w:type="dxa" w:w="397"/>
+          </w:tcPr>
+          <w:p>
+            <w:pPr>
+              <w:keepNext/>
+            </w:pPr>
+            <w:r/>
+            <w:r>
+              <w:rPr>
+                <w:sz w:val="14"/>
+              </w:rPr>
+              <w:t>2</w:t>
+            </w:r>
+          </w:p>
+        </w:tc>
+        <w:tc>
+          <w:tcPr>
+            <w:tcW w:type="dxa" w:w="397"/>
+          </w:tcPr>
+          <w:p>
+            <w:pPr>
+              <w:keepNext/>
+            </w:pPr>
+            <w:r/>
+            <w:r>
+              <w:rPr>
+                <w:sz w:val="14"/>
+              </w:rPr>
+              <w:t>9</w:t>
+            </w:r>
+          </w:p>
+        </w:tc>
+        <w:tc>
+          <w:tcPr>
+            <w:tcW w:type="dxa" w:w="397"/>
+          </w:tcPr>
+          <w:p>
+            <w:pPr>
+              <w:keepNext/>
+            </w:pPr>
+            <w:r/>
+            <w:r>
+              <w:rPr>
+                <w:sz w:val="14"/>
+              </w:rPr>
+              <w:t>5</w:t>
+            </w:r>
+          </w:p>
+        </w:tc>
+        <w:tc>
+          <w:tcPr>
+            <w:tcW w:type="dxa" w:w="510"/>
+          </w:tcPr>
+          <w:p>
+            <w:pPr>
+              <w:keepNext/>
+            </w:pPr>
+            <w:r/>
+            <w:r>
+              <w:rPr>
+                <w:sz w:val="14"/>
+              </w:rPr>
+              <w:t>90</w:t>
+            </w:r>
+          </w:p>
+        </w:tc>
+        <w:tc>
+          <w:tcPr>
+            <w:tcW w:type="dxa" w:w="1928"/>
+          </w:tcPr>
+          <w:p>
+            <w:pPr>
+              <w:keepNext/>
+            </w:pPr>
+            <w:r/>
+            <w:r>
+              <w:rPr>
+                <w:sz w:val="14"/>
+              </w:rPr>
+              <w:t>PP con 30 % de fibra de vidrio y nervios; ensayo de resistencia UNE-EN 14183</w:t>
+            </w:r>
+          </w:p>
+        </w:tc>
+        <w:tc>
+          <w:tcPr>
+            <w:tcW w:type="dxa" w:w="567"/>
+          </w:tcPr>
+          <w:p>
+            <w:pPr>
+              <w:keepNext/>
+            </w:pPr>
+            <w:r/>
+            <w:r>
+              <w:rPr>
+                <w:sz w:val="14"/>
+              </w:rPr>
+              <w:t>27</w:t>
+            </w:r>
+          </w:p>
+        </w:tc>
+      </w:tr>
+      <w:tr>
+        <w:tc>
+          <w:tcPr>
+            <w:tcW w:type="dxa" w:w="1191"/>
+          </w:tcPr>
+          <w:p>
+            <w:pPr>
+              <w:keepNext/>
+            </w:pPr>
+            <w:r/>
+            <w:r>
+              <w:rPr>
+                <w:sz w:val="14"/>
+              </w:rPr>
+              <w:t>Largueros y patas</w:t>
+            </w:r>
+          </w:p>
+        </w:tc>
+        <w:tc>
+          <w:tcPr>
+            <w:tcW w:type="dxa" w:w="1304"/>
+          </w:tcPr>
+          <w:p>
+            <w:pPr>
+              <w:keepNext/>
+            </w:pPr>
+            <w:r/>
+            <w:r>
+              <w:rPr>
+                <w:sz w:val="14"/>
+              </w:rPr>
+              <w:t>Deformación permanente</w:t>
+            </w:r>
+          </w:p>
+        </w:tc>
+        <w:tc>
+          <w:tcPr>
+            <w:tcW w:type="dxa" w:w="1134"/>
+          </w:tcPr>
+          <w:p>
+            <w:pPr>
+              <w:keepNext/>
+            </w:pPr>
+            <w:r/>
+            <w:r>
+              <w:rPr>
+                <w:sz w:val="14"/>
+              </w:rPr>
+              <w:t>Inclinación del taburete</w:t>
+            </w:r>
+          </w:p>
+        </w:tc>
+        <w:tc>
+          <w:tcPr>
+            <w:tcW w:type="dxa" w:w="1247"/>
+          </w:tcPr>
+          <w:p>
+            <w:pPr>
+              <w:keepNext/>
+            </w:pPr>
+            <w:r/>
+            <w:r>
+              <w:rPr>
+                <w:sz w:val="14"/>
+              </w:rPr>
+              <w:t>Sobrecarga por encima de 150 kg</w:t>
+            </w:r>
+          </w:p>
+        </w:tc>
+        <w:tc>
+          <w:tcPr>
+            <w:tcW w:type="dxa" w:w="397"/>
+          </w:tcPr>
+          <w:p>
+            <w:pPr>
+              <w:keepNext/>
+            </w:pPr>
+            <w:r/>
+            <w:r>
+              <w:rPr>
+                <w:sz w:val="14"/>
+              </w:rPr>
+              <w:t>2</w:t>
+            </w:r>
+          </w:p>
+        </w:tc>
+        <w:tc>
+          <w:tcPr>
+            <w:tcW w:type="dxa" w:w="397"/>
+          </w:tcPr>
+          <w:p>
+            <w:pPr>
+              <w:keepNext/>
+            </w:pPr>
+            <w:r/>
+            <w:r>
+              <w:rPr>
+                <w:sz w:val="14"/>
+              </w:rPr>
+              <w:t>8</w:t>
+            </w:r>
+          </w:p>
+        </w:tc>
+        <w:tc>
+          <w:tcPr>
+            <w:tcW w:type="dxa" w:w="397"/>
+          </w:tcPr>
+          <w:p>
+            <w:pPr>
+              <w:keepNext/>
+            </w:pPr>
+            <w:r/>
+            <w:r>
+              <w:rPr>
+                <w:sz w:val="14"/>
+              </w:rPr>
+              <w:t>5</w:t>
+            </w:r>
+          </w:p>
+        </w:tc>
+        <w:tc>
+          <w:tcPr>
+            <w:tcW w:type="dxa" w:w="510"/>
+          </w:tcPr>
+          <w:p>
+            <w:pPr>
+              <w:keepNext/>
+            </w:pPr>
+            <w:r/>
+            <w:r>
+              <w:rPr>
+                <w:sz w:val="14"/>
+              </w:rPr>
+              <w:t>80</w:t>
+            </w:r>
+          </w:p>
+        </w:tc>
+        <w:tc>
+          <w:tcPr>
+            <w:tcW w:type="dxa" w:w="1928"/>
+          </w:tcPr>
+          <w:p>
+            <w:pPr>
+              <w:keepNext/>
+            </w:pPr>
+            <w:r/>
+            <w:r>
+              <w:rPr>
+                <w:sz w:val="14"/>
+              </w:rPr>
+              <w:t>Marcado visible de la carga máxima; ensayo de tipo</w:t>
+            </w:r>
+          </w:p>
+        </w:tc>
+        <w:tc>
+          <w:tcPr>
+            <w:tcW w:type="dxa" w:w="567"/>
+          </w:tcPr>
+          <w:p>
+            <w:pPr>
+              <w:keepNext/>
+            </w:pPr>
+            <w:r/>
+            <w:r>
+              <w:rPr>
+                <w:sz w:val="14"/>
+              </w:rPr>
+              <w:t>48</w:t>
+            </w:r>
+          </w:p>
+        </w:tc>
+      </w:tr>
+      <w:tr>
+        <w:tc>
+          <w:tcPr>
+            <w:tcW w:type="dxa" w:w="1191"/>
+          </w:tcPr>
+          <w:p>
+            <w:pPr>
+              <w:keepNext/>
+            </w:pPr>
+            <w:r/>
+            <w:r>
+              <w:rPr>
+                <w:sz w:val="14"/>
+              </w:rPr>
+              <w:t>Zona de plegado</w:t>
+            </w:r>
+          </w:p>
+        </w:tc>
+        <w:tc>
+          <w:tcPr>
+            <w:tcW w:type="dxa" w:w="1304"/>
+          </w:tcPr>
+          <w:p>
+            <w:pPr>
+              <w:keepNext/>
+            </w:pPr>
+            <w:r/>
+            <w:r>
+              <w:rPr>
+                <w:sz w:val="14"/>
+              </w:rPr>
+              <w:t>Atrapamiento de los dedos al cerrar</w:t>
+            </w:r>
+          </w:p>
+        </w:tc>
+        <w:tc>
+          <w:tcPr>
+            <w:tcW w:type="dxa" w:w="1134"/>
+          </w:tcPr>
+          <w:p>
+            <w:pPr>
+              <w:keepNext/>
+            </w:pPr>
+            <w:r/>
+            <w:r>
+              <w:rPr>
+                <w:sz w:val="14"/>
+              </w:rPr>
+              <w:t>Lesión en la mano</w:t>
+            </w:r>
+          </w:p>
+        </w:tc>
+        <w:tc>
+          <w:tcPr>
+            <w:tcW w:type="dxa" w:w="1247"/>
+          </w:tcPr>
+          <w:p>
+            <w:pPr>
+              <w:keepNext/>
+            </w:pPr>
+            <w:r/>
+            <w:r>
+              <w:rPr>
+                <w:sz w:val="14"/>
+              </w:rPr>
+              <w:t>Holguras entre 8 y 25 mm</w:t>
+            </w:r>
+          </w:p>
+        </w:tc>
+        <w:tc>
+          <w:tcPr>
+            <w:tcW w:type="dxa" w:w="397"/>
+          </w:tcPr>
+          <w:p>
+            <w:pPr>
+              <w:keepNext/>
+            </w:pPr>
+            <w:r/>
+            <w:r>
+              <w:rPr>
+                <w:sz w:val="14"/>
+              </w:rPr>
+              <w:t>4</w:t>
+            </w:r>
+          </w:p>
+        </w:tc>
+        <w:tc>
+          <w:tcPr>
+            <w:tcW w:type="dxa" w:w="397"/>
+          </w:tcPr>
+          <w:p>
+            <w:pPr>
+              <w:keepNext/>
+            </w:pPr>
+            <w:r/>
+            <w:r>
+              <w:rPr>
+                <w:sz w:val="14"/>
+              </w:rPr>
+              <w:t>6</w:t>
+            </w:r>
+          </w:p>
+        </w:tc>
+        <w:tc>
+          <w:tcPr>
+            <w:tcW w:type="dxa" w:w="397"/>
+          </w:tcPr>
+          <w:p>
+            <w:pPr>
+              <w:keepNext/>
+            </w:pPr>
+            <w:r/>
+            <w:r>
+              <w:rPr>
+                <w:sz w:val="14"/>
+              </w:rPr>
+              <w:t>3</w:t>
+            </w:r>
+          </w:p>
+        </w:tc>
+        <w:tc>
+          <w:tcPr>
+            <w:tcW w:type="dxa" w:w="510"/>
+          </w:tcPr>
+          <w:p>
+            <w:pPr>
+              <w:keepNext/>
+            </w:pPr>
+            <w:r/>
+            <w:r>
+              <w:rPr>
+                <w:sz w:val="14"/>
+              </w:rPr>
+              <w:t>72</w:t>
+            </w:r>
+          </w:p>
+        </w:tc>
+        <w:tc>
+          <w:tcPr>
+            <w:tcW w:type="dxa" w:w="1928"/>
+          </w:tcPr>
+          <w:p>
+            <w:pPr>
+              <w:keepNext/>
+            </w:pPr>
+            <w:r/>
+            <w:r>
+              <w:rPr>
+                <w:sz w:val="14"/>
+              </w:rPr>
+              <w:t>Holguras &lt; 8 mm o &gt; 25 mm y protector en la articulación</w:t>
+            </w:r>
+          </w:p>
+        </w:tc>
+        <w:tc>
+          <w:tcPr>
+            <w:tcW w:type="dxa" w:w="567"/>
+          </w:tcPr>
+          <w:p>
+            <w:pPr>
+              <w:keepNext/>
+            </w:pPr>
+            <w:r/>
+            <w:r>
+              <w:rPr>
+                <w:sz w:val="14"/>
+              </w:rPr>
+              <w:t>24</w:t>
+            </w:r>
+          </w:p>
+        </w:tc>
+      </w:tr>
+      <w:tr>
+        <w:tc>
+          <w:tcPr>
+            <w:tcW w:type="dxa" w:w="1191"/>
+          </w:tcPr>
+          <w:p>
+            <w:pPr>
+              <w:keepNext/>
+            </w:pPr>
+            <w:r/>
+            <w:r>
+              <w:rPr>
+                <w:sz w:val="14"/>
+              </w:rPr>
+              <w:t>Pata trasera plegada</w:t>
+            </w:r>
+          </w:p>
+        </w:tc>
+        <w:tc>
+          <w:tcPr>
+            <w:tcW w:type="dxa" w:w="1304"/>
+          </w:tcPr>
+          <w:p>
+            <w:pPr>
+              <w:keepNext/>
+            </w:pPr>
+            <w:r/>
+            <w:r>
+              <w:rPr>
+                <w:sz w:val="14"/>
+              </w:rPr>
+              <w:t>Apertura involuntaria al transportarlo</w:t>
+            </w:r>
+          </w:p>
+        </w:tc>
+        <w:tc>
+          <w:tcPr>
+            <w:tcW w:type="dxa" w:w="1134"/>
+          </w:tcPr>
+          <w:p>
+            <w:pPr>
+              <w:keepNext/>
+            </w:pPr>
+            <w:r/>
+            <w:r>
+              <w:rPr>
+                <w:sz w:val="14"/>
+              </w:rPr>
+              <w:t>Golpe al usuario</w:t>
+            </w:r>
+          </w:p>
+        </w:tc>
+        <w:tc>
+          <w:tcPr>
+            <w:tcW w:type="dxa" w:w="1247"/>
+          </w:tcPr>
+          <w:p>
+            <w:pPr>
+              <w:keepNext/>
+            </w:pPr>
+            <w:r/>
+            <w:r>
+              <w:rPr>
+                <w:sz w:val="14"/>
+              </w:rPr>
+              <w:t>No hay retención en posición cerrada</w:t>
+            </w:r>
+          </w:p>
+        </w:tc>
+        <w:tc>
+          <w:tcPr>
+            <w:tcW w:type="dxa" w:w="397"/>
+          </w:tcPr>
+          <w:p>
+            <w:pPr>
+              <w:keepNext/>
+            </w:pPr>
+            <w:r/>
+            <w:r>
+              <w:rPr>
+                <w:sz w:val="14"/>
+              </w:rPr>
+              <w:t>4</w:t>
+            </w:r>
+          </w:p>
+        </w:tc>
+        <w:tc>
+          <w:tcPr>
+            <w:tcW w:type="dxa" w:w="397"/>
+          </w:tcPr>
+          <w:p>
+            <w:pPr>
+              <w:keepNext/>
+            </w:pPr>
+            <w:r/>
+            <w:r>
+              <w:rPr>
+                <w:sz w:val="14"/>
+              </w:rPr>
+              <w:t>4</w:t>
+            </w:r>
+          </w:p>
+        </w:tc>
+        <w:tc>
+          <w:tcPr>
+            <w:tcW w:type="dxa" w:w="397"/>
+          </w:tcPr>
+          <w:p>
+            <w:pPr>
+              <w:keepNext/>
+            </w:pPr>
+            <w:r/>
+            <w:r>
+              <w:rPr>
+                <w:sz w:val="14"/>
+              </w:rPr>
+              <w:t>4</w:t>
+            </w:r>
+          </w:p>
+        </w:tc>
+        <w:tc>
+          <w:tcPr>
+            <w:tcW w:type="dxa" w:w="510"/>
+          </w:tcPr>
+          <w:p>
+            <w:pPr>
+              <w:keepNext/>
+            </w:pPr>
+            <w:r/>
+            <w:r>
+              <w:rPr>
+                <w:sz w:val="14"/>
+              </w:rPr>
+              <w:t>64</w:t>
+            </w:r>
+          </w:p>
+        </w:tc>
+        <w:tc>
+          <w:tcPr>
+            <w:tcW w:type="dxa" w:w="1928"/>
+          </w:tcPr>
+          <w:p>
+            <w:pPr>
+              <w:keepNext/>
+            </w:pPr>
+            <w:r/>
+            <w:r>
+              <w:rPr>
+                <w:sz w:val="14"/>
+              </w:rPr>
+              <w:t>Clip de retención en plegado (idea de la patente US 6 454 050)</w:t>
+            </w:r>
+          </w:p>
+        </w:tc>
+        <w:tc>
+          <w:tcPr>
+            <w:tcW w:type="dxa" w:w="567"/>
+          </w:tcPr>
+          <w:p>
+            <w:pPr>
+              <w:keepNext/>
+            </w:pPr>
+            <w:r/>
+            <w:r>
+              <w:rPr>
+                <w:sz w:val="14"/>
+              </w:rPr>
+              <w:t>24</w:t>
+            </w:r>
+          </w:p>
+        </w:tc>
+      </w:tr>
+    </w:tbl>
+    <w:p>
+      <w:pPr>
+        <w:jc w:val="center"/>
+      </w:pPr>
+      <w:r>
+        <w:rPr>
+          <w:b w:val="0"/>
+          <w:i/>
+          <w:sz w:val="18"/>
+        </w:rPr>
+        <w:t>Tabla 16. AMFEC del taburete-escalera. Elaboración propia.</w:t>
+      </w:r>
+    </w:p>
+    <w:p>
+      <w:r>
+        <w:rPr>
+          <w:b w:val="0"/>
+          <w:i w:val="0"/>
+        </w:rPr>
+        <w:t>El fallo más crítico es el desbloqueo con el usuario encima (IPR = 150), por su gravedad máxima, seguido de los tacos antideslizantes y las articulaciones. Con las acciones propuestas, sobre todo un pestillo que necesite dos gestos y un indicador visual de bloqueo (idea tomada de la patente US 6 966 404), todos los IPR bajan por debajo de 100 y el más alto pasa a ser de 48.</w:t>
+      </w:r>
+    </w:p>
+    <w:p>
+      <w:pPr>
+        <w:pStyle w:val="Heading2"/>
+      </w:pPr>
+      <w:r>
+        <w:rPr>
+          <w:b w:val="0"/>
+          <w:i w:val="0"/>
+        </w:rPr>
+        <w:t>5.3. ANÁLISIS DEL VALOR</w:t>
+      </w:r>
+    </w:p>
+    <w:p>
+      <w:r>
+        <w:rPr>
+          <w:b w:val="0"/>
+          <w:i w:val="0"/>
+        </w:rPr>
+        <w:t>El análisis del valor compara la importancia que el cliente da a cada función del producto con lo que cuesta cumplirla, para detectar funciones en las que se gasta más de lo que el cliente valora, o al revés. El coste de cada componente se ha estimado a partir del coste industrial objetivo (apartado 2.1) y se ha repartido entre las funciones a las que contribuye; la importancia de cada función se ha obtenido del QFD y del EDP.</w:t>
+      </w:r>
+    </w:p>
+    <w:tbl>
+      <w:tblPr>
+        <w:tblStyle w:val="TableGrid"/>
+        <w:tblW w:type="auto" w:w="0"/>
+        <w:tblLook w:firstColumn="1" w:firstRow="1" w:lastColumn="0" w:lastRow="0" w:noHBand="0" w:noVBand="1" w:val="04A0"/>
+        <w:tblLayout w:type="fixed"/>
+      </w:tblPr>
+      <w:tblGrid>
+        <w:gridCol w:w="3401"/>
+        <w:gridCol w:w="2267"/>
+      </w:tblGrid>
+      <w:tr>
+        <w:tc>
+          <w:tcPr>
+            <w:tcW w:type="dxa" w:w="3402"/>
+            <w:shd w:val="clear" w:color="auto" w:fill="C0392B"/>
+          </w:tcPr>
+          <w:p>
+            <w:pPr>
+              <w:keepNext/>
+            </w:pPr>
+            <w:r/>
+            <w:r>
+              <w:rPr>
+                <w:b/>
+                <w:color w:val="FFFFFF"/>
+                <w:sz w:val="17"/>
+              </w:rPr>
+              <w:t>Componente</w:t>
+            </w:r>
+          </w:p>
+        </w:tc>
+        <w:tc>
+          <w:tcPr>
+            <w:tcW w:type="dxa" w:w="2268"/>
+            <w:shd w:val="clear" w:color="auto" w:fill="C0392B"/>
+          </w:tcPr>
+          <w:p>
+            <w:pPr>
+              <w:keepNext/>
+            </w:pPr>
+            <w:r/>
+            <w:r>
+              <w:rPr>
+                <w:b/>
+                <w:color w:val="FFFFFF"/>
+                <w:sz w:val="17"/>
+              </w:rPr>
+              <w:t>Coste estimado (€)</w:t>
+            </w:r>
+          </w:p>
+        </w:tc>
+      </w:tr>
+      <w:tr>
+        <w:tc>
+          <w:tcPr>
+            <w:tcW w:type="dxa" w:w="3402"/>
+          </w:tcPr>
+          <w:p>
+            <w:pPr>
+              <w:keepNext/>
+            </w:pPr>
+            <w:r/>
+            <w:r>
+              <w:rPr>
+                <w:sz w:val="16"/>
+              </w:rPr>
+              <w:t>Largueros</w:t>
+            </w:r>
+          </w:p>
+        </w:tc>
+        <w:tc>
+          <w:tcPr>
+            <w:tcW w:type="dxa" w:w="2268"/>
+          </w:tcPr>
+          <w:p>
+            <w:pPr>
+              <w:keepNext/>
+            </w:pPr>
+            <w:r/>
+            <w:r>
+              <w:rPr>
+                <w:sz w:val="16"/>
+              </w:rPr>
+              <w:t>3,88</w:t>
+            </w:r>
+          </w:p>
+        </w:tc>
+      </w:tr>
+      <w:tr>
+        <w:tc>
+          <w:tcPr>
+            <w:tcW w:type="dxa" w:w="3402"/>
+          </w:tcPr>
+          <w:p>
+            <w:pPr>
+              <w:keepNext/>
+            </w:pPr>
+            <w:r/>
+            <w:r>
+              <w:rPr>
+                <w:sz w:val="16"/>
+              </w:rPr>
+              <w:t>Patas traseras</w:t>
+            </w:r>
+          </w:p>
+        </w:tc>
+        <w:tc>
+          <w:tcPr>
+            <w:tcW w:type="dxa" w:w="2268"/>
+          </w:tcPr>
+          <w:p>
+            <w:pPr>
+              <w:keepNext/>
+            </w:pPr>
+            <w:r/>
+            <w:r>
+              <w:rPr>
+                <w:sz w:val="16"/>
+              </w:rPr>
+              <w:t>3,66</w:t>
+            </w:r>
+          </w:p>
+        </w:tc>
+      </w:tr>
+      <w:tr>
+        <w:tc>
+          <w:tcPr>
+            <w:tcW w:type="dxa" w:w="3402"/>
+          </w:tcPr>
+          <w:p>
+            <w:pPr>
+              <w:keepNext/>
+            </w:pPr>
+            <w:r/>
+            <w:r>
+              <w:rPr>
+                <w:sz w:val="16"/>
+              </w:rPr>
+              <w:t>Trav. asidero</w:t>
+            </w:r>
+          </w:p>
+        </w:tc>
+        <w:tc>
+          <w:tcPr>
+            <w:tcW w:type="dxa" w:w="2268"/>
+          </w:tcPr>
+          <w:p>
+            <w:pPr>
+              <w:keepNext/>
+            </w:pPr>
+            <w:r/>
+            <w:r>
+              <w:rPr>
+                <w:sz w:val="16"/>
+              </w:rPr>
+              <w:t>0,71</w:t>
+            </w:r>
+          </w:p>
+        </w:tc>
+      </w:tr>
+      <w:tr>
+        <w:tc>
+          <w:tcPr>
+            <w:tcW w:type="dxa" w:w="3402"/>
+          </w:tcPr>
+          <w:p>
+            <w:pPr>
+              <w:keepNext/>
+            </w:pPr>
+            <w:r/>
+            <w:r>
+              <w:rPr>
+                <w:sz w:val="16"/>
+              </w:rPr>
+              <w:t>Trav. trasero</w:t>
+            </w:r>
+          </w:p>
+        </w:tc>
+        <w:tc>
+          <w:tcPr>
+            <w:tcW w:type="dxa" w:w="2268"/>
+          </w:tcPr>
+          <w:p>
+            <w:pPr>
+              <w:keepNext/>
+            </w:pPr>
+            <w:r/>
+            <w:r>
+              <w:rPr>
+                <w:sz w:val="16"/>
+              </w:rPr>
+              <w:t>0,65</w:t>
+            </w:r>
+          </w:p>
+        </w:tc>
+      </w:tr>
+      <w:tr>
+        <w:tc>
+          <w:tcPr>
+            <w:tcW w:type="dxa" w:w="3402"/>
+          </w:tcPr>
+          <w:p>
+            <w:pPr>
+              <w:keepNext/>
+            </w:pPr>
+            <w:r/>
+            <w:r>
+              <w:rPr>
+                <w:sz w:val="16"/>
+              </w:rPr>
+              <w:t>Plataforma</w:t>
+            </w:r>
+          </w:p>
+        </w:tc>
+        <w:tc>
+          <w:tcPr>
+            <w:tcW w:type="dxa" w:w="2268"/>
+          </w:tcPr>
+          <w:p>
+            <w:pPr>
+              <w:keepNext/>
+            </w:pPr>
+            <w:r/>
+            <w:r>
+              <w:rPr>
+                <w:sz w:val="16"/>
+              </w:rPr>
+              <w:t>1,53</w:t>
+            </w:r>
+          </w:p>
+        </w:tc>
+      </w:tr>
+      <w:tr>
+        <w:tc>
+          <w:tcPr>
+            <w:tcW w:type="dxa" w:w="3402"/>
+          </w:tcPr>
+          <w:p>
+            <w:pPr>
+              <w:keepNext/>
+            </w:pPr>
+            <w:r/>
+            <w:r>
+              <w:rPr>
+                <w:sz w:val="16"/>
+              </w:rPr>
+              <w:t>Peldaño</w:t>
+            </w:r>
+          </w:p>
+        </w:tc>
+        <w:tc>
+          <w:tcPr>
+            <w:tcW w:type="dxa" w:w="2268"/>
+          </w:tcPr>
+          <w:p>
+            <w:pPr>
+              <w:keepNext/>
+            </w:pPr>
+            <w:r/>
+            <w:r>
+              <w:rPr>
+                <w:sz w:val="16"/>
+              </w:rPr>
+              <w:t>1,30</w:t>
+            </w:r>
+          </w:p>
+        </w:tc>
+      </w:tr>
+      <w:tr>
+        <w:tc>
+          <w:tcPr>
+            <w:tcW w:type="dxa" w:w="3402"/>
+          </w:tcPr>
+          <w:p>
+            <w:pPr>
+              <w:keepNext/>
+            </w:pPr>
+            <w:r/>
+            <w:r>
+              <w:rPr>
+                <w:sz w:val="16"/>
+              </w:rPr>
+              <w:t>Bielas</w:t>
+            </w:r>
+          </w:p>
+        </w:tc>
+        <w:tc>
+          <w:tcPr>
+            <w:tcW w:type="dxa" w:w="2268"/>
+          </w:tcPr>
+          <w:p>
+            <w:pPr>
+              <w:keepNext/>
+            </w:pPr>
+            <w:r/>
+            <w:r>
+              <w:rPr>
+                <w:sz w:val="16"/>
+              </w:rPr>
+              <w:t>0,63</w:t>
+            </w:r>
+          </w:p>
+        </w:tc>
+      </w:tr>
+      <w:tr>
+        <w:tc>
+          <w:tcPr>
+            <w:tcW w:type="dxa" w:w="3402"/>
+          </w:tcPr>
+          <w:p>
+            <w:pPr>
+              <w:keepNext/>
+            </w:pPr>
+            <w:r/>
+            <w:r>
+              <w:rPr>
+                <w:sz w:val="16"/>
+              </w:rPr>
+              <w:t>Tirantes</w:t>
+            </w:r>
+          </w:p>
+        </w:tc>
+        <w:tc>
+          <w:tcPr>
+            <w:tcW w:type="dxa" w:w="2268"/>
+          </w:tcPr>
+          <w:p>
+            <w:pPr>
+              <w:keepNext/>
+            </w:pPr>
+            <w:r/>
+            <w:r>
+              <w:rPr>
+                <w:sz w:val="16"/>
+              </w:rPr>
+              <w:t>0,60</w:t>
+            </w:r>
+          </w:p>
+        </w:tc>
+      </w:tr>
+      <w:tr>
+        <w:tc>
+          <w:tcPr>
+            <w:tcW w:type="dxa" w:w="3402"/>
+          </w:tcPr>
+          <w:p>
+            <w:pPr>
+              <w:keepNext/>
+            </w:pPr>
+            <w:r/>
+            <w:r>
+              <w:rPr>
+                <w:sz w:val="16"/>
+              </w:rPr>
+              <w:t>Pasadores</w:t>
+            </w:r>
+          </w:p>
+        </w:tc>
+        <w:tc>
+          <w:tcPr>
+            <w:tcW w:type="dxa" w:w="2268"/>
+          </w:tcPr>
+          <w:p>
+            <w:pPr>
+              <w:keepNext/>
+            </w:pPr>
+            <w:r/>
+            <w:r>
+              <w:rPr>
+                <w:sz w:val="16"/>
+              </w:rPr>
+              <w:t>0,30</w:t>
+            </w:r>
+          </w:p>
+        </w:tc>
+      </w:tr>
+      <w:tr>
+        <w:tc>
+          <w:tcPr>
+            <w:tcW w:type="dxa" w:w="3402"/>
+          </w:tcPr>
+          <w:p>
+            <w:pPr>
+              <w:keepNext/>
+            </w:pPr>
+            <w:r/>
+            <w:r>
+              <w:rPr>
+                <w:sz w:val="16"/>
+              </w:rPr>
+              <w:t>Tacos</w:t>
+            </w:r>
+          </w:p>
+        </w:tc>
+        <w:tc>
+          <w:tcPr>
+            <w:tcW w:type="dxa" w:w="2268"/>
+          </w:tcPr>
+          <w:p>
+            <w:pPr>
+              <w:keepNext/>
+            </w:pPr>
+            <w:r/>
+            <w:r>
+              <w:rPr>
+                <w:sz w:val="16"/>
+              </w:rPr>
+              <w:t>0,20</w:t>
+            </w:r>
+          </w:p>
+        </w:tc>
+      </w:tr>
+      <w:tr>
+        <w:tc>
+          <w:tcPr>
+            <w:tcW w:type="dxa" w:w="3402"/>
+          </w:tcPr>
+          <w:p>
+            <w:pPr>
+              <w:keepNext/>
+            </w:pPr>
+            <w:r/>
+            <w:r>
+              <w:rPr>
+                <w:sz w:val="16"/>
+              </w:rPr>
+              <w:t>TOTAL piezas</w:t>
+            </w:r>
+          </w:p>
+        </w:tc>
+        <w:tc>
+          <w:tcPr>
+            <w:tcW w:type="dxa" w:w="2268"/>
+          </w:tcPr>
+          <w:p>
+            <w:pPr>
+              <w:keepNext/>
+            </w:pPr>
+            <w:r/>
+            <w:r>
+              <w:rPr>
+                <w:sz w:val="16"/>
+              </w:rPr>
+              <w:t>13,46</w:t>
+            </w:r>
+          </w:p>
+        </w:tc>
+      </w:tr>
+    </w:tbl>
+    <w:p>
+      <w:pPr>
+        <w:jc w:val="center"/>
+      </w:pPr>
+      <w:r>
+        <w:rPr>
+          <w:b w:val="0"/>
+          <w:i/>
+          <w:sz w:val="18"/>
+        </w:rPr>
+        <w:t>Tabla 17. Coste estimado de cada componente (alternativa 2). Estimación propia a partir del coste objetivo.</w:t>
+      </w:r>
+    </w:p>
+    <w:p>
+      <w:pPr>
+        <w:jc w:val="center"/>
+      </w:pPr>
+      <w:r>
+        <w:drawing>
+          <wp:inline xmlns:a="http://schemas.openxmlformats.org/drawingml/2006/main" xmlns:pic="http://schemas.openxmlformats.org/drawingml/2006/picture">
+            <wp:extent cx="5760000" cy="2764800"/>
+            <wp:docPr id="20" name="Picture 20"/>
+            <wp:cNvGraphicFramePr>
+              <a:graphicFrameLocks noChangeAspect="1"/>
+            </wp:cNvGraphicFramePr>
+            <a:graphic>
+              <a:graphicData uri="http://schemas.openxmlformats.org/drawingml/2006/picture">
+                <pic:pic>
+                  <pic:nvPicPr>
+                    <pic:cNvPr id="0" name="figura_analisis_valor.png"/>
+                    <pic:cNvPicPr/>
+                  </pic:nvPicPr>
+                  <pic:blipFill>
+                    <a:blip r:embed="rId29"/>
+                    <a:stretch>
+                      <a:fillRect/>
+                    </a:stretch>
+                  </pic:blipFill>
+                  <pic:spPr>
+                    <a:xfrm>
+                      <a:off x="0" y="0"/>
+                      <a:ext cx="5760000" cy="2764800"/>
+                    </a:xfrm>
+                    <a:prstGeom prst="rect"/>
+                  </pic:spPr>
+                </pic:pic>
+              </a:graphicData>
+            </a:graphic>
+          </wp:inline>
+        </w:drawing>
+      </w:r>
+    </w:p>
+    <w:p>
+      <w:pPr>
+        <w:jc w:val="center"/>
+      </w:pPr>
+      <w:r>
+        <w:rPr>
+          <w:b w:val="0"/>
+          <w:i/>
+          <w:sz w:val="18"/>
+        </w:rPr>
+        <w:t>Ilustración 20. Análisis del valor: valor para el cliente frente a coste de cada función. Elaboración propia.</w:t>
+      </w:r>
+    </w:p>
+    <w:p>
+      <w:r>
+        <w:rPr>
+          <w:b w:val="0"/>
+          <w:i w:val="0"/>
+        </w:rPr>
+        <w:t>Del análisis se deducen las siguientes acciones:</w:t>
+      </w:r>
+    </w:p>
+    <w:p>
+      <w:pPr>
+        <w:pStyle w:val="ListBullet"/>
+      </w:pPr>
+      <w:r>
+        <w:rPr>
+          <w:b w:val="0"/>
+          <w:i w:val="0"/>
+        </w:rPr>
+        <w:t>Soportar la carga (33 % del coste frente a un 20 % de valor) y la estética (7 % frente a 4 %) están sobredimensionadas. Se propone optimizar la sección de los largueros y las patas, por ejemplo con un perfil de 1,5 mm de pared en las zonas menos cargadas tras un cálculo por elementos finitos, y simplificar el asidero.</w:t>
+      </w:r>
+    </w:p>
+    <w:p>
+      <w:pPr>
+        <w:pStyle w:val="ListBullet"/>
+      </w:pPr>
+      <w:r>
+        <w:rPr>
+          <w:b w:val="0"/>
+          <w:i w:val="0"/>
+        </w:rPr>
+        <w:t>El bloqueo (2 % del coste frente a un 12 % de valor) y el antideslizante (1,5 % frente a 8 %) están infravalorados en el diseño actual. Coincide con el AMFEC: conviene invertir en un buen pestillo de seguridad y en tacos y superficies antideslizantes de calidad, porque el cliente los valora mucho y su coste es pequeño.</w:t>
+      </w:r>
+    </w:p>
+    <w:p>
+      <w:pPr>
+        <w:pStyle w:val="ListBullet"/>
+      </w:pPr>
+      <w:r>
+        <w:rPr>
+          <w:b w:val="0"/>
+          <w:i w:val="0"/>
+        </w:rPr>
+        <w:t>Transportar y guardar tiene mucho valor y muy poco coste, gracias al plegado plano y al hueco-asa; es uno de los puntos fuertes del producto y conviene destacarlo en la comunicación comercial.</w:t>
+      </w:r>
+    </w:p>
+    <w:p>
+      <w:pPr>
+        <w:pStyle w:val="Heading1"/>
+        <w:pageBreakBefore/>
+      </w:pPr>
+      <w:r>
+        <w:rPr>
+          <w:b w:val="0"/>
+          <w:i w:val="0"/>
+        </w:rPr>
+        <w:t>6. ANEXOS</w:t>
+      </w:r>
+    </w:p>
+    <w:p>
+      <w:pPr>
+        <w:pStyle w:val="Heading2"/>
+      </w:pPr>
+      <w:r>
+        <w:rPr>
+          <w:b w:val="0"/>
+          <w:i w:val="0"/>
+        </w:rPr>
+        <w:t>6.1. PLANOS</w:t>
+      </w:r>
+    </w:p>
+    <w:p>
+      <w:r>
+        <w:rPr>
+          <w:b w:val="0"/>
+          <w:i w:val="0"/>
+        </w:rPr>
+        <w:t>Se adjuntan los planos del producto en formato A3 (archivo «Anexo_Planos.pdf»). A continuación se incluye una reproducción reducida de cada uno.</w:t>
+      </w:r>
+    </w:p>
+    <w:p>
+      <w:pPr>
+        <w:jc w:val="center"/>
+      </w:pPr>
+      <w:r>
+        <w:drawing>
+          <wp:inline xmlns:a="http://schemas.openxmlformats.org/drawingml/2006/main" xmlns:pic="http://schemas.openxmlformats.org/drawingml/2006/picture">
+            <wp:extent cx="5760000" cy="4072287"/>
+            <wp:docPr id="21" name="Picture 21"/>
+            <wp:cNvGraphicFramePr>
+              <a:graphicFrameLocks noChangeAspect="1"/>
+            </wp:cNvGraphicFramePr>
+            <a:graphic>
+              <a:graphicData uri="http://schemas.openxmlformats.org/drawingml/2006/picture">
+                <pic:pic>
+                  <pic:nvPicPr>
+                    <pic:cNvPr id="0" name="plano1_conjunto_abierto.png"/>
+                    <pic:cNvPicPr/>
+                  </pic:nvPicPr>
+                  <pic:blipFill>
+                    <a:blip r:embed="rId30"/>
+                    <a:stretch>
+                      <a:fillRect/>
+                    </a:stretch>
+                  </pic:blipFill>
+                  <pic:spPr>
+                    <a:xfrm>
+                      <a:off x="0" y="0"/>
+                      <a:ext cx="5760000" cy="4072287"/>
+                    </a:xfrm>
+                    <a:prstGeom prst="rect"/>
+                  </pic:spPr>
+                </pic:pic>
+              </a:graphicData>
+            </a:graphic>
+          </wp:inline>
+        </w:drawing>
+      </w:r>
+    </w:p>
+    <w:p>
+      <w:pPr>
+        <w:jc w:val="center"/>
+      </w:pPr>
+      <w:r>
+        <w:rPr>
+          <w:b w:val="0"/>
+          <w:i/>
+          <w:sz w:val="18"/>
+        </w:rPr>
+        <w:t>Plano 1. Conjunto abierto con lista de piezas.</w:t>
+      </w:r>
+    </w:p>
+    <w:p>
+      <w:pPr>
+        <w:jc w:val="center"/>
+      </w:pPr>
+      <w:r>
+        <w:drawing>
+          <wp:inline xmlns:a="http://schemas.openxmlformats.org/drawingml/2006/main" xmlns:pic="http://schemas.openxmlformats.org/drawingml/2006/picture">
+            <wp:extent cx="5760000" cy="4072287"/>
+            <wp:docPr id="22" name="Picture 22"/>
+            <wp:cNvGraphicFramePr>
+              <a:graphicFrameLocks noChangeAspect="1"/>
+            </wp:cNvGraphicFramePr>
+            <a:graphic>
+              <a:graphicData uri="http://schemas.openxmlformats.org/drawingml/2006/picture">
+                <pic:pic>
+                  <pic:nvPicPr>
+                    <pic:cNvPr id="0" name="plano2_conjunto_plegado.png"/>
+                    <pic:cNvPicPr/>
+                  </pic:nvPicPr>
+                  <pic:blipFill>
+                    <a:blip r:embed="rId31"/>
+                    <a:stretch>
+                      <a:fillRect/>
+                    </a:stretch>
+                  </pic:blipFill>
+                  <pic:spPr>
+                    <a:xfrm>
+                      <a:off x="0" y="0"/>
+                      <a:ext cx="5760000" cy="4072287"/>
+                    </a:xfrm>
+                    <a:prstGeom prst="rect"/>
+                  </pic:spPr>
+                </pic:pic>
+              </a:graphicData>
+            </a:graphic>
+          </wp:inline>
+        </w:drawing>
+      </w:r>
+    </w:p>
+    <w:p>
+      <w:pPr>
+        <w:jc w:val="center"/>
+      </w:pPr>
+      <w:r>
+        <w:rPr>
+          <w:b w:val="0"/>
+          <w:i/>
+          <w:sz w:val="18"/>
+        </w:rPr>
+        <w:t>Plano 2. Conjunto plegado.</w:t>
+      </w:r>
+    </w:p>
+    <w:p>
+      <w:pPr>
+        <w:jc w:val="center"/>
+      </w:pPr>
+      <w:r>
+        <w:drawing>
+          <wp:inline xmlns:a="http://schemas.openxmlformats.org/drawingml/2006/main" xmlns:pic="http://schemas.openxmlformats.org/drawingml/2006/picture">
+            <wp:extent cx="5760000" cy="4072287"/>
+            <wp:docPr id="23" name="Picture 23"/>
+            <wp:cNvGraphicFramePr>
+              <a:graphicFrameLocks noChangeAspect="1"/>
+            </wp:cNvGraphicFramePr>
+            <a:graphic>
+              <a:graphicData uri="http://schemas.openxmlformats.org/drawingml/2006/picture">
+                <pic:pic>
+                  <pic:nvPicPr>
+                    <pic:cNvPr id="0" name="plano3_larguero_pata.png"/>
+                    <pic:cNvPicPr/>
+                  </pic:nvPicPr>
+                  <pic:blipFill>
+                    <a:blip r:embed="rId32"/>
+                    <a:stretch>
+                      <a:fillRect/>
+                    </a:stretch>
+                  </pic:blipFill>
+                  <pic:spPr>
+                    <a:xfrm>
+                      <a:off x="0" y="0"/>
+                      <a:ext cx="5760000" cy="4072287"/>
+                    </a:xfrm>
+                    <a:prstGeom prst="rect"/>
+                  </pic:spPr>
+                </pic:pic>
+              </a:graphicData>
+            </a:graphic>
+          </wp:inline>
+        </w:drawing>
+      </w:r>
+    </w:p>
+    <w:p>
+      <w:pPr>
+        <w:jc w:val="center"/>
+      </w:pPr>
+      <w:r>
+        <w:rPr>
+          <w:b w:val="0"/>
+          <w:i/>
+          <w:sz w:val="18"/>
+        </w:rPr>
+        <w:t>Plano 3. Larguero delantero y pata trasera.</w:t>
+      </w:r>
+    </w:p>
+    <w:p>
+      <w:pPr>
+        <w:jc w:val="center"/>
+      </w:pPr>
+      <w:r>
+        <w:drawing>
+          <wp:inline xmlns:a="http://schemas.openxmlformats.org/drawingml/2006/main" xmlns:pic="http://schemas.openxmlformats.org/drawingml/2006/picture">
+            <wp:extent cx="5760000" cy="4072287"/>
+            <wp:docPr id="24" name="Picture 24"/>
+            <wp:cNvGraphicFramePr>
+              <a:graphicFrameLocks noChangeAspect="1"/>
+            </wp:cNvGraphicFramePr>
+            <a:graphic>
+              <a:graphicData uri="http://schemas.openxmlformats.org/drawingml/2006/picture">
+                <pic:pic>
+                  <pic:nvPicPr>
+                    <pic:cNvPr id="0" name="plano4_plataforma_peldano.png"/>
+                    <pic:cNvPicPr/>
+                  </pic:nvPicPr>
+                  <pic:blipFill>
+                    <a:blip r:embed="rId33"/>
+                    <a:stretch>
+                      <a:fillRect/>
+                    </a:stretch>
+                  </pic:blipFill>
+                  <pic:spPr>
+                    <a:xfrm>
+                      <a:off x="0" y="0"/>
+                      <a:ext cx="5760000" cy="4072287"/>
+                    </a:xfrm>
+                    <a:prstGeom prst="rect"/>
+                  </pic:spPr>
+                </pic:pic>
+              </a:graphicData>
+            </a:graphic>
+          </wp:inline>
+        </w:drawing>
+      </w:r>
+    </w:p>
+    <w:p>
+      <w:pPr>
+        <w:jc w:val="center"/>
+      </w:pPr>
+      <w:r>
+        <w:rPr>
+          <w:b w:val="0"/>
+          <w:i/>
+          <w:sz w:val="18"/>
+        </w:rPr>
+        <w:t>Plano 4. Plataforma y peldaño.</w:t>
+      </w:r>
+    </w:p>
+    <w:p>
+      <w:pPr>
+        <w:jc w:val="center"/>
+      </w:pPr>
+      <w:r>
+        <w:drawing>
+          <wp:inline xmlns:a="http://schemas.openxmlformats.org/drawingml/2006/main" xmlns:pic="http://schemas.openxmlformats.org/drawingml/2006/picture">
+            <wp:extent cx="5760000" cy="4072287"/>
+            <wp:docPr id="25" name="Picture 25"/>
+            <wp:cNvGraphicFramePr>
+              <a:graphicFrameLocks noChangeAspect="1"/>
+            </wp:cNvGraphicFramePr>
+            <a:graphic>
+              <a:graphicData uri="http://schemas.openxmlformats.org/drawingml/2006/picture">
+                <pic:pic>
+                  <pic:nvPicPr>
+                    <pic:cNvPr id="0" name="plano5_piezas_varias.png"/>
+                    <pic:cNvPicPr/>
+                  </pic:nvPicPr>
+                  <pic:blipFill>
+                    <a:blip r:embed="rId34"/>
+                    <a:stretch>
+                      <a:fillRect/>
+                    </a:stretch>
+                  </pic:blipFill>
+                  <pic:spPr>
+                    <a:xfrm>
+                      <a:off x="0" y="0"/>
+                      <a:ext cx="5760000" cy="4072287"/>
+                    </a:xfrm>
+                    <a:prstGeom prst="rect"/>
+                  </pic:spPr>
+                </pic:pic>
+              </a:graphicData>
+            </a:graphic>
+          </wp:inline>
+        </w:drawing>
+      </w:r>
+    </w:p>
+    <w:p>
+      <w:pPr>
+        <w:jc w:val="center"/>
+      </w:pPr>
+      <w:r>
+        <w:rPr>
+          <w:b w:val="0"/>
+          <w:i/>
+          <w:sz w:val="18"/>
+        </w:rPr>
+        <w:t>Plano 5. Travesaños, biela, tirante, pasador y taco.</w:t>
+      </w:r>
+    </w:p>
+    <w:p>
+      <w:pPr>
+        <w:pStyle w:val="Heading2"/>
+        <w:pageBreakBefore/>
       </w:pPr>
       <w:r>
         <w:t>Bibliografía</w:t>

</xml_diff>

<commit_message>
Portada nueva, nombre del autor, índice con páginas, revisión de coherencia y documento de dudas
Co-Authored-By: Claude Opus 5.5 <noreply@anthropic.com>
Claude-Session: https://claude.ai/code/session_01GULK22xqK1fWX4r8uc4cx1
</commit_message>
<xml_diff>
--- a/trabajo/Trabajo_Taburete.docx
+++ b/trabajo/Trabajo_Taburete.docx
@@ -2,82 +2,91 @@
 <file path=word/document.xml><?xml version="1.0" encoding="utf-8"?>
 <w:document xmlns:wpc="http://schemas.microsoft.com/office/word/2010/wordprocessingCanvas" xmlns:mo="http://schemas.microsoft.com/office/mac/office/2008/main" xmlns:mc="http://schemas.openxmlformats.org/markup-compatibility/2006" xmlns:mv="urn:schemas-microsoft-com:mac:vml" xmlns:o="urn:schemas-microsoft-com:office:office" xmlns:r="http://schemas.openxmlformats.org/officeDocument/2006/relationships" xmlns:m="http://schemas.openxmlformats.org/officeDocument/2006/math" xmlns:v="urn:schemas-microsoft-com:vml" xmlns:wp14="http://schemas.microsoft.com/office/word/2010/wordprocessingDrawing" xmlns:wp="http://schemas.openxmlformats.org/drawingml/2006/wordprocessingDrawing" xmlns:w10="urn:schemas-microsoft-com:office:word" xmlns:w="http://schemas.openxmlformats.org/wordprocessingml/2006/main" xmlns:w14="http://schemas.microsoft.com/office/word/2010/wordml" xmlns:wpg="http://schemas.microsoft.com/office/word/2010/wordprocessingGroup" xmlns:wpi="http://schemas.microsoft.com/office/word/2010/wordprocessingInk" xmlns:wne="http://schemas.microsoft.com/office/word/2006/wordml" xmlns:wps="http://schemas.microsoft.com/office/word/2010/wordprocessingShape" mc:Ignorable="w14 wp14">
   <w:body>
+    <w:tbl>
+      <w:tblPr>
+        <w:tblW w:type="auto" w:w="0"/>
+        <w:jc w:val="center"/>
+        <w:tblLayout w:type="fixed"/>
+        <w:tblLook w:firstColumn="1" w:firstRow="1" w:lastColumn="0" w:lastRow="0" w:noHBand="0" w:noVBand="1" w:val="04A0"/>
+        <w:tblBorders>
+          <w:top w:val="nil"/>
+          <w:left w:val="nil"/>
+          <w:bottom w:val="nil"/>
+          <w:right w:val="nil"/>
+          <w:insideH w:val="nil"/>
+          <w:insideV w:val="nil"/>
+        </w:tblBorders>
+      </w:tblPr>
+      <w:tblGrid>
+        <w:gridCol w:w="9072"/>
+      </w:tblGrid>
+      <w:tr>
+        <w:tc>
+          <w:tcPr>
+            <w:tcW w:type="dxa" w:w="9071"/>
+            <w:shd w:val="clear" w:color="auto" w:fill="1F2A36"/>
+          </w:tcPr>
+          <w:p>
+            <w:pPr>
+              <w:spacing w:after="0" w:before="0"/>
+              <w:jc w:val="center"/>
+            </w:pPr>
+            <w:r/>
+            <w:r>
+              <w:rPr>
+                <w:b w:val="0"/>
+                <w:color w:val="1F2A36"/>
+                <w:sz w:val="8"/>
+              </w:rPr>
+            </w:r>
+          </w:p>
+          <w:p>
+            <w:pPr>
+              <w:spacing w:after="0" w:before="0"/>
+              <w:jc w:val="center"/>
+            </w:pPr>
+            <w:r>
+              <w:rPr>
+                <w:b/>
+                <w:color w:val="FFFFFF"/>
+                <w:sz w:val="26"/>
+              </w:rPr>
+              <w:t>UNIVERSIDAD DE LA RIOJA</w:t>
+            </w:r>
+          </w:p>
+          <w:p>
+            <w:pPr>
+              <w:spacing w:after="0" w:before="0"/>
+              <w:jc w:val="center"/>
+            </w:pPr>
+            <w:r>
+              <w:rPr>
+                <w:b w:val="0"/>
+                <w:color w:val="C9D1DB"/>
+                <w:sz w:val="19"/>
+              </w:rPr>
+              <w:t>Grado en Ingeniería Mecánica  ·  Ingeniería Simultánea</w:t>
+            </w:r>
+          </w:p>
+          <w:p>
+            <w:pPr>
+              <w:spacing w:after="0" w:before="0"/>
+              <w:jc w:val="center"/>
+            </w:pPr>
+            <w:r>
+              <w:rPr>
+                <w:b w:val="0"/>
+                <w:color w:val="1F2A36"/>
+                <w:sz w:val="8"/>
+              </w:rPr>
+            </w:r>
+          </w:p>
+        </w:tc>
+      </w:tr>
+    </w:tbl>
     <w:p>
       <w:pPr>
-        <w:jc w:val="center"/>
-      </w:pPr>
-    </w:p>
-    <w:p>
-      <w:pPr>
-        <w:jc w:val="center"/>
-      </w:pPr>
-    </w:p>
-    <w:p>
-      <w:pPr>
-        <w:jc w:val="center"/>
-      </w:pPr>
-    </w:p>
-    <w:p>
-      <w:pPr>
-        <w:jc w:val="center"/>
-      </w:pPr>
-      <w:r>
-        <w:rPr>
-          <w:b/>
-          <w:i w:val="0"/>
-          <w:sz w:val="28"/>
-        </w:rPr>
-        <w:t>UNIVERSIDAD DE LA RIOJA</w:t>
-      </w:r>
-    </w:p>
-    <w:p>
-      <w:pPr>
-        <w:jc w:val="center"/>
-      </w:pPr>
-      <w:r>
-        <w:rPr>
-          <w:b w:val="0"/>
-          <w:i w:val="0"/>
-          <w:sz w:val="22"/>
-        </w:rPr>
-        <w:t>Grado en Ingeniería Mecánica · 4.º curso</w:t>
-      </w:r>
-    </w:p>
-    <w:p>
-      <w:pPr>
-        <w:jc w:val="center"/>
-      </w:pPr>
-      <w:r>
-        <w:rPr>
-          <w:b w:val="0"/>
-          <w:i/>
-          <w:sz w:val="22"/>
-        </w:rPr>
-        <w:t>Ingeniería Simultánea</w:t>
-      </w:r>
-    </w:p>
-    <w:p>
-      <w:pPr>
-        <w:jc w:val="center"/>
-      </w:pPr>
-    </w:p>
-    <w:p>
-      <w:pPr>
-        <w:jc w:val="center"/>
-      </w:pPr>
-    </w:p>
-    <w:p>
-      <w:pPr>
-        <w:jc w:val="center"/>
-      </w:pPr>
-    </w:p>
-    <w:p>
-      <w:pPr>
-        <w:jc w:val="center"/>
-      </w:pPr>
-    </w:p>
-    <w:p>
-      <w:pPr>
+        <w:spacing w:before="600" w:after="120" w:line="240" w:lineRule="auto"/>
         <w:jc w:val="center"/>
       </w:pPr>
       <w:r>
@@ -85,51 +94,69 @@
           <w:b/>
           <w:i w:val="0"/>
           <w:color w:val="C0392B"/>
-          <w:sz w:val="48"/>
+          <w:sz w:val="18"/>
+          <w:spacing w:val="40"/>
         </w:rPr>
-        <w:t>DISEÑO DE UN TABURETE-ESCALERA</w:t>
+        <w:t>TRABAJO DE ASIGNATURA  ·  CURSO 2026-2027</w:t>
       </w:r>
     </w:p>
     <w:p>
       <w:pPr>
+        <w:spacing w:before="0" w:after="0" w:line="240" w:lineRule="auto"/>
         <w:jc w:val="center"/>
       </w:pPr>
       <w:r>
         <w:rPr>
           <w:b/>
           <w:i w:val="0"/>
-          <w:color w:val="C0392B"/>
-          <w:sz w:val="48"/>
+          <w:color w:val="1F2A36"/>
+          <w:sz w:val="52"/>
         </w:rPr>
-        <w:t>PLEGABLE DE USO DOMÉSTICO</w:t>
+        <w:t>Taburete-escalera plegable</w:t>
       </w:r>
     </w:p>
     <w:p>
       <w:pPr>
+        <w:spacing w:before="0" w:after="200" w:line="240" w:lineRule="auto"/>
         <w:jc w:val="center"/>
-      </w:pPr>
-    </w:p>
-    <w:p>
-      <w:pPr>
-        <w:jc w:val="center"/>
+        <w:pBdr>
+          <w:bottom w:val="single" w:sz="12" w:space="4" w:color="C0392B"/>
+        </w:pBdr>
       </w:pPr>
       <w:r>
         <w:rPr>
           <w:b w:val="0"/>
           <w:i w:val="0"/>
-          <w:sz w:val="24"/>
+          <w:color w:val="6B7280"/>
+          <w:sz w:val="40"/>
         </w:rPr>
-        <w:t>Trabajo de la asignatura</w:t>
+        <w:t>de uso doméstico</w:t>
       </w:r>
     </w:p>
     <w:p>
       <w:pPr>
+        <w:spacing w:before="120" w:after="280" w:line="240" w:lineRule="auto"/>
+        <w:jc w:val="center"/>
+      </w:pPr>
+      <w:r>
+        <w:rPr>
+          <w:b w:val="0"/>
+          <w:i/>
+          <w:color w:val="6B7280"/>
+          <w:sz w:val="21"/>
+        </w:rPr>
+        <w:t>Diseño, ciclo de vida y rediseño con la metodología de Ingeniería Simultánea</w:t>
+      </w:r>
+    </w:p>
+    <w:p>
+      <w:pPr>
+        <w:spacing w:before="0" w:after="80" w:line="240" w:lineRule="auto"/>
         <w:jc w:val="center"/>
       </w:pPr>
       <w:r>
         <w:drawing>
           <wp:inline xmlns:a="http://schemas.openxmlformats.org/drawingml/2006/main" xmlns:pic="http://schemas.openxmlformats.org/drawingml/2006/picture">
-            <wp:extent cx="2520000" cy="1891338"/>
+            <wp:extent cx="3619727" cy="3348000"/>
             <wp:docPr id="26" name="Picture 26"/>
             <wp:cNvGraphicFramePr>
               <a:graphicFrameLocks noChangeAspect="1"/>
@@ -142,7 +169,7 @@
                     <pic:cNvPicPr/>
                   </pic:nvPicPr>
                   <pic:blipFill>
-                    <a:blip r:embed="rId23"/>
+                    <a:blip r:embed="rId35"/>
                     <a:stretch>
                       <a:fillRect/>
                     </a:stretch>
@@ -150,7 +177,7 @@
                   <pic:spPr>
                     <a:xfrm>
                       <a:off x="0" y="0"/>
-                      <a:ext cx="2520000" cy="1891338"/>
+                      <a:ext cx="3619727" cy="3348000"/>
                     </a:xfrm>
                     <a:prstGeom prst="rect"/>
                   </pic:spPr>
@@ -163,66 +190,1247 @@
     </w:p>
     <w:p>
       <w:pPr>
+        <w:spacing w:before="0" w:after="280" w:line="240" w:lineRule="auto"/>
+        <w:jc w:val="center"/>
+      </w:pPr>
+      <w:r>
+        <w:rPr>
+          <w:b w:val="0"/>
+          <w:i/>
+          <w:color w:val="6B7280"/>
+          <w:sz w:val="17"/>
+        </w:rPr>
+        <w:t>Plegado  ·  Abierto</w:t>
+      </w:r>
+    </w:p>
+    <w:tbl>
+      <w:tblPr>
+        <w:tblW w:type="auto" w:w="0"/>
+        <w:jc w:val="center"/>
+        <w:tblLayout w:type="fixed"/>
+        <w:tblLook w:firstColumn="1" w:firstRow="1" w:lastColumn="0" w:lastRow="0" w:noHBand="0" w:noVBand="1" w:val="04A0"/>
+        <w:tblBorders>
+          <w:top w:val="nil"/>
+          <w:left w:val="nil"/>
+          <w:bottom w:val="nil"/>
+          <w:right w:val="nil"/>
+          <w:insideH w:val="nil"/>
+          <w:insideV w:val="nil"/>
+        </w:tblBorders>
+      </w:tblPr>
+      <w:tblGrid>
+        <w:gridCol w:w="2268"/>
+        <w:gridCol w:w="2268"/>
+        <w:gridCol w:w="2268"/>
+        <w:gridCol w:w="2268"/>
+      </w:tblGrid>
+      <w:tr>
+        <w:tc>
+          <w:tcPr>
+            <w:tcW w:type="dxa" w:w="2268"/>
+            <w:shd w:val="clear" w:color="auto" w:fill="F3F4F6"/>
+          </w:tcPr>
+          <w:p>
+            <w:pPr>
+              <w:spacing w:after="0" w:before="0"/>
+              <w:jc w:val="center"/>
+            </w:pPr>
+            <w:r/>
+            <w:r>
+              <w:rPr>
+                <w:b w:val="0"/>
+                <w:color w:val="1F2A36"/>
+                <w:sz w:val="6"/>
+              </w:rPr>
+            </w:r>
+          </w:p>
+          <w:p>
+            <w:pPr>
+              <w:spacing w:after="0" w:before="0"/>
+              <w:jc w:val="center"/>
+            </w:pPr>
+            <w:r>
+              <w:rPr>
+                <w:b/>
+                <w:color w:val="C0392B"/>
+                <w:sz w:val="34"/>
+              </w:rPr>
+              <w:t>0,48 m</w:t>
+            </w:r>
+          </w:p>
+          <w:p>
+            <w:pPr>
+              <w:spacing w:after="0" w:before="0"/>
+              <w:jc w:val="center"/>
+            </w:pPr>
+            <w:r>
+              <w:rPr>
+                <w:b w:val="0"/>
+                <w:color w:val="6B7280"/>
+                <w:sz w:val="17"/>
+              </w:rPr>
+              <w:t>altura de plataforma</w:t>
+            </w:r>
+          </w:p>
+          <w:p>
+            <w:pPr>
+              <w:spacing w:after="0" w:before="0"/>
+              <w:jc w:val="center"/>
+            </w:pPr>
+            <w:r>
+              <w:rPr>
+                <w:b w:val="0"/>
+                <w:color w:val="1F2A36"/>
+                <w:sz w:val="6"/>
+              </w:rPr>
+            </w:r>
+          </w:p>
+        </w:tc>
+        <w:tc>
+          <w:tcPr>
+            <w:tcW w:type="dxa" w:w="2268"/>
+            <w:shd w:val="clear" w:color="auto" w:fill="F3F4F6"/>
+          </w:tcPr>
+          <w:p>
+            <w:pPr>
+              <w:spacing w:after="0" w:before="0"/>
+              <w:jc w:val="center"/>
+            </w:pPr>
+            <w:r/>
+            <w:r>
+              <w:rPr>
+                <w:b w:val="0"/>
+                <w:color w:val="1F2A36"/>
+                <w:sz w:val="6"/>
+              </w:rPr>
+            </w:r>
+          </w:p>
+          <w:p>
+            <w:pPr>
+              <w:spacing w:after="0" w:before="0"/>
+              <w:jc w:val="center"/>
+            </w:pPr>
+            <w:r>
+              <w:rPr>
+                <w:b/>
+                <w:color w:val="C0392B"/>
+                <w:sz w:val="34"/>
+              </w:rPr>
+              <w:t>150 kg</w:t>
+            </w:r>
+          </w:p>
+          <w:p>
+            <w:pPr>
+              <w:spacing w:after="0" w:before="0"/>
+              <w:jc w:val="center"/>
+            </w:pPr>
+            <w:r>
+              <w:rPr>
+                <w:b w:val="0"/>
+                <w:color w:val="6B7280"/>
+                <w:sz w:val="17"/>
+              </w:rPr>
+              <w:t>carga máxima</w:t>
+            </w:r>
+          </w:p>
+          <w:p>
+            <w:pPr>
+              <w:spacing w:after="0" w:before="0"/>
+              <w:jc w:val="center"/>
+            </w:pPr>
+            <w:r>
+              <w:rPr>
+                <w:b w:val="0"/>
+                <w:color w:val="1F2A36"/>
+                <w:sz w:val="6"/>
+              </w:rPr>
+            </w:r>
+          </w:p>
+        </w:tc>
+        <w:tc>
+          <w:tcPr>
+            <w:tcW w:type="dxa" w:w="2268"/>
+            <w:shd w:val="clear" w:color="auto" w:fill="F3F4F6"/>
+          </w:tcPr>
+          <w:p>
+            <w:pPr>
+              <w:spacing w:after="0" w:before="0"/>
+              <w:jc w:val="center"/>
+            </w:pPr>
+            <w:r/>
+            <w:r>
+              <w:rPr>
+                <w:b w:val="0"/>
+                <w:color w:val="1F2A36"/>
+                <w:sz w:val="6"/>
+              </w:rPr>
+            </w:r>
+          </w:p>
+          <w:p>
+            <w:pPr>
+              <w:spacing w:after="0" w:before="0"/>
+              <w:jc w:val="center"/>
+            </w:pPr>
+            <w:r>
+              <w:rPr>
+                <w:b/>
+                <w:color w:val="C0392B"/>
+                <w:sz w:val="34"/>
+              </w:rPr>
+              <w:t>40 mm</w:t>
+            </w:r>
+          </w:p>
+          <w:p>
+            <w:pPr>
+              <w:spacing w:after="0" w:before="0"/>
+              <w:jc w:val="center"/>
+            </w:pPr>
+            <w:r>
+              <w:rPr>
+                <w:b w:val="0"/>
+                <w:color w:val="6B7280"/>
+                <w:sz w:val="17"/>
+              </w:rPr>
+              <w:t>espesor plegado</w:t>
+            </w:r>
+          </w:p>
+          <w:p>
+            <w:pPr>
+              <w:spacing w:after="0" w:before="0"/>
+              <w:jc w:val="center"/>
+            </w:pPr>
+            <w:r>
+              <w:rPr>
+                <w:b w:val="0"/>
+                <w:color w:val="1F2A36"/>
+                <w:sz w:val="6"/>
+              </w:rPr>
+            </w:r>
+          </w:p>
+        </w:tc>
+        <w:tc>
+          <w:tcPr>
+            <w:tcW w:type="dxa" w:w="2268"/>
+            <w:shd w:val="clear" w:color="auto" w:fill="F3F4F6"/>
+          </w:tcPr>
+          <w:p>
+            <w:pPr>
+              <w:spacing w:after="0" w:before="0"/>
+              <w:jc w:val="center"/>
+            </w:pPr>
+            <w:r/>
+            <w:r>
+              <w:rPr>
+                <w:b w:val="0"/>
+                <w:color w:val="1F2A36"/>
+                <w:sz w:val="6"/>
+              </w:rPr>
+            </w:r>
+          </w:p>
+          <w:p>
+            <w:pPr>
+              <w:spacing w:after="0" w:before="0"/>
+              <w:jc w:val="center"/>
+            </w:pPr>
+            <w:r>
+              <w:rPr>
+                <w:b/>
+                <w:color w:val="C0392B"/>
+                <w:sz w:val="34"/>
+              </w:rPr>
+              <w:t>3,17 kg</w:t>
+            </w:r>
+          </w:p>
+          <w:p>
+            <w:pPr>
+              <w:spacing w:after="0" w:before="0"/>
+              <w:jc w:val="center"/>
+            </w:pPr>
+            <w:r>
+              <w:rPr>
+                <w:b w:val="0"/>
+                <w:color w:val="6B7280"/>
+                <w:sz w:val="17"/>
+              </w:rPr>
+              <w:t>peso (alt. aluminio)</w:t>
+            </w:r>
+          </w:p>
+          <w:p>
+            <w:pPr>
+              <w:spacing w:after="0" w:before="0"/>
+              <w:jc w:val="center"/>
+            </w:pPr>
+            <w:r>
+              <w:rPr>
+                <w:b w:val="0"/>
+                <w:color w:val="1F2A36"/>
+                <w:sz w:val="6"/>
+              </w:rPr>
+            </w:r>
+          </w:p>
+        </w:tc>
+      </w:tr>
+    </w:tbl>
+    <w:p>
+      <w:pPr>
+        <w:spacing w:before="600" w:after="0" w:line="240" w:lineRule="auto"/>
         <w:jc w:val="center"/>
       </w:pPr>
     </w:p>
     <w:p>
       <w:pPr>
-        <w:jc w:val="center"/>
-      </w:pPr>
-    </w:p>
-    <w:p>
-      <w:pPr>
-        <w:jc w:val="center"/>
-      </w:pPr>
-    </w:p>
-    <w:p>
-      <w:pPr>
+        <w:spacing w:before="0" w:after="0" w:line="240" w:lineRule="auto"/>
         <w:jc w:val="center"/>
       </w:pPr>
       <w:r>
         <w:rPr>
           <w:b w:val="0"/>
           <w:i w:val="0"/>
-          <w:sz w:val="22"/>
+          <w:color w:val="6B7280"/>
+          <w:sz w:val="17"/>
+          <w:spacing w:val="30"/>
         </w:rPr>
-        <w:t xml:space="preserve">Alumno: </w:t>
-      </w:r>
-      <w:r>
-        <w:rPr>
-          <w:sz w:val="22"/>
-          <w:highlight w:val="yellow"/>
-        </w:rPr>
-        <w:t>[nombre y apellidos]</w:t>
+        <w:t>Alumno</w:t>
       </w:r>
     </w:p>
     <w:p>
       <w:pPr>
+        <w:spacing w:before="0" w:after="40" w:line="240" w:lineRule="auto"/>
+        <w:jc w:val="center"/>
+      </w:pPr>
+      <w:r>
+        <w:rPr>
+          <w:b/>
+          <w:i w:val="0"/>
+          <w:color w:val="1F2A36"/>
+          <w:sz w:val="30"/>
+        </w:rPr>
+        <w:t>Iván Roig Pérez</w:t>
+      </w:r>
+    </w:p>
+    <w:p>
+      <w:pPr>
+        <w:spacing w:before="0" w:after="0" w:line="240" w:lineRule="auto"/>
         <w:jc w:val="center"/>
       </w:pPr>
       <w:r>
         <w:rPr>
           <w:b w:val="0"/>
           <w:i w:val="0"/>
+          <w:color w:val="6B7280"/>
+          <w:sz w:val="19"/>
+        </w:rPr>
+        <w:t>Logroño, 2026</w:t>
+      </w:r>
+    </w:p>
+    <w:p>
+      <w:pPr>
+        <w:pStyle w:val="TOCHeading"/>
+        <w:pageBreakBefore/>
+      </w:pPr>
+      <w:r>
+        <w:t>ÍNDICE</w:t>
+      </w:r>
+    </w:p>
+    <w:p>
+      <w:pPr>
+        <w:tabs>
+          <w:tab w:pos="9071" w:val="right" w:leader="dot"/>
+        </w:tabs>
+        <w:spacing w:before="160" w:after="40"/>
+        <w:ind w:left="0"/>
+      </w:pPr>
+      <w:r>
+        <w:fldChar w:fldCharType="begin"/>
+      </w:r>
+      <w:r>
+        <w:instrText xml:space="preserve"> TOC \o "1-2" \h \z \u </w:instrText>
+      </w:r>
+      <w:r>
+        <w:fldChar w:fldCharType="separate"/>
+      </w:r>
+      <w:r>
+        <w:rPr>
+          <w:b/>
           <w:sz w:val="22"/>
         </w:rPr>
-        <w:t>Curso 2026-2027</w:t>
+        <w:t>1. ETAPA INICIAL</w:t>
+      </w:r>
+      <w:r>
+        <w:rPr>
+          <w:b/>
+          <w:sz w:val="22"/>
+        </w:rPr>
+        <w:tab/>
+        <w:t>3</w:t>
       </w:r>
     </w:p>
     <w:p>
       <w:pPr>
-        <w:pStyle w:val="Heading1"/>
-      </w:pPr>
-      <w:r>
-        <w:t>ÍNDICE</w:t>
+        <w:tabs>
+          <w:tab w:pos="9071" w:val="right" w:leader="dot"/>
+        </w:tabs>
+        <w:spacing w:before="0" w:after="40"/>
+        <w:ind w:left="340"/>
+      </w:pPr>
+      <w:r>
+        <w:rPr>
+          <w:b w:val="0"/>
+          <w:sz w:val="20"/>
+        </w:rPr>
+        <w:t>1.1. INTRODUCCIÓN</w:t>
+      </w:r>
+      <w:r>
+        <w:rPr>
+          <w:b w:val="0"/>
+          <w:sz w:val="20"/>
+        </w:rPr>
+        <w:tab/>
+        <w:t>3</w:t>
       </w:r>
     </w:p>
     <w:p>
-      <w:fldSimple w:instr="TOC \o &quot;1-3&quot; \h \z \u">
-        <w:r>
-          <w:t>Haz clic derecho aquí y elige «Actualizar campo» para generar el índice.</w:t>
-        </w:r>
-      </w:fldSimple>
+      <w:pPr>
+        <w:tabs>
+          <w:tab w:pos="9071" w:val="right" w:leader="dot"/>
+        </w:tabs>
+        <w:spacing w:before="0" w:after="40"/>
+        <w:ind w:left="340"/>
+      </w:pPr>
+      <w:r>
+        <w:rPr>
+          <w:b w:val="0"/>
+          <w:sz w:val="20"/>
+        </w:rPr>
+        <w:t>1.2. DEFINICIÓN</w:t>
+      </w:r>
+      <w:r>
+        <w:rPr>
+          <w:b w:val="0"/>
+          <w:sz w:val="20"/>
+        </w:rPr>
+        <w:tab/>
+        <w:t>5</w:t>
+      </w:r>
+    </w:p>
+    <w:p>
+      <w:pPr>
+        <w:tabs>
+          <w:tab w:pos="9071" w:val="right" w:leader="dot"/>
+        </w:tabs>
+        <w:spacing w:before="0" w:after="40"/>
+        <w:ind w:left="340"/>
+      </w:pPr>
+      <w:r>
+        <w:rPr>
+          <w:b w:val="0"/>
+          <w:sz w:val="20"/>
+        </w:rPr>
+        <w:t>1.3. OBJETIVOS</w:t>
+      </w:r>
+      <w:r>
+        <w:rPr>
+          <w:b w:val="0"/>
+          <w:sz w:val="20"/>
+        </w:rPr>
+        <w:tab/>
+        <w:t>5</w:t>
+      </w:r>
+    </w:p>
+    <w:p>
+      <w:pPr>
+        <w:tabs>
+          <w:tab w:pos="9071" w:val="right" w:leader="dot"/>
+        </w:tabs>
+        <w:spacing w:before="0" w:after="40"/>
+        <w:ind w:left="340"/>
+      </w:pPr>
+      <w:r>
+        <w:rPr>
+          <w:b w:val="0"/>
+          <w:sz w:val="20"/>
+        </w:rPr>
+        <w:t>1.4. FUNCIONES</w:t>
+      </w:r>
+      <w:r>
+        <w:rPr>
+          <w:b w:val="0"/>
+          <w:sz w:val="20"/>
+        </w:rPr>
+        <w:tab/>
+        <w:t>6</w:t>
+      </w:r>
+    </w:p>
+    <w:p>
+      <w:pPr>
+        <w:tabs>
+          <w:tab w:pos="9071" w:val="right" w:leader="dot"/>
+        </w:tabs>
+        <w:spacing w:before="0" w:after="40"/>
+        <w:ind w:left="340"/>
+      </w:pPr>
+      <w:r>
+        <w:rPr>
+          <w:b w:val="0"/>
+          <w:sz w:val="20"/>
+        </w:rPr>
+        <w:t>1.5. REQUISITOS</w:t>
+      </w:r>
+      <w:r>
+        <w:rPr>
+          <w:b w:val="0"/>
+          <w:sz w:val="20"/>
+        </w:rPr>
+        <w:tab/>
+        <w:t>7</w:t>
+      </w:r>
+    </w:p>
+    <w:p>
+      <w:pPr>
+        <w:tabs>
+          <w:tab w:pos="9071" w:val="right" w:leader="dot"/>
+        </w:tabs>
+        <w:spacing w:before="0" w:after="40"/>
+        <w:ind w:left="340"/>
+      </w:pPr>
+      <w:r>
+        <w:rPr>
+          <w:b w:val="0"/>
+          <w:sz w:val="20"/>
+        </w:rPr>
+        <w:t>1.6. PROPIEDADES, ASPECTO Y FORMA</w:t>
+      </w:r>
+      <w:r>
+        <w:rPr>
+          <w:b w:val="0"/>
+          <w:sz w:val="20"/>
+        </w:rPr>
+        <w:tab/>
+        <w:t>8</w:t>
+      </w:r>
+    </w:p>
+    <w:p>
+      <w:pPr>
+        <w:tabs>
+          <w:tab w:pos="9071" w:val="right" w:leader="dot"/>
+        </w:tabs>
+        <w:spacing w:before="160" w:after="40"/>
+        <w:ind w:left="0"/>
+      </w:pPr>
+      <w:r>
+        <w:rPr>
+          <w:b/>
+          <w:sz w:val="22"/>
+        </w:rPr>
+        <w:t>2. ETAPA DE INFORMACIÓN</w:t>
+      </w:r>
+      <w:r>
+        <w:rPr>
+          <w:b/>
+          <w:sz w:val="22"/>
+        </w:rPr>
+        <w:tab/>
+        <w:t>10</w:t>
+      </w:r>
+    </w:p>
+    <w:p>
+      <w:pPr>
+        <w:tabs>
+          <w:tab w:pos="9071" w:val="right" w:leader="dot"/>
+        </w:tabs>
+        <w:spacing w:before="0" w:after="40"/>
+        <w:ind w:left="340"/>
+      </w:pPr>
+      <w:r>
+        <w:rPr>
+          <w:b w:val="0"/>
+          <w:sz w:val="20"/>
+        </w:rPr>
+        <w:t>2.1. COSTES</w:t>
+      </w:r>
+      <w:r>
+        <w:rPr>
+          <w:b w:val="0"/>
+          <w:sz w:val="20"/>
+        </w:rPr>
+        <w:tab/>
+        <w:t>10</w:t>
+      </w:r>
+    </w:p>
+    <w:p>
+      <w:pPr>
+        <w:tabs>
+          <w:tab w:pos="9071" w:val="right" w:leader="dot"/>
+        </w:tabs>
+        <w:spacing w:before="0" w:after="40"/>
+        <w:ind w:left="340"/>
+      </w:pPr>
+      <w:r>
+        <w:rPr>
+          <w:b w:val="0"/>
+          <w:sz w:val="20"/>
+        </w:rPr>
+        <w:t>2.2. ESTUDIO DE MERCADO, PRODUCTOS SIMILARES Y SOLUCIONES</w:t>
+      </w:r>
+      <w:r>
+        <w:rPr>
+          <w:b w:val="0"/>
+          <w:sz w:val="20"/>
+        </w:rPr>
+        <w:tab/>
+        <w:t>10</w:t>
+      </w:r>
+    </w:p>
+    <w:p>
+      <w:pPr>
+        <w:tabs>
+          <w:tab w:pos="9071" w:val="right" w:leader="dot"/>
+        </w:tabs>
+        <w:spacing w:before="0" w:after="40"/>
+        <w:ind w:left="340"/>
+      </w:pPr>
+      <w:r>
+        <w:rPr>
+          <w:b w:val="0"/>
+          <w:sz w:val="20"/>
+        </w:rPr>
+        <w:t>2.3. EDP (DOCUMENTO DE ESPECIFICACIONES DE DISEÑO DEL PRODUCTO)</w:t>
+      </w:r>
+      <w:r>
+        <w:rPr>
+          <w:b w:val="0"/>
+          <w:sz w:val="20"/>
+        </w:rPr>
+        <w:tab/>
+        <w:t>12</w:t>
+      </w:r>
+    </w:p>
+    <w:p>
+      <w:pPr>
+        <w:tabs>
+          <w:tab w:pos="9071" w:val="right" w:leader="dot"/>
+        </w:tabs>
+        <w:spacing w:before="0" w:after="40"/>
+        <w:ind w:left="340"/>
+      </w:pPr>
+      <w:r>
+        <w:rPr>
+          <w:b w:val="0"/>
+          <w:sz w:val="20"/>
+        </w:rPr>
+        <w:t>2.4. TECNOLOGÍAS EXISTENTES</w:t>
+      </w:r>
+      <w:r>
+        <w:rPr>
+          <w:b w:val="0"/>
+          <w:sz w:val="20"/>
+        </w:rPr>
+        <w:tab/>
+        <w:t>13</w:t>
+      </w:r>
+    </w:p>
+    <w:p>
+      <w:pPr>
+        <w:tabs>
+          <w:tab w:pos="9071" w:val="right" w:leader="dot"/>
+        </w:tabs>
+        <w:spacing w:before="0" w:after="40"/>
+        <w:ind w:left="340"/>
+      </w:pPr>
+      <w:r>
+        <w:rPr>
+          <w:b w:val="0"/>
+          <w:sz w:val="20"/>
+        </w:rPr>
+        <w:t>2.5. ESTUDIO DE PATENTES</w:t>
+      </w:r>
+      <w:r>
+        <w:rPr>
+          <w:b w:val="0"/>
+          <w:sz w:val="20"/>
+        </w:rPr>
+        <w:tab/>
+        <w:t>13</w:t>
+      </w:r>
+    </w:p>
+    <w:p>
+      <w:pPr>
+        <w:tabs>
+          <w:tab w:pos="9071" w:val="right" w:leader="dot"/>
+        </w:tabs>
+        <w:spacing w:before="0" w:after="40"/>
+        <w:ind w:left="340"/>
+      </w:pPr>
+      <w:r>
+        <w:rPr>
+          <w:b w:val="0"/>
+          <w:sz w:val="20"/>
+        </w:rPr>
+        <w:t>2.6. LEGISLACIÓN A CUMPLIR</w:t>
+      </w:r>
+      <w:r>
+        <w:rPr>
+          <w:b w:val="0"/>
+          <w:sz w:val="20"/>
+        </w:rPr>
+        <w:tab/>
+        <w:t>20</w:t>
+      </w:r>
+    </w:p>
+    <w:p>
+      <w:pPr>
+        <w:tabs>
+          <w:tab w:pos="9071" w:val="right" w:leader="dot"/>
+        </w:tabs>
+        <w:spacing w:before="0" w:after="40"/>
+        <w:ind w:left="340"/>
+      </w:pPr>
+      <w:r>
+        <w:rPr>
+          <w:b w:val="0"/>
+          <w:sz w:val="20"/>
+        </w:rPr>
+        <w:t>2.7. NORMAS INTERESANTES DE OTROS PAÍSES</w:t>
+      </w:r>
+      <w:r>
+        <w:rPr>
+          <w:b w:val="0"/>
+          <w:sz w:val="20"/>
+        </w:rPr>
+        <w:tab/>
+        <w:t>21</w:t>
+      </w:r>
+    </w:p>
+    <w:p>
+      <w:pPr>
+        <w:tabs>
+          <w:tab w:pos="9071" w:val="right" w:leader="dot"/>
+        </w:tabs>
+        <w:spacing w:before="0" w:after="40"/>
+        <w:ind w:left="340"/>
+      </w:pPr>
+      <w:r>
+        <w:rPr>
+          <w:b w:val="0"/>
+          <w:sz w:val="20"/>
+        </w:rPr>
+        <w:t>2.8. AFECCIÓN AL ENTORNO</w:t>
+      </w:r>
+      <w:r>
+        <w:rPr>
+          <w:b w:val="0"/>
+          <w:sz w:val="20"/>
+        </w:rPr>
+        <w:tab/>
+        <w:t>21</w:t>
+      </w:r>
+    </w:p>
+    <w:p>
+      <w:pPr>
+        <w:tabs>
+          <w:tab w:pos="9071" w:val="right" w:leader="dot"/>
+        </w:tabs>
+        <w:spacing w:before="0" w:after="40"/>
+        <w:ind w:left="340"/>
+      </w:pPr>
+      <w:r>
+        <w:rPr>
+          <w:b w:val="0"/>
+          <w:sz w:val="20"/>
+        </w:rPr>
+        <w:t>2.9. ALMACENAJE</w:t>
+      </w:r>
+      <w:r>
+        <w:rPr>
+          <w:b w:val="0"/>
+          <w:sz w:val="20"/>
+        </w:rPr>
+        <w:tab/>
+        <w:t>22</w:t>
+      </w:r>
+    </w:p>
+    <w:p>
+      <w:pPr>
+        <w:tabs>
+          <w:tab w:pos="9071" w:val="right" w:leader="dot"/>
+        </w:tabs>
+        <w:spacing w:before="0" w:after="40"/>
+        <w:ind w:left="340"/>
+      </w:pPr>
+      <w:r>
+        <w:rPr>
+          <w:b w:val="0"/>
+          <w:sz w:val="20"/>
+        </w:rPr>
+        <w:t>2.10. EMBALAJE</w:t>
+      </w:r>
+      <w:r>
+        <w:rPr>
+          <w:b w:val="0"/>
+          <w:sz w:val="20"/>
+        </w:rPr>
+        <w:tab/>
+        <w:t>22</w:t>
+      </w:r>
+    </w:p>
+    <w:p>
+      <w:pPr>
+        <w:tabs>
+          <w:tab w:pos="9071" w:val="right" w:leader="dot"/>
+        </w:tabs>
+        <w:spacing w:before="0" w:after="40"/>
+        <w:ind w:left="340"/>
+      </w:pPr>
+      <w:r>
+        <w:rPr>
+          <w:b w:val="0"/>
+          <w:sz w:val="20"/>
+        </w:rPr>
+        <w:t>2.11. MONTAJE</w:t>
+      </w:r>
+      <w:r>
+        <w:rPr>
+          <w:b w:val="0"/>
+          <w:sz w:val="20"/>
+        </w:rPr>
+        <w:tab/>
+        <w:t>23</w:t>
+      </w:r>
+    </w:p>
+    <w:p>
+      <w:pPr>
+        <w:tabs>
+          <w:tab w:pos="9071" w:val="right" w:leader="dot"/>
+        </w:tabs>
+        <w:spacing w:before="160" w:after="40"/>
+        <w:ind w:left="0"/>
+      </w:pPr>
+      <w:r>
+        <w:rPr>
+          <w:b/>
+          <w:sz w:val="22"/>
+        </w:rPr>
+        <w:t>3. ETAPA TÉCNICO-CREATIVA</w:t>
+      </w:r>
+      <w:r>
+        <w:rPr>
+          <w:b/>
+          <w:sz w:val="22"/>
+        </w:rPr>
+        <w:tab/>
+        <w:t>24</w:t>
+      </w:r>
+    </w:p>
+    <w:p>
+      <w:pPr>
+        <w:tabs>
+          <w:tab w:pos="9071" w:val="right" w:leader="dot"/>
+        </w:tabs>
+        <w:spacing w:before="0" w:after="40"/>
+        <w:ind w:left="340"/>
+      </w:pPr>
+      <w:r>
+        <w:rPr>
+          <w:b w:val="0"/>
+          <w:sz w:val="20"/>
+        </w:rPr>
+        <w:t>3.1. MAPA MENTAL</w:t>
+      </w:r>
+      <w:r>
+        <w:rPr>
+          <w:b w:val="0"/>
+          <w:sz w:val="20"/>
+        </w:rPr>
+        <w:tab/>
+        <w:t>24</w:t>
+      </w:r>
+    </w:p>
+    <w:p>
+      <w:pPr>
+        <w:tabs>
+          <w:tab w:pos="9071" w:val="right" w:leader="dot"/>
+        </w:tabs>
+        <w:spacing w:before="0" w:after="40"/>
+        <w:ind w:left="340"/>
+      </w:pPr>
+      <w:r>
+        <w:rPr>
+          <w:b w:val="0"/>
+          <w:sz w:val="20"/>
+        </w:rPr>
+        <w:t>3.2. MÉTODO TRIZ</w:t>
+      </w:r>
+      <w:r>
+        <w:rPr>
+          <w:b w:val="0"/>
+          <w:sz w:val="20"/>
+        </w:rPr>
+        <w:tab/>
+        <w:t>24</w:t>
+      </w:r>
+    </w:p>
+    <w:p>
+      <w:pPr>
+        <w:tabs>
+          <w:tab w:pos="9071" w:val="right" w:leader="dot"/>
+        </w:tabs>
+        <w:spacing w:before="0" w:after="40"/>
+        <w:ind w:left="340"/>
+      </w:pPr>
+      <w:r>
+        <w:rPr>
+          <w:b w:val="0"/>
+          <w:sz w:val="20"/>
+        </w:rPr>
+        <w:t>3.3. BOCETO INICIAL</w:t>
+      </w:r>
+      <w:r>
+        <w:rPr>
+          <w:b w:val="0"/>
+          <w:sz w:val="20"/>
+        </w:rPr>
+        <w:tab/>
+        <w:t>27</w:t>
+      </w:r>
+    </w:p>
+    <w:p>
+      <w:pPr>
+        <w:tabs>
+          <w:tab w:pos="9071" w:val="right" w:leader="dot"/>
+        </w:tabs>
+        <w:spacing w:before="0" w:after="40"/>
+        <w:ind w:left="340"/>
+      </w:pPr>
+      <w:r>
+        <w:rPr>
+          <w:b w:val="0"/>
+          <w:sz w:val="20"/>
+        </w:rPr>
+        <w:t>3.4. DISEÑO EN SOLID DEL PRODUCTO FINAL</w:t>
+      </w:r>
+      <w:r>
+        <w:rPr>
+          <w:b w:val="0"/>
+          <w:sz w:val="20"/>
+        </w:rPr>
+        <w:tab/>
+        <w:t>27</w:t>
+      </w:r>
+    </w:p>
+    <w:p>
+      <w:pPr>
+        <w:tabs>
+          <w:tab w:pos="9071" w:val="right" w:leader="dot"/>
+        </w:tabs>
+        <w:spacing w:before="160" w:after="40"/>
+        <w:ind w:left="0"/>
+      </w:pPr>
+      <w:r>
+        <w:rPr>
+          <w:b/>
+          <w:sz w:val="22"/>
+        </w:rPr>
+        <w:t>4. ETAPA DE EVALUACIÓN</w:t>
+      </w:r>
+      <w:r>
+        <w:rPr>
+          <w:b/>
+          <w:sz w:val="22"/>
+        </w:rPr>
+        <w:tab/>
+        <w:t>32</w:t>
+      </w:r>
+    </w:p>
+    <w:p>
+      <w:pPr>
+        <w:tabs>
+          <w:tab w:pos="9071" w:val="right" w:leader="dot"/>
+        </w:tabs>
+        <w:spacing w:before="0" w:after="40"/>
+        <w:ind w:left="340"/>
+      </w:pPr>
+      <w:r>
+        <w:rPr>
+          <w:b w:val="0"/>
+          <w:sz w:val="20"/>
+        </w:rPr>
+        <w:t>4.1. METODOLOGÍA Y DATOS DEL ANÁLISIS</w:t>
+      </w:r>
+      <w:r>
+        <w:rPr>
+          <w:b w:val="0"/>
+          <w:sz w:val="20"/>
+        </w:rPr>
+        <w:tab/>
+        <w:t>32</w:t>
+      </w:r>
+    </w:p>
+    <w:p>
+      <w:pPr>
+        <w:tabs>
+          <w:tab w:pos="9071" w:val="right" w:leader="dot"/>
+        </w:tabs>
+        <w:spacing w:before="0" w:after="40"/>
+        <w:ind w:left="340"/>
+      </w:pPr>
+      <w:r>
+        <w:rPr>
+          <w:b w:val="0"/>
+          <w:sz w:val="20"/>
+        </w:rPr>
+        <w:t>4.2. ALTERNATIVA 1: ACERO</w:t>
+      </w:r>
+      <w:r>
+        <w:rPr>
+          <w:b w:val="0"/>
+          <w:sz w:val="20"/>
+        </w:rPr>
+        <w:tab/>
+        <w:t>33</w:t>
+      </w:r>
+    </w:p>
+    <w:p>
+      <w:pPr>
+        <w:tabs>
+          <w:tab w:pos="9071" w:val="right" w:leader="dot"/>
+        </w:tabs>
+        <w:spacing w:before="0" w:after="40"/>
+        <w:ind w:left="340"/>
+      </w:pPr>
+      <w:r>
+        <w:rPr>
+          <w:b w:val="0"/>
+          <w:sz w:val="20"/>
+        </w:rPr>
+        <w:t>4.3. ALTERNATIVA 2: ALUMINIO Y POLIPROPILENO</w:t>
+      </w:r>
+      <w:r>
+        <w:rPr>
+          <w:b w:val="0"/>
+          <w:sz w:val="20"/>
+        </w:rPr>
+        <w:tab/>
+        <w:t>33</w:t>
+      </w:r>
+    </w:p>
+    <w:p>
+      <w:pPr>
+        <w:tabs>
+          <w:tab w:pos="9071" w:val="right" w:leader="dot"/>
+        </w:tabs>
+        <w:spacing w:before="0" w:after="40"/>
+        <w:ind w:left="340"/>
+      </w:pPr>
+      <w:r>
+        <w:rPr>
+          <w:b w:val="0"/>
+          <w:sz w:val="20"/>
+        </w:rPr>
+        <w:t>4.4. ALTERNATIVA 3: MADERA</w:t>
+      </w:r>
+      <w:r>
+        <w:rPr>
+          <w:b w:val="0"/>
+          <w:sz w:val="20"/>
+        </w:rPr>
+        <w:tab/>
+        <w:t>33</w:t>
+      </w:r>
+    </w:p>
+    <w:p>
+      <w:pPr>
+        <w:tabs>
+          <w:tab w:pos="9071" w:val="right" w:leader="dot"/>
+        </w:tabs>
+        <w:spacing w:before="0" w:after="40"/>
+        <w:ind w:left="340"/>
+      </w:pPr>
+      <w:r>
+        <w:rPr>
+          <w:b w:val="0"/>
+          <w:sz w:val="20"/>
+        </w:rPr>
+        <w:t>4.5. COMPARATIVA Y CONCLUSIONES</w:t>
+      </w:r>
+      <w:r>
+        <w:rPr>
+          <w:b w:val="0"/>
+          <w:sz w:val="20"/>
+        </w:rPr>
+        <w:tab/>
+        <w:t>34</w:t>
+      </w:r>
+    </w:p>
+    <w:p>
+      <w:pPr>
+        <w:tabs>
+          <w:tab w:pos="9071" w:val="right" w:leader="dot"/>
+        </w:tabs>
+        <w:spacing w:before="160" w:after="40"/>
+        <w:ind w:left="0"/>
+      </w:pPr>
+      <w:r>
+        <w:rPr>
+          <w:b/>
+          <w:sz w:val="22"/>
+        </w:rPr>
+        <w:t>5. ETAPA DE REDISEÑO</w:t>
+      </w:r>
+      <w:r>
+        <w:rPr>
+          <w:b/>
+          <w:sz w:val="22"/>
+        </w:rPr>
+        <w:tab/>
+        <w:t>36</w:t>
+      </w:r>
+    </w:p>
+    <w:p>
+      <w:pPr>
+        <w:tabs>
+          <w:tab w:pos="9071" w:val="right" w:leader="dot"/>
+        </w:tabs>
+        <w:spacing w:before="0" w:after="40"/>
+        <w:ind w:left="340"/>
+      </w:pPr>
+      <w:r>
+        <w:rPr>
+          <w:b w:val="0"/>
+          <w:sz w:val="20"/>
+        </w:rPr>
+        <w:t>5.1. DESPLIEGUE DE LA FUNCIÓN CALIDAD (QFD)</w:t>
+      </w:r>
+      <w:r>
+        <w:rPr>
+          <w:b w:val="0"/>
+          <w:sz w:val="20"/>
+        </w:rPr>
+        <w:tab/>
+        <w:t>36</w:t>
+      </w:r>
+    </w:p>
+    <w:p>
+      <w:pPr>
+        <w:tabs>
+          <w:tab w:pos="9071" w:val="right" w:leader="dot"/>
+        </w:tabs>
+        <w:spacing w:before="0" w:after="40"/>
+        <w:ind w:left="340"/>
+      </w:pPr>
+      <w:r>
+        <w:rPr>
+          <w:b w:val="0"/>
+          <w:sz w:val="20"/>
+        </w:rPr>
+        <w:t>5.2. ANÁLISIS MODAL DE FALLOS, EFECTOS Y CRITICIDAD (AMFEC)</w:t>
+      </w:r>
+      <w:r>
+        <w:rPr>
+          <w:b w:val="0"/>
+          <w:sz w:val="20"/>
+        </w:rPr>
+        <w:tab/>
+        <w:t>37</w:t>
+      </w:r>
+    </w:p>
+    <w:p>
+      <w:pPr>
+        <w:tabs>
+          <w:tab w:pos="9071" w:val="right" w:leader="dot"/>
+        </w:tabs>
+        <w:spacing w:before="0" w:after="40"/>
+        <w:ind w:left="340"/>
+      </w:pPr>
+      <w:r>
+        <w:rPr>
+          <w:b w:val="0"/>
+          <w:sz w:val="20"/>
+        </w:rPr>
+        <w:t>5.3. ANÁLISIS DEL VALOR</w:t>
+      </w:r>
+      <w:r>
+        <w:rPr>
+          <w:b w:val="0"/>
+          <w:sz w:val="20"/>
+        </w:rPr>
+        <w:tab/>
+        <w:t>38</w:t>
+      </w:r>
+    </w:p>
+    <w:p>
+      <w:pPr>
+        <w:tabs>
+          <w:tab w:pos="9071" w:val="right" w:leader="dot"/>
+        </w:tabs>
+        <w:spacing w:before="160" w:after="40"/>
+        <w:ind w:left="0"/>
+      </w:pPr>
+      <w:r>
+        <w:rPr>
+          <w:b/>
+          <w:sz w:val="22"/>
+        </w:rPr>
+        <w:t>6. ANEXOS</w:t>
+      </w:r>
+      <w:r>
+        <w:rPr>
+          <w:b/>
+          <w:sz w:val="22"/>
+        </w:rPr>
+        <w:tab/>
+        <w:t>40</w:t>
+      </w:r>
+    </w:p>
+    <w:p>
+      <w:pPr>
+        <w:tabs>
+          <w:tab w:pos="9071" w:val="right" w:leader="dot"/>
+        </w:tabs>
+        <w:spacing w:before="0" w:after="40"/>
+        <w:ind w:left="340"/>
+      </w:pPr>
+      <w:r>
+        <w:rPr>
+          <w:b w:val="0"/>
+          <w:sz w:val="20"/>
+        </w:rPr>
+        <w:t>6.1. PLANOS</w:t>
+      </w:r>
+      <w:r>
+        <w:rPr>
+          <w:b w:val="0"/>
+          <w:sz w:val="20"/>
+        </w:rPr>
+        <w:tab/>
+        <w:t>40</w:t>
+      </w:r>
+    </w:p>
+    <w:p>
+      <w:pPr>
+        <w:tabs>
+          <w:tab w:pos="9071" w:val="right" w:leader="dot"/>
+        </w:tabs>
+        <w:spacing w:before="0" w:after="40"/>
+        <w:ind w:left="340"/>
+      </w:pPr>
+      <w:r>
+        <w:rPr>
+          <w:b w:val="0"/>
+          <w:sz w:val="20"/>
+        </w:rPr>
+        <w:t>Bibliografía</w:t>
+      </w:r>
+      <w:r>
+        <w:rPr>
+          <w:b w:val="0"/>
+          <w:sz w:val="20"/>
+        </w:rPr>
+        <w:tab/>
+        <w:t>43</w:t>
+      </w:r>
+      <w:r>
+        <w:fldChar w:fldCharType="end"/>
+      </w:r>
     </w:p>
     <w:p>
       <w:r>
@@ -839,15 +2047,15 @@
         <w:tblLayout w:type="fixed"/>
       </w:tblPr>
       <w:tblGrid>
-        <w:gridCol w:w="850"/>
-        <w:gridCol w:w="1700"/>
-        <w:gridCol w:w="5669"/>
-        <w:gridCol w:w="850"/>
+        <w:gridCol w:w="963"/>
+        <w:gridCol w:w="1474"/>
+        <w:gridCol w:w="5953"/>
+        <w:gridCol w:w="680"/>
       </w:tblGrid>
       <w:tr>
         <w:tc>
           <w:tcPr>
-            <w:tcW w:type="dxa" w:w="850"/>
+            <w:tcW w:type="dxa" w:w="963"/>
             <w:shd w:val="clear" w:color="auto" w:fill="C0392B"/>
           </w:tcPr>
           <w:p>
@@ -864,7 +2072,7 @@
         </w:tc>
         <w:tc>
           <w:tcPr>
-            <w:tcW w:type="dxa" w:w="1701"/>
+            <w:tcW w:type="dxa" w:w="1474"/>
             <w:shd w:val="clear" w:color="auto" w:fill="C0392B"/>
           </w:tcPr>
           <w:p>
@@ -881,7 +2089,7 @@
         </w:tc>
         <w:tc>
           <w:tcPr>
-            <w:tcW w:type="dxa" w:w="5669"/>
+            <w:tcW w:type="dxa" w:w="5953"/>
             <w:shd w:val="clear" w:color="auto" w:fill="C0392B"/>
           </w:tcPr>
           <w:p>
@@ -898,7 +2106,7 @@
         </w:tc>
         <w:tc>
           <w:tcPr>
-            <w:tcW w:type="dxa" w:w="850"/>
+            <w:tcW w:type="dxa" w:w="680"/>
             <w:shd w:val="clear" w:color="auto" w:fill="C0392B"/>
           </w:tcPr>
           <w:p>
@@ -917,7 +2125,7 @@
       <w:tr>
         <w:tc>
           <w:tcPr>
-            <w:tcW w:type="dxa" w:w="850"/>
+            <w:tcW w:type="dxa" w:w="963"/>
           </w:tcPr>
           <w:p>
             <w:r/>
@@ -931,7 +2139,7 @@
         </w:tc>
         <w:tc>
           <w:tcPr>
-            <w:tcW w:type="dxa" w:w="1701"/>
+            <w:tcW w:type="dxa" w:w="1474"/>
           </w:tcPr>
           <w:p>
             <w:r/>
@@ -945,7 +2153,7 @@
         </w:tc>
         <w:tc>
           <w:tcPr>
-            <w:tcW w:type="dxa" w:w="5669"/>
+            <w:tcW w:type="dxa" w:w="5953"/>
           </w:tcPr>
           <w:p>
             <w:r/>
@@ -959,7 +2167,7 @@
         </w:tc>
         <w:tc>
           <w:tcPr>
-            <w:tcW w:type="dxa" w:w="850"/>
+            <w:tcW w:type="dxa" w:w="680"/>
           </w:tcPr>
           <w:p>
             <w:r/>
@@ -975,7 +2183,7 @@
       <w:tr>
         <w:tc>
           <w:tcPr>
-            <w:tcW w:type="dxa" w:w="850"/>
+            <w:tcW w:type="dxa" w:w="963"/>
           </w:tcPr>
           <w:p>
             <w:r/>
@@ -989,7 +2197,7 @@
         </w:tc>
         <w:tc>
           <w:tcPr>
-            <w:tcW w:type="dxa" w:w="1701"/>
+            <w:tcW w:type="dxa" w:w="1474"/>
           </w:tcPr>
           <w:p>
             <w:r/>
@@ -1003,7 +2211,7 @@
         </w:tc>
         <w:tc>
           <w:tcPr>
-            <w:tcW w:type="dxa" w:w="5669"/>
+            <w:tcW w:type="dxa" w:w="5953"/>
           </w:tcPr>
           <w:p>
             <w:r/>
@@ -1017,7 +2225,7 @@
         </w:tc>
         <w:tc>
           <w:tcPr>
-            <w:tcW w:type="dxa" w:w="850"/>
+            <w:tcW w:type="dxa" w:w="680"/>
           </w:tcPr>
           <w:p>
             <w:r/>
@@ -1033,7 +2241,7 @@
       <w:tr>
         <w:tc>
           <w:tcPr>
-            <w:tcW w:type="dxa" w:w="850"/>
+            <w:tcW w:type="dxa" w:w="963"/>
           </w:tcPr>
           <w:p>
             <w:r/>
@@ -1047,7 +2255,7 @@
         </w:tc>
         <w:tc>
           <w:tcPr>
-            <w:tcW w:type="dxa" w:w="1701"/>
+            <w:tcW w:type="dxa" w:w="1474"/>
           </w:tcPr>
           <w:p>
             <w:r/>
@@ -1061,7 +2269,7 @@
         </w:tc>
         <w:tc>
           <w:tcPr>
-            <w:tcW w:type="dxa" w:w="5669"/>
+            <w:tcW w:type="dxa" w:w="5953"/>
           </w:tcPr>
           <w:p>
             <w:r/>
@@ -1075,7 +2283,7 @@
         </w:tc>
         <w:tc>
           <w:tcPr>
-            <w:tcW w:type="dxa" w:w="850"/>
+            <w:tcW w:type="dxa" w:w="680"/>
           </w:tcPr>
           <w:p>
             <w:r/>
@@ -1091,7 +2299,7 @@
       <w:tr>
         <w:tc>
           <w:tcPr>
-            <w:tcW w:type="dxa" w:w="850"/>
+            <w:tcW w:type="dxa" w:w="963"/>
           </w:tcPr>
           <w:p>
             <w:r/>
@@ -1105,7 +2313,7 @@
         </w:tc>
         <w:tc>
           <w:tcPr>
-            <w:tcW w:type="dxa" w:w="1701"/>
+            <w:tcW w:type="dxa" w:w="1474"/>
           </w:tcPr>
           <w:p>
             <w:r/>
@@ -1119,7 +2327,7 @@
         </w:tc>
         <w:tc>
           <w:tcPr>
-            <w:tcW w:type="dxa" w:w="5669"/>
+            <w:tcW w:type="dxa" w:w="5953"/>
           </w:tcPr>
           <w:p>
             <w:r/>
@@ -1133,7 +2341,7 @@
         </w:tc>
         <w:tc>
           <w:tcPr>
-            <w:tcW w:type="dxa" w:w="850"/>
+            <w:tcW w:type="dxa" w:w="680"/>
           </w:tcPr>
           <w:p>
             <w:r/>
@@ -1149,7 +2357,7 @@
       <w:tr>
         <w:tc>
           <w:tcPr>
-            <w:tcW w:type="dxa" w:w="850"/>
+            <w:tcW w:type="dxa" w:w="963"/>
           </w:tcPr>
           <w:p>
             <w:r/>
@@ -1163,7 +2371,7 @@
         </w:tc>
         <w:tc>
           <w:tcPr>
-            <w:tcW w:type="dxa" w:w="1701"/>
+            <w:tcW w:type="dxa" w:w="1474"/>
           </w:tcPr>
           <w:p>
             <w:r/>
@@ -1177,7 +2385,7 @@
         </w:tc>
         <w:tc>
           <w:tcPr>
-            <w:tcW w:type="dxa" w:w="5669"/>
+            <w:tcW w:type="dxa" w:w="5953"/>
           </w:tcPr>
           <w:p>
             <w:r/>
@@ -1191,7 +2399,7 @@
         </w:tc>
         <w:tc>
           <w:tcPr>
-            <w:tcW w:type="dxa" w:w="850"/>
+            <w:tcW w:type="dxa" w:w="680"/>
           </w:tcPr>
           <w:p>
             <w:r/>
@@ -1207,7 +2415,7 @@
       <w:tr>
         <w:tc>
           <w:tcPr>
-            <w:tcW w:type="dxa" w:w="850"/>
+            <w:tcW w:type="dxa" w:w="963"/>
           </w:tcPr>
           <w:p>
             <w:r/>
@@ -1221,7 +2429,7 @@
         </w:tc>
         <w:tc>
           <w:tcPr>
-            <w:tcW w:type="dxa" w:w="1701"/>
+            <w:tcW w:type="dxa" w:w="1474"/>
           </w:tcPr>
           <w:p>
             <w:r/>
@@ -1235,7 +2443,7 @@
         </w:tc>
         <w:tc>
           <w:tcPr>
-            <w:tcW w:type="dxa" w:w="5669"/>
+            <w:tcW w:type="dxa" w:w="5953"/>
           </w:tcPr>
           <w:p>
             <w:r/>
@@ -1249,7 +2457,7 @@
         </w:tc>
         <w:tc>
           <w:tcPr>
-            <w:tcW w:type="dxa" w:w="850"/>
+            <w:tcW w:type="dxa" w:w="680"/>
           </w:tcPr>
           <w:p>
             <w:r/>
@@ -1265,7 +2473,7 @@
       <w:tr>
         <w:tc>
           <w:tcPr>
-            <w:tcW w:type="dxa" w:w="850"/>
+            <w:tcW w:type="dxa" w:w="963"/>
           </w:tcPr>
           <w:p>
             <w:r/>
@@ -1279,7 +2487,7 @@
         </w:tc>
         <w:tc>
           <w:tcPr>
-            <w:tcW w:type="dxa" w:w="1701"/>
+            <w:tcW w:type="dxa" w:w="1474"/>
           </w:tcPr>
           <w:p>
             <w:r/>
@@ -1293,7 +2501,7 @@
         </w:tc>
         <w:tc>
           <w:tcPr>
-            <w:tcW w:type="dxa" w:w="5669"/>
+            <w:tcW w:type="dxa" w:w="5953"/>
           </w:tcPr>
           <w:p>
             <w:r/>
@@ -1307,7 +2515,7 @@
         </w:tc>
         <w:tc>
           <w:tcPr>
-            <w:tcW w:type="dxa" w:w="850"/>
+            <w:tcW w:type="dxa" w:w="680"/>
           </w:tcPr>
           <w:p>
             <w:r/>
@@ -1323,7 +2531,7 @@
       <w:tr>
         <w:tc>
           <w:tcPr>
-            <w:tcW w:type="dxa" w:w="850"/>
+            <w:tcW w:type="dxa" w:w="963"/>
           </w:tcPr>
           <w:p>
             <w:r/>
@@ -1337,7 +2545,7 @@
         </w:tc>
         <w:tc>
           <w:tcPr>
-            <w:tcW w:type="dxa" w:w="1701"/>
+            <w:tcW w:type="dxa" w:w="1474"/>
           </w:tcPr>
           <w:p>
             <w:r/>
@@ -1351,7 +2559,7 @@
         </w:tc>
         <w:tc>
           <w:tcPr>
-            <w:tcW w:type="dxa" w:w="5669"/>
+            <w:tcW w:type="dxa" w:w="5953"/>
           </w:tcPr>
           <w:p>
             <w:r/>
@@ -1365,7 +2573,7 @@
         </w:tc>
         <w:tc>
           <w:tcPr>
-            <w:tcW w:type="dxa" w:w="850"/>
+            <w:tcW w:type="dxa" w:w="680"/>
           </w:tcPr>
           <w:p>
             <w:r/>
@@ -1381,7 +2589,7 @@
       <w:tr>
         <w:tc>
           <w:tcPr>
-            <w:tcW w:type="dxa" w:w="850"/>
+            <w:tcW w:type="dxa" w:w="963"/>
           </w:tcPr>
           <w:p>
             <w:r/>
@@ -1395,7 +2603,7 @@
         </w:tc>
         <w:tc>
           <w:tcPr>
-            <w:tcW w:type="dxa" w:w="1701"/>
+            <w:tcW w:type="dxa" w:w="1474"/>
           </w:tcPr>
           <w:p>
             <w:r/>
@@ -1409,7 +2617,7 @@
         </w:tc>
         <w:tc>
           <w:tcPr>
-            <w:tcW w:type="dxa" w:w="5669"/>
+            <w:tcW w:type="dxa" w:w="5953"/>
           </w:tcPr>
           <w:p>
             <w:r/>
@@ -1423,7 +2631,7 @@
         </w:tc>
         <w:tc>
           <w:tcPr>
-            <w:tcW w:type="dxa" w:w="850"/>
+            <w:tcW w:type="dxa" w:w="680"/>
           </w:tcPr>
           <w:p>
             <w:r/>
@@ -1439,7 +2647,7 @@
       <w:tr>
         <w:tc>
           <w:tcPr>
-            <w:tcW w:type="dxa" w:w="850"/>
+            <w:tcW w:type="dxa" w:w="963"/>
           </w:tcPr>
           <w:p>
             <w:r/>
@@ -1453,7 +2661,7 @@
         </w:tc>
         <w:tc>
           <w:tcPr>
-            <w:tcW w:type="dxa" w:w="1701"/>
+            <w:tcW w:type="dxa" w:w="1474"/>
           </w:tcPr>
           <w:p>
             <w:r/>
@@ -1467,7 +2675,7 @@
         </w:tc>
         <w:tc>
           <w:tcPr>
-            <w:tcW w:type="dxa" w:w="5669"/>
+            <w:tcW w:type="dxa" w:w="5953"/>
           </w:tcPr>
           <w:p>
             <w:r/>
@@ -1481,7 +2689,7 @@
         </w:tc>
         <w:tc>
           <w:tcPr>
-            <w:tcW w:type="dxa" w:w="850"/>
+            <w:tcW w:type="dxa" w:w="680"/>
           </w:tcPr>
           <w:p>
             <w:r/>
@@ -1497,7 +2705,7 @@
       <w:tr>
         <w:tc>
           <w:tcPr>
-            <w:tcW w:type="dxa" w:w="850"/>
+            <w:tcW w:type="dxa" w:w="963"/>
           </w:tcPr>
           <w:p>
             <w:r/>
@@ -1511,7 +2719,7 @@
         </w:tc>
         <w:tc>
           <w:tcPr>
-            <w:tcW w:type="dxa" w:w="1701"/>
+            <w:tcW w:type="dxa" w:w="1474"/>
           </w:tcPr>
           <w:p>
             <w:r/>
@@ -1525,7 +2733,7 @@
         </w:tc>
         <w:tc>
           <w:tcPr>
-            <w:tcW w:type="dxa" w:w="5669"/>
+            <w:tcW w:type="dxa" w:w="5953"/>
           </w:tcPr>
           <w:p>
             <w:r/>
@@ -1539,7 +2747,7 @@
         </w:tc>
         <w:tc>
           <w:tcPr>
-            <w:tcW w:type="dxa" w:w="850"/>
+            <w:tcW w:type="dxa" w:w="680"/>
           </w:tcPr>
           <w:p>
             <w:r/>
@@ -1555,7 +2763,7 @@
       <w:tr>
         <w:tc>
           <w:tcPr>
-            <w:tcW w:type="dxa" w:w="850"/>
+            <w:tcW w:type="dxa" w:w="963"/>
           </w:tcPr>
           <w:p>
             <w:r/>
@@ -1569,7 +2777,7 @@
         </w:tc>
         <w:tc>
           <w:tcPr>
-            <w:tcW w:type="dxa" w:w="1701"/>
+            <w:tcW w:type="dxa" w:w="1474"/>
           </w:tcPr>
           <w:p>
             <w:r/>
@@ -1583,7 +2791,7 @@
         </w:tc>
         <w:tc>
           <w:tcPr>
-            <w:tcW w:type="dxa" w:w="5669"/>
+            <w:tcW w:type="dxa" w:w="5953"/>
           </w:tcPr>
           <w:p>
             <w:r/>
@@ -1597,7 +2805,7 @@
         </w:tc>
         <w:tc>
           <w:tcPr>
-            <w:tcW w:type="dxa" w:w="850"/>
+            <w:tcW w:type="dxa" w:w="680"/>
           </w:tcPr>
           <w:p>
             <w:r/>
@@ -1613,7 +2821,7 @@
       <w:tr>
         <w:tc>
           <w:tcPr>
-            <w:tcW w:type="dxa" w:w="850"/>
+            <w:tcW w:type="dxa" w:w="963"/>
           </w:tcPr>
           <w:p>
             <w:r/>
@@ -1627,7 +2835,7 @@
         </w:tc>
         <w:tc>
           <w:tcPr>
-            <w:tcW w:type="dxa" w:w="1701"/>
+            <w:tcW w:type="dxa" w:w="1474"/>
           </w:tcPr>
           <w:p>
             <w:r/>
@@ -1641,7 +2849,7 @@
         </w:tc>
         <w:tc>
           <w:tcPr>
-            <w:tcW w:type="dxa" w:w="5669"/>
+            <w:tcW w:type="dxa" w:w="5953"/>
           </w:tcPr>
           <w:p>
             <w:r/>
@@ -1655,7 +2863,7 @@
         </w:tc>
         <w:tc>
           <w:tcPr>
-            <w:tcW w:type="dxa" w:w="850"/>
+            <w:tcW w:type="dxa" w:w="680"/>
           </w:tcPr>
           <w:p>
             <w:r/>
@@ -1671,7 +2879,7 @@
       <w:tr>
         <w:tc>
           <w:tcPr>
-            <w:tcW w:type="dxa" w:w="850"/>
+            <w:tcW w:type="dxa" w:w="963"/>
           </w:tcPr>
           <w:p>
             <w:r/>
@@ -1685,7 +2893,7 @@
         </w:tc>
         <w:tc>
           <w:tcPr>
-            <w:tcW w:type="dxa" w:w="1701"/>
+            <w:tcW w:type="dxa" w:w="1474"/>
           </w:tcPr>
           <w:p>
             <w:r/>
@@ -1699,7 +2907,7 @@
         </w:tc>
         <w:tc>
           <w:tcPr>
-            <w:tcW w:type="dxa" w:w="5669"/>
+            <w:tcW w:type="dxa" w:w="5953"/>
           </w:tcPr>
           <w:p>
             <w:r/>
@@ -1713,7 +2921,7 @@
         </w:tc>
         <w:tc>
           <w:tcPr>
-            <w:tcW w:type="dxa" w:w="850"/>
+            <w:tcW w:type="dxa" w:w="680"/>
           </w:tcPr>
           <w:p>
             <w:r/>
@@ -1729,7 +2937,7 @@
       <w:tr>
         <w:tc>
           <w:tcPr>
-            <w:tcW w:type="dxa" w:w="850"/>
+            <w:tcW w:type="dxa" w:w="963"/>
           </w:tcPr>
           <w:p>
             <w:r/>
@@ -1743,7 +2951,7 @@
         </w:tc>
         <w:tc>
           <w:tcPr>
-            <w:tcW w:type="dxa" w:w="1701"/>
+            <w:tcW w:type="dxa" w:w="1474"/>
           </w:tcPr>
           <w:p>
             <w:r/>
@@ -1757,7 +2965,7 @@
         </w:tc>
         <w:tc>
           <w:tcPr>
-            <w:tcW w:type="dxa" w:w="5669"/>
+            <w:tcW w:type="dxa" w:w="5953"/>
           </w:tcPr>
           <w:p>
             <w:r/>
@@ -1771,7 +2979,7 @@
         </w:tc>
         <w:tc>
           <w:tcPr>
-            <w:tcW w:type="dxa" w:w="850"/>
+            <w:tcW w:type="dxa" w:w="680"/>
           </w:tcPr>
           <w:p>
             <w:r/>
@@ -1787,7 +2995,7 @@
       <w:tr>
         <w:tc>
           <w:tcPr>
-            <w:tcW w:type="dxa" w:w="850"/>
+            <w:tcW w:type="dxa" w:w="963"/>
           </w:tcPr>
           <w:p>
             <w:r/>
@@ -1801,7 +3009,7 @@
         </w:tc>
         <w:tc>
           <w:tcPr>
-            <w:tcW w:type="dxa" w:w="1701"/>
+            <w:tcW w:type="dxa" w:w="1474"/>
           </w:tcPr>
           <w:p>
             <w:r/>
@@ -1815,7 +3023,7 @@
         </w:tc>
         <w:tc>
           <w:tcPr>
-            <w:tcW w:type="dxa" w:w="5669"/>
+            <w:tcW w:type="dxa" w:w="5953"/>
           </w:tcPr>
           <w:p>
             <w:r/>
@@ -1829,7 +3037,7 @@
         </w:tc>
         <w:tc>
           <w:tcPr>
-            <w:tcW w:type="dxa" w:w="850"/>
+            <w:tcW w:type="dxa" w:w="680"/>
           </w:tcPr>
           <w:p>
             <w:r/>
@@ -1845,7 +3053,7 @@
       <w:tr>
         <w:tc>
           <w:tcPr>
-            <w:tcW w:type="dxa" w:w="850"/>
+            <w:tcW w:type="dxa" w:w="963"/>
           </w:tcPr>
           <w:p>
             <w:r/>
@@ -1859,7 +3067,7 @@
         </w:tc>
         <w:tc>
           <w:tcPr>
-            <w:tcW w:type="dxa" w:w="1701"/>
+            <w:tcW w:type="dxa" w:w="1474"/>
           </w:tcPr>
           <w:p>
             <w:r/>
@@ -1873,7 +3081,7 @@
         </w:tc>
         <w:tc>
           <w:tcPr>
-            <w:tcW w:type="dxa" w:w="5669"/>
+            <w:tcW w:type="dxa" w:w="5953"/>
           </w:tcPr>
           <w:p>
             <w:r/>
@@ -1887,7 +3095,7 @@
         </w:tc>
         <w:tc>
           <w:tcPr>
-            <w:tcW w:type="dxa" w:w="850"/>
+            <w:tcW w:type="dxa" w:w="680"/>
           </w:tcPr>
           <w:p>
             <w:r/>
@@ -1903,7 +3111,7 @@
       <w:tr>
         <w:tc>
           <w:tcPr>
-            <w:tcW w:type="dxa" w:w="850"/>
+            <w:tcW w:type="dxa" w:w="963"/>
           </w:tcPr>
           <w:p>
             <w:r/>
@@ -1917,7 +3125,7 @@
         </w:tc>
         <w:tc>
           <w:tcPr>
-            <w:tcW w:type="dxa" w:w="1701"/>
+            <w:tcW w:type="dxa" w:w="1474"/>
           </w:tcPr>
           <w:p>
             <w:r/>
@@ -1931,7 +3139,7 @@
         </w:tc>
         <w:tc>
           <w:tcPr>
-            <w:tcW w:type="dxa" w:w="5669"/>
+            <w:tcW w:type="dxa" w:w="5953"/>
           </w:tcPr>
           <w:p>
             <w:r/>
@@ -1945,7 +3153,7 @@
         </w:tc>
         <w:tc>
           <w:tcPr>
-            <w:tcW w:type="dxa" w:w="850"/>
+            <w:tcW w:type="dxa" w:w="680"/>
           </w:tcPr>
           <w:p>
             <w:r/>
@@ -1961,7 +3169,7 @@
       <w:tr>
         <w:tc>
           <w:tcPr>
-            <w:tcW w:type="dxa" w:w="850"/>
+            <w:tcW w:type="dxa" w:w="963"/>
           </w:tcPr>
           <w:p>
             <w:r/>
@@ -1975,7 +3183,7 @@
         </w:tc>
         <w:tc>
           <w:tcPr>
-            <w:tcW w:type="dxa" w:w="1701"/>
+            <w:tcW w:type="dxa" w:w="1474"/>
           </w:tcPr>
           <w:p>
             <w:r/>
@@ -1989,7 +3197,7 @@
         </w:tc>
         <w:tc>
           <w:tcPr>
-            <w:tcW w:type="dxa" w:w="5669"/>
+            <w:tcW w:type="dxa" w:w="5953"/>
           </w:tcPr>
           <w:p>
             <w:r/>
@@ -2003,7 +3211,7 @@
         </w:tc>
         <w:tc>
           <w:tcPr>
-            <w:tcW w:type="dxa" w:w="850"/>
+            <w:tcW w:type="dxa" w:w="680"/>
           </w:tcPr>
           <w:p>
             <w:r/>
@@ -2019,7 +3227,7 @@
       <w:tr>
         <w:tc>
           <w:tcPr>
-            <w:tcW w:type="dxa" w:w="850"/>
+            <w:tcW w:type="dxa" w:w="963"/>
           </w:tcPr>
           <w:p>
             <w:r/>
@@ -2033,7 +3241,7 @@
         </w:tc>
         <w:tc>
           <w:tcPr>
-            <w:tcW w:type="dxa" w:w="1701"/>
+            <w:tcW w:type="dxa" w:w="1474"/>
           </w:tcPr>
           <w:p>
             <w:r/>
@@ -2047,7 +3255,7 @@
         </w:tc>
         <w:tc>
           <w:tcPr>
-            <w:tcW w:type="dxa" w:w="5669"/>
+            <w:tcW w:type="dxa" w:w="5953"/>
           </w:tcPr>
           <w:p>
             <w:r/>
@@ -2061,7 +3269,7 @@
         </w:tc>
         <w:tc>
           <w:tcPr>
-            <w:tcW w:type="dxa" w:w="850"/>
+            <w:tcW w:type="dxa" w:w="680"/>
           </w:tcPr>
           <w:p>
             <w:r/>
@@ -2077,7 +3285,7 @@
       <w:tr>
         <w:tc>
           <w:tcPr>
-            <w:tcW w:type="dxa" w:w="850"/>
+            <w:tcW w:type="dxa" w:w="963"/>
           </w:tcPr>
           <w:p>
             <w:r/>
@@ -2091,7 +3299,7 @@
         </w:tc>
         <w:tc>
           <w:tcPr>
-            <w:tcW w:type="dxa" w:w="1701"/>
+            <w:tcW w:type="dxa" w:w="1474"/>
           </w:tcPr>
           <w:p>
             <w:r/>
@@ -2105,7 +3313,7 @@
         </w:tc>
         <w:tc>
           <w:tcPr>
-            <w:tcW w:type="dxa" w:w="5669"/>
+            <w:tcW w:type="dxa" w:w="5953"/>
           </w:tcPr>
           <w:p>
             <w:r/>
@@ -2119,7 +3327,7 @@
         </w:tc>
         <w:tc>
           <w:tcPr>
-            <w:tcW w:type="dxa" w:w="850"/>
+            <w:tcW w:type="dxa" w:w="680"/>
           </w:tcPr>
           <w:p>
             <w:r/>
@@ -2135,7 +3343,7 @@
       <w:tr>
         <w:tc>
           <w:tcPr>
-            <w:tcW w:type="dxa" w:w="850"/>
+            <w:tcW w:type="dxa" w:w="963"/>
           </w:tcPr>
           <w:p>
             <w:r/>
@@ -2149,7 +3357,7 @@
         </w:tc>
         <w:tc>
           <w:tcPr>
-            <w:tcW w:type="dxa" w:w="1701"/>
+            <w:tcW w:type="dxa" w:w="1474"/>
           </w:tcPr>
           <w:p>
             <w:r/>
@@ -2163,7 +3371,7 @@
         </w:tc>
         <w:tc>
           <w:tcPr>
-            <w:tcW w:type="dxa" w:w="5669"/>
+            <w:tcW w:type="dxa" w:w="5953"/>
           </w:tcPr>
           <w:p>
             <w:r/>
@@ -2177,7 +3385,7 @@
         </w:tc>
         <w:tc>
           <w:tcPr>
-            <w:tcW w:type="dxa" w:w="850"/>
+            <w:tcW w:type="dxa" w:w="680"/>
           </w:tcPr>
           <w:p>
             <w:r/>
@@ -2193,7 +3401,7 @@
       <w:tr>
         <w:tc>
           <w:tcPr>
-            <w:tcW w:type="dxa" w:w="850"/>
+            <w:tcW w:type="dxa" w:w="963"/>
           </w:tcPr>
           <w:p>
             <w:r/>
@@ -2207,7 +3415,7 @@
         </w:tc>
         <w:tc>
           <w:tcPr>
-            <w:tcW w:type="dxa" w:w="1701"/>
+            <w:tcW w:type="dxa" w:w="1474"/>
           </w:tcPr>
           <w:p>
             <w:r/>
@@ -2221,7 +3429,7 @@
         </w:tc>
         <w:tc>
           <w:tcPr>
-            <w:tcW w:type="dxa" w:w="5669"/>
+            <w:tcW w:type="dxa" w:w="5953"/>
           </w:tcPr>
           <w:p>
             <w:r/>
@@ -2235,7 +3443,7 @@
         </w:tc>
         <w:tc>
           <w:tcPr>
-            <w:tcW w:type="dxa" w:w="850"/>
+            <w:tcW w:type="dxa" w:w="680"/>
           </w:tcPr>
           <w:p>
             <w:r/>
@@ -2290,15 +3498,15 @@
         <w:tblLayout w:type="fixed"/>
       </w:tblPr>
       <w:tblGrid>
-        <w:gridCol w:w="850"/>
-        <w:gridCol w:w="1133"/>
-        <w:gridCol w:w="5952"/>
-        <w:gridCol w:w="1133"/>
+        <w:gridCol w:w="907"/>
+        <w:gridCol w:w="1247"/>
+        <w:gridCol w:w="5896"/>
+        <w:gridCol w:w="1020"/>
       </w:tblGrid>
       <w:tr>
         <w:tc>
           <w:tcPr>
-            <w:tcW w:type="dxa" w:w="850"/>
+            <w:tcW w:type="dxa" w:w="907"/>
             <w:shd w:val="clear" w:color="auto" w:fill="C0392B"/>
           </w:tcPr>
           <w:p>
@@ -2315,7 +3523,7 @@
         </w:tc>
         <w:tc>
           <w:tcPr>
-            <w:tcW w:type="dxa" w:w="1134"/>
+            <w:tcW w:type="dxa" w:w="1247"/>
             <w:shd w:val="clear" w:color="auto" w:fill="C0392B"/>
           </w:tcPr>
           <w:p>
@@ -2332,7 +3540,7 @@
         </w:tc>
         <w:tc>
           <w:tcPr>
-            <w:tcW w:type="dxa" w:w="5953"/>
+            <w:tcW w:type="dxa" w:w="5896"/>
             <w:shd w:val="clear" w:color="auto" w:fill="C0392B"/>
           </w:tcPr>
           <w:p>
@@ -2349,7 +3557,7 @@
         </w:tc>
         <w:tc>
           <w:tcPr>
-            <w:tcW w:type="dxa" w:w="1134"/>
+            <w:tcW w:type="dxa" w:w="1020"/>
             <w:shd w:val="clear" w:color="auto" w:fill="C0392B"/>
           </w:tcPr>
           <w:p>
@@ -2368,7 +3576,7 @@
       <w:tr>
         <w:tc>
           <w:tcPr>
-            <w:tcW w:type="dxa" w:w="850"/>
+            <w:tcW w:type="dxa" w:w="907"/>
           </w:tcPr>
           <w:p>
             <w:r/>
@@ -2382,7 +3590,7 @@
         </w:tc>
         <w:tc>
           <w:tcPr>
-            <w:tcW w:type="dxa" w:w="1134"/>
+            <w:tcW w:type="dxa" w:w="1247"/>
           </w:tcPr>
           <w:p>
             <w:r/>
@@ -2396,7 +3604,7 @@
         </w:tc>
         <w:tc>
           <w:tcPr>
-            <w:tcW w:type="dxa" w:w="5953"/>
+            <w:tcW w:type="dxa" w:w="5896"/>
           </w:tcPr>
           <w:p>
             <w:r/>
@@ -2410,7 +3618,7 @@
         </w:tc>
         <w:tc>
           <w:tcPr>
-            <w:tcW w:type="dxa" w:w="1134"/>
+            <w:tcW w:type="dxa" w:w="1020"/>
           </w:tcPr>
           <w:p>
             <w:r/>
@@ -2426,7 +3634,7 @@
       <w:tr>
         <w:tc>
           <w:tcPr>
-            <w:tcW w:type="dxa" w:w="850"/>
+            <w:tcW w:type="dxa" w:w="907"/>
           </w:tcPr>
           <w:p>
             <w:r/>
@@ -2440,7 +3648,7 @@
         </w:tc>
         <w:tc>
           <w:tcPr>
-            <w:tcW w:type="dxa" w:w="1134"/>
+            <w:tcW w:type="dxa" w:w="1247"/>
           </w:tcPr>
           <w:p>
             <w:r/>
@@ -2454,7 +3662,7 @@
         </w:tc>
         <w:tc>
           <w:tcPr>
-            <w:tcW w:type="dxa" w:w="5953"/>
+            <w:tcW w:type="dxa" w:w="5896"/>
           </w:tcPr>
           <w:p>
             <w:r>
@@ -2467,7 +3675,7 @@
         </w:tc>
         <w:tc>
           <w:tcPr>
-            <w:tcW w:type="dxa" w:w="1134"/>
+            <w:tcW w:type="dxa" w:w="1020"/>
           </w:tcPr>
           <w:p>
             <w:r/>
@@ -2483,7 +3691,7 @@
       <w:tr>
         <w:tc>
           <w:tcPr>
-            <w:tcW w:type="dxa" w:w="850"/>
+            <w:tcW w:type="dxa" w:w="907"/>
           </w:tcPr>
           <w:p>
             <w:r/>
@@ -2497,7 +3705,7 @@
         </w:tc>
         <w:tc>
           <w:tcPr>
-            <w:tcW w:type="dxa" w:w="1134"/>
+            <w:tcW w:type="dxa" w:w="1247"/>
           </w:tcPr>
           <w:p>
             <w:r/>
@@ -2511,7 +3719,7 @@
         </w:tc>
         <w:tc>
           <w:tcPr>
-            <w:tcW w:type="dxa" w:w="5953"/>
+            <w:tcW w:type="dxa" w:w="5896"/>
           </w:tcPr>
           <w:p>
             <w:r/>
@@ -2525,7 +3733,7 @@
         </w:tc>
         <w:tc>
           <w:tcPr>
-            <w:tcW w:type="dxa" w:w="1134"/>
+            <w:tcW w:type="dxa" w:w="1020"/>
           </w:tcPr>
           <w:p>
             <w:r/>
@@ -2541,7 +3749,7 @@
       <w:tr>
         <w:tc>
           <w:tcPr>
-            <w:tcW w:type="dxa" w:w="850"/>
+            <w:tcW w:type="dxa" w:w="907"/>
           </w:tcPr>
           <w:p>
             <w:r/>
@@ -2555,7 +3763,7 @@
         </w:tc>
         <w:tc>
           <w:tcPr>
-            <w:tcW w:type="dxa" w:w="1134"/>
+            <w:tcW w:type="dxa" w:w="1247"/>
           </w:tcPr>
           <w:p>
             <w:r/>
@@ -2569,7 +3777,7 @@
         </w:tc>
         <w:tc>
           <w:tcPr>
-            <w:tcW w:type="dxa" w:w="5953"/>
+            <w:tcW w:type="dxa" w:w="5896"/>
           </w:tcPr>
           <w:p>
             <w:r/>
@@ -2583,7 +3791,7 @@
         </w:tc>
         <w:tc>
           <w:tcPr>
-            <w:tcW w:type="dxa" w:w="1134"/>
+            <w:tcW w:type="dxa" w:w="1020"/>
           </w:tcPr>
           <w:p>
             <w:r/>
@@ -2599,7 +3807,7 @@
       <w:tr>
         <w:tc>
           <w:tcPr>
-            <w:tcW w:type="dxa" w:w="850"/>
+            <w:tcW w:type="dxa" w:w="907"/>
           </w:tcPr>
           <w:p>
             <w:r/>
@@ -2613,7 +3821,7 @@
         </w:tc>
         <w:tc>
           <w:tcPr>
-            <w:tcW w:type="dxa" w:w="1134"/>
+            <w:tcW w:type="dxa" w:w="1247"/>
           </w:tcPr>
           <w:p>
             <w:r/>
@@ -2627,7 +3835,7 @@
         </w:tc>
         <w:tc>
           <w:tcPr>
-            <w:tcW w:type="dxa" w:w="5953"/>
+            <w:tcW w:type="dxa" w:w="5896"/>
           </w:tcPr>
           <w:p>
             <w:r>
@@ -2640,7 +3848,7 @@
         </w:tc>
         <w:tc>
           <w:tcPr>
-            <w:tcW w:type="dxa" w:w="1134"/>
+            <w:tcW w:type="dxa" w:w="1020"/>
           </w:tcPr>
           <w:p>
             <w:r/>
@@ -2656,7 +3864,7 @@
       <w:tr>
         <w:tc>
           <w:tcPr>
-            <w:tcW w:type="dxa" w:w="850"/>
+            <w:tcW w:type="dxa" w:w="907"/>
           </w:tcPr>
           <w:p>
             <w:r/>
@@ -2670,7 +3878,7 @@
         </w:tc>
         <w:tc>
           <w:tcPr>
-            <w:tcW w:type="dxa" w:w="1134"/>
+            <w:tcW w:type="dxa" w:w="1247"/>
           </w:tcPr>
           <w:p>
             <w:r/>
@@ -2684,7 +3892,7 @@
         </w:tc>
         <w:tc>
           <w:tcPr>
-            <w:tcW w:type="dxa" w:w="5953"/>
+            <w:tcW w:type="dxa" w:w="5896"/>
           </w:tcPr>
           <w:p>
             <w:r>
@@ -2697,7 +3905,7 @@
         </w:tc>
         <w:tc>
           <w:tcPr>
-            <w:tcW w:type="dxa" w:w="1134"/>
+            <w:tcW w:type="dxa" w:w="1020"/>
           </w:tcPr>
           <w:p>
             <w:r/>
@@ -2713,7 +3921,7 @@
       <w:tr>
         <w:tc>
           <w:tcPr>
-            <w:tcW w:type="dxa" w:w="850"/>
+            <w:tcW w:type="dxa" w:w="907"/>
           </w:tcPr>
           <w:p>
             <w:r/>
@@ -2727,7 +3935,7 @@
         </w:tc>
         <w:tc>
           <w:tcPr>
-            <w:tcW w:type="dxa" w:w="1134"/>
+            <w:tcW w:type="dxa" w:w="1247"/>
           </w:tcPr>
           <w:p>
             <w:r/>
@@ -2741,7 +3949,7 @@
         </w:tc>
         <w:tc>
           <w:tcPr>
-            <w:tcW w:type="dxa" w:w="5953"/>
+            <w:tcW w:type="dxa" w:w="5896"/>
           </w:tcPr>
           <w:p>
             <w:r/>
@@ -2755,7 +3963,7 @@
         </w:tc>
         <w:tc>
           <w:tcPr>
-            <w:tcW w:type="dxa" w:w="1134"/>
+            <w:tcW w:type="dxa" w:w="1020"/>
           </w:tcPr>
           <w:p>
             <w:r/>
@@ -2771,7 +3979,7 @@
       <w:tr>
         <w:tc>
           <w:tcPr>
-            <w:tcW w:type="dxa" w:w="850"/>
+            <w:tcW w:type="dxa" w:w="907"/>
           </w:tcPr>
           <w:p>
             <w:r/>
@@ -2785,7 +3993,7 @@
         </w:tc>
         <w:tc>
           <w:tcPr>
-            <w:tcW w:type="dxa" w:w="1134"/>
+            <w:tcW w:type="dxa" w:w="1247"/>
           </w:tcPr>
           <w:p>
             <w:r/>
@@ -2799,7 +4007,7 @@
         </w:tc>
         <w:tc>
           <w:tcPr>
-            <w:tcW w:type="dxa" w:w="5953"/>
+            <w:tcW w:type="dxa" w:w="5896"/>
           </w:tcPr>
           <w:p>
             <w:r/>
@@ -2813,7 +4021,7 @@
         </w:tc>
         <w:tc>
           <w:tcPr>
-            <w:tcW w:type="dxa" w:w="1134"/>
+            <w:tcW w:type="dxa" w:w="1020"/>
           </w:tcPr>
           <w:p>
             <w:r/>
@@ -2829,7 +4037,7 @@
       <w:tr>
         <w:tc>
           <w:tcPr>
-            <w:tcW w:type="dxa" w:w="850"/>
+            <w:tcW w:type="dxa" w:w="907"/>
           </w:tcPr>
           <w:p>
             <w:r/>
@@ -2843,7 +4051,7 @@
         </w:tc>
         <w:tc>
           <w:tcPr>
-            <w:tcW w:type="dxa" w:w="1134"/>
+            <w:tcW w:type="dxa" w:w="1247"/>
           </w:tcPr>
           <w:p>
             <w:r/>
@@ -2857,7 +4065,7 @@
         </w:tc>
         <w:tc>
           <w:tcPr>
-            <w:tcW w:type="dxa" w:w="5953"/>
+            <w:tcW w:type="dxa" w:w="5896"/>
           </w:tcPr>
           <w:p>
             <w:r/>
@@ -2871,7 +4079,7 @@
         </w:tc>
         <w:tc>
           <w:tcPr>
-            <w:tcW w:type="dxa" w:w="1134"/>
+            <w:tcW w:type="dxa" w:w="1020"/>
           </w:tcPr>
           <w:p>
             <w:r/>
@@ -2887,7 +4095,7 @@
       <w:tr>
         <w:tc>
           <w:tcPr>
-            <w:tcW w:type="dxa" w:w="850"/>
+            <w:tcW w:type="dxa" w:w="907"/>
           </w:tcPr>
           <w:p>
             <w:r/>
@@ -2901,7 +4109,7 @@
         </w:tc>
         <w:tc>
           <w:tcPr>
-            <w:tcW w:type="dxa" w:w="1134"/>
+            <w:tcW w:type="dxa" w:w="1247"/>
           </w:tcPr>
           <w:p>
             <w:r/>
@@ -2915,7 +4123,7 @@
         </w:tc>
         <w:tc>
           <w:tcPr>
-            <w:tcW w:type="dxa" w:w="5953"/>
+            <w:tcW w:type="dxa" w:w="5896"/>
           </w:tcPr>
           <w:p>
             <w:r/>
@@ -2929,7 +4137,7 @@
         </w:tc>
         <w:tc>
           <w:tcPr>
-            <w:tcW w:type="dxa" w:w="1134"/>
+            <w:tcW w:type="dxa" w:w="1020"/>
           </w:tcPr>
           <w:p>
             <w:r/>
@@ -2945,7 +4153,7 @@
       <w:tr>
         <w:tc>
           <w:tcPr>
-            <w:tcW w:type="dxa" w:w="850"/>
+            <w:tcW w:type="dxa" w:w="907"/>
           </w:tcPr>
           <w:p>
             <w:r/>
@@ -2959,7 +4167,7 @@
         </w:tc>
         <w:tc>
           <w:tcPr>
-            <w:tcW w:type="dxa" w:w="1134"/>
+            <w:tcW w:type="dxa" w:w="1247"/>
           </w:tcPr>
           <w:p>
             <w:r/>
@@ -2973,7 +4181,7 @@
         </w:tc>
         <w:tc>
           <w:tcPr>
-            <w:tcW w:type="dxa" w:w="5953"/>
+            <w:tcW w:type="dxa" w:w="5896"/>
           </w:tcPr>
           <w:p>
             <w:r/>
@@ -2987,7 +4195,7 @@
         </w:tc>
         <w:tc>
           <w:tcPr>
-            <w:tcW w:type="dxa" w:w="1134"/>
+            <w:tcW w:type="dxa" w:w="1020"/>
           </w:tcPr>
           <w:p>
             <w:r/>
@@ -3003,7 +4211,7 @@
       <w:tr>
         <w:tc>
           <w:tcPr>
-            <w:tcW w:type="dxa" w:w="850"/>
+            <w:tcW w:type="dxa" w:w="907"/>
           </w:tcPr>
           <w:p>
             <w:r/>
@@ -3017,7 +4225,7 @@
         </w:tc>
         <w:tc>
           <w:tcPr>
-            <w:tcW w:type="dxa" w:w="1134"/>
+            <w:tcW w:type="dxa" w:w="1247"/>
           </w:tcPr>
           <w:p>
             <w:r/>
@@ -3031,7 +4239,7 @@
         </w:tc>
         <w:tc>
           <w:tcPr>
-            <w:tcW w:type="dxa" w:w="5953"/>
+            <w:tcW w:type="dxa" w:w="5896"/>
           </w:tcPr>
           <w:p>
             <w:r>
@@ -3044,7 +4252,7 @@
         </w:tc>
         <w:tc>
           <w:tcPr>
-            <w:tcW w:type="dxa" w:w="1134"/>
+            <w:tcW w:type="dxa" w:w="1020"/>
           </w:tcPr>
           <w:p>
             <w:r/>
@@ -3483,7 +4691,7 @@
         <w:rPr>
           <w:b w:val="0"/>
         </w:rPr>
-        <w:t>Este coste industrial se reparte, como primera aproximación, de la siguiente manera: materiales ≈ 8,50 €, transformación (corte, doblado, inyección, acabado) ≈ 4,00 €, montaje ≈ 1,50 €, embalaje ≈ 1,00 € y gastos generales y amortización de utillajes ≈ 2,30 €. Los porcentajes de margen son hipótesis habituales del sector y se revisarán cuando se tengan las masas reales de cada pieza a partir del modelo en SolidWorks.</w:t>
+        <w:t>Este coste industrial se reparte, como primera aproximación, de la siguiente manera: materiales ≈ 8,50 €, transformación (corte, doblado, inyección, acabado) ≈ 4,00 €, montaje ≈ 1,50 €, embalaje ≈ 1,00 € y gastos generales y amortización de utillajes ≈ 2,30 €. Los porcentajes de margen son hipótesis habituales del sector; el reparto se ha revisado por componente en el análisis del valor (apartado 5.3), a partir de las masas del modelo de SolidWorks.</w:t>
       </w:r>
     </w:p>
     <w:p>
@@ -7967,7 +9175,7 @@
         <w:rPr>
           <w:b w:val="0"/>
         </w:rPr>
-        <w:t>Dimensiones aproximadas de la caja, a partir del tamaño plegado: 640 × 470 × 60 mm.</w:t>
+        <w:t>Dimensiones aproximadas de la caja, a partir del tamaño plegado medido en el modelo (861 × 450 × 40 mm): 880 × 470 × 60 mm.</w:t>
       </w:r>
     </w:p>
     <w:p>
@@ -7986,7 +9194,7 @@
         <w:rPr>
           <w:b w:val="0"/>
         </w:rPr>
-        <w:t>Paletización: en un palé europeo (1200 × 800 mm), colocando las cajas de canto se pueden poner 20 cajas por fila en el lado de 1200 mm y 3 alturas de 470 mm, lo que da 60 unidades por palé con una altura total de unos 1,55 m. Si las cajas se colocaran planas cabrían solo unas 50 unidades, por lo que se elige la disposición de canto. El plegado plano del producto es la clave para reducir el volumen transportado y, con ello, el coste y las emisiones del transporte.</w:t>
+        <w:t>Paletización: en un palé europeo (1200 × 800 mm) las cajas se colocan de canto, con su lado largo (880 mm) en la dirección de 1200 mm. Así caben 13 cajas en el lado de 800 mm y 3 alturas de 470 mm, lo que da 39 unidades por palé con una altura total de unos 1,55 m. Colocadas planas solo cabría una caja por capa (unas 23 unidades por palé), por lo que se elige la disposición de canto. El plegado plano del producto es la clave para reducir el volumen transportado y, con ello, el coste y las emisiones del transporte.</w:t>
       </w:r>
     </w:p>
     <w:p>
@@ -8002,7 +9210,7 @@
         <w:rPr>
           <w:b w:val="0"/>
         </w:rPr>
-        <w:t>El producto se entrega completamente montado, por lo que el usuario no tiene que realizar ninguna operación salvo desplegarlo. El montaje se hace en fábrica, con una secuencia prevista como la siguiente:</w:t>
+        <w:t>El producto se entrega completamente montado, por lo que el usuario no tiene que realizar ninguna operación salvo desplegarlo. El montaje se hace en fábrica con la siguiente secuencia, actualizada con el diseño definitivo del apartado 3.4:</w:t>
       </w:r>
     </w:p>
     <w:p>
@@ -8013,7 +9221,7 @@
         <w:rPr>
           <w:b w:val="0"/>
         </w:rPr>
-        <w:t>1. Preparación de los largueros delanteros y traseros (cortados, taladrados y con su acabado superficial).</w:t>
+        <w:t>1. Corte, taladrado y acabado superficial de los largueros delanteros, las patas traseras y los travesaños; inyección de la plataforma y el peldaño.</w:t>
       </w:r>
     </w:p>
     <w:p>
@@ -8024,7 +9232,7 @@
         <w:rPr>
           <w:b w:val="0"/>
         </w:rPr>
-        <w:t>2. Colocación de los tacos antideslizantes en los extremos de los largueros.</w:t>
+        <w:t>2. Unión del travesaño del asidero a los dos largueros delanteros y del travesaño trasero a las dos patas traseras, formando dos bastidores.</w:t>
       </w:r>
     </w:p>
     <w:p>
@@ -8035,7 +9243,7 @@
         <w:rPr>
           <w:b w:val="0"/>
         </w:rPr>
-        <w:t>3. Unión de los peldaños y de la plataforma a los largueros delanteros mediante pasadores o remaches.</w:t>
+        <w:t>3. Colocación de los tacos antideslizantes en los extremos inferiores de los largueros y de las patas.</w:t>
       </w:r>
     </w:p>
     <w:p>
@@ -8046,7 +9254,7 @@
         <w:rPr>
           <w:b w:val="0"/>
         </w:rPr>
-        <w:t>4. Unión de la pata trasera a la plataforma en la articulación superior.</w:t>
+        <w:t>4. Articulación de la plataforma y del peldaño a los largueros delanteros mediante pasadores.</w:t>
       </w:r>
     </w:p>
     <w:p>
@@ -8057,7 +9265,7 @@
         <w:rPr>
           <w:b w:val="0"/>
         </w:rPr>
-        <w:t>5. Montaje de los tirantes y del mecanismo de bloqueo.</w:t>
+        <w:t>5. Unión de las patas traseras a los largueros delanteros en el pivote superior, por encima de la plataforma.</w:t>
       </w:r>
     </w:p>
     <w:p>
@@ -8068,7 +9276,7 @@
         <w:rPr>
           <w:b w:val="0"/>
         </w:rPr>
-        <w:t>6. Colocación de las etiquetas de advertencia y carga máxima.</w:t>
+        <w:t>6. Montaje de las bielas de la plataforma, los tirantes del peldaño y el pestillo de seguridad.</w:t>
       </w:r>
     </w:p>
     <w:p>
@@ -8079,7 +9287,7 @@
         <w:rPr>
           <w:b w:val="0"/>
         </w:rPr>
-        <w:t>7. Control final: apertura y cierre, comprobación del bloqueo y prueba de carga por muestreo.</w:t>
+        <w:t>7. Colocación de las etiquetas de advertencia y carga máxima, y control final: apertura y cierre, comprobación del bloqueo y prueba de carga por muestreo.</w:t>
       </w:r>
     </w:p>
     <w:p>
@@ -11273,6 +12481,15 @@
         <w:t>Con el modelo se han comprobado las principales propiedades fijadas en la etapa inicial: plataforma a 480 mm y peldaño a 240 mm del suelo, huella de 496 × 450 mm, espesor plegado de 40 mm (P6 exigía 50 mm como máximo) y ausencia de interferencias entre piezas tanto abierto como plegado. En la posición plegada las patas traseras sobresalen unos 4 cm por debajo de los largueros, lo cual no supone ningún problema porque el taburete plegado se guarda apoyado en la pared o colgado por el asa. Las masas de cada pieza, obtenidas con la herramienta de propiedades físicas, se recogen en la Tabla 10.</w:t>
       </w:r>
     </w:p>
+    <w:p>
+      <w:r>
+        <w:rPr>
+          <w:b w:val="0"/>
+          <w:i w:val="0"/>
+        </w:rPr>
+        <w:t>El modelo todavía no incluye el pestillo de seguridad propuesto con el método TRIZ (contradicción tercera). Como el mecanismo tiene un único grado de libertad, basta con bloquear una de sus articulaciones para fijar el taburete abierto; la solución concreta (por ejemplo, un pasador con muelle en la articulación de la plataforma, como en el modelo de utilidad ES 1 070 877 U) se deja para el diseño de detalle y aparece como acción correctora en el AMFEC (apartado 5.2).</w:t>
+      </w:r>
+    </w:p>
     <w:tbl>
       <w:tblPr>
         <w:tblStyle w:val="TableGrid"/>
@@ -15044,7 +16261,7 @@
           <w:b w:val="0"/>
           <w:i w:val="0"/>
         </w:rPr>
-        <w:t>Una vez elegida la solución, se han aplicado las técnicas de rediseño vistas en la asignatura (QFD, AMFEC y análisis del valor) para detectar los puntos débiles del diseño y proponer mejoras antes de pasar a la fabricación de prototipos. El análisis se ha hecho sobre la alternativa 2 (aluminio), que es la que actualmente cumple todas las propiedades del EDP, aunque las conclusiones son aplicables también a la de madera.</w:t>
+        <w:t>Una vez comparadas las alternativas, se han aplicado las técnicas de rediseño vistas en la asignatura (QFD, AMFEC y análisis del valor) para detectar los puntos débiles del diseño y proponer mejoras antes de pasar a la fabricación de prototipos. Los análisis se han hecho sobre la alternativa 2 (aluminio y polipropileno), porque es la única cuyo modelo cumple hoy todas las propiedades del EDP y la única con una estimación de costes por componente. La mayoría de las conclusiones afectan al mecanismo (bloqueo, articulaciones, tacos y plegado), que es común a las tres alternativas, así que son igualmente válidas para la alternativa de madera propuesta en el apartado 4.5; al final del AMFEC se indican los cambios propios de la madera.</w:t>
       </w:r>
     </w:p>
     <w:p>
@@ -15167,21 +16384,21 @@
         <w:tblLayout w:type="fixed"/>
       </w:tblPr>
       <w:tblGrid>
-        <w:gridCol w:w="1190"/>
-        <w:gridCol w:w="1303"/>
-        <w:gridCol w:w="1133"/>
-        <w:gridCol w:w="1247"/>
-        <w:gridCol w:w="396"/>
-        <w:gridCol w:w="396"/>
-        <w:gridCol w:w="396"/>
-        <w:gridCol w:w="510"/>
-        <w:gridCol w:w="1927"/>
-        <w:gridCol w:w="566"/>
+        <w:gridCol w:w="1304"/>
+        <w:gridCol w:w="1134"/>
+        <w:gridCol w:w="1020"/>
+        <w:gridCol w:w="1077"/>
+        <w:gridCol w:w="340"/>
+        <w:gridCol w:w="340"/>
+        <w:gridCol w:w="340"/>
+        <w:gridCol w:w="453"/>
+        <w:gridCol w:w="2041"/>
+        <w:gridCol w:w="567"/>
       </w:tblGrid>
       <w:tr>
         <w:tc>
           <w:tcPr>
-            <w:tcW w:type="dxa" w:w="1191"/>
+            <w:tcW w:type="dxa" w:w="1304"/>
             <w:shd w:val="clear" w:color="auto" w:fill="C0392B"/>
           </w:tcPr>
           <w:p>
@@ -15201,7 +16418,7 @@
         </w:tc>
         <w:tc>
           <w:tcPr>
-            <w:tcW w:type="dxa" w:w="1304"/>
+            <w:tcW w:type="dxa" w:w="1134"/>
             <w:shd w:val="clear" w:color="auto" w:fill="C0392B"/>
           </w:tcPr>
           <w:p>
@@ -15221,7 +16438,7 @@
         </w:tc>
         <w:tc>
           <w:tcPr>
-            <w:tcW w:type="dxa" w:w="1134"/>
+            <w:tcW w:type="dxa" w:w="1020"/>
             <w:shd w:val="clear" w:color="auto" w:fill="C0392B"/>
           </w:tcPr>
           <w:p>
@@ -15241,7 +16458,7 @@
         </w:tc>
         <w:tc>
           <w:tcPr>
-            <w:tcW w:type="dxa" w:w="1247"/>
+            <w:tcW w:type="dxa" w:w="1077"/>
             <w:shd w:val="clear" w:color="auto" w:fill="C0392B"/>
           </w:tcPr>
           <w:p>
@@ -15261,7 +16478,7 @@
         </w:tc>
         <w:tc>
           <w:tcPr>
-            <w:tcW w:type="dxa" w:w="397"/>
+            <w:tcW w:type="dxa" w:w="340"/>
             <w:shd w:val="clear" w:color="auto" w:fill="C0392B"/>
           </w:tcPr>
           <w:p>
@@ -15281,7 +16498,7 @@
         </w:tc>
         <w:tc>
           <w:tcPr>
-            <w:tcW w:type="dxa" w:w="397"/>
+            <w:tcW w:type="dxa" w:w="340"/>
             <w:shd w:val="clear" w:color="auto" w:fill="C0392B"/>
           </w:tcPr>
           <w:p>
@@ -15301,7 +16518,7 @@
         </w:tc>
         <w:tc>
           <w:tcPr>
-            <w:tcW w:type="dxa" w:w="397"/>
+            <w:tcW w:type="dxa" w:w="340"/>
             <w:shd w:val="clear" w:color="auto" w:fill="C0392B"/>
           </w:tcPr>
           <w:p>
@@ -15321,7 +16538,7 @@
         </w:tc>
         <w:tc>
           <w:tcPr>
-            <w:tcW w:type="dxa" w:w="510"/>
+            <w:tcW w:type="dxa" w:w="453"/>
             <w:shd w:val="clear" w:color="auto" w:fill="C0392B"/>
           </w:tcPr>
           <w:p>
@@ -15341,7 +16558,7 @@
         </w:tc>
         <w:tc>
           <w:tcPr>
-            <w:tcW w:type="dxa" w:w="1928"/>
+            <w:tcW w:type="dxa" w:w="2041"/>
             <w:shd w:val="clear" w:color="auto" w:fill="C0392B"/>
           </w:tcPr>
           <w:p>
@@ -15383,7 +16600,7 @@
       <w:tr>
         <w:tc>
           <w:tcPr>
-            <w:tcW w:type="dxa" w:w="1191"/>
+            <w:tcW w:type="dxa" w:w="1304"/>
           </w:tcPr>
           <w:p>
             <w:pPr>
@@ -15400,7 +16617,7 @@
         </w:tc>
         <w:tc>
           <w:tcPr>
-            <w:tcW w:type="dxa" w:w="1304"/>
+            <w:tcW w:type="dxa" w:w="1134"/>
           </w:tcPr>
           <w:p>
             <w:pPr>
@@ -15417,7 +16634,7 @@
         </w:tc>
         <w:tc>
           <w:tcPr>
-            <w:tcW w:type="dxa" w:w="1134"/>
+            <w:tcW w:type="dxa" w:w="1020"/>
           </w:tcPr>
           <w:p>
             <w:pPr>
@@ -15434,7 +16651,7 @@
         </w:tc>
         <w:tc>
           <w:tcPr>
-            <w:tcW w:type="dxa" w:w="1247"/>
+            <w:tcW w:type="dxa" w:w="1077"/>
           </w:tcPr>
           <w:p>
             <w:pPr>
@@ -15451,7 +16668,7 @@
         </w:tc>
         <w:tc>
           <w:tcPr>
-            <w:tcW w:type="dxa" w:w="397"/>
+            <w:tcW w:type="dxa" w:w="340"/>
           </w:tcPr>
           <w:p>
             <w:pPr>
@@ -15468,7 +16685,7 @@
         </w:tc>
         <w:tc>
           <w:tcPr>
-            <w:tcW w:type="dxa" w:w="397"/>
+            <w:tcW w:type="dxa" w:w="340"/>
           </w:tcPr>
           <w:p>
             <w:pPr>
@@ -15485,7 +16702,7 @@
         </w:tc>
         <w:tc>
           <w:tcPr>
-            <w:tcW w:type="dxa" w:w="397"/>
+            <w:tcW w:type="dxa" w:w="340"/>
           </w:tcPr>
           <w:p>
             <w:pPr>
@@ -15502,7 +16719,7 @@
         </w:tc>
         <w:tc>
           <w:tcPr>
-            <w:tcW w:type="dxa" w:w="510"/>
+            <w:tcW w:type="dxa" w:w="453"/>
           </w:tcPr>
           <w:p>
             <w:pPr>
@@ -15519,7 +16736,7 @@
         </w:tc>
         <w:tc>
           <w:tcPr>
-            <w:tcW w:type="dxa" w:w="1928"/>
+            <w:tcW w:type="dxa" w:w="2041"/>
           </w:tcPr>
           <w:p>
             <w:pPr>
@@ -15555,7 +16772,7 @@
       <w:tr>
         <w:tc>
           <w:tcPr>
-            <w:tcW w:type="dxa" w:w="1191"/>
+            <w:tcW w:type="dxa" w:w="1304"/>
           </w:tcPr>
           <w:p>
             <w:pPr>
@@ -15572,7 +16789,7 @@
         </w:tc>
         <w:tc>
           <w:tcPr>
-            <w:tcW w:type="dxa" w:w="1304"/>
+            <w:tcW w:type="dxa" w:w="1134"/>
           </w:tcPr>
           <w:p>
             <w:pPr>
@@ -15589,7 +16806,7 @@
         </w:tc>
         <w:tc>
           <w:tcPr>
-            <w:tcW w:type="dxa" w:w="1134"/>
+            <w:tcW w:type="dxa" w:w="1020"/>
           </w:tcPr>
           <w:p>
             <w:pPr>
@@ -15606,7 +16823,7 @@
         </w:tc>
         <w:tc>
           <w:tcPr>
-            <w:tcW w:type="dxa" w:w="1247"/>
+            <w:tcW w:type="dxa" w:w="1077"/>
           </w:tcPr>
           <w:p>
             <w:pPr>
@@ -15623,7 +16840,7 @@
         </w:tc>
         <w:tc>
           <w:tcPr>
-            <w:tcW w:type="dxa" w:w="397"/>
+            <w:tcW w:type="dxa" w:w="340"/>
           </w:tcPr>
           <w:p>
             <w:pPr>
@@ -15640,7 +16857,7 @@
         </w:tc>
         <w:tc>
           <w:tcPr>
-            <w:tcW w:type="dxa" w:w="397"/>
+            <w:tcW w:type="dxa" w:w="340"/>
           </w:tcPr>
           <w:p>
             <w:pPr>
@@ -15657,7 +16874,7 @@
         </w:tc>
         <w:tc>
           <w:tcPr>
-            <w:tcW w:type="dxa" w:w="397"/>
+            <w:tcW w:type="dxa" w:w="340"/>
           </w:tcPr>
           <w:p>
             <w:pPr>
@@ -15674,7 +16891,7 @@
         </w:tc>
         <w:tc>
           <w:tcPr>
-            <w:tcW w:type="dxa" w:w="510"/>
+            <w:tcW w:type="dxa" w:w="453"/>
           </w:tcPr>
           <w:p>
             <w:pPr>
@@ -15691,7 +16908,7 @@
         </w:tc>
         <w:tc>
           <w:tcPr>
-            <w:tcW w:type="dxa" w:w="1928"/>
+            <w:tcW w:type="dxa" w:w="2041"/>
           </w:tcPr>
           <w:p>
             <w:pPr>
@@ -15727,7 +16944,7 @@
       <w:tr>
         <w:tc>
           <w:tcPr>
-            <w:tcW w:type="dxa" w:w="1191"/>
+            <w:tcW w:type="dxa" w:w="1304"/>
           </w:tcPr>
           <w:p>
             <w:pPr>
@@ -15744,7 +16961,7 @@
         </w:tc>
         <w:tc>
           <w:tcPr>
-            <w:tcW w:type="dxa" w:w="1304"/>
+            <w:tcW w:type="dxa" w:w="1134"/>
           </w:tcPr>
           <w:p>
             <w:pPr>
@@ -15761,7 +16978,7 @@
         </w:tc>
         <w:tc>
           <w:tcPr>
-            <w:tcW w:type="dxa" w:w="1134"/>
+            <w:tcW w:type="dxa" w:w="1020"/>
           </w:tcPr>
           <w:p>
             <w:pPr>
@@ -15778,7 +16995,7 @@
         </w:tc>
         <w:tc>
           <w:tcPr>
-            <w:tcW w:type="dxa" w:w="1247"/>
+            <w:tcW w:type="dxa" w:w="1077"/>
           </w:tcPr>
           <w:p>
             <w:pPr>
@@ -15795,7 +17012,7 @@
         </w:tc>
         <w:tc>
           <w:tcPr>
-            <w:tcW w:type="dxa" w:w="397"/>
+            <w:tcW w:type="dxa" w:w="340"/>
           </w:tcPr>
           <w:p>
             <w:pPr>
@@ -15812,7 +17029,7 @@
         </w:tc>
         <w:tc>
           <w:tcPr>
-            <w:tcW w:type="dxa" w:w="397"/>
+            <w:tcW w:type="dxa" w:w="340"/>
           </w:tcPr>
           <w:p>
             <w:pPr>
@@ -15829,7 +17046,7 @@
         </w:tc>
         <w:tc>
           <w:tcPr>
-            <w:tcW w:type="dxa" w:w="397"/>
+            <w:tcW w:type="dxa" w:w="340"/>
           </w:tcPr>
           <w:p>
             <w:pPr>
@@ -15846,7 +17063,7 @@
         </w:tc>
         <w:tc>
           <w:tcPr>
-            <w:tcW w:type="dxa" w:w="510"/>
+            <w:tcW w:type="dxa" w:w="453"/>
           </w:tcPr>
           <w:p>
             <w:pPr>
@@ -15863,7 +17080,7 @@
         </w:tc>
         <w:tc>
           <w:tcPr>
-            <w:tcW w:type="dxa" w:w="1928"/>
+            <w:tcW w:type="dxa" w:w="2041"/>
           </w:tcPr>
           <w:p>
             <w:pPr>
@@ -15899,7 +17116,7 @@
       <w:tr>
         <w:tc>
           <w:tcPr>
-            <w:tcW w:type="dxa" w:w="1191"/>
+            <w:tcW w:type="dxa" w:w="1304"/>
           </w:tcPr>
           <w:p>
             <w:pPr>
@@ -15916,7 +17133,7 @@
         </w:tc>
         <w:tc>
           <w:tcPr>
-            <w:tcW w:type="dxa" w:w="1304"/>
+            <w:tcW w:type="dxa" w:w="1134"/>
           </w:tcPr>
           <w:p>
             <w:pPr>
@@ -15933,7 +17150,7 @@
         </w:tc>
         <w:tc>
           <w:tcPr>
-            <w:tcW w:type="dxa" w:w="1134"/>
+            <w:tcW w:type="dxa" w:w="1020"/>
           </w:tcPr>
           <w:p>
             <w:pPr>
@@ -15950,7 +17167,7 @@
         </w:tc>
         <w:tc>
           <w:tcPr>
-            <w:tcW w:type="dxa" w:w="1247"/>
+            <w:tcW w:type="dxa" w:w="1077"/>
           </w:tcPr>
           <w:p>
             <w:pPr>
@@ -15967,7 +17184,7 @@
         </w:tc>
         <w:tc>
           <w:tcPr>
-            <w:tcW w:type="dxa" w:w="397"/>
+            <w:tcW w:type="dxa" w:w="340"/>
           </w:tcPr>
           <w:p>
             <w:pPr>
@@ -15984,7 +17201,7 @@
         </w:tc>
         <w:tc>
           <w:tcPr>
-            <w:tcW w:type="dxa" w:w="397"/>
+            <w:tcW w:type="dxa" w:w="340"/>
           </w:tcPr>
           <w:p>
             <w:pPr>
@@ -16001,7 +17218,7 @@
         </w:tc>
         <w:tc>
           <w:tcPr>
-            <w:tcW w:type="dxa" w:w="397"/>
+            <w:tcW w:type="dxa" w:w="340"/>
           </w:tcPr>
           <w:p>
             <w:pPr>
@@ -16018,7 +17235,7 @@
         </w:tc>
         <w:tc>
           <w:tcPr>
-            <w:tcW w:type="dxa" w:w="510"/>
+            <w:tcW w:type="dxa" w:w="453"/>
           </w:tcPr>
           <w:p>
             <w:pPr>
@@ -16035,7 +17252,7 @@
         </w:tc>
         <w:tc>
           <w:tcPr>
-            <w:tcW w:type="dxa" w:w="1928"/>
+            <w:tcW w:type="dxa" w:w="2041"/>
           </w:tcPr>
           <w:p>
             <w:pPr>
@@ -16071,7 +17288,7 @@
       <w:tr>
         <w:tc>
           <w:tcPr>
-            <w:tcW w:type="dxa" w:w="1191"/>
+            <w:tcW w:type="dxa" w:w="1304"/>
           </w:tcPr>
           <w:p>
             <w:pPr>
@@ -16088,7 +17305,7 @@
         </w:tc>
         <w:tc>
           <w:tcPr>
-            <w:tcW w:type="dxa" w:w="1304"/>
+            <w:tcW w:type="dxa" w:w="1134"/>
           </w:tcPr>
           <w:p>
             <w:pPr>
@@ -16105,7 +17322,7 @@
         </w:tc>
         <w:tc>
           <w:tcPr>
-            <w:tcW w:type="dxa" w:w="1134"/>
+            <w:tcW w:type="dxa" w:w="1020"/>
           </w:tcPr>
           <w:p>
             <w:pPr>
@@ -16122,7 +17339,7 @@
         </w:tc>
         <w:tc>
           <w:tcPr>
-            <w:tcW w:type="dxa" w:w="1247"/>
+            <w:tcW w:type="dxa" w:w="1077"/>
           </w:tcPr>
           <w:p>
             <w:pPr>
@@ -16139,7 +17356,7 @@
         </w:tc>
         <w:tc>
           <w:tcPr>
-            <w:tcW w:type="dxa" w:w="397"/>
+            <w:tcW w:type="dxa" w:w="340"/>
           </w:tcPr>
           <w:p>
             <w:pPr>
@@ -16156,7 +17373,7 @@
         </w:tc>
         <w:tc>
           <w:tcPr>
-            <w:tcW w:type="dxa" w:w="397"/>
+            <w:tcW w:type="dxa" w:w="340"/>
           </w:tcPr>
           <w:p>
             <w:pPr>
@@ -16173,7 +17390,7 @@
         </w:tc>
         <w:tc>
           <w:tcPr>
-            <w:tcW w:type="dxa" w:w="397"/>
+            <w:tcW w:type="dxa" w:w="340"/>
           </w:tcPr>
           <w:p>
             <w:pPr>
@@ -16190,7 +17407,7 @@
         </w:tc>
         <w:tc>
           <w:tcPr>
-            <w:tcW w:type="dxa" w:w="510"/>
+            <w:tcW w:type="dxa" w:w="453"/>
           </w:tcPr>
           <w:p>
             <w:pPr>
@@ -16207,7 +17424,7 @@
         </w:tc>
         <w:tc>
           <w:tcPr>
-            <w:tcW w:type="dxa" w:w="1928"/>
+            <w:tcW w:type="dxa" w:w="2041"/>
           </w:tcPr>
           <w:p>
             <w:pPr>
@@ -16243,7 +17460,7 @@
       <w:tr>
         <w:tc>
           <w:tcPr>
-            <w:tcW w:type="dxa" w:w="1191"/>
+            <w:tcW w:type="dxa" w:w="1304"/>
           </w:tcPr>
           <w:p>
             <w:pPr>
@@ -16260,7 +17477,7 @@
         </w:tc>
         <w:tc>
           <w:tcPr>
-            <w:tcW w:type="dxa" w:w="1304"/>
+            <w:tcW w:type="dxa" w:w="1134"/>
           </w:tcPr>
           <w:p>
             <w:pPr>
@@ -16277,7 +17494,7 @@
         </w:tc>
         <w:tc>
           <w:tcPr>
-            <w:tcW w:type="dxa" w:w="1134"/>
+            <w:tcW w:type="dxa" w:w="1020"/>
           </w:tcPr>
           <w:p>
             <w:pPr>
@@ -16294,7 +17511,7 @@
         </w:tc>
         <w:tc>
           <w:tcPr>
-            <w:tcW w:type="dxa" w:w="1247"/>
+            <w:tcW w:type="dxa" w:w="1077"/>
           </w:tcPr>
           <w:p>
             <w:pPr>
@@ -16311,7 +17528,7 @@
         </w:tc>
         <w:tc>
           <w:tcPr>
-            <w:tcW w:type="dxa" w:w="397"/>
+            <w:tcW w:type="dxa" w:w="340"/>
           </w:tcPr>
           <w:p>
             <w:pPr>
@@ -16328,7 +17545,7 @@
         </w:tc>
         <w:tc>
           <w:tcPr>
-            <w:tcW w:type="dxa" w:w="397"/>
+            <w:tcW w:type="dxa" w:w="340"/>
           </w:tcPr>
           <w:p>
             <w:pPr>
@@ -16345,7 +17562,7 @@
         </w:tc>
         <w:tc>
           <w:tcPr>
-            <w:tcW w:type="dxa" w:w="397"/>
+            <w:tcW w:type="dxa" w:w="340"/>
           </w:tcPr>
           <w:p>
             <w:pPr>
@@ -16362,7 +17579,7 @@
         </w:tc>
         <w:tc>
           <w:tcPr>
-            <w:tcW w:type="dxa" w:w="510"/>
+            <w:tcW w:type="dxa" w:w="453"/>
           </w:tcPr>
           <w:p>
             <w:pPr>
@@ -16379,7 +17596,7 @@
         </w:tc>
         <w:tc>
           <w:tcPr>
-            <w:tcW w:type="dxa" w:w="1928"/>
+            <w:tcW w:type="dxa" w:w="2041"/>
           </w:tcPr>
           <w:p>
             <w:pPr>
@@ -16415,7 +17632,7 @@
       <w:tr>
         <w:tc>
           <w:tcPr>
-            <w:tcW w:type="dxa" w:w="1191"/>
+            <w:tcW w:type="dxa" w:w="1304"/>
           </w:tcPr>
           <w:p>
             <w:pPr>
@@ -16432,7 +17649,7 @@
         </w:tc>
         <w:tc>
           <w:tcPr>
-            <w:tcW w:type="dxa" w:w="1304"/>
+            <w:tcW w:type="dxa" w:w="1134"/>
           </w:tcPr>
           <w:p>
             <w:pPr>
@@ -16449,7 +17666,7 @@
         </w:tc>
         <w:tc>
           <w:tcPr>
-            <w:tcW w:type="dxa" w:w="1134"/>
+            <w:tcW w:type="dxa" w:w="1020"/>
           </w:tcPr>
           <w:p>
             <w:pPr>
@@ -16466,7 +17683,7 @@
         </w:tc>
         <w:tc>
           <w:tcPr>
-            <w:tcW w:type="dxa" w:w="1247"/>
+            <w:tcW w:type="dxa" w:w="1077"/>
           </w:tcPr>
           <w:p>
             <w:pPr>
@@ -16483,7 +17700,7 @@
         </w:tc>
         <w:tc>
           <w:tcPr>
-            <w:tcW w:type="dxa" w:w="397"/>
+            <w:tcW w:type="dxa" w:w="340"/>
           </w:tcPr>
           <w:p>
             <w:pPr>
@@ -16500,7 +17717,7 @@
         </w:tc>
         <w:tc>
           <w:tcPr>
-            <w:tcW w:type="dxa" w:w="397"/>
+            <w:tcW w:type="dxa" w:w="340"/>
           </w:tcPr>
           <w:p>
             <w:pPr>
@@ -16517,7 +17734,7 @@
         </w:tc>
         <w:tc>
           <w:tcPr>
-            <w:tcW w:type="dxa" w:w="397"/>
+            <w:tcW w:type="dxa" w:w="340"/>
           </w:tcPr>
           <w:p>
             <w:pPr>
@@ -16534,7 +17751,7 @@
         </w:tc>
         <w:tc>
           <w:tcPr>
-            <w:tcW w:type="dxa" w:w="510"/>
+            <w:tcW w:type="dxa" w:w="453"/>
           </w:tcPr>
           <w:p>
             <w:pPr>
@@ -16551,7 +17768,7 @@
         </w:tc>
         <w:tc>
           <w:tcPr>
-            <w:tcW w:type="dxa" w:w="1928"/>
+            <w:tcW w:type="dxa" w:w="2041"/>
           </w:tcPr>
           <w:p>
             <w:pPr>
@@ -16587,7 +17804,7 @@
       <w:tr>
         <w:tc>
           <w:tcPr>
-            <w:tcW w:type="dxa" w:w="1191"/>
+            <w:tcW w:type="dxa" w:w="1304"/>
           </w:tcPr>
           <w:p>
             <w:pPr>
@@ -16604,7 +17821,7 @@
         </w:tc>
         <w:tc>
           <w:tcPr>
-            <w:tcW w:type="dxa" w:w="1304"/>
+            <w:tcW w:type="dxa" w:w="1134"/>
           </w:tcPr>
           <w:p>
             <w:pPr>
@@ -16621,7 +17838,7 @@
         </w:tc>
         <w:tc>
           <w:tcPr>
-            <w:tcW w:type="dxa" w:w="1134"/>
+            <w:tcW w:type="dxa" w:w="1020"/>
           </w:tcPr>
           <w:p>
             <w:pPr>
@@ -16638,7 +17855,7 @@
         </w:tc>
         <w:tc>
           <w:tcPr>
-            <w:tcW w:type="dxa" w:w="1247"/>
+            <w:tcW w:type="dxa" w:w="1077"/>
           </w:tcPr>
           <w:p>
             <w:pPr>
@@ -16655,7 +17872,7 @@
         </w:tc>
         <w:tc>
           <w:tcPr>
-            <w:tcW w:type="dxa" w:w="397"/>
+            <w:tcW w:type="dxa" w:w="340"/>
           </w:tcPr>
           <w:p>
             <w:pPr>
@@ -16672,7 +17889,7 @@
         </w:tc>
         <w:tc>
           <w:tcPr>
-            <w:tcW w:type="dxa" w:w="397"/>
+            <w:tcW w:type="dxa" w:w="340"/>
           </w:tcPr>
           <w:p>
             <w:pPr>
@@ -16689,7 +17906,7 @@
         </w:tc>
         <w:tc>
           <w:tcPr>
-            <w:tcW w:type="dxa" w:w="397"/>
+            <w:tcW w:type="dxa" w:w="340"/>
           </w:tcPr>
           <w:p>
             <w:pPr>
@@ -16706,7 +17923,7 @@
         </w:tc>
         <w:tc>
           <w:tcPr>
-            <w:tcW w:type="dxa" w:w="510"/>
+            <w:tcW w:type="dxa" w:w="453"/>
           </w:tcPr>
           <w:p>
             <w:pPr>
@@ -16723,7 +17940,7 @@
         </w:tc>
         <w:tc>
           <w:tcPr>
-            <w:tcW w:type="dxa" w:w="1928"/>
+            <w:tcW w:type="dxa" w:w="2041"/>
           </w:tcPr>
           <w:p>
             <w:pPr>
@@ -16777,6 +17994,15 @@
           <w:i w:val="0"/>
         </w:rPr>
         <w:t>El fallo más crítico es el desbloqueo con el usuario encima (IPR = 150), por su gravedad máxima, seguido de los tacos antideslizantes y las articulaciones. Con las acciones propuestas, sobre todo un pestillo que necesite dos gestos y un indicador visual de bloqueo (idea tomada de la patente US 6 966 404), todos los IPR bajan por debajo de 100 y el más alto pasa a ser de 48.</w:t>
+      </w:r>
+    </w:p>
+    <w:p>
+      <w:r>
+        <w:rPr>
+          <w:b w:val="0"/>
+          <w:i w:val="0"/>
+        </w:rPr>
+        <w:t>En la alternativa de madera cambian los fallos propios del material: la plataforma de contrachapado es menos sensible al impacto que la de polipropileno, pero sí a la humedad (acción: barniz y ensayo en cámara húmeda), y los taladros de las articulaciones necesitan casquillos metálicos para que la madera no se ovalice con el uso.</w:t>
       </w:r>
     </w:p>
     <w:p>
@@ -17321,6 +18547,18 @@
           <w:b w:val="0"/>
           <w:i w:val="0"/>
         </w:rPr>
+        <w:t>La suma del coste de las piezas (13,46 €) supera en casi 1 € los 12,50 € previstos para materiales y transformación en el apartado 2.1 (8,50 € + 4,00 €), lo que confirma que hay que ajustar el diseño para cumplir el coste industrial objetivo.</w:t>
+      </w:r>
+    </w:p>
+    <w:p>
+      <w:pPr>
+        <w:keepNext/>
+      </w:pPr>
+      <w:r>
+        <w:rPr>
+          <w:b w:val="0"/>
+          <w:i w:val="0"/>
+        </w:rPr>
         <w:t>Del análisis se deducen las siguientes acciones:</w:t>
       </w:r>
     </w:p>
@@ -17983,13 +19221,53 @@
       </w:r>
     </w:p>
     <w:sectPr>
+      <w:footerReference w:type="default" r:id="rId36"/>
       <w:pgSz w:w="11906" w:h="16838"/>
       <w:pgMar w:top="1417" w:right="1417" w:bottom="1417" w:left="1417" w:header="720" w:footer="720" w:gutter="0"/>
       <w:cols w:space="720"/>
+      <w:titlePg/>
       <w:docGrid w:linePitch="360"/>
     </w:sectPr>
   </w:body>
 </w:document>
+</file>
+
+<file path=word/footer1.xml><?xml version="1.0" encoding="utf-8"?>
+<w:ftr xmlns:m="http://schemas.openxmlformats.org/officeDocument/2006/math" xmlns:mc="http://schemas.openxmlformats.org/markup-compatibility/2006" xmlns:mo="http://schemas.microsoft.com/office/mac/office/2008/main" xmlns:mv="urn:schemas-microsoft-com:mac:vml" xmlns:o="urn:schemas-microsoft-com:office:office" xmlns:r="http://schemas.openxmlformats.org/officeDocument/2006/relationships" xmlns:v="urn:schemas-microsoft-com:vml" xmlns:w10="urn:schemas-microsoft-com:office:word" xmlns:w14="http://schemas.microsoft.com/office/word/2010/wordml" xmlns:w="http://schemas.openxmlformats.org/wordprocessingml/2006/main" xmlns:wne="http://schemas.microsoft.com/office/word/2006/wordml" xmlns:wp14="http://schemas.microsoft.com/office/word/2010/wordprocessingDrawing" xmlns:wp="http://schemas.openxmlformats.org/drawingml/2006/wordprocessingDrawing" xmlns:wpc="http://schemas.microsoft.com/office/word/2010/wordprocessingCanvas" xmlns:wpg="http://schemas.microsoft.com/office/word/2010/wordprocessingGroup" xmlns:wpi="http://schemas.microsoft.com/office/word/2010/wordprocessingInk" xmlns:wps="http://schemas.microsoft.com/office/word/2010/wordprocessingShape" mc:Ignorable="w14 wp14">
+  <w:p>
+    <w:pPr>
+      <w:pStyle w:val="Footer"/>
+      <w:jc w:val="center"/>
+    </w:pPr>
+    <w:r/>
+    <w:r>
+      <w:rPr>
+        <w:color w:val="6B7280"/>
+        <w:sz w:val="18"/>
+      </w:rPr>
+      <w:t xml:space="preserve">Taburete-escalera plegable  ·  Iván Roig Pérez  ·  </w:t>
+    </w:r>
+    <w:r>
+      <w:fldChar w:fldCharType="begin"/>
+    </w:r>
+    <w:r>
+      <w:instrText xml:space="preserve"> PAGE </w:instrText>
+    </w:r>
+    <w:r>
+      <w:fldChar w:fldCharType="separate"/>
+    </w:r>
+    <w:r>
+      <w:rPr>
+        <w:color w:val="6B7280"/>
+        <w:sz w:val="18"/>
+      </w:rPr>
+      <w:t>1</w:t>
+    </w:r>
+    <w:r>
+      <w:fldChar w:fldCharType="end"/>
+    </w:r>
+  </w:p>
+</w:ftr>
 </file>
 
 <file path=word/numbering.xml><?xml version="1.0" encoding="utf-8"?>

</xml_diff>